<commit_message>
docs(bd): DIALOG Edmonton brief — Phase-1 deep verification (thesis corrected)
2 research + 4 adversarial verification passes flipped the core premise:
DIALOG SELF-PERFORMS most structural incl. hospitals (Hildenbrandt/Renihan/Lenzin)
and venues (Oosterhof did ICE District) - the "outsources hospital structural"
thesis is REFUTED. It outsources narrowly: top-scale healthcare co-SE (Kaye, w/
Jacobs), mass timber (Fast+Epp), residential towers (RJC). Event Park/NAIT likely
self-performed or Thornton Tomasetti (HNTB's venue SE, did Rogers Place). Reframed
from open-seat pitch to healthcare-overflow/seismic long-game; Misericordia tower
(architect open) = best teaming target. Verified seismic wedge (NBC 2023 AB Ed,
eff May 1 2024, hospitals IE 1.5). Hard prerequisites flagged: APEGA Permit to
Practice + real BC hospital references. Added roster (Oosterhof, Neil Robson) +
Do-NOT-say list.

Co-Authored-By: Claude Opus 4.8 <noreply@anthropic.com>
</commit_message>
<xml_diff>
--- a/docs/KOR-DIALOG-Edmonton-Structural-Outsourcing-2026-06-30.docx
+++ b/docs/KOR-DIALOG-Edmonton-Structural-Outsourcing-2026-06-30.docx
@@ -10,7 +10,7 @@
           <w:sz w:val="24"/>
           <w:szCs w:val="24"/>
         </w:rPr>
-        <w:id w:val="-1808773062"/>
+        <w:id w:val="-954636161"/>
         <w:docPartObj>
           <w:docPartGallery w:val="Table of Contents"/>
           <w:docPartUnique/>
@@ -52,7 +52,7 @@
           <w:r>
             <w:fldChar w:fldCharType="separate"/>
           </w:r>
-          <w:hyperlink w:anchor="_Toc233747663" w:history="1">
+          <w:hyperlink w:anchor="_Toc233750666" w:history="1">
             <w:r>
               <w:rPr>
                 <w:rStyle w:val="Hyperlink"/>
@@ -79,7 +79,7 @@
                 <w:noProof/>
                 <w:webHidden/>
               </w:rPr>
-              <w:instrText xml:space="preserve"> PAGEREF _Toc233747663 \h </w:instrText>
+              <w:instrText xml:space="preserve"> PAGEREF _Toc233750666 \h </w:instrText>
             </w:r>
             <w:r>
               <w:rPr>
@@ -120,13 +120,13 @@
               <w:noProof/>
             </w:rPr>
           </w:pPr>
-          <w:hyperlink w:anchor="_Toc233747664" w:history="1">
+          <w:hyperlink w:anchor="_Toc233750667" w:history="1">
             <w:r>
               <w:rPr>
                 <w:rStyle w:val="Hyperlink"/>
                 <w:noProof/>
               </w:rPr>
-              <w:t>Bottom line — what DIALOG Edmonton outsources structural for</w:t>
+              <w:t>Bottom line — the honest answer to “what does DIALOG outsource structural for?”</w:t>
             </w:r>
             <w:r>
               <w:rPr>
@@ -147,7 +147,7 @@
                 <w:noProof/>
                 <w:webHidden/>
               </w:rPr>
-              <w:instrText xml:space="preserve"> PAGEREF _Toc233747664 \h </w:instrText>
+              <w:instrText xml:space="preserve"> PAGEREF _Toc233750667 \h </w:instrText>
             </w:r>
             <w:r>
               <w:rPr>
@@ -188,13 +188,13 @@
               <w:noProof/>
             </w:rPr>
           </w:pPr>
-          <w:hyperlink w:anchor="_Toc233747665" w:history="1">
+          <w:hyperlink w:anchor="_Toc233750668" w:history="1">
             <w:r>
               <w:rPr>
                 <w:rStyle w:val="Hyperlink"/>
                 <w:noProof/>
               </w:rPr>
-              <w:t>Verified external-SE credits (the evidence base)</w:t>
+              <w:t>The “open seats” reality check (verified)</w:t>
             </w:r>
             <w:r>
               <w:rPr>
@@ -215,7 +215,7 @@
                 <w:noProof/>
                 <w:webHidden/>
               </w:rPr>
-              <w:instrText xml:space="preserve"> PAGEREF _Toc233747665 \h </w:instrText>
+              <w:instrText xml:space="preserve"> PAGEREF _Toc233750668 \h </w:instrText>
             </w:r>
             <w:r>
               <w:rPr>
@@ -256,13 +256,13 @@
               <w:noProof/>
             </w:rPr>
           </w:pPr>
-          <w:hyperlink w:anchor="_Toc233747666" w:history="1">
+          <w:hyperlink w:anchor="_Toc233750669" w:history="1">
             <w:r>
               <w:rPr>
                 <w:rStyle w:val="Hyperlink"/>
                 <w:noProof/>
               </w:rPr>
-              <w:t>Live opportunities — reprioritised by the fact-check</w:t>
+              <w:t>Where KOR realistically fits (the actual play)</w:t>
             </w:r>
             <w:r>
               <w:rPr>
@@ -283,7 +283,7 @@
                 <w:noProof/>
                 <w:webHidden/>
               </w:rPr>
-              <w:instrText xml:space="preserve"> PAGEREF _Toc233747666 \h </w:instrText>
+              <w:instrText xml:space="preserve"> PAGEREF _Toc233750669 \h </w:instrText>
             </w:r>
             <w:r>
               <w:rPr>
@@ -324,13 +324,13 @@
               <w:noProof/>
             </w:rPr>
           </w:pPr>
-          <w:hyperlink w:anchor="_Toc233747667" w:history="1">
+          <w:hyperlink w:anchor="_Toc233750670" w:history="1">
             <w:r>
               <w:rPr>
                 <w:rStyle w:val="Hyperlink"/>
                 <w:noProof/>
               </w:rPr>
-              <w:t>DIALOG Edmonton structural team (verified)</w:t>
+              <w:t>Prerequisites — close before July 10 (only KOR can)</w:t>
             </w:r>
             <w:r>
               <w:rPr>
@@ -351,7 +351,7 @@
                 <w:noProof/>
                 <w:webHidden/>
               </w:rPr>
-              <w:instrText xml:space="preserve"> PAGEREF _Toc233747667 \h </w:instrText>
+              <w:instrText xml:space="preserve"> PAGEREF _Toc233750670 \h </w:instrText>
             </w:r>
             <w:r>
               <w:rPr>
@@ -392,13 +392,13 @@
               <w:noProof/>
             </w:rPr>
           </w:pPr>
-          <w:hyperlink w:anchor="_Toc233747668" w:history="1">
+          <w:hyperlink w:anchor="_Toc233750671" w:history="1">
             <w:r>
               <w:rPr>
                 <w:rStyle w:val="Hyperlink"/>
                 <w:noProof/>
               </w:rPr>
-              <w:t>Do NOT say in the meeting (fact-check landmines)</w:t>
+              <w:t>Competitors (verified)</w:t>
             </w:r>
             <w:r>
               <w:rPr>
@@ -419,7 +419,7 @@
                 <w:noProof/>
                 <w:webHidden/>
               </w:rPr>
-              <w:instrText xml:space="preserve"> PAGEREF _Toc233747668 \h </w:instrText>
+              <w:instrText xml:space="preserve"> PAGEREF _Toc233750671 \h </w:instrText>
             </w:r>
             <w:r>
               <w:rPr>
@@ -439,7 +439,7 @@
                 <w:noProof/>
                 <w:webHidden/>
               </w:rPr>
-              <w:t>4</w:t>
+              <w:t>3</w:t>
             </w:r>
             <w:r>
               <w:rPr>
@@ -460,13 +460,13 @@
               <w:noProof/>
             </w:rPr>
           </w:pPr>
-          <w:hyperlink w:anchor="_Toc233747669" w:history="1">
+          <w:hyperlink w:anchor="_Toc233750672" w:history="1">
             <w:r>
               <w:rPr>
                 <w:rStyle w:val="Hyperlink"/>
                 <w:noProof/>
               </w:rPr>
-              <w:t>Questions to ask Georg Josi on July 10</w:t>
+              <w:t>DIALOG Edmonton structural bench (verified — this is why they self-perform)</w:t>
             </w:r>
             <w:r>
               <w:rPr>
@@ -487,7 +487,143 @@
                 <w:noProof/>
                 <w:webHidden/>
               </w:rPr>
-              <w:instrText xml:space="preserve"> PAGEREF _Toc233747669 \h </w:instrText>
+              <w:instrText xml:space="preserve"> PAGEREF _Toc233750672 \h </w:instrText>
+            </w:r>
+            <w:r>
+              <w:rPr>
+                <w:noProof/>
+                <w:webHidden/>
+              </w:rPr>
+            </w:r>
+            <w:r>
+              <w:rPr>
+                <w:noProof/>
+                <w:webHidden/>
+              </w:rPr>
+              <w:fldChar w:fldCharType="separate"/>
+            </w:r>
+            <w:r>
+              <w:rPr>
+                <w:noProof/>
+                <w:webHidden/>
+              </w:rPr>
+              <w:t>3</w:t>
+            </w:r>
+            <w:r>
+              <w:rPr>
+                <w:noProof/>
+                <w:webHidden/>
+              </w:rPr>
+              <w:fldChar w:fldCharType="end"/>
+            </w:r>
+          </w:hyperlink>
+        </w:p>
+        <w:p>
+          <w:pPr>
+            <w:pStyle w:val="TOC2"/>
+            <w:tabs>
+              <w:tab w:val="right" w:leader="dot" w:pos="9350"/>
+            </w:tabs>
+            <w:rPr>
+              <w:noProof/>
+            </w:rPr>
+          </w:pPr>
+          <w:hyperlink w:anchor="_Toc233750673" w:history="1">
+            <w:r>
+              <w:rPr>
+                <w:rStyle w:val="Hyperlink"/>
+                <w:noProof/>
+              </w:rPr>
+              <w:t>Do NOT say (fact-check landmines)</w:t>
+            </w:r>
+            <w:r>
+              <w:rPr>
+                <w:noProof/>
+                <w:webHidden/>
+              </w:rPr>
+              <w:tab/>
+            </w:r>
+            <w:r>
+              <w:rPr>
+                <w:noProof/>
+                <w:webHidden/>
+              </w:rPr>
+              <w:fldChar w:fldCharType="begin"/>
+            </w:r>
+            <w:r>
+              <w:rPr>
+                <w:noProof/>
+                <w:webHidden/>
+              </w:rPr>
+              <w:instrText xml:space="preserve"> PAGEREF _Toc233750673 \h </w:instrText>
+            </w:r>
+            <w:r>
+              <w:rPr>
+                <w:noProof/>
+                <w:webHidden/>
+              </w:rPr>
+            </w:r>
+            <w:r>
+              <w:rPr>
+                <w:noProof/>
+                <w:webHidden/>
+              </w:rPr>
+              <w:fldChar w:fldCharType="separate"/>
+            </w:r>
+            <w:r>
+              <w:rPr>
+                <w:noProof/>
+                <w:webHidden/>
+              </w:rPr>
+              <w:t>3</w:t>
+            </w:r>
+            <w:r>
+              <w:rPr>
+                <w:noProof/>
+                <w:webHidden/>
+              </w:rPr>
+              <w:fldChar w:fldCharType="end"/>
+            </w:r>
+          </w:hyperlink>
+        </w:p>
+        <w:p>
+          <w:pPr>
+            <w:pStyle w:val="TOC2"/>
+            <w:tabs>
+              <w:tab w:val="right" w:leader="dot" w:pos="9350"/>
+            </w:tabs>
+            <w:rPr>
+              <w:noProof/>
+            </w:rPr>
+          </w:pPr>
+          <w:hyperlink w:anchor="_Toc233750674" w:history="1">
+            <w:r>
+              <w:rPr>
+                <w:rStyle w:val="Hyperlink"/>
+                <w:noProof/>
+              </w:rPr>
+              <w:t>Reframed questions for Georg Josi (relationship, not seat-hunting)</w:t>
+            </w:r>
+            <w:r>
+              <w:rPr>
+                <w:noProof/>
+                <w:webHidden/>
+              </w:rPr>
+              <w:tab/>
+            </w:r>
+            <w:r>
+              <w:rPr>
+                <w:noProof/>
+                <w:webHidden/>
+              </w:rPr>
+              <w:fldChar w:fldCharType="begin"/>
+            </w:r>
+            <w:r>
+              <w:rPr>
+                <w:noProof/>
+                <w:webHidden/>
+              </w:rPr>
+              <w:instrText xml:space="preserve"> PAGEREF _Toc233750674 \h </w:instrText>
             </w:r>
             <w:r>
               <w:rPr>
@@ -530,7 +666,7 @@
         <w:pStyle w:val="Heading1"/>
       </w:pPr>
       <w:bookmarkStart w:id="0" w:name="X88c8d68f0ff638f683c6a4eb2fa37528304d4e8"/>
-      <w:bookmarkStart w:id="1" w:name="_Toc233747663"/>
+      <w:bookmarkStart w:id="1" w:name="_Toc233750666"/>
       <w:r>
         <w:t>DIALOG Edmonton — Structural Outsourcing Brief</w:t>
       </w:r>
@@ -545,7 +681,7 @@
           <w:b/>
           <w:bCs/>
         </w:rPr>
-        <w:t>Prepared for KOR Structural · July 10, 2026 meeting · Verified 2026-06-30 (three-way primary-source fact-check)</w:t>
+        <w:t>KOR Structural · July 10, 2026 meeting · Verified + deepened 2026-06-30 (2 research + 4 adversarial verification passes)</w:t>
       </w:r>
     </w:p>
     <w:p>
@@ -562,14 +698,7 @@
         <w:ind w:left="200" w:right="200"/>
       </w:pPr>
       <w:r>
-        <w:rPr>
-          <w:b/>
-          <w:bCs/>
-        </w:rPr>
-        <w:t>How to read this:</w:t>
-      </w:r>
-      <w:r>
-        <w:t xml:space="preserve"> every claim is either </w:t>
+        <w:t xml:space="preserve">Every claim is </w:t>
       </w:r>
       <w:r>
         <w:rPr>
@@ -579,14 +708,14 @@
         <w:t>[Verified]</w:t>
       </w:r>
       <w:r>
-        <w:t xml:space="preserve"> against a primary source or </w:t>
-      </w:r>
-      <w:r>
-        <w:rPr>
-          <w:b/>
-          <w:bCs/>
-        </w:rPr>
-        <w:t>[Hypothesis — test in the room]</w:t>
+        <w:t xml:space="preserve"> (primary source) or </w:t>
+      </w:r>
+      <w:r>
+        <w:rPr>
+          <w:b/>
+          <w:bCs/>
+        </w:rPr>
+        <w:t>[Hypothesis]</w:t>
       </w:r>
       <w:r>
         <w:t xml:space="preserve">. A </w:t>
@@ -599,7 +728,7 @@
         <w:t>“Do NOT say”</w:t>
       </w:r>
       <w:r>
-        <w:t xml:space="preserve"> list at the end flags the meeting landmines the fact-check caught. Decision-maker: </w:t>
+        <w:t xml:space="preserve"> list flags the meeting landmines. Decision-maker: </w:t>
       </w:r>
       <w:r>
         <w:rPr>
@@ -609,12 +738,12 @@
         <w:t>Georg Josi</w:t>
       </w:r>
       <w:r>
-        <w:t>, Partner, Structural Engineer, Edmonton Studio Chair (PhD, PEng).</w:t>
-      </w:r>
-    </w:p>
-    <w:p>
-      <w:r>
-        <w:pict w14:anchorId="0819E7D8">
+        <w:t>, Partner/Structural Engineer/Edmonton Studio Chair (PhD, PEng).</w:t>
+      </w:r>
+    </w:p>
+    <w:p>
+      <w:r>
+        <w:pict w14:anchorId="534AF633">
           <v:rect id="_x0000_i1025" style="width:0;height:1.5pt" o:hralign="center" o:hrstd="t" o:hr="t"/>
         </w:pict>
       </w:r>
@@ -624,10 +753,10 @@
         <w:pStyle w:val="Heading2"/>
         <w:pageBreakBefore/>
       </w:pPr>
-      <w:bookmarkStart w:id="2" w:name="Xb451100c4653fd1c0488d5cfd095a498a7cd2c0"/>
-      <w:bookmarkStart w:id="3" w:name="_Toc233747664"/>
-      <w:r>
-        <w:t>Bottom line — what DIALOG Edmonton outsources structural for</w:t>
+      <w:bookmarkStart w:id="2" w:name="X58b4608537bcadf292dbfc53c464d351ed65849"/>
+      <w:bookmarkStart w:id="3" w:name="_Toc233750667"/>
+      <w:r>
+        <w:t>Bottom line — the honest answer to “what does DIALOG outsource structural for?”</w:t>
       </w:r>
       <w:bookmarkEnd w:id="3"/>
     </w:p>
@@ -636,27 +765,24 @@
         <w:pStyle w:val="FirstParagraph"/>
       </w:pPr>
       <w:r>
-        <w:t xml:space="preserve">DIALOG has a real, capable in-house structural team in Edmonton and does most structural in-house — </w:t>
-      </w:r>
-      <w:r>
-        <w:rPr>
-          <w:b/>
-          <w:bCs/>
-        </w:rPr>
-        <w:t>including bridges and transit</w:t>
-      </w:r>
-      <w:r>
-        <w:t xml:space="preserve"> (they </w:t>
-      </w:r>
-      <w:r>
-        <w:rPr>
-          <w:i/>
-          <w:iCs/>
-        </w:rPr>
-        <w:t>lead</w:t>
-      </w:r>
-      <w:r>
-        <w:t xml:space="preserve"> that work; see below). They bring in an external structural partner in three evidenced situations:</w:t>
+        <w:rPr>
+          <w:b/>
+          <w:bCs/>
+        </w:rPr>
+        <w:t>Less than the premise assumes. DIALOG self-performs the large majority of its structural — including most hospitals and its venue work — with a deep in-house structural bench.</w:t>
+      </w:r>
+      <w:r>
+        <w:t xml:space="preserve"> It brings in an external structural engineer only in three </w:t>
+      </w:r>
+      <w:r>
+        <w:rPr>
+          <w:b/>
+          <w:bCs/>
+        </w:rPr>
+        <w:t>narrow</w:t>
+      </w:r>
+      <w:r>
+        <w:t xml:space="preserve"> situations [all Verified]:</w:t>
       </w:r>
     </w:p>
     <w:p>
@@ -672,10 +798,10 @@
           <w:b/>
           <w:bCs/>
         </w:rPr>
-        <w:t>Hospital-scale healthcare</w:t>
-      </w:r>
-      <w:r>
-        <w:t xml:space="preserve"> — On the </w:t>
+        <w:t>Top-scale healthcare, as a co-SE (not a hand-off):</w:t>
+      </w:r>
+      <w:r>
+        <w:t xml:space="preserve"> On the </w:t>
       </w:r>
       <w:r>
         <w:rPr>
@@ -685,7 +811,7 @@
         <w:t>Kaye Edmonton Clinic</w:t>
       </w:r>
       <w:r>
-        <w:t xml:space="preserve"> (~$900M, university-affiliated), DIALOG and </w:t>
+        <w:t xml:space="preserve"> (~$900M, university-affiliated) DIALOG and </w:t>
       </w:r>
       <w:r>
         <w:rPr>
@@ -702,10 +828,13 @@
           <w:b/>
           <w:bCs/>
         </w:rPr>
-        <w:t>co-equal structural engineers</w:t>
-      </w:r>
-      <w:r>
-        <w:t>. [Verified] This is the model KOR should speak to.</w:t>
+        <w:t>co-equal</w:t>
+      </w:r>
+      <w:r>
+        <w:t xml:space="preserve"> </w:t>
+      </w:r>
+      <w:r>
+        <w:t>structural engineers. This is the exception, at the very top of the scale — not DIALOG’s norm.</w:t>
       </w:r>
     </w:p>
     <w:p>
@@ -721,10 +850,10 @@
           <w:b/>
           <w:bCs/>
         </w:rPr>
-        <w:t>Mass-timber / novel typologies</w:t>
-      </w:r>
-      <w:r>
-        <w:t xml:space="preserve"> — For advanced mass-timber they retain </w:t>
+        <w:t>Mass timber / novel typologies:</w:t>
+      </w:r>
+      <w:r>
+        <w:t xml:space="preserve"> </w:t>
       </w:r>
       <w:r>
         <w:rPr>
@@ -734,24 +863,7 @@
         <w:t>Fast+Epp</w:t>
       </w:r>
       <w:r>
-        <w:t xml:space="preserve"> (e.g. </w:t>
-      </w:r>
-      <w:r>
-        <w:rPr>
-          <w:b/>
-          <w:bCs/>
-        </w:rPr>
-        <w:t>The Hive</w:t>
-      </w:r>
-      <w:r>
-        <w:t xml:space="preserve">, Vancouver). [Verified] Fast+Epp has had an Edmonton office since 2012 — this relationship is entrenched; </w:t>
-      </w:r>
-      <w:r>
-        <w:rPr>
-          <w:b/>
-          <w:bCs/>
-        </w:rPr>
-        <w:t>differentiate, don’t attack it.</w:t>
+        <w:t xml:space="preserve"> (e.g. The Hive). Entrenched (Fast+Epp has an Edmonton office since 2012).</w:t>
       </w:r>
     </w:p>
     <w:p>
@@ -767,20 +879,10 @@
           <w:b/>
           <w:bCs/>
         </w:rPr>
-        <w:t>High-rise residential towers</w:t>
-      </w:r>
-      <w:r>
-        <w:t xml:space="preserve"> — On </w:t>
-      </w:r>
-      <w:r>
-        <w:rPr>
-          <w:b/>
-          <w:bCs/>
-        </w:rPr>
-        <w:t>The Parks</w:t>
-      </w:r>
-      <w:r>
-        <w:t xml:space="preserve"> (Edmonton, 45+35 storeys), structural is </w:t>
+        <w:t>High-rise residential towers:</w:t>
+      </w:r>
+      <w:r>
+        <w:t xml:space="preserve"> </w:t>
       </w:r>
       <w:r>
         <w:rPr>
@@ -790,17 +892,7 @@
         <w:t>RJC Engineers</w:t>
       </w:r>
       <w:r>
-        <w:t xml:space="preserve">; DIALOG was </w:t>
-      </w:r>
-      <w:r>
-        <w:rPr>
-          <w:b/>
-          <w:bCs/>
-        </w:rPr>
-        <w:t>co-architect with Hariri Pontarini Architects</w:t>
-      </w:r>
-      <w:r>
-        <w:t>. [Verified]</w:t>
+        <w:t xml:space="preserve"> (The Parks; DIALOG co-architect w/ Hariri Pontarini).</w:t>
       </w:r>
     </w:p>
     <w:p>
@@ -812,48 +904,73 @@
           <w:b/>
           <w:bCs/>
         </w:rPr>
-        <w:t>Capacity signal [Hypothesis — plausible, not confirmed]:</w:t>
+        <w:t>What DIALOG does IN-HOUSE (do not pitch these):</w:t>
+      </w:r>
+      <w:r>
+        <w:t xml:space="preserve"> most hospitals (GP Regional → Ralph Hildenbrandt; Edson → Sandra Renihan; Calgary Cancer Centre → DIALOG+Stantec), </w:t>
+      </w:r>
+      <w:r>
+        <w:rPr>
+          <w:b/>
+          <w:bCs/>
+        </w:rPr>
+        <w:t>venues</w:t>
       </w:r>
       <w:r>
         <w:t xml:space="preserve"> </w:t>
       </w:r>
       <w:r>
-        <w:t xml:space="preserve">DIALOG Edmonton is carrying unusual simultaneous load — the </w:t>
-      </w:r>
-      <w:r>
-        <w:rPr>
-          <w:b/>
-          <w:bCs/>
-        </w:rPr>
-        <w:t>Edmonton Event Park</w:t>
-      </w:r>
-      <w:r>
-        <w:t xml:space="preserve"> and </w:t>
-      </w:r>
-      <w:r>
-        <w:rPr>
-          <w:b/>
-          <w:bCs/>
-        </w:rPr>
-        <w:t>NAIT Advanced Skills Centre</w:t>
-      </w:r>
-      <w:r>
-        <w:t xml:space="preserve"> both in design, plus healthcare/institutional work from the </w:t>
-      </w:r>
-      <w:r>
-        <w:rPr>
-          <w:b/>
-          <w:bCs/>
-        </w:rPr>
-        <w:t>RPK merger (Aug 1 2025)</w:t>
-      </w:r>
-      <w:r>
-        <w:t xml:space="preserve"> without added structural staff, and Jeff DiBattista now Partner Emeritus. Probe it; don’t assert it.</w:t>
-      </w:r>
-    </w:p>
-    <w:p>
-      <w:r>
-        <w:pict w14:anchorId="64E00C9A">
+        <w:t xml:space="preserve">(ICE District/Rogers Place structural team incl. Steven Oosterhof — TT was arena prime, DIALOG associate), </w:t>
+      </w:r>
+      <w:r>
+        <w:rPr>
+          <w:b/>
+          <w:bCs/>
+        </w:rPr>
+        <w:t>bridges &amp; transit</w:t>
+      </w:r>
+      <w:r>
+        <w:t xml:space="preserve"> (Walterdale led in-house; Neil Robson, Steven Prozniak).</w:t>
+      </w:r>
+    </w:p>
+    <w:p>
+      <w:pPr>
+        <w:pStyle w:val="BodyText"/>
+      </w:pPr>
+      <w:r>
+        <w:rPr>
+          <w:b/>
+          <w:bCs/>
+        </w:rPr>
+        <w:t>Implication:</w:t>
+      </w:r>
+      <w:r>
+        <w:t xml:space="preserve"> this is a </w:t>
+      </w:r>
+      <w:r>
+        <w:rPr>
+          <w:b/>
+          <w:bCs/>
+        </w:rPr>
+        <w:t>relationship / long-game</w:t>
+      </w:r>
+      <w:r>
+        <w:t xml:space="preserve"> meeting, not an open-seat pitch. KOR’s realistic wedge is </w:t>
+      </w:r>
+      <w:r>
+        <w:rPr>
+          <w:i/>
+          <w:iCs/>
+        </w:rPr>
+        <w:t>specialist healthcare-seismic depth + overflow capacity at the top scale</w:t>
+      </w:r>
+      <w:r>
+        <w:t xml:space="preserve"> — not “you outsource, hire us.”</w:t>
+      </w:r>
+    </w:p>
+    <w:p>
+      <w:r>
+        <w:pict w14:anchorId="7DD3F277">
           <v:rect id="_x0000_i1026" style="width:0;height:1.5pt" o:hralign="center" o:hrstd="t" o:hr="t"/>
         </w:pict>
       </w:r>
@@ -863,13 +980,346 @@
         <w:pStyle w:val="Heading2"/>
         <w:pageBreakBefore/>
       </w:pPr>
-      <w:bookmarkStart w:id="4" w:name="X280a27b1dd59874d847e4645f0080a65e97cc81"/>
-      <w:bookmarkStart w:id="5" w:name="_Toc233747665"/>
+      <w:bookmarkStart w:id="4" w:name="the-open-seats-reality-check-verified"/>
+      <w:bookmarkStart w:id="5" w:name="_Toc233750668"/>
       <w:bookmarkEnd w:id="2"/>
       <w:r>
-        <w:t>Verified external-SE credits (the evidence base)</w:t>
+        <w:t>The “open seats” reality check (verified)</w:t>
       </w:r>
       <w:bookmarkEnd w:id="5"/>
+    </w:p>
+    <w:p>
+      <w:pPr>
+        <w:pStyle w:val="Compact"/>
+        <w:numPr>
+          <w:ilvl w:val="0"/>
+          <w:numId w:val="3"/>
+        </w:numPr>
+      </w:pPr>
+      <w:r>
+        <w:rPr>
+          <w:b/>
+          <w:bCs/>
+        </w:rPr>
+        <w:t>Edmonton Event Park</w:t>
+      </w:r>
+      <w:r>
+        <w:t xml:space="preserve"> — DIALOG+HNTB, no SE named publicly. But DIALOG likely </w:t>
+      </w:r>
+      <w:r>
+        <w:rPr>
+          <w:b/>
+          <w:bCs/>
+        </w:rPr>
+        <w:t>self-performs</w:t>
+      </w:r>
+      <w:r>
+        <w:t xml:space="preserve"> (Oosterhof did the adjacent ICE District), OR </w:t>
+      </w:r>
+      <w:r>
+        <w:rPr>
+          <w:b/>
+          <w:bCs/>
+        </w:rPr>
+        <w:t>Thornton Tomasetti</w:t>
+      </w:r>
+      <w:r>
+        <w:t xml:space="preserve"> gets it via HNTB (TT = HNTB’s SE on Ryan Field + Vegas A’s, and did </w:t>
+      </w:r>
+      <w:r>
+        <w:rPr>
+          <w:b/>
+          <w:bCs/>
+        </w:rPr>
+        <w:t>Rogers Place</w:t>
+      </w:r>
+      <w:r>
+        <w:t xml:space="preserve"> next door). </w:t>
+      </w:r>
+      <w:r>
+        <w:rPr>
+          <w:b/>
+          <w:bCs/>
+        </w:rPr>
+        <w:t>KOR’s odds are low — probe, don’t pitch.</w:t>
+      </w:r>
+    </w:p>
+    <w:p>
+      <w:pPr>
+        <w:pStyle w:val="Compact"/>
+        <w:numPr>
+          <w:ilvl w:val="0"/>
+          <w:numId w:val="3"/>
+        </w:numPr>
+      </w:pPr>
+      <w:r>
+        <w:rPr>
+          <w:b/>
+          <w:bCs/>
+        </w:rPr>
+        <w:t>NAIT Advanced Skills Centre</w:t>
+      </w:r>
+      <w:r>
+        <w:t xml:space="preserve"> — GEC+DIALOG, PCL builder, early works ~spring 2026. DIALOG almost certainly </w:t>
+      </w:r>
+      <w:r>
+        <w:rPr>
+          <w:b/>
+          <w:bCs/>
+        </w:rPr>
+        <w:t>self-performs</w:t>
+      </w:r>
+      <w:r>
+        <w:t xml:space="preserve">; no separate SE RFP. Effectively </w:t>
+      </w:r>
+      <w:r>
+        <w:rPr>
+          <w:b/>
+          <w:bCs/>
+        </w:rPr>
+        <w:t>not open.</w:t>
+      </w:r>
+    </w:p>
+    <w:p>
+      <w:pPr>
+        <w:pStyle w:val="FirstParagraph"/>
+      </w:pPr>
+      <w:r>
+        <w:t xml:space="preserve">The one real regulatory wedge if a US firm (e.g. Walter P Moore) were in the mix: </w:t>
+      </w:r>
+      <w:r>
+        <w:rPr>
+          <w:b/>
+          <w:bCs/>
+        </w:rPr>
+        <w:t>APEGA Permit to Practice is mandatory</w:t>
+      </w:r>
+      <w:r>
+        <w:t xml:space="preserve"> </w:t>
+      </w:r>
+      <w:r>
+        <w:t>to seal Alberta structural drawings [Verified] — but TT already operates in Canada, so it doesn’t protect KOR against TT.</w:t>
+      </w:r>
+    </w:p>
+    <w:p>
+      <w:r>
+        <w:pict w14:anchorId="4709CDAB">
+          <v:rect id="_x0000_i1027" style="width:0;height:1.5pt" o:hralign="center" o:hrstd="t" o:hr="t"/>
+        </w:pict>
+      </w:r>
+    </w:p>
+    <w:p>
+      <w:pPr>
+        <w:pStyle w:val="Heading2"/>
+        <w:pageBreakBefore/>
+      </w:pPr>
+      <w:bookmarkStart w:id="6" w:name="Xeab2317e66d08ceb771af8812bac4f0c7393527"/>
+      <w:bookmarkStart w:id="7" w:name="_Toc233750669"/>
+      <w:bookmarkEnd w:id="4"/>
+      <w:r>
+        <w:t>Where KOR realistically fits (the actual play)</w:t>
+      </w:r>
+      <w:bookmarkEnd w:id="7"/>
+    </w:p>
+    <w:p>
+      <w:pPr>
+        <w:pStyle w:val="Compact"/>
+        <w:numPr>
+          <w:ilvl w:val="0"/>
+          <w:numId w:val="4"/>
+        </w:numPr>
+      </w:pPr>
+      <w:r>
+        <w:rPr>
+          <w:b/>
+          <w:bCs/>
+        </w:rPr>
+        <w:t>Healthcare co-SE / overflow at the top scale</w:t>
+      </w:r>
+      <w:r>
+        <w:t xml:space="preserve"> — position KOR as the specialist structural partner DIALOG reaches for when a hospital hits Kaye-scale or their in-house team is maxed. Long-game.</w:t>
+      </w:r>
+    </w:p>
+    <w:p>
+      <w:pPr>
+        <w:pStyle w:val="Compact"/>
+        <w:numPr>
+          <w:ilvl w:val="0"/>
+          <w:numId w:val="4"/>
+        </w:numPr>
+      </w:pPr>
+      <w:r>
+        <w:rPr>
+          <w:b/>
+          <w:bCs/>
+        </w:rPr>
+        <w:t>Misericordia Community Hospital inpatient tower</w:t>
+      </w:r>
+      <w:r>
+        <w:t xml:space="preserve"> (~350 beds per provincial reporting; Acute Care Action Plan, Nov 2025; planning-only funding) — </w:t>
+      </w:r>
+      <w:r>
+        <w:rPr>
+          <w:b/>
+          <w:bCs/>
+        </w:rPr>
+        <w:t>architect seat is OPEN</w:t>
+      </w:r>
+      <w:r>
+        <w:t xml:space="preserve"> → if DIALOG wins the architect role, KOR could ride as co-SE. The better teaming target. </w:t>
+      </w:r>
+      <w:r>
+        <w:rPr>
+          <w:i/>
+          <w:iCs/>
+        </w:rPr>
+        <w:t>(Grey Nuns tower is real but Stantec is already architect → structural-teaming only.)</w:t>
+      </w:r>
+    </w:p>
+    <w:p>
+      <w:pPr>
+        <w:pStyle w:val="Compact"/>
+        <w:numPr>
+          <w:ilvl w:val="0"/>
+          <w:numId w:val="4"/>
+        </w:numPr>
+      </w:pPr>
+      <w:r>
+        <w:rPr>
+          <w:b/>
+          <w:bCs/>
+        </w:rPr>
+        <w:t>Seismic specialist depth</w:t>
+      </w:r>
+      <w:r>
+        <w:t xml:space="preserve"> — the NBC post-disaster hospital angle (below) as </w:t>
+      </w:r>
+      <w:r>
+        <w:rPr>
+          <w:i/>
+          <w:iCs/>
+        </w:rPr>
+        <w:t>added specialist capacity</w:t>
+      </w:r>
+      <w:r>
+        <w:t>, not “you can’t do this” (DIALOG’s in-house team knows the code).</w:t>
+      </w:r>
+    </w:p>
+    <w:p>
+      <w:pPr>
+        <w:pStyle w:val="FirstParagraph"/>
+      </w:pPr>
+      <w:r>
+        <w:rPr>
+          <w:b/>
+          <w:bCs/>
+        </w:rPr>
+        <w:t>Differentiation line [Verified, use this wording]:</w:t>
+      </w:r>
+      <w:r>
+        <w:t xml:space="preserve"> </w:t>
+      </w:r>
+      <w:r>
+        <w:rPr>
+          <w:i/>
+          <w:iCs/>
+        </w:rPr>
+        <w:t>“Since May 1, 2024, Alberta builds to the NBC 2023 Alberta Edition (based on NBC 2020) — hospitals are post-disaster buildings, seismic importance factor 1.5, with the new near-elastic / limited-damage objective. That’s a standard BC firms have designed to for a decade; KOR brings that hospital-seismic depth as added capacity.”</w:t>
+      </w:r>
+      <w:r>
+        <w:t xml:space="preserve"> (Do not call it Alberta-unique — it’s national.)</w:t>
+      </w:r>
+    </w:p>
+    <w:p>
+      <w:r>
+        <w:pict w14:anchorId="5E23FE7F">
+          <v:rect id="_x0000_i1028" style="width:0;height:1.5pt" o:hralign="center" o:hrstd="t" o:hr="t"/>
+        </w:pict>
+      </w:r>
+    </w:p>
+    <w:p>
+      <w:pPr>
+        <w:pStyle w:val="Heading2"/>
+        <w:pageBreakBefore/>
+      </w:pPr>
+      <w:bookmarkStart w:id="8" w:name="X3307e16a0659ff59c2f591c95fcda550004a6d3"/>
+      <w:bookmarkStart w:id="9" w:name="_Toc233750670"/>
+      <w:bookmarkEnd w:id="6"/>
+      <w:r>
+        <w:t>Prerequisites — close before July 10 (only KOR can)</w:t>
+      </w:r>
+      <w:bookmarkEnd w:id="9"/>
+    </w:p>
+    <w:p>
+      <w:pPr>
+        <w:pStyle w:val="Compact"/>
+        <w:numPr>
+          <w:ilvl w:val="0"/>
+          <w:numId w:val="5"/>
+        </w:numPr>
+      </w:pPr>
+      <w:r>
+        <w:rPr>
+          <w:b/>
+          <w:bCs/>
+        </w:rPr>
+        <w:t>APEGA Permit to Practice + a licensed responsible member.</w:t>
+      </w:r>
+      <w:r>
+        <w:t xml:space="preserve"> </w:t>
+      </w:r>
+      <w:r>
+        <w:t xml:space="preserve">Hard legal requirement — </w:t>
+      </w:r>
+      <w:r>
+        <w:rPr>
+          <w:i/>
+          <w:iCs/>
+        </w:rPr>
+        <w:t>no Alberta structural work is possible without it.</w:t>
+      </w:r>
+      <w:r>
+        <w:t xml:space="preserve"> Confirm status.</w:t>
+      </w:r>
+    </w:p>
+    <w:p>
+      <w:pPr>
+        <w:pStyle w:val="Compact"/>
+        <w:numPr>
+          <w:ilvl w:val="0"/>
+          <w:numId w:val="5"/>
+        </w:numPr>
+      </w:pPr>
+      <w:r>
+        <w:rPr>
+          <w:b/>
+          <w:bCs/>
+        </w:rPr>
+        <w:t>Nameable BC hospital / high-importance SE references.</w:t>
+      </w:r>
+      <w:r>
+        <w:t xml:space="preserve"> The healthcare pitch is hollow without them — DIALOG’s public portfolio shows KOR none. Line up specific projects to cite.</w:t>
+      </w:r>
+    </w:p>
+    <w:p>
+      <w:r>
+        <w:pict w14:anchorId="25E74520">
+          <v:rect id="_x0000_i1029" style="width:0;height:1.5pt" o:hralign="center" o:hrstd="t" o:hr="t"/>
+        </w:pict>
+      </w:r>
+    </w:p>
+    <w:p>
+      <w:pPr>
+        <w:pStyle w:val="Heading2"/>
+        <w:pageBreakBefore/>
+      </w:pPr>
+      <w:bookmarkStart w:id="10" w:name="competitors-verified"/>
+      <w:bookmarkStart w:id="11" w:name="_Toc233750671"/>
+      <w:bookmarkEnd w:id="8"/>
+      <w:r>
+        <w:t>Competitors (verified)</w:t>
+      </w:r>
+      <w:bookmarkEnd w:id="11"/>
     </w:p>
     <w:tbl>
       <w:tblPr>
@@ -884,11 +1334,9 @@
         <w:tblLook w:val="0420" w:firstRow="1" w:lastRow="0" w:firstColumn="0" w:lastColumn="0" w:noHBand="0" w:noVBand="1"/>
       </w:tblPr>
       <w:tblGrid>
-        <w:gridCol w:w="1912"/>
-        <w:gridCol w:w="1912"/>
-        <w:gridCol w:w="1912"/>
-        <w:gridCol w:w="1912"/>
-        <w:gridCol w:w="1912"/>
+        <w:gridCol w:w="3188"/>
+        <w:gridCol w:w="3187"/>
+        <w:gridCol w:w="3185"/>
       </w:tblGrid>
       <w:tr>
         <w:trPr>
@@ -898,96 +1346,64 @@
         </w:trPr>
         <w:tc>
           <w:tcPr>
-            <w:tcW w:w="1000" w:type="pct"/>
+            <w:tcW w:w="1667" w:type="pct"/>
           </w:tcPr>
           <w:p>
             <w:pPr>
               <w:pStyle w:val="Compact"/>
               <w:rPr>
+                <w:b w:val="0"/>
                 <w:sz w:val="19"/>
               </w:rPr>
             </w:pPr>
             <w:r>
               <w:rPr>
+                <w:b w:val="0"/>
                 <w:sz w:val="19"/>
               </w:rPr>
-              <w:t>Project</w:t>
+              <w:t>Firm</w:t>
             </w:r>
           </w:p>
         </w:tc>
         <w:tc>
           <w:tcPr>
-            <w:tcW w:w="1000" w:type="pct"/>
+            <w:tcW w:w="1667" w:type="pct"/>
           </w:tcPr>
           <w:p>
             <w:pPr>
               <w:pStyle w:val="Compact"/>
               <w:rPr>
+                <w:b w:val="0"/>
                 <w:sz w:val="19"/>
               </w:rPr>
             </w:pPr>
             <w:r>
               <w:rPr>
+                <w:b w:val="0"/>
                 <w:sz w:val="19"/>
               </w:rPr>
-              <w:t>Structural</w:t>
+              <w:t>Role vs DIALOG</w:t>
             </w:r>
           </w:p>
         </w:tc>
         <w:tc>
           <w:tcPr>
-            <w:tcW w:w="1000" w:type="pct"/>
+            <w:tcW w:w="1667" w:type="pct"/>
           </w:tcPr>
           <w:p>
             <w:pPr>
               <w:pStyle w:val="Compact"/>
               <w:rPr>
+                <w:b w:val="0"/>
                 <w:sz w:val="19"/>
               </w:rPr>
             </w:pPr>
             <w:r>
               <w:rPr>
+                <w:b w:val="0"/>
                 <w:sz w:val="19"/>
               </w:rPr>
-              <w:t>DIALOG role</w:t>
-            </w:r>
-          </w:p>
-        </w:tc>
-        <w:tc>
-          <w:tcPr>
-            <w:tcW w:w="1000" w:type="pct"/>
-          </w:tcPr>
-          <w:p>
-            <w:pPr>
-              <w:pStyle w:val="Compact"/>
-              <w:rPr>
-                <w:sz w:val="19"/>
-              </w:rPr>
-            </w:pPr>
-            <w:r>
-              <w:rPr>
-                <w:sz w:val="19"/>
-              </w:rPr>
-              <w:t>Status</w:t>
-            </w:r>
-          </w:p>
-        </w:tc>
-        <w:tc>
-          <w:tcPr>
-            <w:tcW w:w="1000" w:type="pct"/>
-          </w:tcPr>
-          <w:p>
-            <w:pPr>
-              <w:pStyle w:val="Compact"/>
-              <w:rPr>
-                <w:sz w:val="19"/>
-              </w:rPr>
-            </w:pPr>
-            <w:r>
-              <w:rPr>
-                <w:sz w:val="19"/>
-              </w:rPr>
-              <w:t>Confidence</w:t>
+              <w:t>Note</w:t>
             </w:r>
           </w:p>
         </w:tc>
@@ -999,7 +1415,7 @@
         </w:trPr>
         <w:tc>
           <w:tcPr>
-            <w:tcW w:w="1000" w:type="pct"/>
+            <w:tcW w:w="1667" w:type="pct"/>
           </w:tcPr>
           <w:p>
             <w:pPr>
@@ -1010,15 +1426,17 @@
             </w:pPr>
             <w:r>
               <w:rPr>
+                <w:b/>
+                <w:bCs/>
                 <w:sz w:val="19"/>
               </w:rPr>
-              <w:t>Kaye Edmonton Clinic</w:t>
+              <w:t>RJC Engineers</w:t>
             </w:r>
           </w:p>
         </w:tc>
         <w:tc>
           <w:tcPr>
-            <w:tcW w:w="1000" w:type="pct"/>
+            <w:tcW w:w="1667" w:type="pct"/>
           </w:tcPr>
           <w:p>
             <w:pPr>
@@ -1031,27 +1449,13 @@
               <w:rPr>
                 <w:sz w:val="19"/>
               </w:rPr>
-              <w:t xml:space="preserve">DIALOG </w:t>
-            </w:r>
-            <w:r>
-              <w:rPr>
-                <w:b/>
-                <w:bCs/>
-                <w:sz w:val="19"/>
-              </w:rPr>
-              <w:t>+ Yolles (now Jacobs)</w:t>
-            </w:r>
-            <w:r>
-              <w:rPr>
-                <w:sz w:val="19"/>
-              </w:rPr>
-              <w:t>, co-equal</w:t>
+              <w:t>Incumbent — towers + AB healthcare (South Health Campus)</w:t>
             </w:r>
           </w:p>
         </w:tc>
         <w:tc>
           <w:tcPr>
-            <w:tcW w:w="1000" w:type="pct"/>
+            <w:tcW w:w="1667" w:type="pct"/>
           </w:tcPr>
           <w:p>
             <w:pPr>
@@ -1064,45 +1468,7 @@
               <w:rPr>
                 <w:sz w:val="19"/>
               </w:rPr>
-              <w:t>Architect + co-SE</w:t>
-            </w:r>
-          </w:p>
-        </w:tc>
-        <w:tc>
-          <w:tcPr>
-            <w:tcW w:w="1000" w:type="pct"/>
-          </w:tcPr>
-          <w:p>
-            <w:pPr>
-              <w:pStyle w:val="Compact"/>
-              <w:rPr>
-                <w:sz w:val="19"/>
-              </w:rPr>
-            </w:pPr>
-            <w:r>
-              <w:rPr>
-                <w:sz w:val="19"/>
-              </w:rPr>
-              <w:t>Delivered</w:t>
-            </w:r>
-          </w:p>
-        </w:tc>
-        <w:tc>
-          <w:tcPr>
-            <w:tcW w:w="1000" w:type="pct"/>
-          </w:tcPr>
-          <w:p>
-            <w:pPr>
-              <w:pStyle w:val="Compact"/>
-              <w:rPr>
-                <w:sz w:val="19"/>
-              </w:rPr>
-            </w:pPr>
-            <w:r>
-              <w:rPr>
-                <w:sz w:val="19"/>
-              </w:rPr>
-              <w:t>0.85 [Verified]</w:t>
+              <w:t>The one to displace on healthcare</w:t>
             </w:r>
           </w:p>
         </w:tc>
@@ -1113,7 +1479,7 @@
         </w:trPr>
         <w:tc>
           <w:tcPr>
-            <w:tcW w:w="1000" w:type="pct"/>
+            <w:tcW w:w="1667" w:type="pct"/>
           </w:tcPr>
           <w:p>
             <w:pPr>
@@ -1124,15 +1490,17 @@
             </w:pPr>
             <w:r>
               <w:rPr>
+                <w:b/>
+                <w:bCs/>
                 <w:sz w:val="19"/>
               </w:rPr>
-              <w:t>The Hive (Vancouver)</w:t>
+              <w:t>Fast+Epp</w:t>
             </w:r>
           </w:p>
         </w:tc>
         <w:tc>
           <w:tcPr>
-            <w:tcW w:w="1000" w:type="pct"/>
+            <w:tcW w:w="1667" w:type="pct"/>
           </w:tcPr>
           <w:p>
             <w:pPr>
@@ -1143,17 +1511,15 @@
             </w:pPr>
             <w:r>
               <w:rPr>
-                <w:b/>
-                <w:bCs/>
                 <w:sz w:val="19"/>
               </w:rPr>
-              <w:t>Fast+Epp</w:t>
+              <w:t>Mass-timber partner (Edmonton office since 2012)</w:t>
             </w:r>
           </w:p>
         </w:tc>
         <w:tc>
           <w:tcPr>
-            <w:tcW w:w="1000" w:type="pct"/>
+            <w:tcW w:w="1667" w:type="pct"/>
           </w:tcPr>
           <w:p>
             <w:pPr>
@@ -1166,45 +1532,7 @@
               <w:rPr>
                 <w:sz w:val="19"/>
               </w:rPr>
-              <w:t>Architect</w:t>
-            </w:r>
-          </w:p>
-        </w:tc>
-        <w:tc>
-          <w:tcPr>
-            <w:tcW w:w="1000" w:type="pct"/>
-          </w:tcPr>
-          <w:p>
-            <w:pPr>
-              <w:pStyle w:val="Compact"/>
-              <w:rPr>
-                <w:sz w:val="19"/>
-              </w:rPr>
-            </w:pPr>
-            <w:r>
-              <w:rPr>
-                <w:sz w:val="19"/>
-              </w:rPr>
-              <w:t>Delivered</w:t>
-            </w:r>
-          </w:p>
-        </w:tc>
-        <w:tc>
-          <w:tcPr>
-            <w:tcW w:w="1000" w:type="pct"/>
-          </w:tcPr>
-          <w:p>
-            <w:pPr>
-              <w:pStyle w:val="Compact"/>
-              <w:rPr>
-                <w:sz w:val="19"/>
-              </w:rPr>
-            </w:pPr>
-            <w:r>
-              <w:rPr>
-                <w:sz w:val="19"/>
-              </w:rPr>
-              <w:t>0.99 [Verified]</w:t>
+              <w:t>Don’t contest this lane</w:t>
             </w:r>
           </w:p>
         </w:tc>
@@ -1216,7 +1544,7 @@
         </w:trPr>
         <w:tc>
           <w:tcPr>
-            <w:tcW w:w="1000" w:type="pct"/>
+            <w:tcW w:w="1667" w:type="pct"/>
           </w:tcPr>
           <w:p>
             <w:pPr>
@@ -1227,15 +1555,17 @@
             </w:pPr>
             <w:r>
               <w:rPr>
+                <w:b/>
+                <w:bCs/>
                 <w:sz w:val="19"/>
               </w:rPr>
-              <w:t>The Parks (Edmonton, 45+35 st)</w:t>
+              <w:t>Thornton Tomasetti</w:t>
             </w:r>
           </w:p>
         </w:tc>
         <w:tc>
           <w:tcPr>
-            <w:tcW w:w="1000" w:type="pct"/>
+            <w:tcW w:w="1667" w:type="pct"/>
           </w:tcPr>
           <w:p>
             <w:pPr>
@@ -1246,17 +1576,15 @@
             </w:pPr>
             <w:r>
               <w:rPr>
-                <w:b/>
-                <w:bCs/>
                 <w:sz w:val="19"/>
               </w:rPr>
-              <w:t>RJC Engineers</w:t>
+              <w:t>HNTB’s venue SE (Rogers Place, Ryan Field, Vegas A’s)</w:t>
             </w:r>
           </w:p>
         </w:tc>
         <w:tc>
           <w:tcPr>
-            <w:tcW w:w="1000" w:type="pct"/>
+            <w:tcW w:w="1667" w:type="pct"/>
           </w:tcPr>
           <w:p>
             <w:pPr>
@@ -1267,17 +1595,41 @@
             </w:pPr>
             <w:r>
               <w:rPr>
+                <w:sz w:val="19"/>
+              </w:rPr>
+              <w:t>Threat on Event Park if HNTB drives SE</w:t>
+            </w:r>
+          </w:p>
+        </w:tc>
+      </w:tr>
+      <w:tr>
+        <w:trPr>
+          <w:cantSplit/>
+        </w:trPr>
+        <w:tc>
+          <w:tcPr>
+            <w:tcW w:w="1667" w:type="pct"/>
+          </w:tcPr>
+          <w:p>
+            <w:pPr>
+              <w:pStyle w:val="Compact"/>
+              <w:rPr>
+                <w:sz w:val="19"/>
+              </w:rPr>
+            </w:pPr>
+            <w:r>
+              <w:rPr>
                 <w:b/>
                 <w:bCs/>
                 <w:sz w:val="19"/>
               </w:rPr>
-              <w:t>Co-architect w/ Hariri Pontarini</w:t>
+              <w:t>Entuitive</w:t>
             </w:r>
           </w:p>
         </w:tc>
         <w:tc>
           <w:tcPr>
-            <w:tcW w:w="1000" w:type="pct"/>
+            <w:tcW w:w="1667" w:type="pct"/>
           </w:tcPr>
           <w:p>
             <w:pPr>
@@ -1290,13 +1642,13 @@
               <w:rPr>
                 <w:sz w:val="19"/>
               </w:rPr>
-              <w:t>In progress</w:t>
+              <w:t>Edmonton office (2016), institutional</w:t>
             </w:r>
           </w:p>
         </w:tc>
         <w:tc>
           <w:tcPr>
-            <w:tcW w:w="1000" w:type="pct"/>
+            <w:tcW w:w="1667" w:type="pct"/>
           </w:tcPr>
           <w:p>
             <w:pPr>
@@ -1307,627 +1659,11 @@
             </w:pPr>
             <w:r>
               <w:rPr>
+                <w:b/>
+                <w:bCs/>
                 <w:sz w:val="19"/>
               </w:rPr>
-              <w:t>0.95 [Verified]</w:t>
-            </w:r>
-          </w:p>
-        </w:tc>
-      </w:tr>
-    </w:tbl>
-    <w:p>
-      <w:pPr>
-        <w:pStyle w:val="BodyText"/>
-      </w:pPr>
-      <w:r>
-        <w:rPr>
-          <w:b/>
-          <w:bCs/>
-        </w:rPr>
-        <w:t>In-house depth (NOT outsourcing — do not misread):</w:t>
-      </w:r>
-    </w:p>
-    <w:p>
-      <w:pPr>
-        <w:pStyle w:val="Compact"/>
-        <w:numPr>
-          <w:ilvl w:val="0"/>
-          <w:numId w:val="3"/>
-        </w:numPr>
-      </w:pPr>
-      <w:r>
-        <w:rPr>
-          <w:b/>
-          <w:bCs/>
-        </w:rPr>
-        <w:t>Walterdale Bridge (Edmonton):</w:t>
-      </w:r>
-      <w:r>
-        <w:t xml:space="preserve"> DIALOG </w:t>
-      </w:r>
-      <w:r>
-        <w:rPr>
-          <w:b/>
-          <w:bCs/>
-        </w:rPr>
-        <w:t>led structural in-house</w:t>
-      </w:r>
-      <w:r>
-        <w:t xml:space="preserve"> (their own engineers, incl. Steven Prozniak); </w:t>
-      </w:r>
-      <w:r>
-        <w:rPr>
-          <w:b/>
-          <w:bCs/>
-        </w:rPr>
-        <w:t>COWI was DIALOG’s bridge-specialist sub-consultant.</w:t>
-      </w:r>
-      <w:r>
-        <w:t xml:space="preserve"> DIALOG did </w:t>
-      </w:r>
-      <w:r>
-        <w:rPr>
-          <w:i/>
-          <w:iCs/>
-        </w:rPr>
-        <w:t>not</w:t>
-      </w:r>
-      <w:r>
-        <w:t xml:space="preserve"> outsource structural here.</w:t>
-      </w:r>
-    </w:p>
-    <w:p>
-      <w:pPr>
-        <w:pStyle w:val="Compact"/>
-        <w:numPr>
-          <w:ilvl w:val="0"/>
-          <w:numId w:val="3"/>
-        </w:numPr>
-      </w:pPr>
-      <w:r>
-        <w:rPr>
-          <w:b/>
-          <w:bCs/>
-        </w:rPr>
-        <w:t>Valley Line LRT:</w:t>
-      </w:r>
-      <w:r>
-        <w:t xml:space="preserve"> DIALOG was a </w:t>
-      </w:r>
-      <w:r>
-        <w:rPr>
-          <w:b/>
-          <w:bCs/>
-        </w:rPr>
-        <w:t>sub-consultant to AECOM (prime)</w:t>
-      </w:r>
-      <w:r>
-        <w:t xml:space="preserve"> </w:t>
-      </w:r>
-      <w:r>
-        <w:t>delivering its design slice — not the lead. Structural was one discipline within a 12-firm consortium.</w:t>
-      </w:r>
-    </w:p>
-    <w:p>
-      <w:pPr>
-        <w:pStyle w:val="FirstParagraph"/>
-      </w:pPr>
-      <w:r>
-        <w:t xml:space="preserve">Takeaway: DIALOG has genuine in-house bridge/transit structural capability. KOR’s opening is </w:t>
-      </w:r>
-      <w:r>
-        <w:rPr>
-          <w:b/>
-          <w:bCs/>
-        </w:rPr>
-        <w:t>healthcare + complex institutional buildings</w:t>
-      </w:r>
-      <w:r>
-        <w:t>, not transit/bridges.</w:t>
-      </w:r>
-    </w:p>
-    <w:p>
-      <w:r>
-        <w:pict w14:anchorId="02506690">
-          <v:rect id="_x0000_i1027" style="width:0;height:1.5pt" o:hralign="center" o:hrstd="t" o:hr="t"/>
-        </w:pict>
-      </w:r>
-    </w:p>
-    <w:p>
-      <w:pPr>
-        <w:pStyle w:val="Heading2"/>
-        <w:pageBreakBefore/>
-      </w:pPr>
-      <w:bookmarkStart w:id="6" w:name="Xe6179c1f0da109bb2d02d534f9d4095a5360ac6"/>
-      <w:bookmarkStart w:id="7" w:name="_Toc233747666"/>
-      <w:bookmarkEnd w:id="4"/>
-      <w:r>
-        <w:t>Live opportunities — reprioritised by the fact-check</w:t>
-      </w:r>
-      <w:bookmarkEnd w:id="7"/>
-    </w:p>
-    <w:p>
-      <w:pPr>
-        <w:pStyle w:val="Heading3"/>
-      </w:pPr>
-      <w:bookmarkStart w:id="8" w:name="X27002e5e47fdbbd4c172e9e3bf4fde02c7cce35"/>
-      <w:r>
-        <w:t>#1 (cleanest, genuinely open) — Edmonton Event Park [Verified]</w:t>
-      </w:r>
-    </w:p>
-    <w:p>
-      <w:pPr>
-        <w:pStyle w:val="Compact"/>
-        <w:numPr>
-          <w:ilvl w:val="0"/>
-          <w:numId w:val="4"/>
-        </w:numPr>
-      </w:pPr>
-      <w:r>
-        <w:t xml:space="preserve">World-class indoor/outdoor entertainment venue, ICE District (OEG + City of Edmonton). ~$250M. Design team </w:t>
-      </w:r>
-      <w:r>
-        <w:rPr>
-          <w:b/>
-          <w:bCs/>
-        </w:rPr>
-        <w:t>DIALOG (architect) + HNTB (venue specialist)</w:t>
-      </w:r>
-      <w:r>
-        <w:t xml:space="preserve"> selected </w:t>
-      </w:r>
-      <w:r>
-        <w:rPr>
-          <w:b/>
-          <w:bCs/>
-        </w:rPr>
-        <w:t>April 8, 2026</w:t>
-      </w:r>
-      <w:r>
-        <w:t xml:space="preserve"> from 19 submissions. Construction </w:t>
-      </w:r>
-      <w:r>
-        <w:rPr>
-          <w:b/>
-          <w:bCs/>
-        </w:rPr>
-        <w:t>2027–2029</w:t>
-      </w:r>
-      <w:r>
-        <w:t>.</w:t>
-      </w:r>
-    </w:p>
-    <w:p>
-      <w:pPr>
-        <w:pStyle w:val="Compact"/>
-        <w:numPr>
-          <w:ilvl w:val="0"/>
-          <w:numId w:val="4"/>
-        </w:numPr>
-      </w:pPr>
-      <w:r>
-        <w:rPr>
-          <w:b/>
-          <w:bCs/>
-        </w:rPr>
-        <w:t>No structural engineer named in any public source</w:t>
-      </w:r>
-      <w:r>
-        <w:t xml:space="preserve"> — the SE seat is genuinely open, design underway now.</w:t>
-      </w:r>
-    </w:p>
-    <w:p>
-      <w:pPr>
-        <w:pStyle w:val="Compact"/>
-        <w:numPr>
-          <w:ilvl w:val="0"/>
-          <w:numId w:val="4"/>
-        </w:numPr>
-      </w:pPr>
-      <w:r>
-        <w:rPr>
-          <w:b/>
-          <w:bCs/>
-        </w:rPr>
-        <w:t>Why it outsources:</w:t>
-      </w:r>
-      <w:r>
-        <w:t xml:space="preserve"> HNTB is a venue specialist, not a structural firm; long-span roof / large-gathering / vibration loads; a typology DIALOG’s team hasn’t delivered before. A Canadian SE partner is plausibly needed for NBCC/permit.</w:t>
-      </w:r>
-    </w:p>
-    <w:p>
-      <w:pPr>
-        <w:pStyle w:val="Compact"/>
-        <w:numPr>
-          <w:ilvl w:val="0"/>
-          <w:numId w:val="4"/>
-        </w:numPr>
-      </w:pPr>
-      <w:r>
-        <w:rPr>
-          <w:b/>
-          <w:bCs/>
-        </w:rPr>
-        <w:t>KOR play:</w:t>
-      </w:r>
-      <w:r>
-        <w:t xml:space="preserve"> </w:t>
-      </w:r>
-      <w:r>
-        <w:t>this is the live one. Ask Josi how they’re structuring the SE role and whether there’s a Canadian SE-sub seat.</w:t>
-      </w:r>
-    </w:p>
-    <w:p>
-      <w:pPr>
-        <w:pStyle w:val="Heading3"/>
-      </w:pPr>
-      <w:bookmarkStart w:id="9" w:name="Xca57580707dbec9165ec1f8dd63cf6310da885e"/>
-      <w:bookmarkEnd w:id="8"/>
-      <w:r>
-        <w:t>#2 (probe — may already be filled) — NAIT Advanced Skills Centre [Verified w/ caveat]</w:t>
-      </w:r>
-    </w:p>
-    <w:p>
-      <w:pPr>
-        <w:pStyle w:val="Compact"/>
-        <w:numPr>
-          <w:ilvl w:val="0"/>
-          <w:numId w:val="5"/>
-        </w:numPr>
-      </w:pPr>
-      <w:r>
-        <w:t xml:space="preserve">~640,000 sf trades/apprenticeship facility, NAIT campus. Provincial contribution </w:t>
-      </w:r>
-      <w:r>
-        <w:rPr>
-          <w:b/>
-          <w:bCs/>
-        </w:rPr>
-        <w:t>$384M</w:t>
-      </w:r>
-      <w:r>
-        <w:t xml:space="preserve"> (province’s share, not total). </w:t>
-      </w:r>
-      <w:r>
-        <w:rPr>
-          <w:b/>
-          <w:bCs/>
-        </w:rPr>
-        <w:t>GEC Architecture + DIALOG</w:t>
-      </w:r>
-      <w:r>
-        <w:t xml:space="preserve"> co-architects; </w:t>
-      </w:r>
-      <w:r>
-        <w:rPr>
-          <w:b/>
-          <w:bCs/>
-        </w:rPr>
-        <w:t>PCL</w:t>
-      </w:r>
-      <w:r>
-        <w:t xml:space="preserve"> builder. </w:t>
-      </w:r>
-      <w:r>
-        <w:rPr>
-          <w:b/>
-          <w:bCs/>
-        </w:rPr>
-        <w:t>Early works began ~spring 2026</w:t>
-      </w:r>
-      <w:r>
-        <w:t xml:space="preserve"> (already underway — </w:t>
-      </w:r>
-      <w:r>
-        <w:rPr>
-          <w:i/>
-          <w:iCs/>
-        </w:rPr>
-        <w:t>not</w:t>
-      </w:r>
-      <w:r>
-        <w:t xml:space="preserve"> 2027). Occupancy targeted fall 2030.</w:t>
-      </w:r>
-    </w:p>
-    <w:p>
-      <w:pPr>
-        <w:pStyle w:val="Compact"/>
-        <w:numPr>
-          <w:ilvl w:val="0"/>
-          <w:numId w:val="5"/>
-        </w:numPr>
-      </w:pPr>
-      <w:r>
-        <w:t xml:space="preserve">No SE publicly named — but design is advanced, so </w:t>
-      </w:r>
-      <w:r>
-        <w:rPr>
-          <w:b/>
-          <w:bCs/>
-        </w:rPr>
-        <w:t>the SE may already be selected. Ask; don’t assume open.</w:t>
-      </w:r>
-    </w:p>
-    <w:p>
-      <w:pPr>
-        <w:pStyle w:val="Compact"/>
-        <w:numPr>
-          <w:ilvl w:val="0"/>
-          <w:numId w:val="5"/>
-        </w:numPr>
-      </w:pPr>
-      <w:r>
-        <w:rPr>
-          <w:b/>
-          <w:bCs/>
-        </w:rPr>
-        <w:t>KOR play:</w:t>
-      </w:r>
-      <w:r>
-        <w:t xml:space="preserve"> complex trades/industrial loads + high-importance occupancy — AB-registered structural capacity if the seat is live.</w:t>
-      </w:r>
-    </w:p>
-    <w:p>
-      <w:pPr>
-        <w:pStyle w:val="Heading3"/>
-      </w:pPr>
-      <w:bookmarkStart w:id="10" w:name="X2e9d7b621e30c1c2d861add944e8837e16134dc"/>
-      <w:bookmarkEnd w:id="9"/>
-      <w:r>
-        <w:t>#3 (long-lead relationship seed — NOT an active pitch) — Healthcare co-SE, the Kaye model [Verified]</w:t>
-      </w:r>
-    </w:p>
-    <w:p>
-      <w:pPr>
-        <w:pStyle w:val="Compact"/>
-        <w:numPr>
-          <w:ilvl w:val="0"/>
-          <w:numId w:val="6"/>
-        </w:numPr>
-      </w:pPr>
-      <w:r>
-        <w:t>The Kaye Clinic precedent (DIALOG + Yolles/Jacobs co-SE) is the template for hospital-scale structural.</w:t>
-      </w:r>
-    </w:p>
-    <w:p>
-      <w:pPr>
-        <w:pStyle w:val="Compact"/>
-        <w:numPr>
-          <w:ilvl w:val="0"/>
-          <w:numId w:val="6"/>
-        </w:numPr>
-      </w:pPr>
-      <w:r>
-        <w:rPr>
-          <w:b/>
-          <w:bCs/>
-        </w:rPr>
-        <w:t>Stollery Children’s Hospital</w:t>
-      </w:r>
-      <w:r>
-        <w:t xml:space="preserve"> is real but </w:t>
-      </w:r>
-      <w:r>
-        <w:rPr>
-          <w:b/>
-          <w:bCs/>
-        </w:rPr>
-        <w:t>long-lead</w:t>
-      </w:r>
-      <w:r>
-        <w:t xml:space="preserve">: site confirmed Nov 2025, planning completes ~2026, funding follows, </w:t>
-      </w:r>
-      <w:r>
-        <w:rPr>
-          <w:b/>
-          <w:bCs/>
-        </w:rPr>
-        <w:t>design procurement ~2028+</w:t>
-      </w:r>
-      <w:r>
-        <w:t xml:space="preserve">, construction mid-2030s. </w:t>
-      </w:r>
-      <w:r>
-        <w:rPr>
-          <w:b/>
-          <w:bCs/>
-        </w:rPr>
-        <w:t>Stantec is already named</w:t>
-      </w:r>
-      <w:r>
-        <w:t xml:space="preserve"> on planning. Do </w:t>
-      </w:r>
-      <w:r>
-        <w:rPr>
-          <w:b/>
-          <w:bCs/>
-        </w:rPr>
-        <w:t>not</w:t>
-      </w:r>
-      <w:r>
-        <w:t xml:space="preserve"> present this as an imminent, open RFP.</w:t>
-      </w:r>
-    </w:p>
-    <w:p>
-      <w:pPr>
-        <w:pStyle w:val="Compact"/>
-        <w:numPr>
-          <w:ilvl w:val="0"/>
-          <w:numId w:val="6"/>
-        </w:numPr>
-      </w:pPr>
-      <w:r>
-        <w:rPr>
-          <w:b/>
-          <w:bCs/>
-        </w:rPr>
-        <w:t>KOR play:</w:t>
-      </w:r>
-      <w:r>
-        <w:t xml:space="preserve"> relationship-seeding — “when hospital-scale healthcare comes around, the Kaye model is the fit; who are you positioning with?” — not “we want the Stollery SE seat.”</w:t>
-      </w:r>
-    </w:p>
-    <w:p>
-      <w:pPr>
-        <w:pStyle w:val="FirstParagraph"/>
-      </w:pPr>
-      <w:r>
-        <w:rPr>
-          <w:i/>
-          <w:iCs/>
-        </w:rPr>
-        <w:t xml:space="preserve">Context (not an opportunity): Red Deer Regional Hospital ($1.8B) is a DIALOG healthcare project but is already </w:t>
-      </w:r>
-      <w:r>
-        <w:rPr>
-          <w:b/>
-          <w:bCs/>
-          <w:i/>
-          <w:iCs/>
-        </w:rPr>
-        <w:t>under construction</w:t>
-      </w:r>
-      <w:r>
-        <w:rPr>
-          <w:i/>
-          <w:iCs/>
-        </w:rPr>
-        <w:t xml:space="preserve"> </w:t>
-      </w:r>
-      <w:r>
-        <w:rPr>
-          <w:i/>
-          <w:iCs/>
-        </w:rPr>
-        <w:t>(Clark Builders awarded Aug 2024). Use it as proof of DIALOG’s healthcare depth, not an open seat.</w:t>
-      </w:r>
-    </w:p>
-    <w:p>
-      <w:r>
-        <w:pict w14:anchorId="617B4407">
-          <v:rect id="_x0000_i1028" style="width:0;height:1.5pt" o:hralign="center" o:hrstd="t" o:hr="t"/>
-        </w:pict>
-      </w:r>
-    </w:p>
-    <w:p>
-      <w:pPr>
-        <w:pStyle w:val="Heading2"/>
-        <w:pageBreakBefore/>
-      </w:pPr>
-      <w:bookmarkStart w:id="11" w:name="dialog-edmonton-structural-team-verified"/>
-      <w:bookmarkStart w:id="12" w:name="_Toc233747667"/>
-      <w:bookmarkEnd w:id="6"/>
-      <w:bookmarkEnd w:id="10"/>
-      <w:r>
-        <w:t>DIALOG Edmonton structural team (verified)</w:t>
-      </w:r>
-      <w:bookmarkEnd w:id="12"/>
-    </w:p>
-    <w:tbl>
-      <w:tblPr>
-        <w:tblStyle w:val="GridTable4"/>
-        <w:tblW w:w="5000" w:type="pct"/>
-        <w:tblCellMar>
-          <w:top w:w="40" w:type="dxa"/>
-          <w:left w:w="100" w:type="dxa"/>
-          <w:bottom w:w="40" w:type="dxa"/>
-          <w:right w:w="100" w:type="dxa"/>
-        </w:tblCellMar>
-        <w:tblLook w:val="0420" w:firstRow="1" w:lastRow="0" w:firstColumn="0" w:lastColumn="0" w:noHBand="0" w:noVBand="1"/>
-      </w:tblPr>
-      <w:tblGrid>
-        <w:gridCol w:w="2390"/>
-        <w:gridCol w:w="2390"/>
-        <w:gridCol w:w="2390"/>
-        <w:gridCol w:w="2390"/>
-      </w:tblGrid>
-      <w:tr>
-        <w:trPr>
-          <w:cnfStyle w:val="100000000000" w:firstRow="1" w:lastRow="0" w:firstColumn="0" w:lastColumn="0" w:oddVBand="0" w:evenVBand="0" w:oddHBand="0" w:evenHBand="0" w:firstRowFirstColumn="0" w:firstRowLastColumn="0" w:lastRowFirstColumn="0" w:lastRowLastColumn="0"/>
-          <w:cantSplit/>
-          <w:tblHeader/>
-        </w:trPr>
-        <w:tc>
-          <w:tcPr>
-            <w:tcW w:w="1250" w:type="pct"/>
-          </w:tcPr>
-          <w:p>
-            <w:pPr>
-              <w:pStyle w:val="Compact"/>
-              <w:rPr>
-                <w:b w:val="0"/>
-                <w:sz w:val="19"/>
-              </w:rPr>
-            </w:pPr>
-            <w:r>
-              <w:rPr>
-                <w:b w:val="0"/>
-                <w:sz w:val="19"/>
-              </w:rPr>
-              <w:t>Name</w:t>
-            </w:r>
-          </w:p>
-        </w:tc>
-        <w:tc>
-          <w:tcPr>
-            <w:tcW w:w="1250" w:type="pct"/>
-          </w:tcPr>
-          <w:p>
-            <w:pPr>
-              <w:pStyle w:val="Compact"/>
-              <w:rPr>
-                <w:b w:val="0"/>
-                <w:sz w:val="19"/>
-              </w:rPr>
-            </w:pPr>
-            <w:r>
-              <w:rPr>
-                <w:b w:val="0"/>
-                <w:sz w:val="19"/>
-              </w:rPr>
-              <w:t>Title</w:t>
-            </w:r>
-          </w:p>
-        </w:tc>
-        <w:tc>
-          <w:tcPr>
-            <w:tcW w:w="1250" w:type="pct"/>
-          </w:tcPr>
-          <w:p>
-            <w:pPr>
-              <w:pStyle w:val="Compact"/>
-              <w:rPr>
-                <w:b w:val="0"/>
-                <w:sz w:val="19"/>
-              </w:rPr>
-            </w:pPr>
-            <w:r>
-              <w:rPr>
-                <w:b w:val="0"/>
-                <w:sz w:val="19"/>
-              </w:rPr>
-              <w:t>Studio</w:t>
-            </w:r>
-          </w:p>
-        </w:tc>
-        <w:tc>
-          <w:tcPr>
-            <w:tcW w:w="1250" w:type="pct"/>
-          </w:tcPr>
-          <w:p>
-            <w:pPr>
-              <w:pStyle w:val="Compact"/>
-              <w:rPr>
-                <w:b w:val="0"/>
-                <w:sz w:val="19"/>
-              </w:rPr>
-            </w:pPr>
-            <w:r>
-              <w:rPr>
-                <w:b w:val="0"/>
-                <w:sz w:val="19"/>
-              </w:rPr>
-              <w:t>Notes</w:t>
+              <w:t>No AB hospital record — don’t overstate</w:t>
             </w:r>
           </w:p>
         </w:tc>
@@ -1939,7 +1675,7 @@
         </w:trPr>
         <w:tc>
           <w:tcPr>
-            <w:tcW w:w="1250" w:type="pct"/>
+            <w:tcW w:w="1667" w:type="pct"/>
           </w:tcPr>
           <w:p>
             <w:pPr>
@@ -1954,13 +1690,13 @@
                 <w:bCs/>
                 <w:sz w:val="19"/>
               </w:rPr>
-              <w:t>Georg Josi</w:t>
+              <w:t>Jacobs (ex-Yolles)</w:t>
             </w:r>
           </w:p>
         </w:tc>
         <w:tc>
           <w:tcPr>
-            <w:tcW w:w="1250" w:type="pct"/>
+            <w:tcW w:w="1667" w:type="pct"/>
           </w:tcPr>
           <w:p>
             <w:pPr>
@@ -1973,27 +1709,13 @@
               <w:rPr>
                 <w:sz w:val="19"/>
               </w:rPr>
-              <w:t xml:space="preserve">Partner, Structural Engineer, </w:t>
-            </w:r>
-            <w:r>
-              <w:rPr>
-                <w:b/>
-                <w:bCs/>
-                <w:sz w:val="19"/>
-              </w:rPr>
-              <w:t>Edmonton Studio Chair</w:t>
-            </w:r>
-            <w:r>
-              <w:rPr>
-                <w:sz w:val="19"/>
-              </w:rPr>
-              <w:t xml:space="preserve"> (PhD, PEng)</w:t>
+              <w:t>The Kaye co-SE precedent</w:t>
             </w:r>
           </w:p>
         </w:tc>
         <w:tc>
           <w:tcPr>
-            <w:tcW w:w="1250" w:type="pct"/>
+            <w:tcW w:w="1667" w:type="pct"/>
           </w:tcPr>
           <w:p>
             <w:pPr>
@@ -2006,632 +1728,7 @@
               <w:rPr>
                 <w:sz w:val="19"/>
               </w:rPr>
-              <w:t>Edmonton</w:t>
-            </w:r>
-          </w:p>
-        </w:tc>
-        <w:tc>
-          <w:tcPr>
-            <w:tcW w:w="1250" w:type="pct"/>
-          </w:tcPr>
-          <w:p>
-            <w:pPr>
-              <w:pStyle w:val="Compact"/>
-              <w:rPr>
-                <w:sz w:val="19"/>
-              </w:rPr>
-            </w:pPr>
-            <w:r>
-              <w:rPr>
-                <w:b/>
-                <w:bCs/>
-                <w:sz w:val="19"/>
-              </w:rPr>
-              <w:t>The decision-maker.</w:t>
-            </w:r>
-            <w:r>
-              <w:rPr>
-                <w:sz w:val="19"/>
-              </w:rPr>
-              <w:t xml:space="preserve"> Healthcare/transit/bridge background.</w:t>
-            </w:r>
-          </w:p>
-        </w:tc>
-      </w:tr>
-      <w:tr>
-        <w:trPr>
-          <w:cantSplit/>
-        </w:trPr>
-        <w:tc>
-          <w:tcPr>
-            <w:tcW w:w="1250" w:type="pct"/>
-          </w:tcPr>
-          <w:p>
-            <w:pPr>
-              <w:pStyle w:val="Compact"/>
-              <w:rPr>
-                <w:sz w:val="19"/>
-              </w:rPr>
-            </w:pPr>
-            <w:r>
-              <w:rPr>
-                <w:sz w:val="19"/>
-              </w:rPr>
-              <w:t>Jeff DiBattista</w:t>
-            </w:r>
-          </w:p>
-        </w:tc>
-        <w:tc>
-          <w:tcPr>
-            <w:tcW w:w="1250" w:type="pct"/>
-          </w:tcPr>
-          <w:p>
-            <w:pPr>
-              <w:pStyle w:val="Compact"/>
-              <w:rPr>
-                <w:sz w:val="19"/>
-              </w:rPr>
-            </w:pPr>
-            <w:r>
-              <w:rPr>
-                <w:b/>
-                <w:bCs/>
-                <w:sz w:val="19"/>
-              </w:rPr>
-              <w:t>Partner Emeritus</w:t>
-            </w:r>
-            <w:r>
-              <w:rPr>
-                <w:sz w:val="19"/>
-              </w:rPr>
-              <w:t>, Engineer</w:t>
-            </w:r>
-          </w:p>
-        </w:tc>
-        <w:tc>
-          <w:tcPr>
-            <w:tcW w:w="1250" w:type="pct"/>
-          </w:tcPr>
-          <w:p>
-            <w:pPr>
-              <w:pStyle w:val="Compact"/>
-              <w:rPr>
-                <w:sz w:val="19"/>
-              </w:rPr>
-            </w:pPr>
-            <w:r>
-              <w:rPr>
-                <w:sz w:val="19"/>
-              </w:rPr>
-              <w:t>Edmonton</w:t>
-            </w:r>
-          </w:p>
-        </w:tc>
-        <w:tc>
-          <w:tcPr>
-            <w:tcW w:w="1250" w:type="pct"/>
-          </w:tcPr>
-          <w:p>
-            <w:pPr>
-              <w:pStyle w:val="Compact"/>
-              <w:rPr>
-                <w:sz w:val="19"/>
-              </w:rPr>
-            </w:pPr>
-            <w:r>
-              <w:rPr>
-                <w:sz w:val="19"/>
-              </w:rPr>
-              <w:t xml:space="preserve">Still actively engaged — </w:t>
-            </w:r>
-            <w:r>
-              <w:rPr>
-                <w:b/>
-                <w:bCs/>
-                <w:sz w:val="19"/>
-              </w:rPr>
-              <w:t>not “retired.”</w:t>
-            </w:r>
-          </w:p>
-        </w:tc>
-      </w:tr>
-      <w:tr>
-        <w:trPr>
-          <w:cnfStyle w:val="000000100000" w:firstRow="0" w:lastRow="0" w:firstColumn="0" w:lastColumn="0" w:oddVBand="0" w:evenVBand="0" w:oddHBand="1" w:evenHBand="0" w:firstRowFirstColumn="0" w:firstRowLastColumn="0" w:lastRowFirstColumn="0" w:lastRowLastColumn="0"/>
-          <w:cantSplit/>
-        </w:trPr>
-        <w:tc>
-          <w:tcPr>
-            <w:tcW w:w="1250" w:type="pct"/>
-          </w:tcPr>
-          <w:p>
-            <w:pPr>
-              <w:pStyle w:val="Compact"/>
-              <w:rPr>
-                <w:sz w:val="19"/>
-              </w:rPr>
-            </w:pPr>
-            <w:r>
-              <w:rPr>
-                <w:sz w:val="19"/>
-              </w:rPr>
-              <w:t>Sandra Renihan</w:t>
-            </w:r>
-          </w:p>
-        </w:tc>
-        <w:tc>
-          <w:tcPr>
-            <w:tcW w:w="1250" w:type="pct"/>
-          </w:tcPr>
-          <w:p>
-            <w:pPr>
-              <w:pStyle w:val="Compact"/>
-              <w:rPr>
-                <w:sz w:val="19"/>
-              </w:rPr>
-            </w:pPr>
-            <w:r>
-              <w:rPr>
-                <w:sz w:val="19"/>
-              </w:rPr>
-              <w:t>Partner, Structural Engineer</w:t>
-            </w:r>
-          </w:p>
-        </w:tc>
-        <w:tc>
-          <w:tcPr>
-            <w:tcW w:w="1250" w:type="pct"/>
-          </w:tcPr>
-          <w:p>
-            <w:pPr>
-              <w:pStyle w:val="Compact"/>
-              <w:rPr>
-                <w:sz w:val="19"/>
-              </w:rPr>
-            </w:pPr>
-            <w:r>
-              <w:rPr>
-                <w:b/>
-                <w:bCs/>
-                <w:sz w:val="19"/>
-              </w:rPr>
-              <w:t>Edmonton</w:t>
-            </w:r>
-            <w:r>
-              <w:rPr>
-                <w:sz w:val="19"/>
-              </w:rPr>
-              <w:t xml:space="preserve"> </w:t>
-            </w:r>
-            <w:r>
-              <w:rPr>
-                <w:i/>
-                <w:iCs/>
-                <w:sz w:val="19"/>
-              </w:rPr>
-              <w:t>(corrected — not Calgary)</w:t>
-            </w:r>
-          </w:p>
-        </w:tc>
-        <w:tc>
-          <w:tcPr>
-            <w:tcW w:w="1250" w:type="pct"/>
-          </w:tcPr>
-          <w:p>
-            <w:pPr>
-              <w:pStyle w:val="Compact"/>
-              <w:rPr>
-                <w:sz w:val="19"/>
-              </w:rPr>
-            </w:pPr>
-            <w:r>
-              <w:rPr>
-                <w:sz w:val="19"/>
-              </w:rPr>
-              <w:t>Now transit-focused (Valley Line West PM).</w:t>
-            </w:r>
-          </w:p>
-        </w:tc>
-      </w:tr>
-      <w:tr>
-        <w:trPr>
-          <w:cantSplit/>
-        </w:trPr>
-        <w:tc>
-          <w:tcPr>
-            <w:tcW w:w="1250" w:type="pct"/>
-          </w:tcPr>
-          <w:p>
-            <w:pPr>
-              <w:pStyle w:val="Compact"/>
-              <w:rPr>
-                <w:sz w:val="19"/>
-              </w:rPr>
-            </w:pPr>
-            <w:r>
-              <w:rPr>
-                <w:sz w:val="19"/>
-              </w:rPr>
-              <w:t>Ryan Renihan</w:t>
-            </w:r>
-          </w:p>
-        </w:tc>
-        <w:tc>
-          <w:tcPr>
-            <w:tcW w:w="1250" w:type="pct"/>
-          </w:tcPr>
-          <w:p>
-            <w:pPr>
-              <w:pStyle w:val="Compact"/>
-              <w:rPr>
-                <w:sz w:val="19"/>
-              </w:rPr>
-            </w:pPr>
-            <w:r>
-              <w:rPr>
-                <w:sz w:val="19"/>
-              </w:rPr>
-              <w:t>Associate, Structural Engineer</w:t>
-            </w:r>
-          </w:p>
-        </w:tc>
-        <w:tc>
-          <w:tcPr>
-            <w:tcW w:w="1250" w:type="pct"/>
-          </w:tcPr>
-          <w:p>
-            <w:pPr>
-              <w:pStyle w:val="Compact"/>
-              <w:rPr>
-                <w:sz w:val="19"/>
-              </w:rPr>
-            </w:pPr>
-            <w:r>
-              <w:rPr>
-                <w:sz w:val="19"/>
-              </w:rPr>
-              <w:t>Edmonton</w:t>
-            </w:r>
-          </w:p>
-        </w:tc>
-        <w:tc>
-          <w:tcPr>
-            <w:tcW w:w="1250" w:type="pct"/>
-          </w:tcPr>
-          <w:p>
-            <w:pPr>
-              <w:pStyle w:val="Compact"/>
-              <w:rPr>
-                <w:sz w:val="19"/>
-              </w:rPr>
-            </w:pPr>
-          </w:p>
-        </w:tc>
-      </w:tr>
-      <w:tr>
-        <w:trPr>
-          <w:cnfStyle w:val="000000100000" w:firstRow="0" w:lastRow="0" w:firstColumn="0" w:lastColumn="0" w:oddVBand="0" w:evenVBand="0" w:oddHBand="1" w:evenHBand="0" w:firstRowFirstColumn="0" w:firstRowLastColumn="0" w:lastRowFirstColumn="0" w:lastRowLastColumn="0"/>
-          <w:cantSplit/>
-        </w:trPr>
-        <w:tc>
-          <w:tcPr>
-            <w:tcW w:w="1250" w:type="pct"/>
-          </w:tcPr>
-          <w:p>
-            <w:pPr>
-              <w:pStyle w:val="Compact"/>
-              <w:rPr>
-                <w:sz w:val="19"/>
-              </w:rPr>
-            </w:pPr>
-            <w:r>
-              <w:rPr>
-                <w:sz w:val="19"/>
-              </w:rPr>
-              <w:t>Larissa Ulcar</w:t>
-            </w:r>
-          </w:p>
-        </w:tc>
-        <w:tc>
-          <w:tcPr>
-            <w:tcW w:w="1250" w:type="pct"/>
-          </w:tcPr>
-          <w:p>
-            <w:pPr>
-              <w:pStyle w:val="Compact"/>
-              <w:rPr>
-                <w:sz w:val="19"/>
-              </w:rPr>
-            </w:pPr>
-            <w:r>
-              <w:rPr>
-                <w:sz w:val="19"/>
-              </w:rPr>
-              <w:t>Associate, Structural Engineer</w:t>
-            </w:r>
-          </w:p>
-        </w:tc>
-        <w:tc>
-          <w:tcPr>
-            <w:tcW w:w="1250" w:type="pct"/>
-          </w:tcPr>
-          <w:p>
-            <w:pPr>
-              <w:pStyle w:val="Compact"/>
-              <w:rPr>
-                <w:sz w:val="19"/>
-              </w:rPr>
-            </w:pPr>
-            <w:r>
-              <w:rPr>
-                <w:sz w:val="19"/>
-              </w:rPr>
-              <w:t>Edmonton</w:t>
-            </w:r>
-          </w:p>
-        </w:tc>
-        <w:tc>
-          <w:tcPr>
-            <w:tcW w:w="1250" w:type="pct"/>
-          </w:tcPr>
-          <w:p>
-            <w:pPr>
-              <w:pStyle w:val="Compact"/>
-              <w:rPr>
-                <w:sz w:val="19"/>
-              </w:rPr>
-            </w:pPr>
-            <w:r>
-              <w:rPr>
-                <w:sz w:val="19"/>
-              </w:rPr>
-              <w:t>Valley Line design manager.</w:t>
-            </w:r>
-          </w:p>
-        </w:tc>
-      </w:tr>
-      <w:tr>
-        <w:trPr>
-          <w:cantSplit/>
-        </w:trPr>
-        <w:tc>
-          <w:tcPr>
-            <w:tcW w:w="1250" w:type="pct"/>
-          </w:tcPr>
-          <w:p>
-            <w:pPr>
-              <w:pStyle w:val="Compact"/>
-              <w:rPr>
-                <w:sz w:val="19"/>
-              </w:rPr>
-            </w:pPr>
-            <w:r>
-              <w:rPr>
-                <w:sz w:val="19"/>
-              </w:rPr>
-              <w:t>Steven Prozniak</w:t>
-            </w:r>
-          </w:p>
-        </w:tc>
-        <w:tc>
-          <w:tcPr>
-            <w:tcW w:w="1250" w:type="pct"/>
-          </w:tcPr>
-          <w:p>
-            <w:pPr>
-              <w:pStyle w:val="Compact"/>
-              <w:rPr>
-                <w:sz w:val="19"/>
-              </w:rPr>
-            </w:pPr>
-            <w:r>
-              <w:rPr>
-                <w:sz w:val="19"/>
-              </w:rPr>
-              <w:t>Associate, Structural Engineer</w:t>
-            </w:r>
-          </w:p>
-        </w:tc>
-        <w:tc>
-          <w:tcPr>
-            <w:tcW w:w="1250" w:type="pct"/>
-          </w:tcPr>
-          <w:p>
-            <w:pPr>
-              <w:pStyle w:val="Compact"/>
-              <w:rPr>
-                <w:sz w:val="19"/>
-              </w:rPr>
-            </w:pPr>
-            <w:r>
-              <w:rPr>
-                <w:sz w:val="19"/>
-              </w:rPr>
-              <w:t>Edmonton</w:t>
-            </w:r>
-          </w:p>
-        </w:tc>
-        <w:tc>
-          <w:tcPr>
-            <w:tcW w:w="1250" w:type="pct"/>
-          </w:tcPr>
-          <w:p>
-            <w:pPr>
-              <w:pStyle w:val="Compact"/>
-              <w:rPr>
-                <w:sz w:val="19"/>
-              </w:rPr>
-            </w:pPr>
-            <w:r>
-              <w:rPr>
-                <w:sz w:val="19"/>
-              </w:rPr>
-              <w:t>Bridge lead (Walterdale).</w:t>
-            </w:r>
-          </w:p>
-        </w:tc>
-      </w:tr>
-      <w:tr>
-        <w:trPr>
-          <w:cnfStyle w:val="000000100000" w:firstRow="0" w:lastRow="0" w:firstColumn="0" w:lastColumn="0" w:oddVBand="0" w:evenVBand="0" w:oddHBand="1" w:evenHBand="0" w:firstRowFirstColumn="0" w:firstRowLastColumn="0" w:lastRowFirstColumn="0" w:lastRowLastColumn="0"/>
-          <w:cantSplit/>
-        </w:trPr>
-        <w:tc>
-          <w:tcPr>
-            <w:tcW w:w="1250" w:type="pct"/>
-          </w:tcPr>
-          <w:p>
-            <w:pPr>
-              <w:pStyle w:val="Compact"/>
-              <w:rPr>
-                <w:sz w:val="19"/>
-              </w:rPr>
-            </w:pPr>
-            <w:r>
-              <w:rPr>
-                <w:sz w:val="19"/>
-              </w:rPr>
-              <w:t>Victoria Buffam</w:t>
-            </w:r>
-          </w:p>
-        </w:tc>
-        <w:tc>
-          <w:tcPr>
-            <w:tcW w:w="1250" w:type="pct"/>
-          </w:tcPr>
-          <w:p>
-            <w:pPr>
-              <w:pStyle w:val="Compact"/>
-              <w:rPr>
-                <w:sz w:val="19"/>
-              </w:rPr>
-            </w:pPr>
-            <w:r>
-              <w:rPr>
-                <w:sz w:val="19"/>
-              </w:rPr>
-              <w:t>Associate, Structural Engineer</w:t>
-            </w:r>
-          </w:p>
-        </w:tc>
-        <w:tc>
-          <w:tcPr>
-            <w:tcW w:w="1250" w:type="pct"/>
-          </w:tcPr>
-          <w:p>
-            <w:pPr>
-              <w:pStyle w:val="Compact"/>
-              <w:rPr>
-                <w:sz w:val="19"/>
-              </w:rPr>
-            </w:pPr>
-            <w:r>
-              <w:rPr>
-                <w:sz w:val="19"/>
-              </w:rPr>
-              <w:t>Edmonton</w:t>
-            </w:r>
-          </w:p>
-        </w:tc>
-        <w:tc>
-          <w:tcPr>
-            <w:tcW w:w="1250" w:type="pct"/>
-          </w:tcPr>
-          <w:p>
-            <w:pPr>
-              <w:pStyle w:val="Compact"/>
-              <w:rPr>
-                <w:sz w:val="19"/>
-              </w:rPr>
-            </w:pPr>
-            <w:r>
-              <w:rPr>
-                <w:i/>
-                <w:iCs/>
-                <w:sz w:val="19"/>
-              </w:rPr>
-              <w:t>(placeholder resolved)</w:t>
-            </w:r>
-          </w:p>
-        </w:tc>
-      </w:tr>
-      <w:tr>
-        <w:trPr>
-          <w:cantSplit/>
-        </w:trPr>
-        <w:tc>
-          <w:tcPr>
-            <w:tcW w:w="1250" w:type="pct"/>
-          </w:tcPr>
-          <w:p>
-            <w:pPr>
-              <w:pStyle w:val="Compact"/>
-              <w:rPr>
-                <w:sz w:val="19"/>
-              </w:rPr>
-            </w:pPr>
-            <w:r>
-              <w:rPr>
-                <w:sz w:val="19"/>
-              </w:rPr>
-              <w:t>Andrew Neilson</w:t>
-            </w:r>
-          </w:p>
-        </w:tc>
-        <w:tc>
-          <w:tcPr>
-            <w:tcW w:w="1250" w:type="pct"/>
-          </w:tcPr>
-          <w:p>
-            <w:pPr>
-              <w:pStyle w:val="Compact"/>
-              <w:rPr>
-                <w:sz w:val="19"/>
-              </w:rPr>
-            </w:pPr>
-            <w:r>
-              <w:rPr>
-                <w:sz w:val="19"/>
-              </w:rPr>
-              <w:t>Partner, Structural Engineer (transport structures)</w:t>
-            </w:r>
-          </w:p>
-        </w:tc>
-        <w:tc>
-          <w:tcPr>
-            <w:tcW w:w="1250" w:type="pct"/>
-          </w:tcPr>
-          <w:p>
-            <w:pPr>
-              <w:pStyle w:val="Compact"/>
-              <w:rPr>
-                <w:sz w:val="19"/>
-              </w:rPr>
-            </w:pPr>
-            <w:r>
-              <w:rPr>
-                <w:sz w:val="19"/>
-              </w:rPr>
-              <w:t>Calgary</w:t>
-            </w:r>
-          </w:p>
-        </w:tc>
-        <w:tc>
-          <w:tcPr>
-            <w:tcW w:w="1250" w:type="pct"/>
-          </w:tcPr>
-          <w:p>
-            <w:pPr>
-              <w:pStyle w:val="Compact"/>
-              <w:rPr>
-                <w:sz w:val="19"/>
-              </w:rPr>
-            </w:pPr>
-            <w:r>
-              <w:rPr>
-                <w:sz w:val="19"/>
-              </w:rPr>
-              <w:t>Covers Edmonton transit work.</w:t>
+              <w:t>Context</w:t>
             </w:r>
           </w:p>
         </w:tc>
@@ -2639,41 +1736,231 @@
     </w:tbl>
     <w:p>
       <w:pPr>
-        <w:pStyle w:val="BodyText"/>
-      </w:pPr>
-      <w:r>
-        <w:t xml:space="preserve">Headcount: DIALOG doesn’t publish it — </w:t>
-      </w:r>
-      <w:r>
-        <w:rPr>
-          <w:b/>
-          <w:bCs/>
-        </w:rPr>
-        <w:t>4 associates confirmed</w:t>
-      </w:r>
-      <w:r>
-        <w:t xml:space="preserve"> in Edmonton structural. Characterise as “a mid-sized in-house group,” not a specific number.</w:t>
-      </w:r>
-    </w:p>
-    <w:p>
-      <w:r>
-        <w:pict w14:anchorId="50EDB6B5">
-          <v:rect id="_x0000_i1029" style="width:0;height:1.5pt" o:hralign="center" o:hrstd="t" o:hr="t"/>
-        </w:pict>
-      </w:r>
-    </w:p>
-    <w:p>
-      <w:pPr>
         <w:pStyle w:val="Heading2"/>
         <w:pageBreakBefore/>
       </w:pPr>
-      <w:bookmarkStart w:id="13" w:name="X0aaf61ce9ccf51b9fe0162139a445f4ad19baa9"/>
-      <w:bookmarkStart w:id="14" w:name="_Toc233747668"/>
-      <w:bookmarkEnd w:id="11"/>
-      <w:r>
-        <w:t>Do NOT say in the meeting (fact-check landmines)</w:t>
-      </w:r>
+      <w:bookmarkStart w:id="12" w:name="Xd40ded752b374a398f2a0a175309d20f08e809e"/>
+      <w:bookmarkStart w:id="13" w:name="_Toc233750672"/>
+      <w:bookmarkEnd w:id="10"/>
+      <w:r>
+        <w:t>DIALOG Edmonton structural bench (verified — this is why they self-perform)</w:t>
+      </w:r>
+      <w:bookmarkEnd w:id="13"/>
+    </w:p>
+    <w:p>
+      <w:pPr>
+        <w:pStyle w:val="FirstParagraph"/>
+      </w:pPr>
+      <w:r>
+        <w:t xml:space="preserve">Georg Josi (Partner, Studio Chair) · </w:t>
+      </w:r>
+      <w:r>
+        <w:rPr>
+          <w:b/>
+          <w:bCs/>
+        </w:rPr>
+        <w:t>Steven Oosterhof</w:t>
+      </w:r>
+      <w:r>
+        <w:t xml:space="preserve"> (Partner, PhD/PEng/PE/SE — venue/ICE District) · </w:t>
+      </w:r>
+      <w:r>
+        <w:rPr>
+          <w:b/>
+          <w:bCs/>
+        </w:rPr>
+        <w:t>Neil Robson</w:t>
+      </w:r>
+      <w:r>
+        <w:t xml:space="preserve"> </w:t>
+      </w:r>
+      <w:r>
+        <w:t xml:space="preserve">(Partner — transport/institutional) · Sandra Renihan (Partner, Edmonton, transit-focus) · Steven Prozniak (Assoc, bridges) · Ryan Renihan, Larissa Ulcar, Victoria Buffam (Assoc) · Jeff DiBattista (Partner Emeritus, engaged). </w:t>
+      </w:r>
+      <w:r>
+        <w:rPr>
+          <w:i/>
+          <w:iCs/>
+        </w:rPr>
+        <w:t>(Calgary healthcare structural: Ralph Hildenbrandt, Chris Lenzin.)</w:t>
+      </w:r>
+    </w:p>
+    <w:p>
+      <w:r>
+        <w:pict w14:anchorId="3453A12F">
+          <v:rect id="_x0000_i1030" style="width:0;height:1.5pt" o:hralign="center" o:hrstd="t" o:hr="t"/>
+        </w:pict>
+      </w:r>
+    </w:p>
+    <w:p>
+      <w:pPr>
+        <w:pStyle w:val="Heading2"/>
+        <w:pageBreakBefore/>
+      </w:pPr>
+      <w:bookmarkStart w:id="14" w:name="do-not-say-fact-check-landmines"/>
+      <w:bookmarkStart w:id="15" w:name="_Toc233750673"/>
+      <w:bookmarkEnd w:id="12"/>
+      <w:r>
+        <w:t>Do NOT say (fact-check landmines)</w:t>
+      </w:r>
+      <w:bookmarkEnd w:id="15"/>
+    </w:p>
+    <w:p>
+      <w:pPr>
+        <w:pStyle w:val="Compact"/>
+        <w:numPr>
+          <w:ilvl w:val="0"/>
+          <w:numId w:val="6"/>
+        </w:numPr>
+      </w:pPr>
+      <w:r>
+        <w:rPr>
+          <w:b/>
+          <w:bCs/>
+        </w:rPr>
+        <w:t>Do NOT</w:t>
+      </w:r>
+      <w:r>
+        <w:t xml:space="preserve"> say “DIALOG outsources hospital structural” — </w:t>
+      </w:r>
+      <w:r>
+        <w:rPr>
+          <w:b/>
+          <w:bCs/>
+        </w:rPr>
+        <w:t>refuted;</w:t>
+      </w:r>
+      <w:r>
+        <w:t xml:space="preserve"> they self-perform (Hildenbrandt/Renihan/Lenzin lead it). This would be embarrassing in front of their engineers.</w:t>
+      </w:r>
+    </w:p>
+    <w:p>
+      <w:pPr>
+        <w:pStyle w:val="Compact"/>
+        <w:numPr>
+          <w:ilvl w:val="0"/>
+          <w:numId w:val="6"/>
+        </w:numPr>
+      </w:pPr>
+      <w:r>
+        <w:rPr>
+          <w:b/>
+          <w:bCs/>
+        </w:rPr>
+        <w:t>Do NOT</w:t>
+      </w:r>
+      <w:r>
+        <w:t xml:space="preserve"> </w:t>
+      </w:r>
+      <w:r>
+        <w:t>present Event Park or NAIT as open SE seats — likely self-performed / TT.</w:t>
+      </w:r>
+    </w:p>
+    <w:p>
+      <w:pPr>
+        <w:pStyle w:val="Compact"/>
+        <w:numPr>
+          <w:ilvl w:val="0"/>
+          <w:numId w:val="6"/>
+        </w:numPr>
+      </w:pPr>
+      <w:r>
+        <w:rPr>
+          <w:b/>
+          <w:bCs/>
+        </w:rPr>
+        <w:t>Do NOT</w:t>
+      </w:r>
+      <w:r>
+        <w:t xml:space="preserve"> say Oosterhof was Rogers Place SE-of-record — </w:t>
+      </w:r>
+      <w:r>
+        <w:rPr>
+          <w:b/>
+          <w:bCs/>
+        </w:rPr>
+        <w:t>TT was prime;</w:t>
+      </w:r>
+      <w:r>
+        <w:t xml:space="preserve"> DIALOG was associate structural.</w:t>
+      </w:r>
+    </w:p>
+    <w:p>
+      <w:pPr>
+        <w:pStyle w:val="Compact"/>
+        <w:numPr>
+          <w:ilvl w:val="0"/>
+          <w:numId w:val="6"/>
+        </w:numPr>
+      </w:pPr>
+      <w:r>
+        <w:rPr>
+          <w:b/>
+          <w:bCs/>
+        </w:rPr>
+        <w:t>Do NOT</w:t>
+      </w:r>
+      <w:r>
+        <w:t xml:space="preserve"> assert “Chris Minerva (TT) holds an Alberta PEng” — unverified (aggregator only); check APEGA directory first if it matters.</w:t>
+      </w:r>
+    </w:p>
+    <w:p>
+      <w:pPr>
+        <w:pStyle w:val="Compact"/>
+        <w:numPr>
+          <w:ilvl w:val="0"/>
+          <w:numId w:val="6"/>
+        </w:numPr>
+      </w:pPr>
+      <w:r>
+        <w:rPr>
+          <w:b/>
+          <w:bCs/>
+        </w:rPr>
+        <w:t>Do NOT</w:t>
+      </w:r>
+      <w:r>
+        <w:t xml:space="preserve"> call the seismic requirement Alberta-unique, or date it “2023” — it’s national NBC 2020, effective in AB </w:t>
+      </w:r>
+      <w:r>
+        <w:rPr>
+          <w:b/>
+          <w:bCs/>
+        </w:rPr>
+        <w:t>May 1 2024.</w:t>
+      </w:r>
+    </w:p>
+    <w:p>
+      <w:pPr>
+        <w:pStyle w:val="Compact"/>
+        <w:numPr>
+          <w:ilvl w:val="0"/>
+          <w:numId w:val="6"/>
+        </w:numPr>
+      </w:pPr>
+      <w:r>
+        <w:rPr>
+          <w:b/>
+          <w:bCs/>
+        </w:rPr>
+        <w:t>Do NOT</w:t>
+      </w:r>
+      <w:r>
+        <w:t xml:space="preserve"> overstate Entuitive’s AB hospital experience — they have none public.</w:t>
+      </w:r>
+    </w:p>
+    <w:p>
+      <w:pPr>
+        <w:pStyle w:val="Heading2"/>
+        <w:pageBreakBefore/>
+      </w:pPr>
+      <w:bookmarkStart w:id="16" w:name="Xbdf629063cf397fd895ceeefa7c0f09d39fa798"/>
+      <w:bookmarkStart w:id="17" w:name="_Toc233750674"/>
       <w:bookmarkEnd w:id="14"/>
+      <w:r>
+        <w:t>Reframed questions for Georg Josi (relationship, not seat-hunting)</w:t>
+      </w:r>
+      <w:bookmarkEnd w:id="17"/>
     </w:p>
     <w:p>
       <w:pPr>
@@ -2684,24 +1971,7 @@
         </w:numPr>
       </w:pPr>
       <w:r>
-        <w:rPr>
-          <w:b/>
-          <w:bCs/>
-        </w:rPr>
-        <w:t>Do not</w:t>
-      </w:r>
-      <w:r>
-        <w:t xml:space="preserve"> say DIALOG “outsourced structural to COWI on Walterdale” — DIALOG </w:t>
-      </w:r>
-      <w:r>
-        <w:rPr>
-          <w:i/>
-          <w:iCs/>
-        </w:rPr>
-        <w:t>led</w:t>
-      </w:r>
-      <w:r>
-        <w:t xml:space="preserve"> structural; COWI was their sub. This reverses reality and DIALOG will correct you.</w:t>
+        <w:t>“When a hospital hits Kaye-scale, or your team’s stacked, do you still bring in a co-SE — and who do you reach for?”</w:t>
       </w:r>
     </w:p>
     <w:p>
@@ -2713,24 +1983,7 @@
         </w:numPr>
       </w:pPr>
       <w:r>
-        <w:rPr>
-          <w:b/>
-          <w:bCs/>
-        </w:rPr>
-        <w:t>Do not</w:t>
-      </w:r>
-      <w:r>
-        <w:t xml:space="preserve"> present </w:t>
-      </w:r>
-      <w:r>
-        <w:rPr>
-          <w:b/>
-          <w:bCs/>
-        </w:rPr>
-        <w:t>Stollery</w:t>
-      </w:r>
-      <w:r>
-        <w:t xml:space="preserve"> as an imminent/open RFP — it’s long-lead and Stantec is on the planning phase.</w:t>
+        <w:t>“On the acute-care towers coming (Misericordia/Grey Nuns), are you positioning for the architect role — and how do you structure structural on those?”</w:t>
       </w:r>
     </w:p>
     <w:p>
@@ -2742,27 +1995,7 @@
         </w:numPr>
       </w:pPr>
       <w:r>
-        <w:rPr>
-          <w:b/>
-          <w:bCs/>
-        </w:rPr>
-        <w:t>Do not</w:t>
-      </w:r>
-      <w:r>
-        <w:t xml:space="preserve"> frame </w:t>
-      </w:r>
-      <w:r>
-        <w:rPr>
-          <w:b/>
-          <w:bCs/>
-        </w:rPr>
-        <w:t>Red Deer Hospital</w:t>
-      </w:r>
-      <w:r>
-        <w:t xml:space="preserve"> </w:t>
-      </w:r>
-      <w:r>
-        <w:t>as an opportunity — it’s under construction.</w:t>
+        <w:t>“Where’s your structural bandwidth tightest over the next 24 months?”</w:t>
       </w:r>
     </w:p>
     <w:p>
@@ -2774,150 +2007,13 @@
         </w:numPr>
       </w:pPr>
       <w:r>
-        <w:rPr>
-          <w:b/>
-          <w:bCs/>
-        </w:rPr>
-        <w:t>Do not</w:t>
-      </w:r>
-      <w:r>
-        <w:t xml:space="preserve"> call DiBattista “retired,” or place Sandra Renihan in “Calgary.”</w:t>
-      </w:r>
-    </w:p>
-    <w:p>
-      <w:pPr>
-        <w:pStyle w:val="Compact"/>
-        <w:numPr>
-          <w:ilvl w:val="0"/>
-          <w:numId w:val="7"/>
-        </w:numPr>
-      </w:pPr>
-      <w:r>
-        <w:rPr>
-          <w:b/>
-          <w:bCs/>
-        </w:rPr>
-        <w:t>Do not</w:t>
-      </w:r>
-      <w:r>
-        <w:t xml:space="preserve"> try to displace </w:t>
-      </w:r>
-      <w:r>
-        <w:rPr>
-          <w:b/>
-          <w:bCs/>
-        </w:rPr>
-        <w:t>Fast+Epp</w:t>
-      </w:r>
-      <w:r>
-        <w:t xml:space="preserve"> on mass timber or </w:t>
-      </w:r>
-      <w:r>
-        <w:rPr>
-          <w:b/>
-          <w:bCs/>
-        </w:rPr>
-        <w:t>RJC</w:t>
-      </w:r>
-      <w:r>
-        <w:t xml:space="preserve"> on towers — differentiate into healthcare + complex institutional.</w:t>
-      </w:r>
-    </w:p>
-    <w:p>
-      <w:pPr>
-        <w:pStyle w:val="Heading2"/>
-        <w:pageBreakBefore/>
-      </w:pPr>
-      <w:bookmarkStart w:id="15" w:name="questions-to-ask-georg-josi-on-july-10"/>
-      <w:bookmarkStart w:id="16" w:name="_Toc233747669"/>
-      <w:bookmarkEnd w:id="13"/>
-      <w:r>
-        <w:t>Questions to ask Georg Josi on July 10</w:t>
-      </w:r>
-      <w:bookmarkEnd w:id="16"/>
-    </w:p>
-    <w:p>
-      <w:pPr>
-        <w:pStyle w:val="Compact"/>
-        <w:numPr>
-          <w:ilvl w:val="0"/>
-          <w:numId w:val="8"/>
-        </w:numPr>
-      </w:pPr>
-      <w:r>
-        <w:t xml:space="preserve">“How are you structuring the structural role on the </w:t>
-      </w:r>
-      <w:r>
-        <w:rPr>
-          <w:b/>
-          <w:bCs/>
-        </w:rPr>
-        <w:t>Event Park</w:t>
-      </w:r>
-      <w:r>
-        <w:t xml:space="preserve"> — is there a Canadian SE-sub seat?”</w:t>
-      </w:r>
-    </w:p>
-    <w:p>
-      <w:pPr>
-        <w:pStyle w:val="Compact"/>
-        <w:numPr>
-          <w:ilvl w:val="0"/>
-          <w:numId w:val="8"/>
-        </w:numPr>
-      </w:pPr>
-      <w:r>
-        <w:t xml:space="preserve">“On </w:t>
-      </w:r>
-      <w:r>
-        <w:rPr>
-          <w:b/>
-          <w:bCs/>
-        </w:rPr>
-        <w:t>NAIT Advanced Skills Centre</w:t>
-      </w:r>
-      <w:r>
-        <w:t>, is structural engineering already assigned, or still open?”</w:t>
-      </w:r>
-    </w:p>
-    <w:p>
-      <w:pPr>
-        <w:pStyle w:val="Compact"/>
-        <w:numPr>
-          <w:ilvl w:val="0"/>
-          <w:numId w:val="8"/>
-        </w:numPr>
-      </w:pPr>
-      <w:r>
-        <w:t xml:space="preserve">“When hospital-scale healthcare comes back (Stollery, future towers), do you still use the </w:t>
-      </w:r>
-      <w:r>
-        <w:rPr>
-          <w:b/>
-          <w:bCs/>
-        </w:rPr>
-        <w:t>Kaye co-SE model</w:t>
-      </w:r>
-      <w:r>
-        <w:t xml:space="preserve"> — and who are you positioning with?”</w:t>
-      </w:r>
-    </w:p>
-    <w:p>
-      <w:pPr>
-        <w:pStyle w:val="Compact"/>
-        <w:numPr>
-          <w:ilvl w:val="0"/>
-          <w:numId w:val="8"/>
-        </w:numPr>
-      </w:pPr>
-      <w:r>
-        <w:t>“With Event Park and NAIT both in design, where’s the structural-bandwidth pressure over the next 24 months?”</w:t>
-      </w:r>
-    </w:p>
-    <w:p>
-      <w:r>
-        <w:pict w14:anchorId="4A871964">
-          <v:rect id="_x0000_i1030" style="width:0;height:1.5pt" o:hralign="center" o:hrstd="t" o:hr="t"/>
+        <w:t>“What would make an external structural partner genuinely useful to your Edmonton studio — capacity, a specialty, a geography?”</w:t>
+      </w:r>
+    </w:p>
+    <w:p>
+      <w:r>
+        <w:pict w14:anchorId="075B69A2">
+          <v:rect id="_x0000_i1031" style="width:0;height:1.5pt" o:hralign="center" o:hrstd="t" o:hr="t"/>
         </w:pict>
       </w:r>
     </w:p>
@@ -2930,10 +2026,17 @@
           <w:i/>
           <w:iCs/>
         </w:rPr>
-        <w:t>Verification: three independent primary-source fact-checks (SE credits, project statuses/currency, people/roster), 2026-06-30. Sources: dialogdesign.ca, majorprojects.alberta.ca, oeg.ca, gecarchitecture.com, rjc.ca, fastepp.com, ISL/AECOM/Clark Builders project pages, Canadian Consulting Engineer/Architect. Confidence noted per claim; “[Hypothesis]” items are for testing in the meeting, not assertion.</w:t>
+        <w:t xml:space="preserve">Verification: 2 research passes + 4 adversarial primary-source fact-checks (SE credits, project currency, roster, self-perform/venue-SE, regulatory/pipeline), 2026-06-30. Sources: dialogdesign.ca, majorprojects.alberta.ca, alberta.ca, apega.ca, thorntontomasetti.com, oeg.ca, rjc.ca, fastepp.com, entuitive.com, Canadian Consulting Engineer/Architect. Confidence per claim; </w:t>
+      </w:r>
+      <w:r>
+        <w:rPr>
+          <w:i/>
+          <w:iCs/>
+        </w:rPr>
+        <w:t>“[Hypothesis]” = test in the room, do not assert.</w:t>
       </w:r>
       <w:bookmarkEnd w:id="0"/>
-      <w:bookmarkEnd w:id="15"/>
+      <w:bookmarkEnd w:id="16"/>
     </w:p>
     <w:sectPr>
       <w:footnotePr>
@@ -2952,7 +2055,7 @@
   <w:abstractNum w:abstractNumId="0" w15:restartNumberingAfterBreak="0">
     <w:nsid w:val="0000A990"/>
     <w:multiLevelType w:val="multilevel"/>
-    <w:tmpl w:val="99BA0D22"/>
+    <w:tmpl w:val="2522EBDE"/>
     <w:lvl w:ilvl="0">
       <w:numFmt w:val="bullet"/>
       <w:lvlText w:val=" "/>
@@ -3029,7 +2132,7 @@
   <w:abstractNum w:abstractNumId="1" w15:restartNumberingAfterBreak="0">
     <w:nsid w:val="0000A991"/>
     <w:multiLevelType w:val="multilevel"/>
-    <w:tmpl w:val="0A76973E"/>
+    <w:tmpl w:val="9E6ACCD0"/>
     <w:lvl w:ilvl="0">
       <w:numFmt w:val="bullet"/>
       <w:lvlText w:val=""/>
@@ -3133,7 +2236,7 @@
   <w:abstractNum w:abstractNumId="2" w15:restartNumberingAfterBreak="0">
     <w:nsid w:val="00A99411"/>
     <w:multiLevelType w:val="multilevel"/>
-    <w:tmpl w:val="9F6C5EAC"/>
+    <w:tmpl w:val="CB7838CE"/>
     <w:lvl w:ilvl="0">
       <w:start w:val="1"/>
       <w:numFmt w:val="decimal"/>
@@ -3216,10 +2319,10 @@
       </w:pPr>
     </w:lvl>
   </w:abstractNum>
-  <w:num w:numId="1" w16cid:durableId="69548788">
+  <w:num w:numId="1" w16cid:durableId="6371389">
     <w:abstractNumId w:val="0"/>
   </w:num>
-  <w:num w:numId="2" w16cid:durableId="282926441">
+  <w:num w:numId="2" w16cid:durableId="1802572104">
     <w:abstractNumId w:val="2"/>
     <w:lvlOverride w:ilvl="0">
       <w:startOverride w:val="1"/>
@@ -3249,19 +2352,10 @@
       <w:startOverride w:val="1"/>
     </w:lvlOverride>
   </w:num>
-  <w:num w:numId="3" w16cid:durableId="716006111">
+  <w:num w:numId="3" w16cid:durableId="1896773373">
     <w:abstractNumId w:val="1"/>
   </w:num>
-  <w:num w:numId="4" w16cid:durableId="2019458684">
-    <w:abstractNumId w:val="1"/>
-  </w:num>
-  <w:num w:numId="5" w16cid:durableId="1227836063">
-    <w:abstractNumId w:val="1"/>
-  </w:num>
-  <w:num w:numId="6" w16cid:durableId="1055814431">
-    <w:abstractNumId w:val="1"/>
-  </w:num>
-  <w:num w:numId="7" w16cid:durableId="1284271831">
+  <w:num w:numId="4" w16cid:durableId="374504438">
     <w:abstractNumId w:val="2"/>
     <w:lvlOverride w:ilvl="0">
       <w:startOverride w:val="1"/>
@@ -3291,7 +2385,67 @@
       <w:startOverride w:val="1"/>
     </w:lvlOverride>
   </w:num>
-  <w:num w:numId="8" w16cid:durableId="1898785085">
+  <w:num w:numId="5" w16cid:durableId="1386182237">
+    <w:abstractNumId w:val="2"/>
+    <w:lvlOverride w:ilvl="0">
+      <w:startOverride w:val="1"/>
+    </w:lvlOverride>
+    <w:lvlOverride w:ilvl="1">
+      <w:startOverride w:val="1"/>
+    </w:lvlOverride>
+    <w:lvlOverride w:ilvl="2">
+      <w:startOverride w:val="1"/>
+    </w:lvlOverride>
+    <w:lvlOverride w:ilvl="3">
+      <w:startOverride w:val="1"/>
+    </w:lvlOverride>
+    <w:lvlOverride w:ilvl="4">
+      <w:startOverride w:val="1"/>
+    </w:lvlOverride>
+    <w:lvlOverride w:ilvl="5">
+      <w:startOverride w:val="1"/>
+    </w:lvlOverride>
+    <w:lvlOverride w:ilvl="6">
+      <w:startOverride w:val="1"/>
+    </w:lvlOverride>
+    <w:lvlOverride w:ilvl="7">
+      <w:startOverride w:val="1"/>
+    </w:lvlOverride>
+    <w:lvlOverride w:ilvl="8">
+      <w:startOverride w:val="1"/>
+    </w:lvlOverride>
+  </w:num>
+  <w:num w:numId="6" w16cid:durableId="313727428">
+    <w:abstractNumId w:val="2"/>
+    <w:lvlOverride w:ilvl="0">
+      <w:startOverride w:val="1"/>
+    </w:lvlOverride>
+    <w:lvlOverride w:ilvl="1">
+      <w:startOverride w:val="1"/>
+    </w:lvlOverride>
+    <w:lvlOverride w:ilvl="2">
+      <w:startOverride w:val="1"/>
+    </w:lvlOverride>
+    <w:lvlOverride w:ilvl="3">
+      <w:startOverride w:val="1"/>
+    </w:lvlOverride>
+    <w:lvlOverride w:ilvl="4">
+      <w:startOverride w:val="1"/>
+    </w:lvlOverride>
+    <w:lvlOverride w:ilvl="5">
+      <w:startOverride w:val="1"/>
+    </w:lvlOverride>
+    <w:lvlOverride w:ilvl="6">
+      <w:startOverride w:val="1"/>
+    </w:lvlOverride>
+    <w:lvlOverride w:ilvl="7">
+      <w:startOverride w:val="1"/>
+    </w:lvlOverride>
+    <w:lvlOverride w:ilvl="8">
+      <w:startOverride w:val="1"/>
+    </w:lvlOverride>
+  </w:num>
+  <w:num w:numId="7" w16cid:durableId="258029712">
     <w:abstractNumId w:val="2"/>
     <w:lvlOverride w:ilvl="0">
       <w:startOverride w:val="1"/>
@@ -4559,7 +3713,7 @@
     <w:next w:val="Normal"/>
     <w:autoRedefine/>
     <w:uiPriority w:val="39"/>
-    <w:rsid w:val="00CE3D3F"/>
+    <w:rsid w:val="0013381C"/>
     <w:pPr>
       <w:spacing w:after="100"/>
     </w:pPr>
@@ -4570,7 +3724,7 @@
     <w:next w:val="Normal"/>
     <w:autoRedefine/>
     <w:uiPriority w:val="39"/>
-    <w:rsid w:val="00CE3D3F"/>
+    <w:rsid w:val="0013381C"/>
     <w:pPr>
       <w:spacing w:after="100"/>
       <w:ind w:left="240"/>
@@ -4580,7 +3734,7 @@
     <w:name w:val="Grid Table 4"/>
     <w:basedOn w:val="TableNormal"/>
     <w:uiPriority w:val="49"/>
-    <w:rsid w:val="00CE3D3F"/>
+    <w:rsid w:val="0013381C"/>
     <w:pPr>
       <w:spacing w:after="0"/>
     </w:pPr>

</xml_diff>

<commit_message>
docs(bd): DIALOG structural-outsourcing brief — complete verified catalogue
4 research + 6 verification passes over ~60 projects firm-wide. Final answer to
"what does DIALOG outsource structural for": five verified triggers — tall towers
(30+ st, any role), design-architect-of-record projects, mega-scale design-build
healthcare (co-SE), specialist innovation, and studio specialization gaps. Full
external-SE partner map (Jacobs, Stantec, RJC, Fast+Epp, Glotman, Entuitive,
BuroHappold, TT, Equilibrium, Blackwell, ISL). Self-performs transit/bridges,
mid-rise, standard civic, sub-$800M home-market healthcare. Corrected the
"role-not-height" oversimplification (tall towers always external) and dropped
unverified McCaig-Stantec. Actionable verified opening: UHNBC ACT Prince George BC
($1.58B, DIALOG+EllisDon alliance, SE seat open, BC home turf — no APEGA barrier).

Co-Authored-By: Claude Opus 4.8 <noreply@anthropic.com>
</commit_message>
<xml_diff>
--- a/docs/KOR-DIALOG-Edmonton-Structural-Outsourcing-2026-06-30.docx
+++ b/docs/KOR-DIALOG-Edmonton-Structural-Outsourcing-2026-06-30.docx
@@ -10,7 +10,7 @@
           <w:sz w:val="24"/>
           <w:szCs w:val="24"/>
         </w:rPr>
-        <w:id w:val="-954636161"/>
+        <w:id w:val="677770361"/>
         <w:docPartObj>
           <w:docPartGallery w:val="Table of Contents"/>
           <w:docPartUnique/>
@@ -52,13 +52,13 @@
           <w:r>
             <w:fldChar w:fldCharType="separate"/>
           </w:r>
-          <w:hyperlink w:anchor="_Toc233750666" w:history="1">
+          <w:hyperlink w:anchor="_Toc233754120" w:history="1">
             <w:r>
               <w:rPr>
                 <w:rStyle w:val="Hyperlink"/>
                 <w:noProof/>
               </w:rPr>
-              <w:t>DIALOG Edmonton — Structural Outsourcing Brief</w:t>
+              <w:t>DIALOG — Structural Outsourcing Brief</w:t>
             </w:r>
             <w:r>
               <w:rPr>
@@ -79,7 +79,7 @@
                 <w:noProof/>
                 <w:webHidden/>
               </w:rPr>
-              <w:instrText xml:space="preserve"> PAGEREF _Toc233750666 \h </w:instrText>
+              <w:instrText xml:space="preserve"> PAGEREF _Toc233754120 \h </w:instrText>
             </w:r>
             <w:r>
               <w:rPr>
@@ -120,13 +120,13 @@
               <w:noProof/>
             </w:rPr>
           </w:pPr>
-          <w:hyperlink w:anchor="_Toc233750667" w:history="1">
+          <w:hyperlink w:anchor="_Toc233754121" w:history="1">
             <w:r>
               <w:rPr>
                 <w:rStyle w:val="Hyperlink"/>
                 <w:noProof/>
               </w:rPr>
-              <w:t>Bottom line — the honest answer to “what does DIALOG outsource structural for?”</w:t>
+              <w:t>Bottom line — what DIALOG outsources structural engineering for</w:t>
             </w:r>
             <w:r>
               <w:rPr>
@@ -147,7 +147,7 @@
                 <w:noProof/>
                 <w:webHidden/>
               </w:rPr>
-              <w:instrText xml:space="preserve"> PAGEREF _Toc233750667 \h </w:instrText>
+              <w:instrText xml:space="preserve"> PAGEREF _Toc233754121 \h </w:instrText>
             </w:r>
             <w:r>
               <w:rPr>
@@ -188,13 +188,13 @@
               <w:noProof/>
             </w:rPr>
           </w:pPr>
-          <w:hyperlink w:anchor="_Toc233750668" w:history="1">
+          <w:hyperlink w:anchor="_Toc233754122" w:history="1">
             <w:r>
               <w:rPr>
                 <w:rStyle w:val="Hyperlink"/>
                 <w:noProof/>
               </w:rPr>
-              <w:t>The “open seats” reality check (verified)</w:t>
+              <w:t>External structural-engineer partner map (verified)</w:t>
             </w:r>
             <w:r>
               <w:rPr>
@@ -215,7 +215,7 @@
                 <w:noProof/>
                 <w:webHidden/>
               </w:rPr>
-              <w:instrText xml:space="preserve"> PAGEREF _Toc233750668 \h </w:instrText>
+              <w:instrText xml:space="preserve"> PAGEREF _Toc233754122 \h </w:instrText>
             </w:r>
             <w:r>
               <w:rPr>
@@ -256,13 +256,13 @@
               <w:noProof/>
             </w:rPr>
           </w:pPr>
-          <w:hyperlink w:anchor="_Toc233750669" w:history="1">
+          <w:hyperlink w:anchor="_Toc233754123" w:history="1">
             <w:r>
               <w:rPr>
                 <w:rStyle w:val="Hyperlink"/>
                 <w:noProof/>
               </w:rPr>
-              <w:t>Where KOR realistically fits (the actual play)</w:t>
+              <w:t>The actionable opening — UHNBC Acute Care Tower, Prince George BC [Verified]</w:t>
             </w:r>
             <w:r>
               <w:rPr>
@@ -283,7 +283,7 @@
                 <w:noProof/>
                 <w:webHidden/>
               </w:rPr>
-              <w:instrText xml:space="preserve"> PAGEREF _Toc233750669 \h </w:instrText>
+              <w:instrText xml:space="preserve"> PAGEREF _Toc233754123 \h </w:instrText>
             </w:r>
             <w:r>
               <w:rPr>
@@ -324,13 +324,13 @@
               <w:noProof/>
             </w:rPr>
           </w:pPr>
-          <w:hyperlink w:anchor="_Toc233750670" w:history="1">
+          <w:hyperlink w:anchor="_Toc233754124" w:history="1">
             <w:r>
               <w:rPr>
                 <w:rStyle w:val="Hyperlink"/>
                 <w:noProof/>
               </w:rPr>
-              <w:t>Prerequisites — close before July 10 (only KOR can)</w:t>
+              <w:t>DIALOG structural bench (verified — why they self-perform so much)</w:t>
             </w:r>
             <w:r>
               <w:rPr>
@@ -351,7 +351,7 @@
                 <w:noProof/>
                 <w:webHidden/>
               </w:rPr>
-              <w:instrText xml:space="preserve"> PAGEREF _Toc233750670 \h </w:instrText>
+              <w:instrText xml:space="preserve"> PAGEREF _Toc233754124 \h </w:instrText>
             </w:r>
             <w:r>
               <w:rPr>
@@ -392,13 +392,13 @@
               <w:noProof/>
             </w:rPr>
           </w:pPr>
-          <w:hyperlink w:anchor="_Toc233750671" w:history="1">
+          <w:hyperlink w:anchor="_Toc233754125" w:history="1">
             <w:r>
               <w:rPr>
                 <w:rStyle w:val="Hyperlink"/>
                 <w:noProof/>
               </w:rPr>
-              <w:t>Competitors (verified)</w:t>
+              <w:t>Do NOT say (fact-check landmines)</w:t>
             </w:r>
             <w:r>
               <w:rPr>
@@ -419,7 +419,7 @@
                 <w:noProof/>
                 <w:webHidden/>
               </w:rPr>
-              <w:instrText xml:space="preserve"> PAGEREF _Toc233750671 \h </w:instrText>
+              <w:instrText xml:space="preserve"> PAGEREF _Toc233754125 \h </w:instrText>
             </w:r>
             <w:r>
               <w:rPr>
@@ -460,13 +460,13 @@
               <w:noProof/>
             </w:rPr>
           </w:pPr>
-          <w:hyperlink w:anchor="_Toc233750672" w:history="1">
+          <w:hyperlink w:anchor="_Toc233754126" w:history="1">
             <w:r>
               <w:rPr>
                 <w:rStyle w:val="Hyperlink"/>
                 <w:noProof/>
               </w:rPr>
-              <w:t>DIALOG Edmonton structural bench (verified — this is why they self-perform)</w:t>
+              <w:t>Questions for Georg Josi (July 10)</w:t>
             </w:r>
             <w:r>
               <w:rPr>
@@ -487,7 +487,7 @@
                 <w:noProof/>
                 <w:webHidden/>
               </w:rPr>
-              <w:instrText xml:space="preserve"> PAGEREF _Toc233750672 \h </w:instrText>
+              <w:instrText xml:space="preserve"> PAGEREF _Toc233754126 \h </w:instrText>
             </w:r>
             <w:r>
               <w:rPr>
@@ -528,13 +528,13 @@
               <w:noProof/>
             </w:rPr>
           </w:pPr>
-          <w:hyperlink w:anchor="_Toc233750673" w:history="1">
+          <w:hyperlink w:anchor="_Toc233754127" w:history="1">
             <w:r>
               <w:rPr>
                 <w:rStyle w:val="Hyperlink"/>
                 <w:noProof/>
               </w:rPr>
-              <w:t>Do NOT say (fact-check landmines)</w:t>
+              <w:t>Prerequisites — close before July 10 (only KOR can)</w:t>
             </w:r>
             <w:r>
               <w:rPr>
@@ -555,75 +555,7 @@
                 <w:noProof/>
                 <w:webHidden/>
               </w:rPr>
-              <w:instrText xml:space="preserve"> PAGEREF _Toc233750673 \h </w:instrText>
-            </w:r>
-            <w:r>
-              <w:rPr>
-                <w:noProof/>
-                <w:webHidden/>
-              </w:rPr>
-            </w:r>
-            <w:r>
-              <w:rPr>
-                <w:noProof/>
-                <w:webHidden/>
-              </w:rPr>
-              <w:fldChar w:fldCharType="separate"/>
-            </w:r>
-            <w:r>
-              <w:rPr>
-                <w:noProof/>
-                <w:webHidden/>
-              </w:rPr>
-              <w:t>3</w:t>
-            </w:r>
-            <w:r>
-              <w:rPr>
-                <w:noProof/>
-                <w:webHidden/>
-              </w:rPr>
-              <w:fldChar w:fldCharType="end"/>
-            </w:r>
-          </w:hyperlink>
-        </w:p>
-        <w:p>
-          <w:pPr>
-            <w:pStyle w:val="TOC2"/>
-            <w:tabs>
-              <w:tab w:val="right" w:leader="dot" w:pos="9350"/>
-            </w:tabs>
-            <w:rPr>
-              <w:noProof/>
-            </w:rPr>
-          </w:pPr>
-          <w:hyperlink w:anchor="_Toc233750674" w:history="1">
-            <w:r>
-              <w:rPr>
-                <w:rStyle w:val="Hyperlink"/>
-                <w:noProof/>
-              </w:rPr>
-              <w:t>Reframed questions for Georg Josi (relationship, not seat-hunting)</w:t>
-            </w:r>
-            <w:r>
-              <w:rPr>
-                <w:noProof/>
-                <w:webHidden/>
-              </w:rPr>
-              <w:tab/>
-            </w:r>
-            <w:r>
-              <w:rPr>
-                <w:noProof/>
-                <w:webHidden/>
-              </w:rPr>
-              <w:fldChar w:fldCharType="begin"/>
-            </w:r>
-            <w:r>
-              <w:rPr>
-                <w:noProof/>
-                <w:webHidden/>
-              </w:rPr>
-              <w:instrText xml:space="preserve"> PAGEREF _Toc233750674 \h </w:instrText>
+              <w:instrText xml:space="preserve"> PAGEREF _Toc233754127 \h </w:instrText>
             </w:r>
             <w:r>
               <w:rPr>
@@ -665,10 +597,10 @@
       <w:pPr>
         <w:pStyle w:val="Heading1"/>
       </w:pPr>
-      <w:bookmarkStart w:id="0" w:name="X88c8d68f0ff638f683c6a4eb2fa37528304d4e8"/>
-      <w:bookmarkStart w:id="1" w:name="_Toc233750666"/>
-      <w:r>
-        <w:t>DIALOG Edmonton — Structural Outsourcing Brief</w:t>
+      <w:bookmarkStart w:id="0" w:name="dialog-structural-outsourcing-brief"/>
+      <w:bookmarkStart w:id="1" w:name="_Toc233754120"/>
+      <w:r>
+        <w:t>DIALOG — Structural Outsourcing Brief</w:t>
       </w:r>
       <w:bookmarkEnd w:id="1"/>
     </w:p>
@@ -681,7 +613,7 @@
           <w:b/>
           <w:bCs/>
         </w:rPr>
-        <w:t>KOR Structural · July 10, 2026 meeting · Verified + deepened 2026-06-30 (2 research + 4 adversarial verification passes)</w:t>
+        <w:t>KOR Structural · July 10, 2026 meeting · Verified 2026-06-30 (4 research + 6 adversarial verification passes; ~60 projects catalogued firm-wide)</w:t>
       </w:r>
     </w:p>
     <w:p>
@@ -728,7 +660,7 @@
         <w:t>“Do NOT say”</w:t>
       </w:r>
       <w:r>
-        <w:t xml:space="preserve"> list flags the meeting landmines. Decision-maker: </w:t>
+        <w:t xml:space="preserve"> list flags meeting landmines. Decision-maker: </w:t>
       </w:r>
       <w:r>
         <w:rPr>
@@ -743,7 +675,7 @@
     </w:p>
     <w:p>
       <w:r>
-        <w:pict w14:anchorId="534AF633">
+        <w:pict w14:anchorId="76715D11">
           <v:rect id="_x0000_i1025" style="width:0;height:1.5pt" o:hralign="center" o:hrstd="t" o:hr="t"/>
         </w:pict>
       </w:r>
@@ -753,10 +685,10 @@
         <w:pStyle w:val="Heading2"/>
         <w:pageBreakBefore/>
       </w:pPr>
-      <w:bookmarkStart w:id="2" w:name="X58b4608537bcadf292dbfc53c464d351ed65849"/>
-      <w:bookmarkStart w:id="3" w:name="_Toc233750667"/>
-      <w:r>
-        <w:t>Bottom line — the honest answer to “what does DIALOG outsource structural for?”</w:t>
+      <w:bookmarkStart w:id="2" w:name="X3351a517e04db12830a789ebdc6413a2b8dd05f"/>
+      <w:bookmarkStart w:id="3" w:name="_Toc233754121"/>
+      <w:r>
+        <w:t>Bottom line — what DIALOG outsources structural engineering for</w:t>
       </w:r>
       <w:bookmarkEnd w:id="3"/>
     </w:p>
@@ -765,24 +697,17 @@
         <w:pStyle w:val="FirstParagraph"/>
       </w:pPr>
       <w:r>
-        <w:rPr>
-          <w:b/>
-          <w:bCs/>
-        </w:rPr>
-        <w:t>Less than the premise assumes. DIALOG self-performs the large majority of its structural — including most hospitals and its venue work — with a deep in-house structural bench.</w:t>
-      </w:r>
-      <w:r>
-        <w:t xml:space="preserve"> It brings in an external structural engineer only in three </w:t>
-      </w:r>
-      <w:r>
-        <w:rPr>
-          <w:b/>
-          <w:bCs/>
-        </w:rPr>
-        <w:t>narrow</w:t>
-      </w:r>
-      <w:r>
-        <w:t xml:space="preserve"> situations [all Verified]:</w:t>
+        <w:t xml:space="preserve">DIALOG self-performs the bulk of its structural with a deep in-house bench. It brings in an external (or co-) structural engineer in </w:t>
+      </w:r>
+      <w:r>
+        <w:rPr>
+          <w:b/>
+          <w:bCs/>
+        </w:rPr>
+        <w:t>five recurring situations</w:t>
+      </w:r>
+      <w:r>
+        <w:t xml:space="preserve"> [all Verified against ≥60 projects]:</w:t>
       </w:r>
     </w:p>
     <w:p>
@@ -798,43 +723,27 @@
           <w:b/>
           <w:bCs/>
         </w:rPr>
-        <w:t>Top-scale healthcare, as a co-SE (not a hand-off):</w:t>
-      </w:r>
-      <w:r>
-        <w:t xml:space="preserve"> On the </w:t>
-      </w:r>
-      <w:r>
-        <w:rPr>
-          <w:b/>
-          <w:bCs/>
-        </w:rPr>
-        <w:t>Kaye Edmonton Clinic</w:t>
-      </w:r>
-      <w:r>
-        <w:t xml:space="preserve"> (~$900M, university-affiliated) DIALOG and </w:t>
-      </w:r>
-      <w:r>
-        <w:rPr>
-          <w:b/>
-          <w:bCs/>
-        </w:rPr>
-        <w:t>Yolles (now Jacobs)</w:t>
-      </w:r>
-      <w:r>
-        <w:t xml:space="preserve"> were </w:t>
-      </w:r>
-      <w:r>
-        <w:rPr>
-          <w:b/>
-          <w:bCs/>
-        </w:rPr>
-        <w:t>co-equal</w:t>
-      </w:r>
-      <w:r>
-        <w:t xml:space="preserve"> </w:t>
-      </w:r>
-      <w:r>
-        <w:t>structural engineers. This is the exception, at the very top of the scale — not DIALOG’s norm.</w:t>
+        <w:t>Tall towers (~30+ storeys)</w:t>
+      </w:r>
+      <w:r>
+        <w:t xml:space="preserve"> — structural goes external </w:t>
+      </w:r>
+      <w:r>
+        <w:rPr>
+          <w:b/>
+          <w:bCs/>
+        </w:rPr>
+        <w:t>regardless of DIALOG’s architect role</w:t>
+      </w:r>
+      <w:r>
+        <w:t xml:space="preserve">. Verified: Brookfield Place Calgary (60 st) → Entuitive; Telus Sky (58 st) → Glotman Simpson; Vancouver House (53 st) → BuroHappold + Glotman Simpson; JW Marriott/ICE District (55 st) → Thornton Tomasetti; The Parks (45+35 st) → RJC. </w:t>
+      </w:r>
+      <w:r>
+        <w:rPr>
+          <w:i/>
+          <w:iCs/>
+        </w:rPr>
+        <w:t>(Self-performs low/mid-rise when prime — Enbridge Centre, 26 st, in-house.)</w:t>
       </w:r>
     </w:p>
     <w:p>
@@ -850,20 +759,13 @@
           <w:b/>
           <w:bCs/>
         </w:rPr>
-        <w:t>Mass timber / novel typologies:</w:t>
+        <w:t>Design-architect-of-record role</w:t>
       </w:r>
       <w:r>
         <w:t xml:space="preserve"> </w:t>
       </w:r>
       <w:r>
-        <w:rPr>
-          <w:b/>
-          <w:bCs/>
-        </w:rPr>
-        <w:t>Fast+Epp</w:t>
-      </w:r>
-      <w:r>
-        <w:t xml:space="preserve"> (e.g. The Hive). Entrenched (Fast+Epp has an Edmonton office since 2012).</w:t>
+        <w:t>— when a design/starchitect leads and DIALOG is delivery/AOR: Calgary Central Library (Snøhetta design → Entuitive); Brookfield (Arney Fender Katsalidis design → Entuitive).</w:t>
       </w:r>
     </w:p>
     <w:p>
@@ -879,20 +781,108 @@
           <w:b/>
           <w:bCs/>
         </w:rPr>
-        <w:t>High-rise residential towers:</w:t>
+        <w:t>Mega-scale healthcare under design-build/alliance (~$800M+ design-award budget)</w:t>
+      </w:r>
+      <w:r>
+        <w:t xml:space="preserve"> — co-SE: Kaye Edmonton Clinic (~$900M) → </w:t>
+      </w:r>
+      <w:r>
+        <w:rPr>
+          <w:b/>
+          <w:bCs/>
+        </w:rPr>
+        <w:t>Jacobs (ex-Yolles), co-equal</w:t>
+      </w:r>
+      <w:r>
+        <w:t xml:space="preserve">; Calgary Cancer Centre ($1.4B, PCL DB) → </w:t>
+      </w:r>
+      <w:r>
+        <w:rPr>
+          <w:b/>
+          <w:bCs/>
+        </w:rPr>
+        <w:t>DIALOG + Stantec co-SE.</w:t>
+      </w:r>
+    </w:p>
+    <w:p>
+      <w:pPr>
+        <w:pStyle w:val="Compact"/>
+        <w:numPr>
+          <w:ilvl w:val="0"/>
+          <w:numId w:val="2"/>
+        </w:numPr>
+      </w:pPr>
+      <w:r>
+        <w:rPr>
+          <w:b/>
+          <w:bCs/>
+        </w:rPr>
+        <w:t>Specialist structural innovation they lack</w:t>
+      </w:r>
+      <w:r>
+        <w:t xml:space="preserve"> — pioneer seismic mass timber → </w:t>
+      </w:r>
+      <w:r>
+        <w:rPr>
+          <w:b/>
+          <w:bCs/>
+        </w:rPr>
+        <w:t>Fast+Epp</w:t>
+      </w:r>
+      <w:r>
+        <w:t xml:space="preserve"> (The Hive); rammed earth → </w:t>
+      </w:r>
+      <w:r>
+        <w:rPr>
+          <w:b/>
+          <w:bCs/>
+        </w:rPr>
+        <w:t>Equilibrium</w:t>
       </w:r>
       <w:r>
         <w:t xml:space="preserve"> </w:t>
       </w:r>
       <w:r>
-        <w:rPr>
-          <w:b/>
-          <w:bCs/>
-        </w:rPr>
-        <w:t>RJC Engineers</w:t>
-      </w:r>
-      <w:r>
-        <w:t xml:space="preserve"> (The Parks; DIALOG co-architect w/ Hariri Pontarini).</w:t>
+        <w:t xml:space="preserve">(Nk’Mip); life sciences → </w:t>
+      </w:r>
+      <w:r>
+        <w:rPr>
+          <w:b/>
+          <w:bCs/>
+        </w:rPr>
+        <w:t>Blackwell</w:t>
+      </w:r>
+      <w:r>
+        <w:t>; forensic concrete → RJC (Glenbow).</w:t>
+      </w:r>
+    </w:p>
+    <w:p>
+      <w:pPr>
+        <w:pStyle w:val="Compact"/>
+        <w:numPr>
+          <w:ilvl w:val="0"/>
+          <w:numId w:val="2"/>
+        </w:numPr>
+      </w:pPr>
+      <w:r>
+        <w:rPr>
+          <w:b/>
+          <w:bCs/>
+        </w:rPr>
+        <w:t>A studio lacking the relevant specialization</w:t>
+      </w:r>
+      <w:r>
+        <w:t xml:space="preserve"> — e.g., DIALOG </w:t>
+      </w:r>
+      <w:r>
+        <w:rPr>
+          <w:b/>
+          <w:bCs/>
+        </w:rPr>
+        <w:t>Vancouver has structural engineers but no healthcare specialization</w:t>
+      </w:r>
+      <w:r>
+        <w:t xml:space="preserve"> (healthcare structural is run from Calgary) → drives external/teamed structural on BC healthcare (see UHNBC below).</w:t>
       </w:r>
     </w:p>
     <w:p>
@@ -904,33 +894,23 @@
           <w:b/>
           <w:bCs/>
         </w:rPr>
-        <w:t>What DIALOG does IN-HOUSE (do not pitch these):</w:t>
-      </w:r>
-      <w:r>
-        <w:t xml:space="preserve"> most hospitals (GP Regional → Ralph Hildenbrandt; Edson → Sandra Renihan; Calgary Cancer Centre → DIALOG+Stantec), </w:t>
-      </w:r>
-      <w:r>
-        <w:rPr>
-          <w:b/>
-          <w:bCs/>
-        </w:rPr>
-        <w:t>venues</w:t>
+        <w:t>Self-performs (do NOT pitch these):</w:t>
       </w:r>
       <w:r>
         <w:t xml:space="preserve"> </w:t>
       </w:r>
       <w:r>
-        <w:t xml:space="preserve">(ICE District/Rogers Place structural team incl. Steven Oosterhof — TT was arena prime, DIALOG associate), </w:t>
-      </w:r>
-      <w:r>
-        <w:rPr>
-          <w:b/>
-          <w:bCs/>
-        </w:rPr>
-        <w:t>bridges &amp; transit</w:t>
-      </w:r>
-      <w:r>
-        <w:t xml:space="preserve"> (Walterdale led in-house; Neil Robson, Steven Prozniak).</w:t>
+        <w:t xml:space="preserve">transit / bridges (their strongest domain — Walterdale, Valley Line, Broadway Subway — always in-house), low/mid-rise buildings, standard institutional &amp; civic (Royal Alberta Museum, Winspear, Enbridge Centre), standard CLT timber, and </w:t>
+      </w:r>
+      <w:r>
+        <w:rPr>
+          <w:b/>
+          <w:bCs/>
+        </w:rPr>
+        <w:t>healthcare under ~$800M in Alberta/Ontario when they’re prime</w:t>
+      </w:r>
+      <w:r>
+        <w:t xml:space="preserve"> (Grande Prairie ~$647M design budget → Hildenbrandt/Lenzin; Edson → Renihan).</w:t>
       </w:r>
     </w:p>
     <w:p>
@@ -942,35 +922,22 @@
           <w:b/>
           <w:bCs/>
         </w:rPr>
-        <w:t>Implication:</w:t>
-      </w:r>
-      <w:r>
-        <w:t xml:space="preserve"> this is a </w:t>
-      </w:r>
-      <w:r>
-        <w:rPr>
-          <w:b/>
-          <w:bCs/>
-        </w:rPr>
-        <w:t>relationship / long-game</w:t>
-      </w:r>
-      <w:r>
-        <w:t xml:space="preserve"> meeting, not an open-seat pitch. KOR’s realistic wedge is </w:t>
+        <w:t>One-line meeting answer:</w:t>
+      </w:r>
+      <w:r>
+        <w:t xml:space="preserve"> </w:t>
       </w:r>
       <w:r>
         <w:rPr>
           <w:i/>
           <w:iCs/>
         </w:rPr>
-        <w:t>specialist healthcare-seismic depth + overflow capacity at the top scale</w:t>
-      </w:r>
-      <w:r>
-        <w:t xml:space="preserve"> — not “you outsource, hire us.”</w:t>
-      </w:r>
-    </w:p>
-    <w:p>
-      <w:r>
-        <w:pict w14:anchorId="7DD3F277">
+        <w:t>“DIALOG outsources structural on tall towers, on projects where a design architect leads, on mega-scale design-build hospitals (as co-SE), on specialist-innovation work, and where a studio lacks the specialty — and self-performs transit/bridges, mid-rise, standard civic, and sub-$800M home-market healthcare.”</w:t>
+      </w:r>
+    </w:p>
+    <w:p>
+      <w:r>
+        <w:pict w14:anchorId="760C4B1C">
           <v:rect id="_x0000_i1026" style="width:0;height:1.5pt" o:hralign="center" o:hrstd="t" o:hr="t"/>
         </w:pict>
       </w:r>
@@ -980,13 +947,48 @@
         <w:pStyle w:val="Heading2"/>
         <w:pageBreakBefore/>
       </w:pPr>
-      <w:bookmarkStart w:id="4" w:name="the-open-seats-reality-check-verified"/>
-      <w:bookmarkStart w:id="5" w:name="_Toc233750668"/>
+      <w:bookmarkStart w:id="4" w:name="X5f0bef76d4c739a626bae3dce59c26f13fb2e26"/>
+      <w:bookmarkStart w:id="5" w:name="_Toc233754122"/>
       <w:bookmarkEnd w:id="2"/>
       <w:r>
-        <w:t>The “open seats” reality check (verified)</w:t>
+        <w:t>External structural-engineer partner map (verified)</w:t>
       </w:r>
       <w:bookmarkEnd w:id="5"/>
+    </w:p>
+    <w:p>
+      <w:pPr>
+        <w:pStyle w:val="FirstParagraph"/>
+      </w:pPr>
+      <w:r>
+        <w:t xml:space="preserve">Jacobs (ex-Yolles) · Stantec · RJC Engineers · Fast+Epp · Glotman Simpson · Entuitive · BuroHappold · Thornton Tomasetti · Equilibrium Consulting · Blackwell · ISL Engineering · Structural Design Group. </w:t>
+      </w:r>
+      <w:r>
+        <w:rPr>
+          <w:i/>
+          <w:iCs/>
+        </w:rPr>
+        <w:t>(RJC and Entuitive are the ones KOR most directly competes with for AB/BC institutional-and-healthcare overflow.)</w:t>
+      </w:r>
+    </w:p>
+    <w:p>
+      <w:r>
+        <w:pict w14:anchorId="50AA6DC7">
+          <v:rect id="_x0000_i1027" style="width:0;height:1.5pt" o:hralign="center" o:hrstd="t" o:hr="t"/>
+        </w:pict>
+      </w:r>
+    </w:p>
+    <w:p>
+      <w:pPr>
+        <w:pStyle w:val="Heading2"/>
+        <w:pageBreakBefore/>
+      </w:pPr>
+      <w:bookmarkStart w:id="6" w:name="X7a1e3f44ea02b4aaa194059b0df61ae6feb5a51"/>
+      <w:bookmarkStart w:id="7" w:name="_Toc233754123"/>
+      <w:bookmarkEnd w:id="4"/>
+      <w:r>
+        <w:t>The actionable opening — UHNBC Acute Care Tower, Prince George BC [Verified]</w:t>
+      </w:r>
+      <w:bookmarkEnd w:id="7"/>
     </w:p>
     <w:p>
       <w:pPr>
@@ -1001,47 +1003,37 @@
           <w:b/>
           <w:bCs/>
         </w:rPr>
-        <w:t>Edmonton Event Park</w:t>
-      </w:r>
-      <w:r>
-        <w:t xml:space="preserve"> — DIALOG+HNTB, no SE named publicly. But DIALOG likely </w:t>
-      </w:r>
-      <w:r>
-        <w:rPr>
-          <w:b/>
-          <w:bCs/>
-        </w:rPr>
-        <w:t>self-performs</w:t>
-      </w:r>
-      <w:r>
-        <w:t xml:space="preserve"> (Oosterhof did the adjacent ICE District), OR </w:t>
-      </w:r>
-      <w:r>
-        <w:rPr>
-          <w:b/>
-          <w:bCs/>
-        </w:rPr>
-        <w:t>Thornton Tomasetti</w:t>
-      </w:r>
-      <w:r>
-        <w:t xml:space="preserve"> gets it via HNTB (TT = HNTB’s SE on Ryan Field + Vegas A’s, and did </w:t>
-      </w:r>
-      <w:r>
-        <w:rPr>
-          <w:b/>
-          <w:bCs/>
-        </w:rPr>
-        <w:t>Rogers Place</w:t>
-      </w:r>
-      <w:r>
-        <w:t xml:space="preserve"> next door). </w:t>
-      </w:r>
-      <w:r>
-        <w:rPr>
-          <w:b/>
-          <w:bCs/>
-        </w:rPr>
-        <w:t>KOR’s odds are low — probe, don’t pitch.</w:t>
+        <w:t>$1.579B</w:t>
+      </w:r>
+      <w:r>
+        <w:t xml:space="preserve">; </w:t>
+      </w:r>
+      <w:r>
+        <w:rPr>
+          <w:b/>
+          <w:bCs/>
+        </w:rPr>
+        <w:t>DIALOG + EllisDon</w:t>
+      </w:r>
+      <w:r>
+        <w:t xml:space="preserve"> named preferred proponent (Oct 2025); alliance agreement signed </w:t>
+      </w:r>
+      <w:r>
+        <w:rPr>
+          <w:b/>
+          <w:bCs/>
+        </w:rPr>
+        <w:t>Dec 2025</w:t>
+      </w:r>
+      <w:r>
+        <w:t xml:space="preserve">; </w:t>
+      </w:r>
+      <w:r>
+        <w:rPr>
+          <w:b/>
+          <w:bCs/>
+        </w:rPr>
+        <w:t>design/development phase runs through late 2026, construction 2027.</w:t>
       </w:r>
     </w:p>
     <w:p>
@@ -1057,27 +1049,59 @@
           <w:b/>
           <w:bCs/>
         </w:rPr>
-        <w:t>NAIT Advanced Skills Centre</w:t>
-      </w:r>
-      <w:r>
-        <w:t xml:space="preserve"> — GEC+DIALOG, PCL builder, early works ~spring 2026. DIALOG almost certainly </w:t>
-      </w:r>
-      <w:r>
-        <w:rPr>
-          <w:b/>
-          <w:bCs/>
-        </w:rPr>
-        <w:t>self-performs</w:t>
-      </w:r>
-      <w:r>
-        <w:t xml:space="preserve">; no separate SE RFP. Effectively </w:t>
-      </w:r>
-      <w:r>
-        <w:rPr>
-          <w:b/>
-          <w:bCs/>
-        </w:rPr>
-        <w:t>not open.</w:t>
+        <w:t>Structural engineer is publicly unnamed</w:t>
+      </w:r>
+      <w:r>
+        <w:t xml:space="preserve"> — the alliance names only EllisDon, DIALOG BC, PML Mechanical, Houle Electric. SE-sub selection is realistic during the 2026 design phase → </w:t>
+      </w:r>
+      <w:r>
+        <w:rPr>
+          <w:b/>
+          <w:bCs/>
+        </w:rPr>
+        <w:t>pursuable but time-sensitive.</w:t>
+      </w:r>
+    </w:p>
+    <w:p>
+      <w:pPr>
+        <w:pStyle w:val="Compact"/>
+        <w:numPr>
+          <w:ilvl w:val="0"/>
+          <w:numId w:val="3"/>
+        </w:numPr>
+      </w:pPr>
+      <w:r>
+        <w:rPr>
+          <w:b/>
+          <w:bCs/>
+        </w:rPr>
+        <w:t>Why KOR fits:</w:t>
+      </w:r>
+      <w:r>
+        <w:t xml:space="preserve"> it’s </w:t>
+      </w:r>
+      <w:r>
+        <w:rPr>
+          <w:b/>
+          <w:bCs/>
+        </w:rPr>
+        <w:t>in BC (KOR home turf — no APEGA barrier)</w:t>
+      </w:r>
+      <w:r>
+        <w:t xml:space="preserve">, and it sits in DIALOG’s </w:t>
+      </w:r>
+      <w:r>
+        <w:rPr>
+          <w:b/>
+          <w:bCs/>
+        </w:rPr>
+        <w:t>Vancouver healthcare-structural specialization gap.</w:t>
+      </w:r>
+      <w:r>
+        <w:t xml:space="preserve"> </w:t>
+      </w:r>
+      <w:r>
+        <w:t>This is the single best, real opening — far more actionable than the Edmonton venue/hospital seats.</w:t>
       </w:r>
     </w:p>
     <w:p>
@@ -1085,26 +1109,17 @@
         <w:pStyle w:val="FirstParagraph"/>
       </w:pPr>
       <w:r>
-        <w:t xml:space="preserve">The one real regulatory wedge if a US firm (e.g. Walter P Moore) were in the mix: </w:t>
-      </w:r>
-      <w:r>
-        <w:rPr>
-          <w:b/>
-          <w:bCs/>
-        </w:rPr>
-        <w:t>APEGA Permit to Practice is mandatory</w:t>
-      </w:r>
-      <w:r>
-        <w:t xml:space="preserve"> </w:t>
-      </w:r>
-      <w:r>
-        <w:t>to seal Alberta structural drawings [Verified] — but TT already operates in Canada, so it doesn’t protect KOR against TT.</w:t>
-      </w:r>
-    </w:p>
-    <w:p>
-      <w:r>
-        <w:pict w14:anchorId="4709CDAB">
-          <v:rect id="_x0000_i1027" style="width:0;height:1.5pt" o:hralign="center" o:hrstd="t" o:hr="t"/>
+        <w:rPr>
+          <w:i/>
+          <w:iCs/>
+        </w:rPr>
+        <w:t>Edmonton items for context: Event Park (DIALOG+HNTB — likely DIALOG self-perform or Thornton Tomasetti) and NAIT (likely DIALOG self-perform) are probe-not-pitch. Misericordia inpatient tower (architect seat open, planning-only funding) is a long-lead AB teaming watch.</w:t>
+      </w:r>
+    </w:p>
+    <w:p>
+      <w:r>
+        <w:pict w14:anchorId="354247D5">
+          <v:rect id="_x0000_i1028" style="width:0;height:1.5pt" o:hralign="center" o:hrstd="t" o:hr="t"/>
         </w:pict>
       </w:r>
     </w:p>
@@ -1113,13 +1128,74 @@
         <w:pStyle w:val="Heading2"/>
         <w:pageBreakBefore/>
       </w:pPr>
-      <w:bookmarkStart w:id="6" w:name="Xeab2317e66d08ceb771af8812bac4f0c7393527"/>
-      <w:bookmarkStart w:id="7" w:name="_Toc233750669"/>
-      <w:bookmarkEnd w:id="4"/>
-      <w:r>
-        <w:t>Where KOR realistically fits (the actual play)</w:t>
-      </w:r>
-      <w:bookmarkEnd w:id="7"/>
+      <w:bookmarkStart w:id="8" w:name="X47bec40a7c961b90ae8b69b8ef2d8cc8fd8bee7"/>
+      <w:bookmarkStart w:id="9" w:name="_Toc233754124"/>
+      <w:bookmarkEnd w:id="6"/>
+      <w:r>
+        <w:t>DIALOG structural bench (verified — why they self-perform so much)</w:t>
+      </w:r>
+      <w:bookmarkEnd w:id="9"/>
+    </w:p>
+    <w:p>
+      <w:pPr>
+        <w:pStyle w:val="FirstParagraph"/>
+      </w:pPr>
+      <w:r>
+        <w:rPr>
+          <w:b/>
+          <w:bCs/>
+        </w:rPr>
+        <w:t>Edmonton:</w:t>
+      </w:r>
+      <w:r>
+        <w:t xml:space="preserve"> </w:t>
+      </w:r>
+      <w:r>
+        <w:t xml:space="preserve">Georg Josi (Partner, Studio Chair), Steven Oosterhof (Partner — venue/ICE District), Neil Robson (Partner — transport/institutional), Sandra Renihan (Partner — transit focus), Steven Prozniak (Assoc — bridges), Ryan Renihan / Larissa Ulcar / Victoria Buffam (Assoc), Jeff DiBattista (Partner Emeritus, engaged). </w:t>
+      </w:r>
+      <w:r>
+        <w:rPr>
+          <w:b/>
+          <w:bCs/>
+        </w:rPr>
+        <w:t>Calgary (healthcare structural):</w:t>
+      </w:r>
+      <w:r>
+        <w:t xml:space="preserve"> Ralph Hildenbrandt, Chris Lenzin. </w:t>
+      </w:r>
+      <w:r>
+        <w:rPr>
+          <w:b/>
+          <w:bCs/>
+        </w:rPr>
+        <w:t>Vancouver (tall-building/commercial — no healthcare specialty):</w:t>
+      </w:r>
+      <w:r>
+        <w:t xml:space="preserve"> </w:t>
+      </w:r>
+      <w:r>
+        <w:t>Fadi Ghorayeb (Managing Partner), Thomas Wu (Partner), Mehrak Razavi (Principal Assoc).</w:t>
+      </w:r>
+    </w:p>
+    <w:p>
+      <w:r>
+        <w:pict w14:anchorId="4ACA765E">
+          <v:rect id="_x0000_i1029" style="width:0;height:1.5pt" o:hralign="center" o:hrstd="t" o:hr="t"/>
+        </w:pict>
+      </w:r>
+    </w:p>
+    <w:p>
+      <w:pPr>
+        <w:pStyle w:val="Heading2"/>
+        <w:pageBreakBefore/>
+      </w:pPr>
+      <w:bookmarkStart w:id="10" w:name="do-not-say-fact-check-landmines"/>
+      <w:bookmarkStart w:id="11" w:name="_Toc233754125"/>
+      <w:bookmarkEnd w:id="8"/>
+      <w:r>
+        <w:t>Do NOT say (fact-check landmines)</w:t>
+      </w:r>
+      <w:bookmarkEnd w:id="11"/>
     </w:p>
     <w:p>
       <w:pPr>
@@ -1134,10 +1210,10 @@
           <w:b/>
           <w:bCs/>
         </w:rPr>
-        <w:t>Healthcare co-SE / overflow at the top scale</w:t>
-      </w:r>
-      <w:r>
-        <w:t xml:space="preserve"> — position KOR as the specialist structural partner DIALOG reaches for when a hospital hits Kaye-scale or their in-house team is maxed. Long-game.</w:t>
+        <w:t>Do NOT</w:t>
+      </w:r>
+      <w:r>
+        <w:t xml:space="preserve"> say DIALOG self-performs structural on 60-storey towers — refuted; tall towers go to Entuitive/Glotman/BuroHappold/TT.</w:t>
       </w:r>
     </w:p>
     <w:p>
@@ -1153,27 +1229,10 @@
           <w:b/>
           <w:bCs/>
         </w:rPr>
-        <w:t>Misericordia Community Hospital inpatient tower</w:t>
-      </w:r>
-      <w:r>
-        <w:t xml:space="preserve"> (~350 beds per provincial reporting; Acute Care Action Plan, Nov 2025; planning-only funding) — </w:t>
-      </w:r>
-      <w:r>
-        <w:rPr>
-          <w:b/>
-          <w:bCs/>
-        </w:rPr>
-        <w:t>architect seat is OPEN</w:t>
-      </w:r>
-      <w:r>
-        <w:t xml:space="preserve"> → if DIALOG wins the architect role, KOR could ride as co-SE. The better teaming target. </w:t>
-      </w:r>
-      <w:r>
-        <w:rPr>
-          <w:i/>
-          <w:iCs/>
-        </w:rPr>
-        <w:t>(Grey Nuns tower is real but Stantec is already architect → structural-teaming only.)</w:t>
+        <w:t>Do NOT</w:t>
+      </w:r>
+      <w:r>
+        <w:t xml:space="preserve"> say DIALOG “outsources hospital structural” broadly — they self-perform sub-$800M home-market hospitals in-house (Hildenbrandt/Renihan/Lenzin).</w:t>
       </w:r>
     </w:p>
     <w:p>
@@ -1189,52 +1248,97 @@
           <w:b/>
           <w:bCs/>
         </w:rPr>
-        <w:t>Seismic specialist depth</w:t>
-      </w:r>
-      <w:r>
-        <w:t xml:space="preserve"> — the NBC post-disaster hospital angle (below) as </w:t>
-      </w:r>
-      <w:r>
-        <w:rPr>
-          <w:i/>
-          <w:iCs/>
-        </w:rPr>
-        <w:t>added specialist capacity</w:t>
-      </w:r>
-      <w:r>
-        <w:t>, not “you can’t do this” (DIALOG’s in-house team knows the code).</w:t>
-      </w:r>
-    </w:p>
-    <w:p>
-      <w:pPr>
-        <w:pStyle w:val="FirstParagraph"/>
-      </w:pPr>
-      <w:r>
-        <w:rPr>
-          <w:b/>
-          <w:bCs/>
-        </w:rPr>
-        <w:t>Differentiation line [Verified, use this wording]:</w:t>
-      </w:r>
-      <w:r>
-        <w:t xml:space="preserve"> </w:t>
-      </w:r>
-      <w:r>
-        <w:rPr>
-          <w:i/>
-          <w:iCs/>
-        </w:rPr>
-        <w:t>“Since May 1, 2024, Alberta builds to the NBC 2023 Alberta Edition (based on NBC 2020) — hospitals are post-disaster buildings, seismic importance factor 1.5, with the new near-elastic / limited-damage objective. That’s a standard BC firms have designed to for a decade; KOR brings that hospital-seismic depth as added capacity.”</w:t>
-      </w:r>
-      <w:r>
-        <w:t xml:space="preserve"> (Do not call it Alberta-unique — it’s national.)</w:t>
-      </w:r>
-    </w:p>
-    <w:p>
-      <w:r>
-        <w:pict w14:anchorId="5E23FE7F">
-          <v:rect id="_x0000_i1028" style="width:0;height:1.5pt" o:hralign="center" o:hrstd="t" o:hr="t"/>
-        </w:pict>
+        <w:t>Do NOT</w:t>
+      </w:r>
+      <w:r>
+        <w:t xml:space="preserve"> say DIALOG Vancouver has “only one structural engineer” — there are ≥3; the real point is </w:t>
+      </w:r>
+      <w:r>
+        <w:rPr>
+          <w:b/>
+          <w:bCs/>
+        </w:rPr>
+        <w:t>no healthcare specialization</w:t>
+      </w:r>
+      <w:r>
+        <w:t>.</w:t>
+      </w:r>
+    </w:p>
+    <w:p>
+      <w:pPr>
+        <w:pStyle w:val="Compact"/>
+        <w:numPr>
+          <w:ilvl w:val="0"/>
+          <w:numId w:val="4"/>
+        </w:numPr>
+      </w:pPr>
+      <w:r>
+        <w:rPr>
+          <w:b/>
+          <w:bCs/>
+        </w:rPr>
+        <w:t>Do NOT</w:t>
+      </w:r>
+      <w:r>
+        <w:t xml:space="preserve"> attribute Foothills McCaig Tower structural to Stantec — unverified; say “a separate structural firm” (DIALOG was architecture-only).</w:t>
+      </w:r>
+    </w:p>
+    <w:p>
+      <w:pPr>
+        <w:pStyle w:val="Compact"/>
+        <w:numPr>
+          <w:ilvl w:val="0"/>
+          <w:numId w:val="4"/>
+        </w:numPr>
+      </w:pPr>
+      <w:r>
+        <w:rPr>
+          <w:b/>
+          <w:bCs/>
+        </w:rPr>
+        <w:t>Do NOT</w:t>
+      </w:r>
+      <w:r>
+        <w:t xml:space="preserve"> say UHNBC construction starts “fall 2026” — it’s </w:t>
+      </w:r>
+      <w:r>
+        <w:rPr>
+          <w:b/>
+          <w:bCs/>
+        </w:rPr>
+        <w:t>2027</w:t>
+      </w:r>
+      <w:r>
+        <w:t>; design phase through late 2026.</w:t>
+      </w:r>
+    </w:p>
+    <w:p>
+      <w:pPr>
+        <w:pStyle w:val="Compact"/>
+        <w:numPr>
+          <w:ilvl w:val="0"/>
+          <w:numId w:val="4"/>
+        </w:numPr>
+      </w:pPr>
+      <w:r>
+        <w:rPr>
+          <w:b/>
+          <w:bCs/>
+        </w:rPr>
+        <w:t>Do NOT</w:t>
+      </w:r>
+      <w:r>
+        <w:t xml:space="preserve"> say Oosterhof was Rogers Place SE-of-record (TT was prime); or that the AB seismic rule is Alberta-unique (national NBC 2020, effective in AB </w:t>
+      </w:r>
+      <w:r>
+        <w:rPr>
+          <w:b/>
+          <w:bCs/>
+        </w:rPr>
+        <w:t>May 1 2024</w:t>
+      </w:r>
+      <w:r>
+        <w:t>, hospitals post-disaster IE 1.5).</w:t>
       </w:r>
     </w:p>
     <w:p>
@@ -1242,13 +1346,13 @@
         <w:pStyle w:val="Heading2"/>
         <w:pageBreakBefore/>
       </w:pPr>
-      <w:bookmarkStart w:id="8" w:name="X3307e16a0659ff59c2f591c95fcda550004a6d3"/>
-      <w:bookmarkStart w:id="9" w:name="_Toc233750670"/>
-      <w:bookmarkEnd w:id="6"/>
-      <w:r>
-        <w:t>Prerequisites — close before July 10 (only KOR can)</w:t>
-      </w:r>
-      <w:bookmarkEnd w:id="9"/>
+      <w:bookmarkStart w:id="12" w:name="questions-for-georg-josi-july-10"/>
+      <w:bookmarkStart w:id="13" w:name="_Toc233754126"/>
+      <w:bookmarkEnd w:id="10"/>
+      <w:r>
+        <w:t>Questions for Georg Josi (July 10)</w:t>
+      </w:r>
+      <w:bookmarkEnd w:id="13"/>
     </w:p>
     <w:p>
       <w:pPr>
@@ -1259,27 +1363,20 @@
         </w:numPr>
       </w:pPr>
       <w:r>
-        <w:rPr>
-          <w:b/>
-          <w:bCs/>
-        </w:rPr>
-        <w:t>APEGA Permit to Practice + a licensed responsible member.</w:t>
+        <w:t xml:space="preserve">“On </w:t>
+      </w:r>
+      <w:r>
+        <w:rPr>
+          <w:b/>
+          <w:bCs/>
+        </w:rPr>
+        <w:t>UHNBC</w:t>
       </w:r>
       <w:r>
         <w:t xml:space="preserve"> </w:t>
       </w:r>
       <w:r>
-        <w:t xml:space="preserve">Hard legal requirement — </w:t>
-      </w:r>
-      <w:r>
-        <w:rPr>
-          <w:i/>
-          <w:iCs/>
-        </w:rPr>
-        <w:t>no Alberta structural work is possible without it.</w:t>
-      </w:r>
-      <w:r>
-        <w:t xml:space="preserve"> Confirm status.</w:t>
+        <w:t>in Prince George — how are you sourcing structural within the alliance? Is there a role for a BC structural partner?”</w:t>
       </w:r>
     </w:p>
     <w:p>
@@ -1291,21 +1388,31 @@
         </w:numPr>
       </w:pPr>
       <w:r>
-        <w:rPr>
-          <w:b/>
-          <w:bCs/>
-        </w:rPr>
-        <w:t>Nameable BC hospital / high-importance SE references.</w:t>
-      </w:r>
-      <w:r>
-        <w:t xml:space="preserve"> The healthcare pitch is hollow without them — DIALOG’s public portfolio shows KOR none. Line up specific projects to cite.</w:t>
-      </w:r>
-    </w:p>
-    <w:p>
-      <w:r>
-        <w:pict w14:anchorId="25E74520">
-          <v:rect id="_x0000_i1029" style="width:0;height:1.5pt" o:hralign="center" o:hrstd="t" o:hr="t"/>
-        </w:pict>
+        <w:t>“When a hospital hits Kaye/Calgary-Cancer scale under design-build, how do you structure the co-SE — and who do you reach for?”</w:t>
+      </w:r>
+    </w:p>
+    <w:p>
+      <w:pPr>
+        <w:pStyle w:val="Compact"/>
+        <w:numPr>
+          <w:ilvl w:val="0"/>
+          <w:numId w:val="5"/>
+        </w:numPr>
+      </w:pPr>
+      <w:r>
+        <w:t>“Your Vancouver studio’s structural strength is tall-building — how do you cover healthcare structural there?”</w:t>
+      </w:r>
+    </w:p>
+    <w:p>
+      <w:pPr>
+        <w:pStyle w:val="Compact"/>
+        <w:numPr>
+          <w:ilvl w:val="0"/>
+          <w:numId w:val="5"/>
+        </w:numPr>
+      </w:pPr>
+      <w:r>
+        <w:t>“Where’s your structural bandwidth tightest over the next 24 months?”</w:t>
       </w:r>
     </w:p>
     <w:p>
@@ -1313,495 +1420,11 @@
         <w:pStyle w:val="Heading2"/>
         <w:pageBreakBefore/>
       </w:pPr>
-      <w:bookmarkStart w:id="10" w:name="competitors-verified"/>
-      <w:bookmarkStart w:id="11" w:name="_Toc233750671"/>
-      <w:bookmarkEnd w:id="8"/>
-      <w:r>
-        <w:t>Competitors (verified)</w:t>
-      </w:r>
-      <w:bookmarkEnd w:id="11"/>
-    </w:p>
-    <w:tbl>
-      <w:tblPr>
-        <w:tblStyle w:val="GridTable4"/>
-        <w:tblW w:w="5000" w:type="pct"/>
-        <w:tblCellMar>
-          <w:top w:w="40" w:type="dxa"/>
-          <w:left w:w="100" w:type="dxa"/>
-          <w:bottom w:w="40" w:type="dxa"/>
-          <w:right w:w="100" w:type="dxa"/>
-        </w:tblCellMar>
-        <w:tblLook w:val="0420" w:firstRow="1" w:lastRow="0" w:firstColumn="0" w:lastColumn="0" w:noHBand="0" w:noVBand="1"/>
-      </w:tblPr>
-      <w:tblGrid>
-        <w:gridCol w:w="3188"/>
-        <w:gridCol w:w="3187"/>
-        <w:gridCol w:w="3185"/>
-      </w:tblGrid>
-      <w:tr>
-        <w:trPr>
-          <w:cnfStyle w:val="100000000000" w:firstRow="1" w:lastRow="0" w:firstColumn="0" w:lastColumn="0" w:oddVBand="0" w:evenVBand="0" w:oddHBand="0" w:evenHBand="0" w:firstRowFirstColumn="0" w:firstRowLastColumn="0" w:lastRowFirstColumn="0" w:lastRowLastColumn="0"/>
-          <w:cantSplit/>
-          <w:tblHeader/>
-        </w:trPr>
-        <w:tc>
-          <w:tcPr>
-            <w:tcW w:w="1667" w:type="pct"/>
-          </w:tcPr>
-          <w:p>
-            <w:pPr>
-              <w:pStyle w:val="Compact"/>
-              <w:rPr>
-                <w:b w:val="0"/>
-                <w:sz w:val="19"/>
-              </w:rPr>
-            </w:pPr>
-            <w:r>
-              <w:rPr>
-                <w:b w:val="0"/>
-                <w:sz w:val="19"/>
-              </w:rPr>
-              <w:t>Firm</w:t>
-            </w:r>
-          </w:p>
-        </w:tc>
-        <w:tc>
-          <w:tcPr>
-            <w:tcW w:w="1667" w:type="pct"/>
-          </w:tcPr>
-          <w:p>
-            <w:pPr>
-              <w:pStyle w:val="Compact"/>
-              <w:rPr>
-                <w:b w:val="0"/>
-                <w:sz w:val="19"/>
-              </w:rPr>
-            </w:pPr>
-            <w:r>
-              <w:rPr>
-                <w:b w:val="0"/>
-                <w:sz w:val="19"/>
-              </w:rPr>
-              <w:t>Role vs DIALOG</w:t>
-            </w:r>
-          </w:p>
-        </w:tc>
-        <w:tc>
-          <w:tcPr>
-            <w:tcW w:w="1667" w:type="pct"/>
-          </w:tcPr>
-          <w:p>
-            <w:pPr>
-              <w:pStyle w:val="Compact"/>
-              <w:rPr>
-                <w:b w:val="0"/>
-                <w:sz w:val="19"/>
-              </w:rPr>
-            </w:pPr>
-            <w:r>
-              <w:rPr>
-                <w:b w:val="0"/>
-                <w:sz w:val="19"/>
-              </w:rPr>
-              <w:t>Note</w:t>
-            </w:r>
-          </w:p>
-        </w:tc>
-      </w:tr>
-      <w:tr>
-        <w:trPr>
-          <w:cnfStyle w:val="000000100000" w:firstRow="0" w:lastRow="0" w:firstColumn="0" w:lastColumn="0" w:oddVBand="0" w:evenVBand="0" w:oddHBand="1" w:evenHBand="0" w:firstRowFirstColumn="0" w:firstRowLastColumn="0" w:lastRowFirstColumn="0" w:lastRowLastColumn="0"/>
-          <w:cantSplit/>
-        </w:trPr>
-        <w:tc>
-          <w:tcPr>
-            <w:tcW w:w="1667" w:type="pct"/>
-          </w:tcPr>
-          <w:p>
-            <w:pPr>
-              <w:pStyle w:val="Compact"/>
-              <w:rPr>
-                <w:sz w:val="19"/>
-              </w:rPr>
-            </w:pPr>
-            <w:r>
-              <w:rPr>
-                <w:b/>
-                <w:bCs/>
-                <w:sz w:val="19"/>
-              </w:rPr>
-              <w:t>RJC Engineers</w:t>
-            </w:r>
-          </w:p>
-        </w:tc>
-        <w:tc>
-          <w:tcPr>
-            <w:tcW w:w="1667" w:type="pct"/>
-          </w:tcPr>
-          <w:p>
-            <w:pPr>
-              <w:pStyle w:val="Compact"/>
-              <w:rPr>
-                <w:sz w:val="19"/>
-              </w:rPr>
-            </w:pPr>
-            <w:r>
-              <w:rPr>
-                <w:sz w:val="19"/>
-              </w:rPr>
-              <w:t>Incumbent — towers + AB healthcare (South Health Campus)</w:t>
-            </w:r>
-          </w:p>
-        </w:tc>
-        <w:tc>
-          <w:tcPr>
-            <w:tcW w:w="1667" w:type="pct"/>
-          </w:tcPr>
-          <w:p>
-            <w:pPr>
-              <w:pStyle w:val="Compact"/>
-              <w:rPr>
-                <w:sz w:val="19"/>
-              </w:rPr>
-            </w:pPr>
-            <w:r>
-              <w:rPr>
-                <w:sz w:val="19"/>
-              </w:rPr>
-              <w:t>The one to displace on healthcare</w:t>
-            </w:r>
-          </w:p>
-        </w:tc>
-      </w:tr>
-      <w:tr>
-        <w:trPr>
-          <w:cantSplit/>
-        </w:trPr>
-        <w:tc>
-          <w:tcPr>
-            <w:tcW w:w="1667" w:type="pct"/>
-          </w:tcPr>
-          <w:p>
-            <w:pPr>
-              <w:pStyle w:val="Compact"/>
-              <w:rPr>
-                <w:sz w:val="19"/>
-              </w:rPr>
-            </w:pPr>
-            <w:r>
-              <w:rPr>
-                <w:b/>
-                <w:bCs/>
-                <w:sz w:val="19"/>
-              </w:rPr>
-              <w:t>Fast+Epp</w:t>
-            </w:r>
-          </w:p>
-        </w:tc>
-        <w:tc>
-          <w:tcPr>
-            <w:tcW w:w="1667" w:type="pct"/>
-          </w:tcPr>
-          <w:p>
-            <w:pPr>
-              <w:pStyle w:val="Compact"/>
-              <w:rPr>
-                <w:sz w:val="19"/>
-              </w:rPr>
-            </w:pPr>
-            <w:r>
-              <w:rPr>
-                <w:sz w:val="19"/>
-              </w:rPr>
-              <w:t>Mass-timber partner (Edmonton office since 2012)</w:t>
-            </w:r>
-          </w:p>
-        </w:tc>
-        <w:tc>
-          <w:tcPr>
-            <w:tcW w:w="1667" w:type="pct"/>
-          </w:tcPr>
-          <w:p>
-            <w:pPr>
-              <w:pStyle w:val="Compact"/>
-              <w:rPr>
-                <w:sz w:val="19"/>
-              </w:rPr>
-            </w:pPr>
-            <w:r>
-              <w:rPr>
-                <w:sz w:val="19"/>
-              </w:rPr>
-              <w:t>Don’t contest this lane</w:t>
-            </w:r>
-          </w:p>
-        </w:tc>
-      </w:tr>
-      <w:tr>
-        <w:trPr>
-          <w:cnfStyle w:val="000000100000" w:firstRow="0" w:lastRow="0" w:firstColumn="0" w:lastColumn="0" w:oddVBand="0" w:evenVBand="0" w:oddHBand="1" w:evenHBand="0" w:firstRowFirstColumn="0" w:firstRowLastColumn="0" w:lastRowFirstColumn="0" w:lastRowLastColumn="0"/>
-          <w:cantSplit/>
-        </w:trPr>
-        <w:tc>
-          <w:tcPr>
-            <w:tcW w:w="1667" w:type="pct"/>
-          </w:tcPr>
-          <w:p>
-            <w:pPr>
-              <w:pStyle w:val="Compact"/>
-              <w:rPr>
-                <w:sz w:val="19"/>
-              </w:rPr>
-            </w:pPr>
-            <w:r>
-              <w:rPr>
-                <w:b/>
-                <w:bCs/>
-                <w:sz w:val="19"/>
-              </w:rPr>
-              <w:t>Thornton Tomasetti</w:t>
-            </w:r>
-          </w:p>
-        </w:tc>
-        <w:tc>
-          <w:tcPr>
-            <w:tcW w:w="1667" w:type="pct"/>
-          </w:tcPr>
-          <w:p>
-            <w:pPr>
-              <w:pStyle w:val="Compact"/>
-              <w:rPr>
-                <w:sz w:val="19"/>
-              </w:rPr>
-            </w:pPr>
-            <w:r>
-              <w:rPr>
-                <w:sz w:val="19"/>
-              </w:rPr>
-              <w:t>HNTB’s venue SE (Rogers Place, Ryan Field, Vegas A’s)</w:t>
-            </w:r>
-          </w:p>
-        </w:tc>
-        <w:tc>
-          <w:tcPr>
-            <w:tcW w:w="1667" w:type="pct"/>
-          </w:tcPr>
-          <w:p>
-            <w:pPr>
-              <w:pStyle w:val="Compact"/>
-              <w:rPr>
-                <w:sz w:val="19"/>
-              </w:rPr>
-            </w:pPr>
-            <w:r>
-              <w:rPr>
-                <w:sz w:val="19"/>
-              </w:rPr>
-              <w:t>Threat on Event Park if HNTB drives SE</w:t>
-            </w:r>
-          </w:p>
-        </w:tc>
-      </w:tr>
-      <w:tr>
-        <w:trPr>
-          <w:cantSplit/>
-        </w:trPr>
-        <w:tc>
-          <w:tcPr>
-            <w:tcW w:w="1667" w:type="pct"/>
-          </w:tcPr>
-          <w:p>
-            <w:pPr>
-              <w:pStyle w:val="Compact"/>
-              <w:rPr>
-                <w:sz w:val="19"/>
-              </w:rPr>
-            </w:pPr>
-            <w:r>
-              <w:rPr>
-                <w:b/>
-                <w:bCs/>
-                <w:sz w:val="19"/>
-              </w:rPr>
-              <w:t>Entuitive</w:t>
-            </w:r>
-          </w:p>
-        </w:tc>
-        <w:tc>
-          <w:tcPr>
-            <w:tcW w:w="1667" w:type="pct"/>
-          </w:tcPr>
-          <w:p>
-            <w:pPr>
-              <w:pStyle w:val="Compact"/>
-              <w:rPr>
-                <w:sz w:val="19"/>
-              </w:rPr>
-            </w:pPr>
-            <w:r>
-              <w:rPr>
-                <w:sz w:val="19"/>
-              </w:rPr>
-              <w:t>Edmonton office (2016), institutional</w:t>
-            </w:r>
-          </w:p>
-        </w:tc>
-        <w:tc>
-          <w:tcPr>
-            <w:tcW w:w="1667" w:type="pct"/>
-          </w:tcPr>
-          <w:p>
-            <w:pPr>
-              <w:pStyle w:val="Compact"/>
-              <w:rPr>
-                <w:sz w:val="19"/>
-              </w:rPr>
-            </w:pPr>
-            <w:r>
-              <w:rPr>
-                <w:b/>
-                <w:bCs/>
-                <w:sz w:val="19"/>
-              </w:rPr>
-              <w:t>No AB hospital record — don’t overstate</w:t>
-            </w:r>
-          </w:p>
-        </w:tc>
-      </w:tr>
-      <w:tr>
-        <w:trPr>
-          <w:cnfStyle w:val="000000100000" w:firstRow="0" w:lastRow="0" w:firstColumn="0" w:lastColumn="0" w:oddVBand="0" w:evenVBand="0" w:oddHBand="1" w:evenHBand="0" w:firstRowFirstColumn="0" w:firstRowLastColumn="0" w:lastRowFirstColumn="0" w:lastRowLastColumn="0"/>
-          <w:cantSplit/>
-        </w:trPr>
-        <w:tc>
-          <w:tcPr>
-            <w:tcW w:w="1667" w:type="pct"/>
-          </w:tcPr>
-          <w:p>
-            <w:pPr>
-              <w:pStyle w:val="Compact"/>
-              <w:rPr>
-                <w:sz w:val="19"/>
-              </w:rPr>
-            </w:pPr>
-            <w:r>
-              <w:rPr>
-                <w:b/>
-                <w:bCs/>
-                <w:sz w:val="19"/>
-              </w:rPr>
-              <w:t>Jacobs (ex-Yolles)</w:t>
-            </w:r>
-          </w:p>
-        </w:tc>
-        <w:tc>
-          <w:tcPr>
-            <w:tcW w:w="1667" w:type="pct"/>
-          </w:tcPr>
-          <w:p>
-            <w:pPr>
-              <w:pStyle w:val="Compact"/>
-              <w:rPr>
-                <w:sz w:val="19"/>
-              </w:rPr>
-            </w:pPr>
-            <w:r>
-              <w:rPr>
-                <w:sz w:val="19"/>
-              </w:rPr>
-              <w:t>The Kaye co-SE precedent</w:t>
-            </w:r>
-          </w:p>
-        </w:tc>
-        <w:tc>
-          <w:tcPr>
-            <w:tcW w:w="1667" w:type="pct"/>
-          </w:tcPr>
-          <w:p>
-            <w:pPr>
-              <w:pStyle w:val="Compact"/>
-              <w:rPr>
-                <w:sz w:val="19"/>
-              </w:rPr>
-            </w:pPr>
-            <w:r>
-              <w:rPr>
-                <w:sz w:val="19"/>
-              </w:rPr>
-              <w:t>Context</w:t>
-            </w:r>
-          </w:p>
-        </w:tc>
-      </w:tr>
-    </w:tbl>
-    <w:p>
-      <w:pPr>
-        <w:pStyle w:val="Heading2"/>
-        <w:pageBreakBefore/>
-      </w:pPr>
-      <w:bookmarkStart w:id="12" w:name="Xd40ded752b374a398f2a0a175309d20f08e809e"/>
-      <w:bookmarkStart w:id="13" w:name="_Toc233750672"/>
-      <w:bookmarkEnd w:id="10"/>
-      <w:r>
-        <w:t>DIALOG Edmonton structural bench (verified — this is why they self-perform)</w:t>
-      </w:r>
-      <w:bookmarkEnd w:id="13"/>
-    </w:p>
-    <w:p>
-      <w:pPr>
-        <w:pStyle w:val="FirstParagraph"/>
-      </w:pPr>
-      <w:r>
-        <w:t xml:space="preserve">Georg Josi (Partner, Studio Chair) · </w:t>
-      </w:r>
-      <w:r>
-        <w:rPr>
-          <w:b/>
-          <w:bCs/>
-        </w:rPr>
-        <w:t>Steven Oosterhof</w:t>
-      </w:r>
-      <w:r>
-        <w:t xml:space="preserve"> (Partner, PhD/PEng/PE/SE — venue/ICE District) · </w:t>
-      </w:r>
-      <w:r>
-        <w:rPr>
-          <w:b/>
-          <w:bCs/>
-        </w:rPr>
-        <w:t>Neil Robson</w:t>
-      </w:r>
-      <w:r>
-        <w:t xml:space="preserve"> </w:t>
-      </w:r>
-      <w:r>
-        <w:t xml:space="preserve">(Partner — transport/institutional) · Sandra Renihan (Partner, Edmonton, transit-focus) · Steven Prozniak (Assoc, bridges) · Ryan Renihan, Larissa Ulcar, Victoria Buffam (Assoc) · Jeff DiBattista (Partner Emeritus, engaged). </w:t>
-      </w:r>
-      <w:r>
-        <w:rPr>
-          <w:i/>
-          <w:iCs/>
-        </w:rPr>
-        <w:t>(Calgary healthcare structural: Ralph Hildenbrandt, Chris Lenzin.)</w:t>
-      </w:r>
-    </w:p>
-    <w:p>
-      <w:r>
-        <w:pict w14:anchorId="3453A12F">
-          <v:rect id="_x0000_i1030" style="width:0;height:1.5pt" o:hralign="center" o:hrstd="t" o:hr="t"/>
-        </w:pict>
-      </w:r>
-    </w:p>
-    <w:p>
-      <w:pPr>
-        <w:pStyle w:val="Heading2"/>
-        <w:pageBreakBefore/>
-      </w:pPr>
-      <w:bookmarkStart w:id="14" w:name="do-not-say-fact-check-landmines"/>
-      <w:bookmarkStart w:id="15" w:name="_Toc233750673"/>
+      <w:bookmarkStart w:id="14" w:name="X3307e16a0659ff59c2f591c95fcda550004a6d3"/>
+      <w:bookmarkStart w:id="15" w:name="_Toc233754127"/>
       <w:bookmarkEnd w:id="12"/>
       <w:r>
-        <w:t>Do NOT say (fact-check landmines)</w:t>
+        <w:t>Prerequisites — close before July 10 (only KOR can)</w:t>
       </w:r>
       <w:bookmarkEnd w:id="15"/>
     </w:p>
@@ -1818,20 +1441,20 @@
           <w:b/>
           <w:bCs/>
         </w:rPr>
-        <w:t>Do NOT</w:t>
-      </w:r>
-      <w:r>
-        <w:t xml:space="preserve"> say “DIALOG outsources hospital structural” — </w:t>
-      </w:r>
-      <w:r>
-        <w:rPr>
-          <w:b/>
-          <w:bCs/>
-        </w:rPr>
-        <w:t>refuted;</w:t>
-      </w:r>
-      <w:r>
-        <w:t xml:space="preserve"> they self-perform (Hildenbrandt/Renihan/Lenzin lead it). This would be embarrassing in front of their engineers.</w:t>
+        <w:t>APEGA Permit to Practice</w:t>
+      </w:r>
+      <w:r>
+        <w:t xml:space="preserve"> </w:t>
+      </w:r>
+      <w:r>
+        <w:t xml:space="preserve">for any Alberta work (hard requirement) — </w:t>
+      </w:r>
+      <w:r>
+        <w:rPr>
+          <w:i/>
+          <w:iCs/>
+        </w:rPr>
+        <w:t>though UHNBC being in BC removes this barrier for the best opening.</w:t>
       </w:r>
     </w:p>
     <w:p>
@@ -1847,173 +1470,16 @@
           <w:b/>
           <w:bCs/>
         </w:rPr>
-        <w:t>Do NOT</w:t>
-      </w:r>
-      <w:r>
-        <w:t xml:space="preserve"> </w:t>
-      </w:r>
-      <w:r>
-        <w:t>present Event Park or NAIT as open SE seats — likely self-performed / TT.</w:t>
-      </w:r>
-    </w:p>
-    <w:p>
-      <w:pPr>
-        <w:pStyle w:val="Compact"/>
-        <w:numPr>
-          <w:ilvl w:val="0"/>
-          <w:numId w:val="6"/>
-        </w:numPr>
-      </w:pPr>
-      <w:r>
-        <w:rPr>
-          <w:b/>
-          <w:bCs/>
-        </w:rPr>
-        <w:t>Do NOT</w:t>
-      </w:r>
-      <w:r>
-        <w:t xml:space="preserve"> say Oosterhof was Rogers Place SE-of-record — </w:t>
-      </w:r>
-      <w:r>
-        <w:rPr>
-          <w:b/>
-          <w:bCs/>
-        </w:rPr>
-        <w:t>TT was prime;</w:t>
-      </w:r>
-      <w:r>
-        <w:t xml:space="preserve"> DIALOG was associate structural.</w:t>
-      </w:r>
-    </w:p>
-    <w:p>
-      <w:pPr>
-        <w:pStyle w:val="Compact"/>
-        <w:numPr>
-          <w:ilvl w:val="0"/>
-          <w:numId w:val="6"/>
-        </w:numPr>
-      </w:pPr>
-      <w:r>
-        <w:rPr>
-          <w:b/>
-          <w:bCs/>
-        </w:rPr>
-        <w:t>Do NOT</w:t>
-      </w:r>
-      <w:r>
-        <w:t xml:space="preserve"> assert “Chris Minerva (TT) holds an Alberta PEng” — unverified (aggregator only); check APEGA directory first if it matters.</w:t>
-      </w:r>
-    </w:p>
-    <w:p>
-      <w:pPr>
-        <w:pStyle w:val="Compact"/>
-        <w:numPr>
-          <w:ilvl w:val="0"/>
-          <w:numId w:val="6"/>
-        </w:numPr>
-      </w:pPr>
-      <w:r>
-        <w:rPr>
-          <w:b/>
-          <w:bCs/>
-        </w:rPr>
-        <w:t>Do NOT</w:t>
-      </w:r>
-      <w:r>
-        <w:t xml:space="preserve"> call the seismic requirement Alberta-unique, or date it “2023” — it’s national NBC 2020, effective in AB </w:t>
-      </w:r>
-      <w:r>
-        <w:rPr>
-          <w:b/>
-          <w:bCs/>
-        </w:rPr>
-        <w:t>May 1 2024.</w:t>
-      </w:r>
-    </w:p>
-    <w:p>
-      <w:pPr>
-        <w:pStyle w:val="Compact"/>
-        <w:numPr>
-          <w:ilvl w:val="0"/>
-          <w:numId w:val="6"/>
-        </w:numPr>
-      </w:pPr>
-      <w:r>
-        <w:rPr>
-          <w:b/>
-          <w:bCs/>
-        </w:rPr>
-        <w:t>Do NOT</w:t>
-      </w:r>
-      <w:r>
-        <w:t xml:space="preserve"> overstate Entuitive’s AB hospital experience — they have none public.</w:t>
-      </w:r>
-    </w:p>
-    <w:p>
-      <w:pPr>
-        <w:pStyle w:val="Heading2"/>
-        <w:pageBreakBefore/>
-      </w:pPr>
-      <w:bookmarkStart w:id="16" w:name="Xbdf629063cf397fd895ceeefa7c0f09d39fa798"/>
-      <w:bookmarkStart w:id="17" w:name="_Toc233750674"/>
-      <w:bookmarkEnd w:id="14"/>
-      <w:r>
-        <w:t>Reframed questions for Georg Josi (relationship, not seat-hunting)</w:t>
-      </w:r>
-      <w:bookmarkEnd w:id="17"/>
-    </w:p>
-    <w:p>
-      <w:pPr>
-        <w:pStyle w:val="Compact"/>
-        <w:numPr>
-          <w:ilvl w:val="0"/>
-          <w:numId w:val="7"/>
-        </w:numPr>
-      </w:pPr>
-      <w:r>
-        <w:t>“When a hospital hits Kaye-scale, or your team’s stacked, do you still bring in a co-SE — and who do you reach for?”</w:t>
-      </w:r>
-    </w:p>
-    <w:p>
-      <w:pPr>
-        <w:pStyle w:val="Compact"/>
-        <w:numPr>
-          <w:ilvl w:val="0"/>
-          <w:numId w:val="7"/>
-        </w:numPr>
-      </w:pPr>
-      <w:r>
-        <w:t>“On the acute-care towers coming (Misericordia/Grey Nuns), are you positioning for the architect role — and how do you structure structural on those?”</w:t>
-      </w:r>
-    </w:p>
-    <w:p>
-      <w:pPr>
-        <w:pStyle w:val="Compact"/>
-        <w:numPr>
-          <w:ilvl w:val="0"/>
-          <w:numId w:val="7"/>
-        </w:numPr>
-      </w:pPr>
-      <w:r>
-        <w:t>“Where’s your structural bandwidth tightest over the next 24 months?”</w:t>
-      </w:r>
-    </w:p>
-    <w:p>
-      <w:pPr>
-        <w:pStyle w:val="Compact"/>
-        <w:numPr>
-          <w:ilvl w:val="0"/>
-          <w:numId w:val="7"/>
-        </w:numPr>
-      </w:pPr>
-      <w:r>
-        <w:t>“What would make an external structural partner genuinely useful to your Edmonton studio — capacity, a specialty, a geography?”</w:t>
-      </w:r>
-    </w:p>
-    <w:p>
-      <w:r>
-        <w:pict w14:anchorId="075B69A2">
-          <v:rect id="_x0000_i1031" style="width:0;height:1.5pt" o:hralign="center" o:hrstd="t" o:hr="t"/>
+        <w:t>Nameable BC hospital / high-importance SE references</w:t>
+      </w:r>
+      <w:r>
+        <w:t xml:space="preserve"> — the healthcare-seismic wedge (NBC post-disaster, IE 1.5, effective AB May 1 2024) is only credible with real references.</w:t>
+      </w:r>
+    </w:p>
+    <w:p>
+      <w:r>
+        <w:pict w14:anchorId="542BD2A2">
+          <v:rect id="_x0000_i1030" style="width:0;height:1.5pt" o:hralign="center" o:hrstd="t" o:hr="t"/>
         </w:pict>
       </w:r>
     </w:p>
@@ -2026,17 +1492,10 @@
           <w:i/>
           <w:iCs/>
         </w:rPr>
-        <w:t xml:space="preserve">Verification: 2 research passes + 4 adversarial primary-source fact-checks (SE credits, project currency, roster, self-perform/venue-SE, regulatory/pipeline), 2026-06-30. Sources: dialogdesign.ca, majorprojects.alberta.ca, alberta.ca, apega.ca, thorntontomasetti.com, oeg.ca, rjc.ca, fastepp.com, entuitive.com, Canadian Consulting Engineer/Architect. Confidence per claim; </w:t>
-      </w:r>
-      <w:r>
-        <w:rPr>
-          <w:i/>
-          <w:iCs/>
-        </w:rPr>
-        <w:t>“[Hypothesis]” = test in the room, do not assert.</w:t>
+        <w:t>Verification: 4 research passes (2 SE-mechanics/pipeline, 2 portfolio catalogue) + 6 adversarial primary-source fact-checks (~60 projects), 2026-06-30. Sources: dialogdesign.ca, majorprojects.alberta.ca, infrastructurebc.com, northernhealth.ca, alberta.ca, apega.ca, entuitive.com, glotmansimpson.com, thorntontomasetti.com, archdaily.com, Canadian Consulting Engineer/Architect, rjc.ca, fastepp.com. Confidence per claim; “[Hypothesis]” = test in the room, do not assert.</w:t>
       </w:r>
       <w:bookmarkEnd w:id="0"/>
-      <w:bookmarkEnd w:id="16"/>
+      <w:bookmarkEnd w:id="14"/>
     </w:p>
     <w:sectPr>
       <w:footnotePr>
@@ -2055,7 +1514,7 @@
   <w:abstractNum w:abstractNumId="0" w15:restartNumberingAfterBreak="0">
     <w:nsid w:val="0000A990"/>
     <w:multiLevelType w:val="multilevel"/>
-    <w:tmpl w:val="2522EBDE"/>
+    <w:tmpl w:val="F66073CA"/>
     <w:lvl w:ilvl="0">
       <w:numFmt w:val="bullet"/>
       <w:lvlText w:val=" "/>
@@ -2132,7 +1591,7 @@
   <w:abstractNum w:abstractNumId="1" w15:restartNumberingAfterBreak="0">
     <w:nsid w:val="0000A991"/>
     <w:multiLevelType w:val="multilevel"/>
-    <w:tmpl w:val="9E6ACCD0"/>
+    <w:tmpl w:val="A88ED7D4"/>
     <w:lvl w:ilvl="0">
       <w:numFmt w:val="bullet"/>
       <w:lvlText w:val=""/>
@@ -2236,7 +1695,7 @@
   <w:abstractNum w:abstractNumId="2" w15:restartNumberingAfterBreak="0">
     <w:nsid w:val="00A99411"/>
     <w:multiLevelType w:val="multilevel"/>
-    <w:tmpl w:val="CB7838CE"/>
+    <w:tmpl w:val="14D4904A"/>
     <w:lvl w:ilvl="0">
       <w:start w:val="1"/>
       <w:numFmt w:val="decimal"/>
@@ -2319,10 +1778,10 @@
       </w:pPr>
     </w:lvl>
   </w:abstractNum>
-  <w:num w:numId="1" w16cid:durableId="6371389">
+  <w:num w:numId="1" w16cid:durableId="926841863">
     <w:abstractNumId w:val="0"/>
   </w:num>
-  <w:num w:numId="2" w16cid:durableId="1802572104">
+  <w:num w:numId="2" w16cid:durableId="535118067">
     <w:abstractNumId w:val="2"/>
     <w:lvlOverride w:ilvl="0">
       <w:startOverride w:val="1"/>
@@ -2352,10 +1811,10 @@
       <w:startOverride w:val="1"/>
     </w:lvlOverride>
   </w:num>
-  <w:num w:numId="3" w16cid:durableId="1896773373">
+  <w:num w:numId="3" w16cid:durableId="1889293693">
     <w:abstractNumId w:val="1"/>
   </w:num>
-  <w:num w:numId="4" w16cid:durableId="374504438">
+  <w:num w:numId="4" w16cid:durableId="1126629617">
     <w:abstractNumId w:val="2"/>
     <w:lvlOverride w:ilvl="0">
       <w:startOverride w:val="1"/>
@@ -2385,7 +1844,7 @@
       <w:startOverride w:val="1"/>
     </w:lvlOverride>
   </w:num>
-  <w:num w:numId="5" w16cid:durableId="1386182237">
+  <w:num w:numId="5" w16cid:durableId="375783944">
     <w:abstractNumId w:val="2"/>
     <w:lvlOverride w:ilvl="0">
       <w:startOverride w:val="1"/>
@@ -2415,37 +1874,7 @@
       <w:startOverride w:val="1"/>
     </w:lvlOverride>
   </w:num>
-  <w:num w:numId="6" w16cid:durableId="313727428">
-    <w:abstractNumId w:val="2"/>
-    <w:lvlOverride w:ilvl="0">
-      <w:startOverride w:val="1"/>
-    </w:lvlOverride>
-    <w:lvlOverride w:ilvl="1">
-      <w:startOverride w:val="1"/>
-    </w:lvlOverride>
-    <w:lvlOverride w:ilvl="2">
-      <w:startOverride w:val="1"/>
-    </w:lvlOverride>
-    <w:lvlOverride w:ilvl="3">
-      <w:startOverride w:val="1"/>
-    </w:lvlOverride>
-    <w:lvlOverride w:ilvl="4">
-      <w:startOverride w:val="1"/>
-    </w:lvlOverride>
-    <w:lvlOverride w:ilvl="5">
-      <w:startOverride w:val="1"/>
-    </w:lvlOverride>
-    <w:lvlOverride w:ilvl="6">
-      <w:startOverride w:val="1"/>
-    </w:lvlOverride>
-    <w:lvlOverride w:ilvl="7">
-      <w:startOverride w:val="1"/>
-    </w:lvlOverride>
-    <w:lvlOverride w:ilvl="8">
-      <w:startOverride w:val="1"/>
-    </w:lvlOverride>
-  </w:num>
-  <w:num w:numId="7" w16cid:durableId="258029712">
+  <w:num w:numId="6" w16cid:durableId="1516915439">
     <w:abstractNumId w:val="2"/>
     <w:lvlOverride w:ilvl="0">
       <w:startOverride w:val="1"/>
@@ -3713,7 +3142,7 @@
     <w:next w:val="Normal"/>
     <w:autoRedefine/>
     <w:uiPriority w:val="39"/>
-    <w:rsid w:val="0013381C"/>
+    <w:rsid w:val="003663E5"/>
     <w:pPr>
       <w:spacing w:after="100"/>
     </w:pPr>
@@ -3724,87 +3153,11 @@
     <w:next w:val="Normal"/>
     <w:autoRedefine/>
     <w:uiPriority w:val="39"/>
-    <w:rsid w:val="0013381C"/>
+    <w:rsid w:val="003663E5"/>
     <w:pPr>
       <w:spacing w:after="100"/>
       <w:ind w:left="240"/>
     </w:pPr>
-  </w:style>
-  <w:style w:type="table" w:styleId="GridTable4">
-    <w:name w:val="Grid Table 4"/>
-    <w:basedOn w:val="TableNormal"/>
-    <w:uiPriority w:val="49"/>
-    <w:rsid w:val="0013381C"/>
-    <w:pPr>
-      <w:spacing w:after="0"/>
-    </w:pPr>
-    <w:tblPr>
-      <w:tblStyleRowBandSize w:val="1"/>
-      <w:tblStyleColBandSize w:val="1"/>
-      <w:tblBorders>
-        <w:top w:val="single" w:sz="4" w:space="0" w:color="666666" w:themeColor="text1" w:themeTint="99"/>
-        <w:left w:val="single" w:sz="4" w:space="0" w:color="666666" w:themeColor="text1" w:themeTint="99"/>
-        <w:bottom w:val="single" w:sz="4" w:space="0" w:color="666666" w:themeColor="text1" w:themeTint="99"/>
-        <w:right w:val="single" w:sz="4" w:space="0" w:color="666666" w:themeColor="text1" w:themeTint="99"/>
-        <w:insideH w:val="single" w:sz="4" w:space="0" w:color="666666" w:themeColor="text1" w:themeTint="99"/>
-        <w:insideV w:val="single" w:sz="4" w:space="0" w:color="666666" w:themeColor="text1" w:themeTint="99"/>
-      </w:tblBorders>
-    </w:tblPr>
-    <w:tblStylePr w:type="firstRow">
-      <w:rPr>
-        <w:b/>
-        <w:bCs/>
-        <w:color w:val="FFFFFF" w:themeColor="background1"/>
-      </w:rPr>
-      <w:tblPr/>
-      <w:tcPr>
-        <w:tcBorders>
-          <w:top w:val="single" w:sz="4" w:space="0" w:color="000000" w:themeColor="text1"/>
-          <w:left w:val="single" w:sz="4" w:space="0" w:color="000000" w:themeColor="text1"/>
-          <w:bottom w:val="single" w:sz="4" w:space="0" w:color="000000" w:themeColor="text1"/>
-          <w:right w:val="single" w:sz="4" w:space="0" w:color="000000" w:themeColor="text1"/>
-          <w:insideH w:val="nil"/>
-          <w:insideV w:val="nil"/>
-        </w:tcBorders>
-        <w:shd w:val="clear" w:color="auto" w:fill="000000" w:themeFill="text1"/>
-      </w:tcPr>
-    </w:tblStylePr>
-    <w:tblStylePr w:type="lastRow">
-      <w:rPr>
-        <w:b/>
-        <w:bCs/>
-      </w:rPr>
-      <w:tblPr/>
-      <w:tcPr>
-        <w:tcBorders>
-          <w:top w:val="double" w:sz="4" w:space="0" w:color="000000" w:themeColor="text1"/>
-        </w:tcBorders>
-      </w:tcPr>
-    </w:tblStylePr>
-    <w:tblStylePr w:type="firstCol">
-      <w:rPr>
-        <w:b/>
-        <w:bCs/>
-      </w:rPr>
-    </w:tblStylePr>
-    <w:tblStylePr w:type="lastCol">
-      <w:rPr>
-        <w:b/>
-        <w:bCs/>
-      </w:rPr>
-    </w:tblStylePr>
-    <w:tblStylePr w:type="band1Vert">
-      <w:tblPr/>
-      <w:tcPr>
-        <w:shd w:val="clear" w:color="auto" w:fill="CCCCCC" w:themeFill="text1" w:themeFillTint="33"/>
-      </w:tcPr>
-    </w:tblStylePr>
-    <w:tblStylePr w:type="band1Horz">
-      <w:tblPr/>
-      <w:tcPr>
-        <w:shd w:val="clear" w:color="auto" w:fill="CCCCCC" w:themeFill="text1" w:themeFillTint="33"/>
-      </w:tcPr>
-    </w:tblStylePr>
   </w:style>
 </w:styles>
 </file>

</xml_diff>

<commit_message>
docs(bd): DIALOG brief — enriched (bench map, firm profile, positioning, appendices) + denser layout
Added substantial verified depth: structural-bench-by-studio-and-domain (who owns
what; Oosterhof = only firm-wide seismic specialist; AB capacity contracting),
firm profile (partner-owned, 600+ staff, B Corp, SE 2050, alliance-fluent, Chair
Gomez-Palacio), positioning playbook ("integrated team" language, wellbeing +
embodied-carbon story, Fast+Epp-on-The-Hive precedent), competitor frame
(RJC/Entuitive/Glotman/BuroHappold), and two project-evidence appendices (~60
projects). Corrected the tower trigger: height is NOT the trigger (DIALOG
self-performs Shangri-La 62/65st in-house) — role/design-architect-led is.
Regenerated DOCX with -NoPageBreaks (dense, no sparse white space).

Co-Authored-By: Claude Opus 4.8 <noreply@anthropic.com>
</commit_message>
<xml_diff>
--- a/docs/KOR-DIALOG-Edmonton-Structural-Outsourcing-2026-06-30.docx
+++ b/docs/KOR-DIALOG-Edmonton-Structural-Outsourcing-2026-06-30.docx
@@ -2,607 +2,14 @@
 <file path=word/document.xml><?xml version="1.0" encoding="utf-8"?>
 <w:document xmlns:wpc="http://schemas.microsoft.com/office/word/2010/wordprocessingCanvas" xmlns:cx="http://schemas.microsoft.com/office/drawing/2014/chartex" xmlns:cx1="http://schemas.microsoft.com/office/drawing/2015/9/8/chartex" xmlns:cx2="http://schemas.microsoft.com/office/drawing/2015/10/21/chartex" xmlns:cx3="http://schemas.microsoft.com/office/drawing/2016/5/9/chartex" xmlns:cx4="http://schemas.microsoft.com/office/drawing/2016/5/10/chartex" xmlns:cx5="http://schemas.microsoft.com/office/drawing/2016/5/11/chartex" xmlns:cx6="http://schemas.microsoft.com/office/drawing/2016/5/12/chartex" xmlns:cx7="http://schemas.microsoft.com/office/drawing/2016/5/13/chartex" xmlns:cx8="http://schemas.microsoft.com/office/drawing/2016/5/14/chartex" xmlns:mc="http://schemas.openxmlformats.org/markup-compatibility/2006" xmlns:aink="http://schemas.microsoft.com/office/drawing/2016/ink" xmlns:am3d="http://schemas.microsoft.com/office/drawing/2017/model3d" xmlns:o="urn:schemas-microsoft-com:office:office" xmlns:oel="http://schemas.microsoft.com/office/2019/extlst" xmlns:r="http://schemas.openxmlformats.org/officeDocument/2006/relationships" xmlns:m="http://schemas.openxmlformats.org/officeDocument/2006/math" xmlns:v="urn:schemas-microsoft-com:vml" xmlns:wp14="http://schemas.microsoft.com/office/word/2010/wordprocessingDrawing" xmlns:wp="http://schemas.openxmlformats.org/drawingml/2006/wordprocessingDrawing" xmlns:w10="urn:schemas-microsoft-com:office:word" xmlns:w="http://schemas.openxmlformats.org/wordprocessingml/2006/main" xmlns:w14="http://schemas.microsoft.com/office/word/2010/wordml" xmlns:w15="http://schemas.microsoft.com/office/word/2012/wordml" xmlns:w16cex="http://schemas.microsoft.com/office/word/2018/wordml/cex" xmlns:w16cid="http://schemas.microsoft.com/office/word/2016/wordml/cid" xmlns:w16="http://schemas.microsoft.com/office/word/2018/wordml" xmlns:w16du="http://schemas.microsoft.com/office/word/2023/wordml/word16du" xmlns:w16sdtdh="http://schemas.microsoft.com/office/word/2020/wordml/sdtdatahash" xmlns:w16sdtfl="http://schemas.microsoft.com/office/word/2024/wordml/sdtformatlock" xmlns:w16se="http://schemas.microsoft.com/office/word/2015/wordml/symex" xmlns:wpg="http://schemas.microsoft.com/office/word/2010/wordprocessingGroup" xmlns:wpi="http://schemas.microsoft.com/office/word/2010/wordprocessingInk" xmlns:wne="http://schemas.microsoft.com/office/word/2006/wordml" xmlns:wps="http://schemas.microsoft.com/office/word/2010/wordprocessingShape" mc:Ignorable="w14 w15 w16se w16cid w16 w16cex w16sdtdh w16sdtfl w16du wp14">
   <w:body>
-    <w:sdt>
-      <w:sdtPr>
-        <w:rPr>
-          <w:rFonts w:asciiTheme="minorHAnsi" w:eastAsiaTheme="minorEastAsia" w:hAnsiTheme="minorHAnsi" w:cstheme="minorBidi"/>
-          <w:color w:val="auto"/>
-          <w:sz w:val="24"/>
-          <w:szCs w:val="24"/>
-        </w:rPr>
-        <w:id w:val="677770361"/>
-        <w:docPartObj>
-          <w:docPartGallery w:val="Table of Contents"/>
-          <w:docPartUnique/>
-        </w:docPartObj>
-      </w:sdtPr>
-      <w:sdtEndPr>
-        <w:rPr>
-          <w:rFonts w:ascii="Calibri" w:hAnsi="Calibri" w:cs="Calibri"/>
-          <w:b w:val="0"/>
-          <w:sz w:val="21"/>
-        </w:rPr>
-      </w:sdtEndPr>
-      <w:sdtContent>
-        <w:p>
-          <w:pPr>
-            <w:pStyle w:val="TOCHeading"/>
-            <w:pageBreakBefore/>
-          </w:pPr>
-          <w:r>
-            <w:t>Table of Contents</w:t>
-          </w:r>
-        </w:p>
-        <w:p>
-          <w:pPr>
-            <w:pStyle w:val="TOC1"/>
-            <w:tabs>
-              <w:tab w:val="right" w:leader="dot" w:pos="9350"/>
-            </w:tabs>
-            <w:rPr>
-              <w:noProof/>
-            </w:rPr>
-          </w:pPr>
-          <w:r>
-            <w:fldChar w:fldCharType="begin"/>
-          </w:r>
-          <w:r>
-            <w:instrText>TOC \o "1-2" \h \z \u</w:instrText>
-          </w:r>
-          <w:r>
-            <w:fldChar w:fldCharType="separate"/>
-          </w:r>
-          <w:hyperlink w:anchor="_Toc233754120" w:history="1">
-            <w:r>
-              <w:rPr>
-                <w:rStyle w:val="Hyperlink"/>
-                <w:noProof/>
-              </w:rPr>
-              <w:t>DIALOG — Structural Outsourcing Brief</w:t>
-            </w:r>
-            <w:r>
-              <w:rPr>
-                <w:noProof/>
-                <w:webHidden/>
-              </w:rPr>
-              <w:tab/>
-            </w:r>
-            <w:r>
-              <w:rPr>
-                <w:noProof/>
-                <w:webHidden/>
-              </w:rPr>
-              <w:fldChar w:fldCharType="begin"/>
-            </w:r>
-            <w:r>
-              <w:rPr>
-                <w:noProof/>
-                <w:webHidden/>
-              </w:rPr>
-              <w:instrText xml:space="preserve"> PAGEREF _Toc233754120 \h </w:instrText>
-            </w:r>
-            <w:r>
-              <w:rPr>
-                <w:noProof/>
-                <w:webHidden/>
-              </w:rPr>
-            </w:r>
-            <w:r>
-              <w:rPr>
-                <w:noProof/>
-                <w:webHidden/>
-              </w:rPr>
-              <w:fldChar w:fldCharType="separate"/>
-            </w:r>
-            <w:r>
-              <w:rPr>
-                <w:noProof/>
-                <w:webHidden/>
-              </w:rPr>
-              <w:t>1</w:t>
-            </w:r>
-            <w:r>
-              <w:rPr>
-                <w:noProof/>
-                <w:webHidden/>
-              </w:rPr>
-              <w:fldChar w:fldCharType="end"/>
-            </w:r>
-          </w:hyperlink>
-        </w:p>
-        <w:p>
-          <w:pPr>
-            <w:pStyle w:val="TOC2"/>
-            <w:tabs>
-              <w:tab w:val="right" w:leader="dot" w:pos="9350"/>
-            </w:tabs>
-            <w:rPr>
-              <w:noProof/>
-            </w:rPr>
-          </w:pPr>
-          <w:hyperlink w:anchor="_Toc233754121" w:history="1">
-            <w:r>
-              <w:rPr>
-                <w:rStyle w:val="Hyperlink"/>
-                <w:noProof/>
-              </w:rPr>
-              <w:t>Bottom line — what DIALOG outsources structural engineering for</w:t>
-            </w:r>
-            <w:r>
-              <w:rPr>
-                <w:noProof/>
-                <w:webHidden/>
-              </w:rPr>
-              <w:tab/>
-            </w:r>
-            <w:r>
-              <w:rPr>
-                <w:noProof/>
-                <w:webHidden/>
-              </w:rPr>
-              <w:fldChar w:fldCharType="begin"/>
-            </w:r>
-            <w:r>
-              <w:rPr>
-                <w:noProof/>
-                <w:webHidden/>
-              </w:rPr>
-              <w:instrText xml:space="preserve"> PAGEREF _Toc233754121 \h </w:instrText>
-            </w:r>
-            <w:r>
-              <w:rPr>
-                <w:noProof/>
-                <w:webHidden/>
-              </w:rPr>
-            </w:r>
-            <w:r>
-              <w:rPr>
-                <w:noProof/>
-                <w:webHidden/>
-              </w:rPr>
-              <w:fldChar w:fldCharType="separate"/>
-            </w:r>
-            <w:r>
-              <w:rPr>
-                <w:noProof/>
-                <w:webHidden/>
-              </w:rPr>
-              <w:t>1</w:t>
-            </w:r>
-            <w:r>
-              <w:rPr>
-                <w:noProof/>
-                <w:webHidden/>
-              </w:rPr>
-              <w:fldChar w:fldCharType="end"/>
-            </w:r>
-          </w:hyperlink>
-        </w:p>
-        <w:p>
-          <w:pPr>
-            <w:pStyle w:val="TOC2"/>
-            <w:tabs>
-              <w:tab w:val="right" w:leader="dot" w:pos="9350"/>
-            </w:tabs>
-            <w:rPr>
-              <w:noProof/>
-            </w:rPr>
-          </w:pPr>
-          <w:hyperlink w:anchor="_Toc233754122" w:history="1">
-            <w:r>
-              <w:rPr>
-                <w:rStyle w:val="Hyperlink"/>
-                <w:noProof/>
-              </w:rPr>
-              <w:t>External structural-engineer partner map (verified)</w:t>
-            </w:r>
-            <w:r>
-              <w:rPr>
-                <w:noProof/>
-                <w:webHidden/>
-              </w:rPr>
-              <w:tab/>
-            </w:r>
-            <w:r>
-              <w:rPr>
-                <w:noProof/>
-                <w:webHidden/>
-              </w:rPr>
-              <w:fldChar w:fldCharType="begin"/>
-            </w:r>
-            <w:r>
-              <w:rPr>
-                <w:noProof/>
-                <w:webHidden/>
-              </w:rPr>
-              <w:instrText xml:space="preserve"> PAGEREF _Toc233754122 \h </w:instrText>
-            </w:r>
-            <w:r>
-              <w:rPr>
-                <w:noProof/>
-                <w:webHidden/>
-              </w:rPr>
-            </w:r>
-            <w:r>
-              <w:rPr>
-                <w:noProof/>
-                <w:webHidden/>
-              </w:rPr>
-              <w:fldChar w:fldCharType="separate"/>
-            </w:r>
-            <w:r>
-              <w:rPr>
-                <w:noProof/>
-                <w:webHidden/>
-              </w:rPr>
-              <w:t>2</w:t>
-            </w:r>
-            <w:r>
-              <w:rPr>
-                <w:noProof/>
-                <w:webHidden/>
-              </w:rPr>
-              <w:fldChar w:fldCharType="end"/>
-            </w:r>
-          </w:hyperlink>
-        </w:p>
-        <w:p>
-          <w:pPr>
-            <w:pStyle w:val="TOC2"/>
-            <w:tabs>
-              <w:tab w:val="right" w:leader="dot" w:pos="9350"/>
-            </w:tabs>
-            <w:rPr>
-              <w:noProof/>
-            </w:rPr>
-          </w:pPr>
-          <w:hyperlink w:anchor="_Toc233754123" w:history="1">
-            <w:r>
-              <w:rPr>
-                <w:rStyle w:val="Hyperlink"/>
-                <w:noProof/>
-              </w:rPr>
-              <w:t>The actionable opening — UHNBC Acute Care Tower, Prince George BC [Verified]</w:t>
-            </w:r>
-            <w:r>
-              <w:rPr>
-                <w:noProof/>
-                <w:webHidden/>
-              </w:rPr>
-              <w:tab/>
-            </w:r>
-            <w:r>
-              <w:rPr>
-                <w:noProof/>
-                <w:webHidden/>
-              </w:rPr>
-              <w:fldChar w:fldCharType="begin"/>
-            </w:r>
-            <w:r>
-              <w:rPr>
-                <w:noProof/>
-                <w:webHidden/>
-              </w:rPr>
-              <w:instrText xml:space="preserve"> PAGEREF _Toc233754123 \h </w:instrText>
-            </w:r>
-            <w:r>
-              <w:rPr>
-                <w:noProof/>
-                <w:webHidden/>
-              </w:rPr>
-            </w:r>
-            <w:r>
-              <w:rPr>
-                <w:noProof/>
-                <w:webHidden/>
-              </w:rPr>
-              <w:fldChar w:fldCharType="separate"/>
-            </w:r>
-            <w:r>
-              <w:rPr>
-                <w:noProof/>
-                <w:webHidden/>
-              </w:rPr>
-              <w:t>2</w:t>
-            </w:r>
-            <w:r>
-              <w:rPr>
-                <w:noProof/>
-                <w:webHidden/>
-              </w:rPr>
-              <w:fldChar w:fldCharType="end"/>
-            </w:r>
-          </w:hyperlink>
-        </w:p>
-        <w:p>
-          <w:pPr>
-            <w:pStyle w:val="TOC2"/>
-            <w:tabs>
-              <w:tab w:val="right" w:leader="dot" w:pos="9350"/>
-            </w:tabs>
-            <w:rPr>
-              <w:noProof/>
-            </w:rPr>
-          </w:pPr>
-          <w:hyperlink w:anchor="_Toc233754124" w:history="1">
-            <w:r>
-              <w:rPr>
-                <w:rStyle w:val="Hyperlink"/>
-                <w:noProof/>
-              </w:rPr>
-              <w:t>DIALOG structural bench (verified — why they self-perform so much)</w:t>
-            </w:r>
-            <w:r>
-              <w:rPr>
-                <w:noProof/>
-                <w:webHidden/>
-              </w:rPr>
-              <w:tab/>
-            </w:r>
-            <w:r>
-              <w:rPr>
-                <w:noProof/>
-                <w:webHidden/>
-              </w:rPr>
-              <w:fldChar w:fldCharType="begin"/>
-            </w:r>
-            <w:r>
-              <w:rPr>
-                <w:noProof/>
-                <w:webHidden/>
-              </w:rPr>
-              <w:instrText xml:space="preserve"> PAGEREF _Toc233754124 \h </w:instrText>
-            </w:r>
-            <w:r>
-              <w:rPr>
-                <w:noProof/>
-                <w:webHidden/>
-              </w:rPr>
-            </w:r>
-            <w:r>
-              <w:rPr>
-                <w:noProof/>
-                <w:webHidden/>
-              </w:rPr>
-              <w:fldChar w:fldCharType="separate"/>
-            </w:r>
-            <w:r>
-              <w:rPr>
-                <w:noProof/>
-                <w:webHidden/>
-              </w:rPr>
-              <w:t>3</w:t>
-            </w:r>
-            <w:r>
-              <w:rPr>
-                <w:noProof/>
-                <w:webHidden/>
-              </w:rPr>
-              <w:fldChar w:fldCharType="end"/>
-            </w:r>
-          </w:hyperlink>
-        </w:p>
-        <w:p>
-          <w:pPr>
-            <w:pStyle w:val="TOC2"/>
-            <w:tabs>
-              <w:tab w:val="right" w:leader="dot" w:pos="9350"/>
-            </w:tabs>
-            <w:rPr>
-              <w:noProof/>
-            </w:rPr>
-          </w:pPr>
-          <w:hyperlink w:anchor="_Toc233754125" w:history="1">
-            <w:r>
-              <w:rPr>
-                <w:rStyle w:val="Hyperlink"/>
-                <w:noProof/>
-              </w:rPr>
-              <w:t>Do NOT say (fact-check landmines)</w:t>
-            </w:r>
-            <w:r>
-              <w:rPr>
-                <w:noProof/>
-                <w:webHidden/>
-              </w:rPr>
-              <w:tab/>
-            </w:r>
-            <w:r>
-              <w:rPr>
-                <w:noProof/>
-                <w:webHidden/>
-              </w:rPr>
-              <w:fldChar w:fldCharType="begin"/>
-            </w:r>
-            <w:r>
-              <w:rPr>
-                <w:noProof/>
-                <w:webHidden/>
-              </w:rPr>
-              <w:instrText xml:space="preserve"> PAGEREF _Toc233754125 \h </w:instrText>
-            </w:r>
-            <w:r>
-              <w:rPr>
-                <w:noProof/>
-                <w:webHidden/>
-              </w:rPr>
-            </w:r>
-            <w:r>
-              <w:rPr>
-                <w:noProof/>
-                <w:webHidden/>
-              </w:rPr>
-              <w:fldChar w:fldCharType="separate"/>
-            </w:r>
-            <w:r>
-              <w:rPr>
-                <w:noProof/>
-                <w:webHidden/>
-              </w:rPr>
-              <w:t>3</w:t>
-            </w:r>
-            <w:r>
-              <w:rPr>
-                <w:noProof/>
-                <w:webHidden/>
-              </w:rPr>
-              <w:fldChar w:fldCharType="end"/>
-            </w:r>
-          </w:hyperlink>
-        </w:p>
-        <w:p>
-          <w:pPr>
-            <w:pStyle w:val="TOC2"/>
-            <w:tabs>
-              <w:tab w:val="right" w:leader="dot" w:pos="9350"/>
-            </w:tabs>
-            <w:rPr>
-              <w:noProof/>
-            </w:rPr>
-          </w:pPr>
-          <w:hyperlink w:anchor="_Toc233754126" w:history="1">
-            <w:r>
-              <w:rPr>
-                <w:rStyle w:val="Hyperlink"/>
-                <w:noProof/>
-              </w:rPr>
-              <w:t>Questions for Georg Josi (July 10)</w:t>
-            </w:r>
-            <w:r>
-              <w:rPr>
-                <w:noProof/>
-                <w:webHidden/>
-              </w:rPr>
-              <w:tab/>
-            </w:r>
-            <w:r>
-              <w:rPr>
-                <w:noProof/>
-                <w:webHidden/>
-              </w:rPr>
-              <w:fldChar w:fldCharType="begin"/>
-            </w:r>
-            <w:r>
-              <w:rPr>
-                <w:noProof/>
-                <w:webHidden/>
-              </w:rPr>
-              <w:instrText xml:space="preserve"> PAGEREF _Toc233754126 \h </w:instrText>
-            </w:r>
-            <w:r>
-              <w:rPr>
-                <w:noProof/>
-                <w:webHidden/>
-              </w:rPr>
-            </w:r>
-            <w:r>
-              <w:rPr>
-                <w:noProof/>
-                <w:webHidden/>
-              </w:rPr>
-              <w:fldChar w:fldCharType="separate"/>
-            </w:r>
-            <w:r>
-              <w:rPr>
-                <w:noProof/>
-                <w:webHidden/>
-              </w:rPr>
-              <w:t>3</w:t>
-            </w:r>
-            <w:r>
-              <w:rPr>
-                <w:noProof/>
-                <w:webHidden/>
-              </w:rPr>
-              <w:fldChar w:fldCharType="end"/>
-            </w:r>
-          </w:hyperlink>
-        </w:p>
-        <w:p>
-          <w:pPr>
-            <w:pStyle w:val="TOC2"/>
-            <w:tabs>
-              <w:tab w:val="right" w:leader="dot" w:pos="9350"/>
-            </w:tabs>
-            <w:rPr>
-              <w:noProof/>
-            </w:rPr>
-          </w:pPr>
-          <w:hyperlink w:anchor="_Toc233754127" w:history="1">
-            <w:r>
-              <w:rPr>
-                <w:rStyle w:val="Hyperlink"/>
-                <w:noProof/>
-              </w:rPr>
-              <w:t>Prerequisites — close before July 10 (only KOR can)</w:t>
-            </w:r>
-            <w:r>
-              <w:rPr>
-                <w:noProof/>
-                <w:webHidden/>
-              </w:rPr>
-              <w:tab/>
-            </w:r>
-            <w:r>
-              <w:rPr>
-                <w:noProof/>
-                <w:webHidden/>
-              </w:rPr>
-              <w:fldChar w:fldCharType="begin"/>
-            </w:r>
-            <w:r>
-              <w:rPr>
-                <w:noProof/>
-                <w:webHidden/>
-              </w:rPr>
-              <w:instrText xml:space="preserve"> PAGEREF _Toc233754127 \h </w:instrText>
-            </w:r>
-            <w:r>
-              <w:rPr>
-                <w:noProof/>
-                <w:webHidden/>
-              </w:rPr>
-            </w:r>
-            <w:r>
-              <w:rPr>
-                <w:noProof/>
-                <w:webHidden/>
-              </w:rPr>
-              <w:fldChar w:fldCharType="separate"/>
-            </w:r>
-            <w:r>
-              <w:rPr>
-                <w:noProof/>
-                <w:webHidden/>
-              </w:rPr>
-              <w:t>4</w:t>
-            </w:r>
-            <w:r>
-              <w:rPr>
-                <w:noProof/>
-                <w:webHidden/>
-              </w:rPr>
-              <w:fldChar w:fldCharType="end"/>
-            </w:r>
-          </w:hyperlink>
-        </w:p>
-        <w:p>
-          <w:r>
-            <w:fldChar w:fldCharType="end"/>
-          </w:r>
-        </w:p>
-      </w:sdtContent>
-    </w:sdt>
     <w:p>
       <w:pPr>
         <w:pStyle w:val="Heading1"/>
       </w:pPr>
       <w:bookmarkStart w:id="0" w:name="dialog-structural-outsourcing-brief"/>
-      <w:bookmarkStart w:id="1" w:name="_Toc233754120"/>
       <w:r>
         <w:t>DIALOG — Structural Outsourcing Brief</w:t>
       </w:r>
-      <w:bookmarkEnd w:id="1"/>
     </w:p>
     <w:p>
       <w:pPr>
@@ -613,44 +20,35 @@
           <w:b/>
           <w:bCs/>
         </w:rPr>
-        <w:t>KOR Structural · July 10, 2026 meeting · Verified 2026-06-30 (4 research + 6 adversarial verification passes; ~60 projects catalogued firm-wide)</w:t>
+        <w:t>KOR Structural · July 10 2026 meeting · Verified 2026-07-01 (5 research + 6 adversarial fact-check passes; ~60 projects catalogued firm-wide)</w:t>
       </w:r>
     </w:p>
     <w:p>
       <w:pPr>
-        <w:pStyle w:val="BlockText"/>
-        <w:pBdr>
-          <w:top w:val="single" w:sz="8" w:space="1" w:color="1F3B5F"/>
-          <w:left w:val="single" w:sz="8" w:space="4" w:color="1F3B5F"/>
-          <w:bottom w:val="single" w:sz="8" w:space="1" w:color="1F3B5F"/>
-          <w:right w:val="single" w:sz="8" w:space="4" w:color="1F3B5F"/>
-        </w:pBdr>
-        <w:shd w:val="clear" w:color="auto" w:fill="E2EBF6"/>
-        <w:spacing w:before="120" w:after="120"/>
-        <w:ind w:left="200" w:right="200"/>
-      </w:pPr>
-      <w:r>
-        <w:t xml:space="preserve">Every claim is </w:t>
-      </w:r>
-      <w:r>
-        <w:rPr>
-          <w:b/>
-          <w:bCs/>
-        </w:rPr>
-        <w:t>[Verified]</w:t>
-      </w:r>
-      <w:r>
-        <w:t xml:space="preserve"> (primary source) or </w:t>
-      </w:r>
-      <w:r>
-        <w:rPr>
-          <w:b/>
-          <w:bCs/>
-        </w:rPr>
-        <w:t>[Hypothesis]</w:t>
-      </w:r>
-      <w:r>
-        <w:t xml:space="preserve">. A </w:t>
+        <w:pStyle w:val="BodyText"/>
+      </w:pPr>
+      <w:r>
+        <w:t xml:space="preserve">Claims are </w:t>
+      </w:r>
+      <w:r>
+        <w:rPr>
+          <w:b/>
+          <w:bCs/>
+        </w:rPr>
+        <w:t>[V]</w:t>
+      </w:r>
+      <w:r>
+        <w:t xml:space="preserve"> verified (primary source) or </w:t>
+      </w:r>
+      <w:r>
+        <w:rPr>
+          <w:b/>
+          <w:bCs/>
+        </w:rPr>
+        <w:t>[H]</w:t>
+      </w:r>
+      <w:r>
+        <w:t xml:space="preserve"> hypothesis to test. A </w:t>
       </w:r>
       <w:r>
         <w:rPr>
@@ -660,7 +58,7 @@
         <w:t>“Do NOT say”</w:t>
       </w:r>
       <w:r>
-        <w:t xml:space="preserve"> list flags meeting landmines. Decision-maker: </w:t>
+        <w:t xml:space="preserve"> list is at the end. Primary contact: </w:t>
       </w:r>
       <w:r>
         <w:rPr>
@@ -670,34 +68,24 @@
         <w:t>Georg Josi</w:t>
       </w:r>
       <w:r>
-        <w:t>, Partner/Structural Engineer/Edmonton Studio Chair (PhD, PEng).</w:t>
+        <w:t xml:space="preserve"> — Partner, Structural Engineer, Edmonton Studio Chair (PhD, PEng).</w:t>
       </w:r>
     </w:p>
     <w:p>
-      <w:r>
-        <w:pict w14:anchorId="76715D11">
-          <v:rect id="_x0000_i1025" style="width:0;height:1.5pt" o:hralign="center" o:hrstd="t" o:hr="t"/>
-        </w:pict>
+      <w:pPr>
+        <w:pStyle w:val="Heading2"/>
+      </w:pPr>
+      <w:bookmarkStart w:id="1" w:name="X3351a517e04db12830a789ebdc6413a2b8dd05f"/>
+      <w:r>
+        <w:t>Bottom line — what DIALOG outsources structural engineering for</w:t>
       </w:r>
     </w:p>
     <w:p>
       <w:pPr>
-        <w:pStyle w:val="Heading2"/>
-        <w:pageBreakBefore/>
-      </w:pPr>
-      <w:bookmarkStart w:id="2" w:name="X3351a517e04db12830a789ebdc6413a2b8dd05f"/>
-      <w:bookmarkStart w:id="3" w:name="_Toc233754121"/>
-      <w:r>
-        <w:t>Bottom line — what DIALOG outsources structural engineering for</w:t>
-      </w:r>
-      <w:bookmarkEnd w:id="3"/>
-    </w:p>
-    <w:p>
-      <w:pPr>
         <w:pStyle w:val="FirstParagraph"/>
       </w:pPr>
       <w:r>
-        <w:t xml:space="preserve">DIALOG self-performs the bulk of its structural with a deep in-house bench. It brings in an external (or co-) structural engineer in </w:t>
+        <w:t xml:space="preserve">DIALOG self-performs the bulk of its structural with a deep multidisciplinary bench, and brings in an external (or co-) structural engineer in </w:t>
       </w:r>
       <w:r>
         <w:rPr>
@@ -707,7 +95,7 @@
         <w:t>five recurring situations</w:t>
       </w:r>
       <w:r>
-        <w:t xml:space="preserve"> [all Verified against ≥60 projects]:</w:t>
+        <w:t xml:space="preserve"> [V]:</w:t>
       </w:r>
     </w:p>
     <w:p>
@@ -723,27 +111,23 @@
           <w:b/>
           <w:bCs/>
         </w:rPr>
-        <w:t>Tall towers (~30+ storeys)</w:t>
-      </w:r>
-      <w:r>
-        <w:t xml:space="preserve"> — structural goes external </w:t>
-      </w:r>
-      <w:r>
-        <w:rPr>
-          <w:b/>
-          <w:bCs/>
-        </w:rPr>
-        <w:t>regardless of DIALOG’s architect role</w:t>
-      </w:r>
-      <w:r>
-        <w:t xml:space="preserve">. Verified: Brookfield Place Calgary (60 st) → Entuitive; Telus Sky (58 st) → Glotman Simpson; Vancouver House (53 st) → BuroHappold + Glotman Simpson; JW Marriott/ICE District (55 st) → Thornton Tomasetti; The Parks (45+35 st) → RJC. </w:t>
-      </w:r>
-      <w:r>
-        <w:rPr>
-          <w:i/>
-          <w:iCs/>
-        </w:rPr>
-        <w:t>(Self-performs low/mid-rise when prime — Enbridge Centre, 26 st, in-house.)</w:t>
+        <w:t>A design/“star” architect leads and DIALOG is executive/architect-of-record.</w:t>
+      </w:r>
+      <w:r>
+        <w:t xml:space="preserve"> </w:t>
+      </w:r>
+      <w:r>
+        <w:t xml:space="preserve">This — not height — is the dominant trigger. Vancouver House (BIG → Glotman Simpson + BuroHappold), Brookfield Place Calgary 60st (Arney Fender Katsalidis → Entuitive), The Parks (Hariri Pontarini → RJC), Calgary Central Library (Snøhetta → Entuitive), TELUS Spark (Kasian → Stantec). </w:t>
+      </w:r>
+      <w:r>
+        <w:rPr>
+          <w:b/>
+          <w:bCs/>
+        </w:rPr>
+        <w:t>Height is NOT the trigger</w:t>
+      </w:r>
+      <w:r>
+        <w:t xml:space="preserve"> — DIALOG self-performed Living Shangri-La Vancouver (62st) and Toronto (65st) in-house when it was prime.</w:t>
       </w:r>
     </w:p>
     <w:p>
@@ -759,13 +143,13 @@
           <w:b/>
           <w:bCs/>
         </w:rPr>
-        <w:t>Design-architect-of-record role</w:t>
+        <w:t>The developer contracts structural separately from architecture</w:t>
       </w:r>
       <w:r>
         <w:t xml:space="preserve"> </w:t>
       </w:r>
       <w:r>
-        <w:t>— when a design/starchitect leads and DIALOG is delivery/AOR: Calgary Central Library (Snøhetta design → Entuitive); Brookfield (Arney Fender Katsalidis design → Entuitive).</w:t>
+        <w:t>(DIALOG delivers architecture/MEP only): The Hendrix (→ RJC), HSBC Place Repositioning (→ ISL/RJC).</w:t>
       </w:r>
     </w:p>
     <w:p>
@@ -781,27 +165,20 @@
           <w:b/>
           <w:bCs/>
         </w:rPr>
-        <w:t>Mega-scale healthcare under design-build/alliance (~$800M+ design-award budget)</w:t>
-      </w:r>
-      <w:r>
-        <w:t xml:space="preserve"> — co-SE: Kaye Edmonton Clinic (~$900M) → </w:t>
-      </w:r>
-      <w:r>
-        <w:rPr>
-          <w:b/>
-          <w:bCs/>
-        </w:rPr>
-        <w:t>Jacobs (ex-Yolles), co-equal</w:t>
-      </w:r>
-      <w:r>
-        <w:t xml:space="preserve">; Calgary Cancer Centre ($1.4B, PCL DB) → </w:t>
-      </w:r>
-      <w:r>
-        <w:rPr>
-          <w:b/>
-          <w:bCs/>
-        </w:rPr>
-        <w:t>DIALOG + Stantec co-SE.</w:t>
+        <w:t>Mega-scale healthcare (~$800M+) under design-build/alliance</w:t>
+      </w:r>
+      <w:r>
+        <w:t xml:space="preserve"> → co-SE: Kaye Edmonton Clinic ~$900M (→ Jacobs/ex-Yolles, </w:t>
+      </w:r>
+      <w:r>
+        <w:rPr>
+          <w:i/>
+          <w:iCs/>
+        </w:rPr>
+        <w:t>equal partners</w:t>
+      </w:r>
+      <w:r>
+        <w:t>), Calgary Cancer Centre $1.4B (→ DIALOG + Stantec co-SE under PCL).</w:t>
       </w:r>
     </w:p>
     <w:p>
@@ -817,43 +194,13 @@
           <w:b/>
           <w:bCs/>
         </w:rPr>
-        <w:t>Specialist structural innovation they lack</w:t>
-      </w:r>
-      <w:r>
-        <w:t xml:space="preserve"> — pioneer seismic mass timber → </w:t>
-      </w:r>
-      <w:r>
-        <w:rPr>
-          <w:b/>
-          <w:bCs/>
-        </w:rPr>
-        <w:t>Fast+Epp</w:t>
-      </w:r>
-      <w:r>
-        <w:t xml:space="preserve"> (The Hive); rammed earth → </w:t>
-      </w:r>
-      <w:r>
-        <w:rPr>
-          <w:b/>
-          <w:bCs/>
-        </w:rPr>
-        <w:t>Equilibrium</w:t>
+        <w:t>Specialist structural innovation they lack in-house</w:t>
       </w:r>
       <w:r>
         <w:t xml:space="preserve"> </w:t>
       </w:r>
       <w:r>
-        <w:t xml:space="preserve">(Nk’Mip); life sciences → </w:t>
-      </w:r>
-      <w:r>
-        <w:rPr>
-          <w:b/>
-          <w:bCs/>
-        </w:rPr>
-        <w:t>Blackwell</w:t>
-      </w:r>
-      <w:r>
-        <w:t>; forensic concrete → RJC (Glenbow).</w:t>
+        <w:t>→ pioneer seismic mass timber (Fast+Epp, The Hive), rammed earth (Equilibrium, Nk’Mip), life-sciences labs (Blackwell, Catalyst-77 Wade), forensic concrete redesign (RJC, Glenbow), blast/security (Thornton Tomasetti, Peel Police).</w:t>
       </w:r>
     </w:p>
     <w:p>
@@ -869,20 +216,10 @@
           <w:b/>
           <w:bCs/>
         </w:rPr>
-        <w:t>A studio lacking the relevant specialization</w:t>
-      </w:r>
-      <w:r>
-        <w:t xml:space="preserve"> — e.g., DIALOG </w:t>
-      </w:r>
-      <w:r>
-        <w:rPr>
-          <w:b/>
-          <w:bCs/>
-        </w:rPr>
-        <w:t>Vancouver has structural engineers but no healthcare specialization</w:t>
-      </w:r>
-      <w:r>
-        <w:t xml:space="preserve"> (healthcare structural is run from Calgary) → drives external/teamed structural on BC healthcare (see UHNBC below).</w:t>
+        <w:t>A studio lacking the relevant specialty</w:t>
+      </w:r>
+      <w:r>
+        <w:t xml:space="preserve"> → Vancouver structural is tall-building only (no healthcare); Ottawa (opened 2026) has zero structural partners.</w:t>
       </w:r>
     </w:p>
     <w:p>
@@ -894,23 +231,13 @@
           <w:b/>
           <w:bCs/>
         </w:rPr>
-        <w:t>Self-performs (do NOT pitch these):</w:t>
+        <w:t>Self-performs (do NOT pitch):</w:t>
       </w:r>
       <w:r>
         <w:t xml:space="preserve"> </w:t>
       </w:r>
       <w:r>
-        <w:t xml:space="preserve">transit / bridges (their strongest domain — Walterdale, Valley Line, Broadway Subway — always in-house), low/mid-rise buildings, standard institutional &amp; civic (Royal Alberta Museum, Winspear, Enbridge Centre), standard CLT timber, and </w:t>
-      </w:r>
-      <w:r>
-        <w:rPr>
-          <w:b/>
-          <w:bCs/>
-        </w:rPr>
-        <w:t>healthcare under ~$800M in Alberta/Ontario when they’re prime</w:t>
-      </w:r>
-      <w:r>
-        <w:t xml:space="preserve"> (Grande Prairie ~$647M design budget → Hildenbrandt/Lenzin; Edson → Renihan).</w:t>
+        <w:t>transit/bridges (their strongest domain — Walterdale, Valley Line, Broadway Subway, airports — always in-house), sports/rec (always), full-suite residential/commercial at any height when prime (Shangri-La 65st, Enbridge Centre), standard CLT timber (Bill Fisch), own civic (Royal Alberta Museum, Winspear), and sub-$800M home-market healthcare (Grande Prairie, Edson, UHN Toronto Western, Markdale).</w:t>
       </w:r>
     </w:p>
     <w:p>
@@ -922,7 +249,7 @@
           <w:b/>
           <w:bCs/>
         </w:rPr>
-        <w:t>One-line meeting answer:</w:t>
+        <w:t>One line for the room:</w:t>
       </w:r>
       <w:r>
         <w:t xml:space="preserve"> </w:t>
@@ -932,63 +259,26 @@
           <w:i/>
           <w:iCs/>
         </w:rPr>
-        <w:t>“DIALOG outsources structural on tall towers, on projects where a design architect leads, on mega-scale design-build hospitals (as co-SE), on specialist-innovation work, and where a studio lacks the specialty — and self-performs transit/bridges, mid-rise, standard civic, and sub-$800M home-market healthcare.”</w:t>
+        <w:t xml:space="preserve">“DIALOG outsources structural when a design architect leads, when a developer splits engineering off, on mega design-build hospitals as co-SE, for specialist innovation, and where a studio lacks the specialty — and self-performs </w:t>
+      </w:r>
+      <w:r>
+        <w:rPr>
+          <w:i/>
+          <w:iCs/>
+        </w:rPr>
+        <w:lastRenderedPageBreak/>
+        <w:t>transit/bridges, its own full-suite buildings at any height, and sub-$800M home-market healthcare.”</w:t>
       </w:r>
     </w:p>
     <w:p>
-      <w:r>
-        <w:pict w14:anchorId="760C4B1C">
-          <v:rect id="_x0000_i1026" style="width:0;height:1.5pt" o:hralign="center" o:hrstd="t" o:hr="t"/>
-        </w:pict>
-      </w:r>
-    </w:p>
-    <w:p>
       <w:pPr>
         <w:pStyle w:val="Heading2"/>
-        <w:pageBreakBefore/>
-      </w:pPr>
-      <w:bookmarkStart w:id="4" w:name="X5f0bef76d4c739a626bae3dce59c26f13fb2e26"/>
-      <w:bookmarkStart w:id="5" w:name="_Toc233754122"/>
-      <w:bookmarkEnd w:id="2"/>
-      <w:r>
-        <w:t>External structural-engineer partner map (verified)</w:t>
-      </w:r>
-      <w:bookmarkEnd w:id="5"/>
-    </w:p>
-    <w:p>
-      <w:pPr>
-        <w:pStyle w:val="FirstParagraph"/>
-      </w:pPr>
-      <w:r>
-        <w:t xml:space="preserve">Jacobs (ex-Yolles) · Stantec · RJC Engineers · Fast+Epp · Glotman Simpson · Entuitive · BuroHappold · Thornton Tomasetti · Equilibrium Consulting · Blackwell · ISL Engineering · Structural Design Group. </w:t>
-      </w:r>
-      <w:r>
-        <w:rPr>
-          <w:i/>
-          <w:iCs/>
-        </w:rPr>
-        <w:t>(RJC and Entuitive are the ones KOR most directly competes with for AB/BC institutional-and-healthcare overflow.)</w:t>
-      </w:r>
-    </w:p>
-    <w:p>
-      <w:r>
-        <w:pict w14:anchorId="50AA6DC7">
-          <v:rect id="_x0000_i1027" style="width:0;height:1.5pt" o:hralign="center" o:hrstd="t" o:hr="t"/>
-        </w:pict>
-      </w:r>
-    </w:p>
-    <w:p>
-      <w:pPr>
-        <w:pStyle w:val="Heading2"/>
-        <w:pageBreakBefore/>
-      </w:pPr>
-      <w:bookmarkStart w:id="6" w:name="X7a1e3f44ea02b4aaa194059b0df61ae6feb5a51"/>
-      <w:bookmarkStart w:id="7" w:name="_Toc233754123"/>
-      <w:bookmarkEnd w:id="4"/>
-      <w:r>
-        <w:t>The actionable opening — UHNBC Acute Care Tower, Prince George BC [Verified]</w:t>
-      </w:r>
-      <w:bookmarkEnd w:id="7"/>
+      </w:pPr>
+      <w:bookmarkStart w:id="2" w:name="X713a892090ecc76682fb97784d6f6de007755eb"/>
+      <w:bookmarkEnd w:id="1"/>
+      <w:r>
+        <w:t>The one actionable, KOR-winnable opening — UHNBC Acute Care Tower [V]</w:t>
+      </w:r>
     </w:p>
     <w:p>
       <w:pPr>
@@ -1006,7 +296,7 @@
         <w:t>$1.579B</w:t>
       </w:r>
       <w:r>
-        <w:t xml:space="preserve">; </w:t>
+        <w:t xml:space="preserve">, Prince George BC. </w:t>
       </w:r>
       <w:r>
         <w:rPr>
@@ -1016,24 +306,37 @@
         <w:t>DIALOG + EllisDon</w:t>
       </w:r>
       <w:r>
-        <w:t xml:space="preserve"> named preferred proponent (Oct 2025); alliance agreement signed </w:t>
-      </w:r>
-      <w:r>
-        <w:rPr>
-          <w:b/>
-          <w:bCs/>
-        </w:rPr>
-        <w:t>Dec 2025</w:t>
-      </w:r>
-      <w:r>
-        <w:t xml:space="preserve">; </w:t>
-      </w:r>
-      <w:r>
-        <w:rPr>
-          <w:b/>
-          <w:bCs/>
-        </w:rPr>
-        <w:t>design/development phase runs through late 2026, construction 2027.</w:t>
+        <w:t xml:space="preserve"> named preferred proponent Oct 2025; </w:t>
+      </w:r>
+      <w:r>
+        <w:rPr>
+          <w:b/>
+          <w:bCs/>
+        </w:rPr>
+        <w:t>Alliance agreement signed Dec 2025</w:t>
+      </w:r>
+      <w:r>
+        <w:t xml:space="preserve">; design/development phase </w:t>
+      </w:r>
+      <w:r>
+        <w:rPr>
+          <w:b/>
+          <w:bCs/>
+        </w:rPr>
+        <w:t>through late 2026</w:t>
+      </w:r>
+      <w:r>
+        <w:t xml:space="preserve">; construction </w:t>
+      </w:r>
+      <w:r>
+        <w:rPr>
+          <w:b/>
+          <w:bCs/>
+        </w:rPr>
+        <w:t>~2027</w:t>
+      </w:r>
+      <w:r>
+        <w:t>.</w:t>
       </w:r>
     </w:p>
     <w:p>
@@ -1052,14 +355,14 @@
         <w:t>Structural engineer is publicly unnamed</w:t>
       </w:r>
       <w:r>
-        <w:t xml:space="preserve"> — the alliance names only EllisDon, DIALOG BC, PML Mechanical, Houle Electric. SE-sub selection is realistic during the 2026 design phase → </w:t>
-      </w:r>
-      <w:r>
-        <w:rPr>
-          <w:b/>
-          <w:bCs/>
-        </w:rPr>
-        <w:t>pursuable but time-sensitive.</w:t>
+        <w:t xml:space="preserve"> (alliance = EllisDon, DIALOG BC, PML Mechanical, Houle Electric). Selection realistic during the 2026 design phase → </w:t>
+      </w:r>
+      <w:r>
+        <w:rPr>
+          <w:b/>
+          <w:bCs/>
+        </w:rPr>
+        <w:t>pursuable and time-sensitive.</w:t>
       </w:r>
     </w:p>
     <w:p>
@@ -1075,7 +378,7 @@
           <w:b/>
           <w:bCs/>
         </w:rPr>
-        <w:t>Why KOR fits:</w:t>
+        <w:t>Why KOR fits, uniquely:</w:t>
       </w:r>
       <w:r>
         <w:t xml:space="preserve"> it’s </w:t>
@@ -1085,117 +388,70 @@
           <w:b/>
           <w:bCs/>
         </w:rPr>
-        <w:t>in BC (KOR home turf — no APEGA barrier)</w:t>
-      </w:r>
-      <w:r>
-        <w:t xml:space="preserve">, and it sits in DIALOG’s </w:t>
-      </w:r>
-      <w:r>
-        <w:rPr>
-          <w:b/>
-          <w:bCs/>
-        </w:rPr>
-        <w:t>Vancouver healthcare-structural specialization gap.</w:t>
+        <w:t>in BC (home turf — no APEGA barrier)</w:t>
+      </w:r>
+      <w:r>
+        <w:t xml:space="preserve"> and sits squarely in DIALOG’s Vancouver </w:t>
+      </w:r>
+      <w:r>
+        <w:rPr>
+          <w:b/>
+          <w:bCs/>
+        </w:rPr>
+        <w:t>healthcare-structural gap</w:t>
       </w:r>
       <w:r>
         <w:t xml:space="preserve"> </w:t>
       </w:r>
       <w:r>
-        <w:t>This is the single best, real opening — far more actionable than the Edmonton venue/hospital seats.</w:t>
+        <w:t xml:space="preserve">(their only Vancouver structural depth is tall-building). This is the precedent from The Hive played forward: </w:t>
+      </w:r>
+      <w:r>
+        <w:rPr>
+          <w:i/>
+          <w:iCs/>
+        </w:rPr>
+        <w:t>“the Fast+Epp role, but for your BC acute-care tower.”</w:t>
       </w:r>
     </w:p>
     <w:p>
       <w:pPr>
-        <w:pStyle w:val="FirstParagraph"/>
-      </w:pPr>
+        <w:pStyle w:val="Compact"/>
+        <w:numPr>
+          <w:ilvl w:val="0"/>
+          <w:numId w:val="3"/>
+        </w:numPr>
+      </w:pPr>
+      <w:r>
+        <w:t xml:space="preserve">Secondary AB watch: </w:t>
+      </w:r>
+      <w:r>
+        <w:rPr>
+          <w:b/>
+          <w:bCs/>
+        </w:rPr>
+        <w:t>Misericordia inpatient tower</w:t>
+      </w:r>
+      <w:r>
+        <w:t xml:space="preserve"> (~350 beds, architect seat open, planning-only funding) — long-lead teaming target. </w:t>
+      </w:r>
       <w:r>
         <w:rPr>
           <w:i/>
           <w:iCs/>
         </w:rPr>
-        <w:t>Edmonton items for context: Event Park (DIALOG+HNTB — likely DIALOG self-perform or Thornton Tomasetti) and NAIT (likely DIALOG self-perform) are probe-not-pitch. Misericordia inpatient tower (architect seat open, planning-only funding) is a long-lead AB teaming watch.</w:t>
+        <w:t>(Edmonton Event Park &amp; NAIT: likely DIALOG self-perform or Thornton Tomasetti — probe, not pitch.)</w:t>
       </w:r>
     </w:p>
     <w:p>
-      <w:r>
-        <w:pict w14:anchorId="354247D5">
-          <v:rect id="_x0000_i1028" style="width:0;height:1.5pt" o:hralign="center" o:hrstd="t" o:hr="t"/>
-        </w:pict>
-      </w:r>
-    </w:p>
-    <w:p>
       <w:pPr>
         <w:pStyle w:val="Heading2"/>
-        <w:pageBreakBefore/>
-      </w:pPr>
-      <w:bookmarkStart w:id="8" w:name="X47bec40a7c961b90ae8b69b8ef2d8cc8fd8bee7"/>
-      <w:bookmarkStart w:id="9" w:name="_Toc233754124"/>
-      <w:bookmarkEnd w:id="6"/>
-      <w:r>
-        <w:t>DIALOG structural bench (verified — why they self-perform so much)</w:t>
-      </w:r>
-      <w:bookmarkEnd w:id="9"/>
-    </w:p>
-    <w:p>
-      <w:pPr>
-        <w:pStyle w:val="FirstParagraph"/>
-      </w:pPr>
-      <w:r>
-        <w:rPr>
-          <w:b/>
-          <w:bCs/>
-        </w:rPr>
-        <w:t>Edmonton:</w:t>
-      </w:r>
-      <w:r>
-        <w:t xml:space="preserve"> </w:t>
-      </w:r>
-      <w:r>
-        <w:t xml:space="preserve">Georg Josi (Partner, Studio Chair), Steven Oosterhof (Partner — venue/ICE District), Neil Robson (Partner — transport/institutional), Sandra Renihan (Partner — transit focus), Steven Prozniak (Assoc — bridges), Ryan Renihan / Larissa Ulcar / Victoria Buffam (Assoc), Jeff DiBattista (Partner Emeritus, engaged). </w:t>
-      </w:r>
-      <w:r>
-        <w:rPr>
-          <w:b/>
-          <w:bCs/>
-        </w:rPr>
-        <w:t>Calgary (healthcare structural):</w:t>
-      </w:r>
-      <w:r>
-        <w:t xml:space="preserve"> Ralph Hildenbrandt, Chris Lenzin. </w:t>
-      </w:r>
-      <w:r>
-        <w:rPr>
-          <w:b/>
-          <w:bCs/>
-        </w:rPr>
-        <w:t>Vancouver (tall-building/commercial — no healthcare specialty):</w:t>
-      </w:r>
-      <w:r>
-        <w:t xml:space="preserve"> </w:t>
-      </w:r>
-      <w:r>
-        <w:t>Fadi Ghorayeb (Managing Partner), Thomas Wu (Partner), Mehrak Razavi (Principal Assoc).</w:t>
-      </w:r>
-    </w:p>
-    <w:p>
-      <w:r>
-        <w:pict w14:anchorId="4ACA765E">
-          <v:rect id="_x0000_i1029" style="width:0;height:1.5pt" o:hralign="center" o:hrstd="t" o:hr="t"/>
-        </w:pict>
-      </w:r>
-    </w:p>
-    <w:p>
-      <w:pPr>
-        <w:pStyle w:val="Heading2"/>
-        <w:pageBreakBefore/>
-      </w:pPr>
-      <w:bookmarkStart w:id="10" w:name="do-not-say-fact-check-landmines"/>
-      <w:bookmarkStart w:id="11" w:name="_Toc233754125"/>
-      <w:bookmarkEnd w:id="8"/>
-      <w:r>
-        <w:t>Do NOT say (fact-check landmines)</w:t>
-      </w:r>
-      <w:bookmarkEnd w:id="11"/>
+      </w:pPr>
+      <w:bookmarkStart w:id="3" w:name="X2489046b806cd254ebc885d6871664061eefcf1"/>
+      <w:bookmarkEnd w:id="2"/>
+      <w:r>
+        <w:t>DIALOG structural bench — who owns what (know who to talk to) [V]</w:t>
+      </w:r>
     </w:p>
     <w:p>
       <w:pPr>
@@ -1210,10 +466,40 @@
           <w:b/>
           <w:bCs/>
         </w:rPr>
-        <w:t>Do NOT</w:t>
-      </w:r>
-      <w:r>
-        <w:t xml:space="preserve"> say DIALOG self-performs structural on 60-storey towers — refuted; tall towers go to Entuitive/Glotman/BuroHappold/TT.</w:t>
+        <w:t>Edmonton (largest studio, ~150 staff post-RPK):</w:t>
+      </w:r>
+      <w:r>
+        <w:t xml:space="preserve"> </w:t>
+      </w:r>
+      <w:r>
+        <w:t xml:space="preserve">Georg Josi (Studio Chair; healthcare — Kaye), </w:t>
+      </w:r>
+      <w:r>
+        <w:rPr>
+          <w:b/>
+          <w:bCs/>
+        </w:rPr>
+        <w:t>Steven Oosterhof</w:t>
+      </w:r>
+      <w:r>
+        <w:t xml:space="preserve"> (PhD/PE/SE — </w:t>
+      </w:r>
+      <w:r>
+        <w:rPr>
+          <w:i/>
+          <w:iCs/>
+        </w:rPr>
+        <w:t>DIALOG’s only seismic specialist firm-wide, chairs the NBCC seismic committee</w:t>
+      </w:r>
+      <w:r>
+        <w:t xml:space="preserve">; venue/commercial), Neil Robson (bridges/transit), Steven Prozniak (bridges), Ryan Renihan/Larissa Ulcar/Victoria Buffam (assoc). Jim Montgomery → Partner Emeritus 2025; Sandra Renihan → moved to transit PM. </w:t>
+      </w:r>
+      <w:r>
+        <w:rPr>
+          <w:b/>
+          <w:bCs/>
+        </w:rPr>
+        <w:t>Alberta partner-level structural capacity is contracting.</w:t>
       </w:r>
     </w:p>
     <w:p>
@@ -1229,10 +515,23 @@
           <w:b/>
           <w:bCs/>
         </w:rPr>
-        <w:t>Do NOT</w:t>
-      </w:r>
-      <w:r>
-        <w:t xml:space="preserve"> say DIALOG “outsources hospital structural” broadly — they self-perform sub-$800M home-market hospitals in-house (Hildenbrandt/Renihan/Lenzin).</w:t>
+        <w:t>Calgary:</w:t>
+      </w:r>
+      <w:r>
+        <w:t xml:space="preserve"> Ralph Hildenbrandt (</w:t>
+      </w:r>
+      <w:r>
+        <w:rPr>
+          <w:b/>
+          <w:bCs/>
+        </w:rPr>
+        <w:t>healthcare lead</w:t>
+      </w:r>
+      <w:r>
+        <w:t xml:space="preserve"> </w:t>
+      </w:r>
+      <w:r>
+        <w:t>— GP Regional, Calgary Cancer, Dartmouth), Chris Lenzin (Studio Chair), Gerry Carson (precast/UHPC).</w:t>
       </w:r>
     </w:p>
     <w:p>
@@ -1248,20 +547,10 @@
           <w:b/>
           <w:bCs/>
         </w:rPr>
-        <w:t>Do NOT</w:t>
-      </w:r>
-      <w:r>
-        <w:t xml:space="preserve"> say DIALOG Vancouver has “only one structural engineer” — there are ≥3; the real point is </w:t>
-      </w:r>
-      <w:r>
-        <w:rPr>
-          <w:b/>
-          <w:bCs/>
-        </w:rPr>
-        <w:t>no healthcare specialization</w:t>
-      </w:r>
-      <w:r>
-        <w:t>.</w:t>
+        <w:t>Toronto:</w:t>
+      </w:r>
+      <w:r>
+        <w:t xml:space="preserve"> Daria Khachi (healthcare + forensics/post-disaster), Cameron Ritchie (healthcare), Charles Marshall (Studio Chair).</w:t>
       </w:r>
     </w:p>
     <w:p>
@@ -1277,10 +566,17 @@
           <w:b/>
           <w:bCs/>
         </w:rPr>
-        <w:t>Do NOT</w:t>
-      </w:r>
-      <w:r>
-        <w:t xml:space="preserve"> attribute Foothills McCaig Tower structural to Stantec — unverified; say “a separate structural firm” (DIALOG was architecture-only).</w:t>
+        <w:t>Vancouver:</w:t>
+      </w:r>
+      <w:r>
+        <w:t xml:space="preserve"> Thomas Wu (tall-building, 100+ high-rises), Mehrak Razavi, Fadi Ghorayeb — </w:t>
+      </w:r>
+      <w:r>
+        <w:rPr>
+          <w:b/>
+          <w:bCs/>
+        </w:rPr>
+        <w:t>no healthcare structural specialty.</w:t>
       </w:r>
     </w:p>
     <w:p>
@@ -1296,63 +592,126 @@
           <w:b/>
           <w:bCs/>
         </w:rPr>
-        <w:t>Do NOT</w:t>
-      </w:r>
-      <w:r>
-        <w:t xml:space="preserve"> say UHNBC construction starts “fall 2026” — it’s </w:t>
-      </w:r>
-      <w:r>
-        <w:rPr>
-          <w:b/>
-          <w:bCs/>
-        </w:rPr>
-        <w:t>2027</w:t>
-      </w:r>
-      <w:r>
-        <w:t>; design phase through late 2026.</w:t>
+        <w:t>KOR’s sharpest wedge:</w:t>
+      </w:r>
+      <w:r>
+        <w:t xml:space="preserve"> DIALOG has </w:t>
+      </w:r>
+      <w:r>
+        <w:rPr>
+          <w:b/>
+          <w:bCs/>
+        </w:rPr>
+        <w:t>one</w:t>
+      </w:r>
+      <w:r>
+        <w:t xml:space="preserve"> firm-wide seismic specialist (Oosterhof) and </w:t>
+      </w:r>
+      <w:r>
+        <w:rPr>
+          <w:b/>
+          <w:bCs/>
+        </w:rPr>
+        <w:t>zero</w:t>
+      </w:r>
+      <w:r>
+        <w:t xml:space="preserve"> </w:t>
+      </w:r>
+      <w:r>
+        <w:t>BC healthcare structural depth, while Alberta capacity shrinks. KOR is a seismic bench, not a single point of dependency.</w:t>
       </w:r>
     </w:p>
     <w:p>
       <w:pPr>
-        <w:pStyle w:val="Compact"/>
-        <w:numPr>
-          <w:ilvl w:val="0"/>
-          <w:numId w:val="4"/>
-        </w:numPr>
-      </w:pPr>
-      <w:r>
-        <w:rPr>
-          <w:b/>
-          <w:bCs/>
-        </w:rPr>
-        <w:t>Do NOT</w:t>
-      </w:r>
-      <w:r>
-        <w:t xml:space="preserve"> say Oosterhof was Rogers Place SE-of-record (TT was prime); or that the AB seismic rule is Alberta-unique (national NBC 2020, effective in AB </w:t>
-      </w:r>
-      <w:r>
-        <w:rPr>
-          <w:b/>
-          <w:bCs/>
-        </w:rPr>
-        <w:t>May 1 2024</w:t>
-      </w:r>
-      <w:r>
-        <w:t>, hospitals post-disaster IE 1.5).</w:t>
+        <w:pStyle w:val="Heading2"/>
+      </w:pPr>
+      <w:bookmarkStart w:id="4" w:name="firm-context-for-the-relationship-v"/>
+      <w:bookmarkEnd w:id="3"/>
+      <w:r>
+        <w:t>Firm context (for the relationship) [V]</w:t>
       </w:r>
     </w:p>
     <w:p>
       <w:pPr>
+        <w:pStyle w:val="FirstParagraph"/>
+      </w:pPr>
+      <w:r>
+        <w:t xml:space="preserve">Partner-owned (50+ partners, no single CEO — flat governance), </w:t>
+      </w:r>
+      <w:r>
+        <w:rPr>
+          <w:b/>
+          <w:bCs/>
+        </w:rPr>
+        <w:t>600+ staff, 6 studios</w:t>
+      </w:r>
+      <w:r>
+        <w:t xml:space="preserve"> (Vancouver, Calgary, Edmonton, Toronto, Ottawa [2026], San Francisco), fully multidisciplinary in-house. </w:t>
+      </w:r>
+      <w:r>
+        <w:rPr>
+          <w:b/>
+          <w:bCs/>
+        </w:rPr>
+        <w:t>B Corp</w:t>
+      </w:r>
+      <w:r>
+        <w:t xml:space="preserve">, AIA-2030 + </w:t>
+      </w:r>
+      <w:r>
+        <w:rPr>
+          <w:b/>
+          <w:bCs/>
+        </w:rPr>
+        <w:t>SE 2050</w:t>
+      </w:r>
+      <w:r>
+        <w:t xml:space="preserve"> carbon commitments, </w:t>
+      </w:r>
+      <w:r>
+        <w:lastRenderedPageBreak/>
+        <w:t xml:space="preserve">“Community Wellbeing Framework” (with the Conference Board of Canada) is core identity. Chair </w:t>
+      </w:r>
+      <w:r>
+        <w:rPr>
+          <w:b/>
+          <w:bCs/>
+        </w:rPr>
+        <w:t>Antonio Gómez-Palacio</w:t>
+      </w:r>
+      <w:r>
+        <w:t xml:space="preserve"> (since 2022). Named a </w:t>
+      </w:r>
+      <w:r>
+        <w:rPr>
+          <w:i/>
+          <w:iCs/>
+        </w:rPr>
+        <w:t>Fast Company</w:t>
+      </w:r>
+      <w:r>
+        <w:t xml:space="preserve"> Most Innovative Architecture Firm 2026 (Peter Lougheed Wildlife Overpass). Deeply fluent in </w:t>
+      </w:r>
+      <w:r>
+        <w:rPr>
+          <w:b/>
+          <w:bCs/>
+        </w:rPr>
+        <w:t>IPD / alliance / design-build</w:t>
+      </w:r>
+      <w:r>
+        <w:t xml:space="preserve"> (UHNBC alliance, Calgary Cancer DB, Broadway Subway DBF).</w:t>
+      </w:r>
+    </w:p>
+    <w:p>
+      <w:pPr>
         <w:pStyle w:val="Heading2"/>
-        <w:pageBreakBefore/>
-      </w:pPr>
-      <w:bookmarkStart w:id="12" w:name="questions-for-georg-josi-july-10"/>
-      <w:bookmarkStart w:id="13" w:name="_Toc233754126"/>
-      <w:bookmarkEnd w:id="10"/>
-      <w:r>
-        <w:t>Questions for Georg Josi (July 10)</w:t>
-      </w:r>
-      <w:bookmarkEnd w:id="13"/>
+      </w:pPr>
+      <w:bookmarkStart w:id="5" w:name="X3493a9ac3bf1927d474d8c9f0271c10ad13665c"/>
+      <w:bookmarkEnd w:id="4"/>
+      <w:r>
+        <w:t>How KOR should position (from their identity)</w:t>
+      </w:r>
     </w:p>
     <w:p>
       <w:pPr>
@@ -1363,20 +722,24 @@
         </w:numPr>
       </w:pPr>
       <w:r>
-        <w:t xml:space="preserve">“On </w:t>
-      </w:r>
-      <w:r>
-        <w:rPr>
-          <w:b/>
-          <w:bCs/>
-        </w:rPr>
-        <w:t>UHNBC</w:t>
-      </w:r>
-      <w:r>
-        <w:t xml:space="preserve"> </w:t>
-      </w:r>
-      <w:r>
-        <w:t>in Prince George — how are you sourcing structural within the alliance? Is there a role for a BC structural partner?”</w:t>
+        <w:rPr>
+          <w:b/>
+          <w:bCs/>
+        </w:rPr>
+        <w:t>Language:</w:t>
+      </w:r>
+      <w:r>
+        <w:t xml:space="preserve"> “integrated team,” “all disciplines at the table,” “co-creative from concept” — </w:t>
+      </w:r>
+      <w:r>
+        <w:rPr>
+          <w:b/>
+          <w:bCs/>
+        </w:rPr>
+        <w:t>never say “sub-consultant.”</w:t>
+      </w:r>
+      <w:r>
+        <w:t xml:space="preserve"> DIALOG runs alliances/IPD; speak partner, not vendor.</w:t>
       </w:r>
     </w:p>
     <w:p>
@@ -1388,7 +751,34 @@
         </w:numPr>
       </w:pPr>
       <w:r>
-        <w:t>“When a hospital hits Kaye/Calgary-Cancer scale under design-build, how do you structure the co-SE — and who do you reach for?”</w:t>
+        <w:rPr>
+          <w:b/>
+          <w:bCs/>
+        </w:rPr>
+        <w:t>Values hook:</w:t>
+      </w:r>
+      <w:r>
+        <w:t xml:space="preserve"> frame seismic resilience as </w:t>
+      </w:r>
+      <w:r>
+        <w:rPr>
+          <w:b/>
+          <w:bCs/>
+        </w:rPr>
+        <w:t>community wellbeing</w:t>
+      </w:r>
+      <w:r>
+        <w:t xml:space="preserve"> (“buildings that keep communities functioning after an event”) and </w:t>
+      </w:r>
+      <w:r>
+        <w:rPr>
+          <w:b/>
+          <w:bCs/>
+        </w:rPr>
+        <w:t>come with an embodied-carbon / LCA story</w:t>
+      </w:r>
+      <w:r>
+        <w:t xml:space="preserve"> — a B-Corp, SE-2050 firm will expect it from a serious structural partner.</w:t>
       </w:r>
     </w:p>
     <w:p>
@@ -1400,7 +790,21 @@
         </w:numPr>
       </w:pPr>
       <w:r>
-        <w:t>“Your Vancouver studio’s structural strength is tall-building — how do you cover healthcare structural there?”</w:t>
+        <w:rPr>
+          <w:b/>
+          <w:bCs/>
+        </w:rPr>
+        <w:t>The precedent to name:</w:t>
+      </w:r>
+      <w:r>
+        <w:t xml:space="preserve"> </w:t>
+      </w:r>
+      <w:r>
+        <w:rPr>
+          <w:i/>
+          <w:iCs/>
+        </w:rPr>
+        <w:t>“the Fast+Epp-on-The-Hive model — a specialist structural partner brought in co-creatively — but for your BC seismic-intensive healthcare.”</w:t>
       </w:r>
     </w:p>
     <w:p>
@@ -1412,21 +816,45 @@
         </w:numPr>
       </w:pPr>
       <w:r>
-        <w:t>“Where’s your structural bandwidth tightest over the next 24 months?”</w:t>
+        <w:rPr>
+          <w:b/>
+          <w:bCs/>
+        </w:rPr>
+        <w:t>The seismic wedge (verified wording):</w:t>
+      </w:r>
+      <w:r>
+        <w:t xml:space="preserve"> since </w:t>
+      </w:r>
+      <w:r>
+        <w:rPr>
+          <w:b/>
+          <w:bCs/>
+        </w:rPr>
+        <w:t>May 1 2024</w:t>
+      </w:r>
+      <w:r>
+        <w:t xml:space="preserve">, Alberta builds to NBC 2023 Alberta Edition (based on NBC 2020) — hospitals are </w:t>
+      </w:r>
+      <w:r>
+        <w:rPr>
+          <w:b/>
+          <w:bCs/>
+        </w:rPr>
+        <w:t>post-disaster, seismic importance factor 1.5</w:t>
+      </w:r>
+      <w:r>
+        <w:t>, with the new near-elastic objective; BC has designed to this for a decade. (National, not AB-unique.) In BC, this is simply KOR’s daily practice.</w:t>
       </w:r>
     </w:p>
     <w:p>
       <w:pPr>
         <w:pStyle w:val="Heading2"/>
-        <w:pageBreakBefore/>
-      </w:pPr>
-      <w:bookmarkStart w:id="14" w:name="X3307e16a0659ff59c2f591c95fcda550004a6d3"/>
-      <w:bookmarkStart w:id="15" w:name="_Toc233754127"/>
-      <w:bookmarkEnd w:id="12"/>
-      <w:r>
-        <w:t>Prerequisites — close before July 10 (only KOR can)</w:t>
-      </w:r>
-      <w:bookmarkEnd w:id="15"/>
+      </w:pPr>
+      <w:bookmarkStart w:id="6" w:name="X46e1563f68afb84311370d476ebb38f310ef224"/>
+      <w:bookmarkEnd w:id="5"/>
+      <w:r>
+        <w:t>Competitors KOR is up against for DIALOG’s overflow SE [V]</w:t>
+      </w:r>
     </w:p>
     <w:p>
       <w:pPr>
@@ -1441,20 +869,10 @@
           <w:b/>
           <w:bCs/>
         </w:rPr>
-        <w:t>APEGA Permit to Practice</w:t>
-      </w:r>
-      <w:r>
-        <w:t xml:space="preserve"> </w:t>
-      </w:r>
-      <w:r>
-        <w:t xml:space="preserve">for any Alberta work (hard requirement) — </w:t>
-      </w:r>
-      <w:r>
-        <w:rPr>
-          <w:i/>
-          <w:iCs/>
-        </w:rPr>
-        <w:t>though UHNBC being in BC removes this barrier for the best opening.</w:t>
+        <w:t>RJC Engineers</w:t>
+      </w:r>
+      <w:r>
+        <w:t xml:space="preserve"> — the heavyweight: DIALOG’s go-to on towers-with-co-arch, education, museum renovation, YYC airport; AB healthcare (South Health Campus). The one to displace.</w:t>
       </w:r>
     </w:p>
     <w:p>
@@ -1470,40 +888,2486 @@
           <w:b/>
           <w:bCs/>
         </w:rPr>
-        <w:t>Nameable BC hospital / high-importance SE references</w:t>
-      </w:r>
-      <w:r>
-        <w:t xml:space="preserve"> — the healthcare-seismic wedge (NBC post-disaster, IE 1.5, effective AB May 1 2024) is only credible with real references.</w:t>
+        <w:t>Entuitive</w:t>
+      </w:r>
+      <w:r>
+        <w:t xml:space="preserve"> </w:t>
+      </w:r>
+      <w:r>
+        <w:t xml:space="preserve">— Edmonton office since 2016; DIALOG’s SE on major commercial towers + Calgary Library. Institutional, </w:t>
+      </w:r>
+      <w:r>
+        <w:rPr>
+          <w:b/>
+          <w:bCs/>
+        </w:rPr>
+        <w:t>but no AB acute-care record</w:t>
+      </w:r>
+      <w:r>
+        <w:t xml:space="preserve"> (don’t overstate them).</w:t>
       </w:r>
     </w:p>
     <w:p>
-      <w:r>
-        <w:pict w14:anchorId="542BD2A2">
-          <v:rect id="_x0000_i1030" style="width:0;height:1.5pt" o:hralign="center" o:hrstd="t" o:hr="t"/>
-        </w:pict>
+      <w:pPr>
+        <w:pStyle w:val="Compact"/>
+        <w:numPr>
+          <w:ilvl w:val="0"/>
+          <w:numId w:val="6"/>
+        </w:numPr>
+      </w:pPr>
+      <w:r>
+        <w:rPr>
+          <w:b/>
+          <w:bCs/>
+        </w:rPr>
+        <w:t>Glotman Simpson / BuroHappold</w:t>
+      </w:r>
+      <w:r>
+        <w:t xml:space="preserve"> — Vancouver starchitect-led towers. </w:t>
+      </w:r>
+      <w:r>
+        <w:rPr>
+          <w:b/>
+          <w:bCs/>
+        </w:rPr>
+        <w:t>Fast+Epp</w:t>
+      </w:r>
+      <w:r>
+        <w:t xml:space="preserve"> — mass timber (entrenched; don’t contest). </w:t>
+      </w:r>
+      <w:r>
+        <w:rPr>
+          <w:b/>
+          <w:bCs/>
+        </w:rPr>
+        <w:t>Stantec / Jacobs</w:t>
+      </w:r>
+      <w:r>
+        <w:t xml:space="preserve"> — the mega-hospital co-SE incumbents.</w:t>
       </w:r>
     </w:p>
     <w:p>
       <w:pPr>
-        <w:pStyle w:val="FirstParagraph"/>
-      </w:pPr>
+        <w:pStyle w:val="Heading2"/>
+      </w:pPr>
+      <w:bookmarkStart w:id="7" w:name="do-not-say-fact-check-landmines"/>
+      <w:bookmarkEnd w:id="6"/>
+      <w:r>
+        <w:t>Do NOT say (fact-check landmines)</w:t>
+      </w:r>
+    </w:p>
+    <w:p>
+      <w:pPr>
+        <w:pStyle w:val="Compact"/>
+        <w:numPr>
+          <w:ilvl w:val="0"/>
+          <w:numId w:val="7"/>
+        </w:numPr>
+      </w:pPr>
+      <w:r>
+        <w:t xml:space="preserve">Don’t say “DIALOG outsources all tall towers” — they </w:t>
+      </w:r>
+      <w:r>
+        <w:rPr>
+          <w:b/>
+          <w:bCs/>
+        </w:rPr>
+        <w:t>self-perform to 65 storeys</w:t>
+      </w:r>
+      <w:r>
+        <w:t xml:space="preserve"> when prime (Shangri-La). The trigger is the </w:t>
+      </w:r>
       <w:r>
         <w:rPr>
           <w:i/>
           <w:iCs/>
         </w:rPr>
-        <w:t>Verification: 4 research passes (2 SE-mechanics/pipeline, 2 portfolio catalogue) + 6 adversarial primary-source fact-checks (~60 projects), 2026-06-30. Sources: dialogdesign.ca, majorprojects.alberta.ca, infrastructurebc.com, northernhealth.ca, alberta.ca, apega.ca, entuitive.com, glotmansimpson.com, thorntontomasetti.com, archdaily.com, Canadian Consulting Engineer/Architect, rjc.ca, fastepp.com. Confidence per claim; “[Hypothesis]” = test in the room, do not assert.</w:t>
+        <w:t>design-architect-led</w:t>
+      </w:r>
+      <w:r>
+        <w:t xml:space="preserve"> </w:t>
+      </w:r>
+      <w:r>
+        <w:t>role, not height.</w:t>
+      </w:r>
+    </w:p>
+    <w:p>
+      <w:pPr>
+        <w:pStyle w:val="Compact"/>
+        <w:numPr>
+          <w:ilvl w:val="0"/>
+          <w:numId w:val="7"/>
+        </w:numPr>
+      </w:pPr>
+      <w:r>
+        <w:t>Don’t say “DIALOG outsources hospital structural” broadly — they self-perform sub-$800M home-market hospitals (Hildenbrandt/Renihan/Khachi).</w:t>
+      </w:r>
+    </w:p>
+    <w:p>
+      <w:pPr>
+        <w:pStyle w:val="Compact"/>
+        <w:numPr>
+          <w:ilvl w:val="0"/>
+          <w:numId w:val="7"/>
+        </w:numPr>
+      </w:pPr>
+      <w:r>
+        <w:t xml:space="preserve">Don’t say DIALOG Vancouver has “only one structural engineer” — there are ≥3; the point is </w:t>
+      </w:r>
+      <w:r>
+        <w:rPr>
+          <w:b/>
+          <w:bCs/>
+        </w:rPr>
+        <w:t>no healthcare specialty.</w:t>
+      </w:r>
+    </w:p>
+    <w:p>
+      <w:pPr>
+        <w:pStyle w:val="Compact"/>
+        <w:numPr>
+          <w:ilvl w:val="0"/>
+          <w:numId w:val="7"/>
+        </w:numPr>
+      </w:pPr>
+      <w:r>
+        <w:t>Don’t attribute Foothills McCaig structural to Stantec (unverified) — say “a separate firm.”</w:t>
+      </w:r>
+    </w:p>
+    <w:p>
+      <w:pPr>
+        <w:pStyle w:val="Compact"/>
+        <w:numPr>
+          <w:ilvl w:val="0"/>
+          <w:numId w:val="7"/>
+        </w:numPr>
+      </w:pPr>
+      <w:r>
+        <w:t xml:space="preserve">Don’t say UHNBC construction is “fall 2026” — verified current date is </w:t>
+      </w:r>
+      <w:r>
+        <w:rPr>
+          <w:b/>
+          <w:bCs/>
+        </w:rPr>
+        <w:t>~2027</w:t>
+      </w:r>
+      <w:r>
+        <w:t>; design through late 2026.</w:t>
+      </w:r>
+    </w:p>
+    <w:p>
+      <w:pPr>
+        <w:pStyle w:val="Compact"/>
+        <w:numPr>
+          <w:ilvl w:val="0"/>
+          <w:numId w:val="7"/>
+        </w:numPr>
+      </w:pPr>
+      <w:r>
+        <w:t xml:space="preserve">Don’t say Oosterhof was Rogers Place SE-of-record (Thornton Tomasetti was prime); don’t call the AB seismic rule Alberta-unique (national NBC 2020, effective AB </w:t>
+      </w:r>
+      <w:r>
+        <w:rPr>
+          <w:b/>
+          <w:bCs/>
+        </w:rPr>
+        <w:t>May 1 2024</w:t>
+      </w:r>
+      <w:r>
+        <w:t>).</w:t>
+      </w:r>
+    </w:p>
+    <w:p>
+      <w:pPr>
+        <w:pStyle w:val="Heading2"/>
+      </w:pPr>
+      <w:bookmarkStart w:id="8" w:name="questions-for-georg-josi-july-10"/>
+      <w:bookmarkEnd w:id="7"/>
+      <w:r>
+        <w:t>Questions for Georg Josi (July 10)</w:t>
+      </w:r>
+    </w:p>
+    <w:p>
+      <w:pPr>
+        <w:pStyle w:val="Compact"/>
+        <w:numPr>
+          <w:ilvl w:val="0"/>
+          <w:numId w:val="8"/>
+        </w:numPr>
+      </w:pPr>
+      <w:r>
+        <w:t xml:space="preserve">“On </w:t>
+      </w:r>
+      <w:r>
+        <w:rPr>
+          <w:b/>
+          <w:bCs/>
+        </w:rPr>
+        <w:t>UHNBC</w:t>
+      </w:r>
+      <w:r>
+        <w:t xml:space="preserve"> — how are you handling structural inside the alliance? Is there room for a BC structural partner at the table?”</w:t>
+      </w:r>
+    </w:p>
+    <w:p>
+      <w:pPr>
+        <w:pStyle w:val="Compact"/>
+        <w:numPr>
+          <w:ilvl w:val="0"/>
+          <w:numId w:val="8"/>
+        </w:numPr>
+      </w:pPr>
+      <w:r>
+        <w:t>“When a hospital hits Kaye/Calgary-Cancer scale under design-build, how do you structure the co-SE — and who do you reach for?”</w:t>
+      </w:r>
+    </w:p>
+    <w:p>
+      <w:pPr>
+        <w:pStyle w:val="Compact"/>
+        <w:numPr>
+          <w:ilvl w:val="0"/>
+          <w:numId w:val="8"/>
+        </w:numPr>
+      </w:pPr>
+      <w:r>
+        <w:t>“Your Vancouver studio’s structural strength is tall-building — how are you covering healthcare structural there?”</w:t>
+      </w:r>
+    </w:p>
+    <w:p>
+      <w:pPr>
+        <w:pStyle w:val="Compact"/>
+        <w:numPr>
+          <w:ilvl w:val="0"/>
+          <w:numId w:val="8"/>
+        </w:numPr>
+      </w:pPr>
+      <w:r>
+        <w:t>“Where’s your structural bandwidth tightest over the next 24 months?”</w:t>
+      </w:r>
+    </w:p>
+    <w:p>
+      <w:pPr>
+        <w:pStyle w:val="Heading2"/>
+      </w:pPr>
+      <w:bookmarkStart w:id="9" w:name="X3307e16a0659ff59c2f591c95fcda550004a6d3"/>
+      <w:bookmarkEnd w:id="8"/>
+      <w:r>
+        <w:t>Prerequisites — close before July 10 (only KOR can)</w:t>
+      </w:r>
+    </w:p>
+    <w:p>
+      <w:pPr>
+        <w:pStyle w:val="Compact"/>
+        <w:numPr>
+          <w:ilvl w:val="0"/>
+          <w:numId w:val="9"/>
+        </w:numPr>
+      </w:pPr>
+      <w:r>
+        <w:rPr>
+          <w:b/>
+          <w:bCs/>
+        </w:rPr>
+        <w:t>APEGA Permit to Practice</w:t>
+      </w:r>
+      <w:r>
+        <w:t xml:space="preserve"> for Alberta work (hard legal requirement) — </w:t>
+      </w:r>
+      <w:r>
+        <w:rPr>
+          <w:i/>
+          <w:iCs/>
+        </w:rPr>
+        <w:t>not needed for the UHNBC opening, which is BC.</w:t>
+      </w:r>
+    </w:p>
+    <w:p>
+      <w:pPr>
+        <w:pStyle w:val="Compact"/>
+        <w:numPr>
+          <w:ilvl w:val="0"/>
+          <w:numId w:val="9"/>
+        </w:numPr>
+      </w:pPr>
+      <w:r>
+        <w:rPr>
+          <w:b/>
+          <w:bCs/>
+        </w:rPr>
+        <w:t>Nameable BC hospital / high-importance references</w:t>
+      </w:r>
+      <w:r>
+        <w:t xml:space="preserve"> — the seismic wedge only lands with real projects to cite. Line them up.</w:t>
+      </w:r>
+    </w:p>
+    <w:p>
+      <w:r>
+        <w:pict w14:anchorId="540E46AC">
+          <v:rect id="_x0000_i1025" style="width:0;height:1.5pt" o:hralign="center" o:hrstd="t" o:hr="t"/>
+        </w:pict>
+      </w:r>
+    </w:p>
+    <w:p>
+      <w:pPr>
+        <w:pStyle w:val="Heading2"/>
+      </w:pPr>
+      <w:bookmarkStart w:id="10" w:name="X0c1e04b6a3fd8c41ba770d9c2acfa795c203bb0"/>
+      <w:bookmarkEnd w:id="9"/>
+      <w:r>
+        <w:t>Appendix A — Healthcare/institutional structural (verified catalogue)</w:t>
+      </w:r>
+    </w:p>
+    <w:tbl>
+      <w:tblPr>
+        <w:tblStyle w:val="GridTable4"/>
+        <w:tblW w:w="5000" w:type="pct"/>
+        <w:tblCellMar>
+          <w:top w:w="40" w:type="dxa"/>
+          <w:left w:w="100" w:type="dxa"/>
+          <w:bottom w:w="40" w:type="dxa"/>
+          <w:right w:w="100" w:type="dxa"/>
+        </w:tblCellMar>
+        <w:tblLook w:val="0420" w:firstRow="1" w:lastRow="0" w:firstColumn="0" w:lastColumn="0" w:noHBand="0" w:noVBand="1"/>
+      </w:tblPr>
+      <w:tblGrid>
+        <w:gridCol w:w="2610"/>
+        <w:gridCol w:w="2610"/>
+        <w:gridCol w:w="2610"/>
+        <w:gridCol w:w="2610"/>
+      </w:tblGrid>
+      <w:tr>
+        <w:trPr>
+          <w:cnfStyle w:val="100000000000" w:firstRow="1" w:lastRow="0" w:firstColumn="0" w:lastColumn="0" w:oddVBand="0" w:evenVBand="0" w:oddHBand="0" w:evenHBand="0" w:firstRowFirstColumn="0" w:firstRowLastColumn="0" w:lastRowFirstColumn="0" w:lastRowLastColumn="0"/>
+          <w:cantSplit/>
+          <w:tblHeader/>
+        </w:trPr>
+        <w:tc>
+          <w:tcPr>
+            <w:tcW w:w="1250" w:type="pct"/>
+          </w:tcPr>
+          <w:p>
+            <w:pPr>
+              <w:pStyle w:val="Compact"/>
+              <w:rPr>
+                <w:b w:val="0"/>
+                <w:sz w:val="17"/>
+              </w:rPr>
+            </w:pPr>
+            <w:r>
+              <w:rPr>
+                <w:b w:val="0"/>
+                <w:sz w:val="17"/>
+              </w:rPr>
+              <w:t>Project</w:t>
+            </w:r>
+          </w:p>
+        </w:tc>
+        <w:tc>
+          <w:tcPr>
+            <w:tcW w:w="1250" w:type="pct"/>
+          </w:tcPr>
+          <w:p>
+            <w:pPr>
+              <w:pStyle w:val="Compact"/>
+              <w:rPr>
+                <w:b w:val="0"/>
+                <w:sz w:val="17"/>
+              </w:rPr>
+            </w:pPr>
+            <w:r>
+              <w:rPr>
+                <w:b w:val="0"/>
+                <w:sz w:val="17"/>
+              </w:rPr>
+              <w:t>~Value</w:t>
+            </w:r>
+          </w:p>
+        </w:tc>
+        <w:tc>
+          <w:tcPr>
+            <w:tcW w:w="1250" w:type="pct"/>
+          </w:tcPr>
+          <w:p>
+            <w:pPr>
+              <w:pStyle w:val="Compact"/>
+              <w:rPr>
+                <w:b w:val="0"/>
+                <w:sz w:val="17"/>
+              </w:rPr>
+            </w:pPr>
+            <w:r>
+              <w:rPr>
+                <w:b w:val="0"/>
+                <w:sz w:val="17"/>
+              </w:rPr>
+              <w:t>Structural</w:t>
+            </w:r>
+          </w:p>
+        </w:tc>
+        <w:tc>
+          <w:tcPr>
+            <w:tcW w:w="1250" w:type="pct"/>
+          </w:tcPr>
+          <w:p>
+            <w:pPr>
+              <w:pStyle w:val="Compact"/>
+              <w:rPr>
+                <w:b w:val="0"/>
+                <w:sz w:val="17"/>
+              </w:rPr>
+            </w:pPr>
+            <w:r>
+              <w:rPr>
+                <w:b w:val="0"/>
+                <w:sz w:val="17"/>
+              </w:rPr>
+              <w:t>Verdict</w:t>
+            </w:r>
+          </w:p>
+        </w:tc>
+      </w:tr>
+      <w:tr>
+        <w:trPr>
+          <w:cnfStyle w:val="000000100000" w:firstRow="0" w:lastRow="0" w:firstColumn="0" w:lastColumn="0" w:oddVBand="0" w:evenVBand="0" w:oddHBand="1" w:evenHBand="0" w:firstRowFirstColumn="0" w:firstRowLastColumn="0" w:lastRowFirstColumn="0" w:lastRowLastColumn="0"/>
+          <w:cantSplit/>
+        </w:trPr>
+        <w:tc>
+          <w:tcPr>
+            <w:tcW w:w="1250" w:type="pct"/>
+          </w:tcPr>
+          <w:p>
+            <w:pPr>
+              <w:pStyle w:val="Compact"/>
+              <w:rPr>
+                <w:sz w:val="17"/>
+              </w:rPr>
+            </w:pPr>
+            <w:r>
+              <w:rPr>
+                <w:sz w:val="17"/>
+              </w:rPr>
+              <w:t>Kaye Edmonton Clinic</w:t>
+            </w:r>
+          </w:p>
+        </w:tc>
+        <w:tc>
+          <w:tcPr>
+            <w:tcW w:w="1250" w:type="pct"/>
+          </w:tcPr>
+          <w:p>
+            <w:pPr>
+              <w:pStyle w:val="Compact"/>
+              <w:rPr>
+                <w:sz w:val="17"/>
+              </w:rPr>
+            </w:pPr>
+            <w:r>
+              <w:rPr>
+                <w:sz w:val="17"/>
+              </w:rPr>
+              <w:t>$900M</w:t>
+            </w:r>
+          </w:p>
+        </w:tc>
+        <w:tc>
+          <w:tcPr>
+            <w:tcW w:w="1250" w:type="pct"/>
+          </w:tcPr>
+          <w:p>
+            <w:pPr>
+              <w:pStyle w:val="Compact"/>
+              <w:rPr>
+                <w:sz w:val="17"/>
+              </w:rPr>
+            </w:pPr>
+            <w:r>
+              <w:rPr>
+                <w:sz w:val="17"/>
+              </w:rPr>
+              <w:t>DIALOG + Jacobs (ex-Yolles), equal partners</w:t>
+            </w:r>
+          </w:p>
+        </w:tc>
+        <w:tc>
+          <w:tcPr>
+            <w:tcW w:w="1250" w:type="pct"/>
+          </w:tcPr>
+          <w:p>
+            <w:pPr>
+              <w:pStyle w:val="Compact"/>
+              <w:rPr>
+                <w:sz w:val="17"/>
+              </w:rPr>
+            </w:pPr>
+            <w:r>
+              <w:rPr>
+                <w:sz w:val="17"/>
+              </w:rPr>
+              <w:t>Outsourced/co-SE [V]</w:t>
+            </w:r>
+          </w:p>
+        </w:tc>
+      </w:tr>
+      <w:tr>
+        <w:trPr>
+          <w:cantSplit/>
+        </w:trPr>
+        <w:tc>
+          <w:tcPr>
+            <w:tcW w:w="1250" w:type="pct"/>
+          </w:tcPr>
+          <w:p>
+            <w:pPr>
+              <w:pStyle w:val="Compact"/>
+              <w:rPr>
+                <w:sz w:val="17"/>
+              </w:rPr>
+            </w:pPr>
+            <w:r>
+              <w:rPr>
+                <w:sz w:val="17"/>
+              </w:rPr>
+              <w:t>Calgary Cancer Centre</w:t>
+            </w:r>
+          </w:p>
+        </w:tc>
+        <w:tc>
+          <w:tcPr>
+            <w:tcW w:w="1250" w:type="pct"/>
+          </w:tcPr>
+          <w:p>
+            <w:pPr>
+              <w:pStyle w:val="Compact"/>
+              <w:rPr>
+                <w:sz w:val="17"/>
+              </w:rPr>
+            </w:pPr>
+            <w:r>
+              <w:rPr>
+                <w:sz w:val="17"/>
+              </w:rPr>
+              <w:t>$1.4B</w:t>
+            </w:r>
+          </w:p>
+        </w:tc>
+        <w:tc>
+          <w:tcPr>
+            <w:tcW w:w="1250" w:type="pct"/>
+          </w:tcPr>
+          <w:p>
+            <w:pPr>
+              <w:pStyle w:val="Compact"/>
+              <w:rPr>
+                <w:sz w:val="17"/>
+              </w:rPr>
+            </w:pPr>
+            <w:r>
+              <w:rPr>
+                <w:sz w:val="17"/>
+              </w:rPr>
+              <w:t>DIALOG + Stantec co-SE (PCL DB)</w:t>
+            </w:r>
+          </w:p>
+        </w:tc>
+        <w:tc>
+          <w:tcPr>
+            <w:tcW w:w="1250" w:type="pct"/>
+          </w:tcPr>
+          <w:p>
+            <w:pPr>
+              <w:pStyle w:val="Compact"/>
+              <w:rPr>
+                <w:sz w:val="17"/>
+              </w:rPr>
+            </w:pPr>
+            <w:r>
+              <w:rPr>
+                <w:sz w:val="17"/>
+              </w:rPr>
+              <w:t>Outsourced/co-SE [V]</w:t>
+            </w:r>
+          </w:p>
+        </w:tc>
+      </w:tr>
+      <w:tr>
+        <w:trPr>
+          <w:cnfStyle w:val="000000100000" w:firstRow="0" w:lastRow="0" w:firstColumn="0" w:lastColumn="0" w:oddVBand="0" w:evenVBand="0" w:oddHBand="1" w:evenHBand="0" w:firstRowFirstColumn="0" w:firstRowLastColumn="0" w:lastRowFirstColumn="0" w:lastRowLastColumn="0"/>
+          <w:cantSplit/>
+        </w:trPr>
+        <w:tc>
+          <w:tcPr>
+            <w:tcW w:w="1250" w:type="pct"/>
+          </w:tcPr>
+          <w:p>
+            <w:pPr>
+              <w:pStyle w:val="Compact"/>
+              <w:rPr>
+                <w:sz w:val="17"/>
+              </w:rPr>
+            </w:pPr>
+            <w:r>
+              <w:rPr>
+                <w:sz w:val="17"/>
+              </w:rPr>
+              <w:t>Foothills McCaig Tower</w:t>
+            </w:r>
+          </w:p>
+        </w:tc>
+        <w:tc>
+          <w:tcPr>
+            <w:tcW w:w="1250" w:type="pct"/>
+          </w:tcPr>
+          <w:p>
+            <w:pPr>
+              <w:pStyle w:val="Compact"/>
+              <w:rPr>
+                <w:sz w:val="17"/>
+              </w:rPr>
+            </w:pPr>
+            <w:r>
+              <w:rPr>
+                <w:sz w:val="17"/>
+              </w:rPr>
+              <w:t>—</w:t>
+            </w:r>
+          </w:p>
+        </w:tc>
+        <w:tc>
+          <w:tcPr>
+            <w:tcW w:w="1250" w:type="pct"/>
+          </w:tcPr>
+          <w:p>
+            <w:pPr>
+              <w:pStyle w:val="Compact"/>
+              <w:rPr>
+                <w:sz w:val="17"/>
+              </w:rPr>
+            </w:pPr>
+            <w:r>
+              <w:rPr>
+                <w:sz w:val="17"/>
+              </w:rPr>
+              <w:t>DIALOG architecture-only; structural = separate firm</w:t>
+            </w:r>
+          </w:p>
+        </w:tc>
+        <w:tc>
+          <w:tcPr>
+            <w:tcW w:w="1250" w:type="pct"/>
+          </w:tcPr>
+          <w:p>
+            <w:pPr>
+              <w:pStyle w:val="Compact"/>
+              <w:rPr>
+                <w:sz w:val="17"/>
+              </w:rPr>
+            </w:pPr>
+            <w:r>
+              <w:rPr>
+                <w:sz w:val="17"/>
+              </w:rPr>
+              <w:t>Outsourced [V]</w:t>
+            </w:r>
+          </w:p>
+        </w:tc>
+      </w:tr>
+      <w:tr>
+        <w:trPr>
+          <w:cantSplit/>
+        </w:trPr>
+        <w:tc>
+          <w:tcPr>
+            <w:tcW w:w="1250" w:type="pct"/>
+          </w:tcPr>
+          <w:p>
+            <w:pPr>
+              <w:pStyle w:val="Compact"/>
+              <w:rPr>
+                <w:sz w:val="17"/>
+              </w:rPr>
+            </w:pPr>
+            <w:r>
+              <w:rPr>
+                <w:sz w:val="17"/>
+              </w:rPr>
+              <w:t>UHNBC Acute Care Tower</w:t>
+            </w:r>
+          </w:p>
+        </w:tc>
+        <w:tc>
+          <w:tcPr>
+            <w:tcW w:w="1250" w:type="pct"/>
+          </w:tcPr>
+          <w:p>
+            <w:pPr>
+              <w:pStyle w:val="Compact"/>
+              <w:rPr>
+                <w:sz w:val="17"/>
+              </w:rPr>
+            </w:pPr>
+            <w:r>
+              <w:rPr>
+                <w:sz w:val="17"/>
+              </w:rPr>
+              <w:t>$1.58B</w:t>
+            </w:r>
+          </w:p>
+        </w:tc>
+        <w:tc>
+          <w:tcPr>
+            <w:tcW w:w="1250" w:type="pct"/>
+          </w:tcPr>
+          <w:p>
+            <w:pPr>
+              <w:pStyle w:val="Compact"/>
+              <w:rPr>
+                <w:sz w:val="17"/>
+              </w:rPr>
+            </w:pPr>
+            <w:r>
+              <w:rPr>
+                <w:sz w:val="17"/>
+              </w:rPr>
+              <w:t>Unnamed — SEAT OPEN (BC)</w:t>
+            </w:r>
+          </w:p>
+        </w:tc>
+        <w:tc>
+          <w:tcPr>
+            <w:tcW w:w="1250" w:type="pct"/>
+          </w:tcPr>
+          <w:p>
+            <w:pPr>
+              <w:pStyle w:val="Compact"/>
+              <w:rPr>
+                <w:sz w:val="17"/>
+              </w:rPr>
+            </w:pPr>
+            <w:r>
+              <w:rPr>
+                <w:b/>
+                <w:bCs/>
+                <w:sz w:val="17"/>
+              </w:rPr>
+              <w:t>KOR opening</w:t>
+            </w:r>
+            <w:r>
+              <w:rPr>
+                <w:sz w:val="17"/>
+              </w:rPr>
+              <w:t xml:space="preserve"> [V]</w:t>
+            </w:r>
+          </w:p>
+        </w:tc>
+      </w:tr>
+      <w:tr>
+        <w:trPr>
+          <w:cnfStyle w:val="000000100000" w:firstRow="0" w:lastRow="0" w:firstColumn="0" w:lastColumn="0" w:oddVBand="0" w:evenVBand="0" w:oddHBand="1" w:evenHBand="0" w:firstRowFirstColumn="0" w:firstRowLastColumn="0" w:lastRowFirstColumn="0" w:lastRowLastColumn="0"/>
+          <w:cantSplit/>
+        </w:trPr>
+        <w:tc>
+          <w:tcPr>
+            <w:tcW w:w="1250" w:type="pct"/>
+          </w:tcPr>
+          <w:p>
+            <w:pPr>
+              <w:pStyle w:val="Compact"/>
+              <w:rPr>
+                <w:sz w:val="17"/>
+              </w:rPr>
+            </w:pPr>
+            <w:r>
+              <w:rPr>
+                <w:sz w:val="17"/>
+              </w:rPr>
+              <w:t>Grande Prairie Regional</w:t>
+            </w:r>
+          </w:p>
+        </w:tc>
+        <w:tc>
+          <w:tcPr>
+            <w:tcW w:w="1250" w:type="pct"/>
+          </w:tcPr>
+          <w:p>
+            <w:pPr>
+              <w:pStyle w:val="Compact"/>
+              <w:rPr>
+                <w:sz w:val="17"/>
+              </w:rPr>
+            </w:pPr>
+            <w:r>
+              <w:rPr>
+                <w:sz w:val="17"/>
+              </w:rPr>
+              <w:t>~$680M</w:t>
+            </w:r>
+          </w:p>
+        </w:tc>
+        <w:tc>
+          <w:tcPr>
+            <w:tcW w:w="1250" w:type="pct"/>
+          </w:tcPr>
+          <w:p>
+            <w:pPr>
+              <w:pStyle w:val="Compact"/>
+              <w:rPr>
+                <w:sz w:val="17"/>
+              </w:rPr>
+            </w:pPr>
+            <w:r>
+              <w:rPr>
+                <w:sz w:val="17"/>
+              </w:rPr>
+              <w:t>In-house (Hildenbrandt, Lenzin)</w:t>
+            </w:r>
+          </w:p>
+        </w:tc>
+        <w:tc>
+          <w:tcPr>
+            <w:tcW w:w="1250" w:type="pct"/>
+          </w:tcPr>
+          <w:p>
+            <w:pPr>
+              <w:pStyle w:val="Compact"/>
+              <w:rPr>
+                <w:sz w:val="17"/>
+              </w:rPr>
+            </w:pPr>
+            <w:r>
+              <w:rPr>
+                <w:sz w:val="17"/>
+              </w:rPr>
+              <w:t>In-house [V]</w:t>
+            </w:r>
+          </w:p>
+        </w:tc>
+      </w:tr>
+      <w:tr>
+        <w:trPr>
+          <w:cantSplit/>
+        </w:trPr>
+        <w:tc>
+          <w:tcPr>
+            <w:tcW w:w="1250" w:type="pct"/>
+          </w:tcPr>
+          <w:p>
+            <w:pPr>
+              <w:pStyle w:val="Compact"/>
+              <w:rPr>
+                <w:sz w:val="17"/>
+              </w:rPr>
+            </w:pPr>
+            <w:r>
+              <w:rPr>
+                <w:sz w:val="17"/>
+              </w:rPr>
+              <w:t>Edson Healthcare Centre</w:t>
+            </w:r>
+          </w:p>
+        </w:tc>
+        <w:tc>
+          <w:tcPr>
+            <w:tcW w:w="1250" w:type="pct"/>
+          </w:tcPr>
+          <w:p>
+            <w:pPr>
+              <w:pStyle w:val="Compact"/>
+              <w:rPr>
+                <w:sz w:val="17"/>
+              </w:rPr>
+            </w:pPr>
+            <w:r>
+              <w:rPr>
+                <w:sz w:val="17"/>
+              </w:rPr>
+              <w:t>—</w:t>
+            </w:r>
+          </w:p>
+        </w:tc>
+        <w:tc>
+          <w:tcPr>
+            <w:tcW w:w="1250" w:type="pct"/>
+          </w:tcPr>
+          <w:p>
+            <w:pPr>
+              <w:pStyle w:val="Compact"/>
+              <w:rPr>
+                <w:sz w:val="17"/>
+              </w:rPr>
+            </w:pPr>
+            <w:r>
+              <w:rPr>
+                <w:sz w:val="17"/>
+              </w:rPr>
+              <w:t>In-house (Renihan)</w:t>
+            </w:r>
+          </w:p>
+        </w:tc>
+        <w:tc>
+          <w:tcPr>
+            <w:tcW w:w="1250" w:type="pct"/>
+          </w:tcPr>
+          <w:p>
+            <w:pPr>
+              <w:pStyle w:val="Compact"/>
+              <w:rPr>
+                <w:sz w:val="17"/>
+              </w:rPr>
+            </w:pPr>
+            <w:r>
+              <w:rPr>
+                <w:sz w:val="17"/>
+              </w:rPr>
+              <w:t>In-house [V]</w:t>
+            </w:r>
+          </w:p>
+        </w:tc>
+      </w:tr>
+      <w:tr>
+        <w:trPr>
+          <w:cnfStyle w:val="000000100000" w:firstRow="0" w:lastRow="0" w:firstColumn="0" w:lastColumn="0" w:oddVBand="0" w:evenVBand="0" w:oddHBand="1" w:evenHBand="0" w:firstRowFirstColumn="0" w:firstRowLastColumn="0" w:lastRowFirstColumn="0" w:lastRowLastColumn="0"/>
+          <w:cantSplit/>
+        </w:trPr>
+        <w:tc>
+          <w:tcPr>
+            <w:tcW w:w="1250" w:type="pct"/>
+          </w:tcPr>
+          <w:p>
+            <w:pPr>
+              <w:pStyle w:val="Compact"/>
+              <w:rPr>
+                <w:sz w:val="17"/>
+              </w:rPr>
+            </w:pPr>
+            <w:r>
+              <w:rPr>
+                <w:sz w:val="17"/>
+              </w:rPr>
+              <w:t>Gene Zwozdesky / Norwood</w:t>
+            </w:r>
+          </w:p>
+        </w:tc>
+        <w:tc>
+          <w:tcPr>
+            <w:tcW w:w="1250" w:type="pct"/>
+          </w:tcPr>
+          <w:p>
+            <w:pPr>
+              <w:pStyle w:val="Compact"/>
+              <w:rPr>
+                <w:sz w:val="17"/>
+              </w:rPr>
+            </w:pPr>
+            <w:r>
+              <w:rPr>
+                <w:sz w:val="17"/>
+              </w:rPr>
+              <w:t>$364M</w:t>
+            </w:r>
+          </w:p>
+        </w:tc>
+        <w:tc>
+          <w:tcPr>
+            <w:tcW w:w="1250" w:type="pct"/>
+          </w:tcPr>
+          <w:p>
+            <w:pPr>
+              <w:pStyle w:val="Compact"/>
+              <w:rPr>
+                <w:sz w:val="17"/>
+              </w:rPr>
+            </w:pPr>
+            <w:r>
+              <w:rPr>
+                <w:sz w:val="17"/>
+              </w:rPr>
+              <w:t>In-house</w:t>
+            </w:r>
+          </w:p>
+        </w:tc>
+        <w:tc>
+          <w:tcPr>
+            <w:tcW w:w="1250" w:type="pct"/>
+          </w:tcPr>
+          <w:p>
+            <w:pPr>
+              <w:pStyle w:val="Compact"/>
+              <w:rPr>
+                <w:sz w:val="17"/>
+              </w:rPr>
+            </w:pPr>
+            <w:r>
+              <w:rPr>
+                <w:sz w:val="17"/>
+              </w:rPr>
+              <w:t>In-house [V]</w:t>
+            </w:r>
+          </w:p>
+        </w:tc>
+      </w:tr>
+      <w:tr>
+        <w:trPr>
+          <w:cantSplit/>
+        </w:trPr>
+        <w:tc>
+          <w:tcPr>
+            <w:tcW w:w="1250" w:type="pct"/>
+          </w:tcPr>
+          <w:p>
+            <w:pPr>
+              <w:pStyle w:val="Compact"/>
+              <w:rPr>
+                <w:sz w:val="17"/>
+              </w:rPr>
+            </w:pPr>
+            <w:r>
+              <w:rPr>
+                <w:sz w:val="17"/>
+              </w:rPr>
+              <w:t>UHN Toronto Western Tower</w:t>
+            </w:r>
+          </w:p>
+        </w:tc>
+        <w:tc>
+          <w:tcPr>
+            <w:tcW w:w="1250" w:type="pct"/>
+          </w:tcPr>
+          <w:p>
+            <w:pPr>
+              <w:pStyle w:val="Compact"/>
+              <w:rPr>
+                <w:sz w:val="17"/>
+              </w:rPr>
+            </w:pPr>
+            <w:r>
+              <w:rPr>
+                <w:sz w:val="17"/>
+              </w:rPr>
+              <w:t>~$1B</w:t>
+            </w:r>
+          </w:p>
+        </w:tc>
+        <w:tc>
+          <w:tcPr>
+            <w:tcW w:w="1250" w:type="pct"/>
+          </w:tcPr>
+          <w:p>
+            <w:pPr>
+              <w:pStyle w:val="Compact"/>
+              <w:rPr>
+                <w:sz w:val="17"/>
+              </w:rPr>
+            </w:pPr>
+            <w:r>
+              <w:rPr>
+                <w:sz w:val="17"/>
+              </w:rPr>
+              <w:t>In-house (Khachi, Ritchie)</w:t>
+            </w:r>
+          </w:p>
+        </w:tc>
+        <w:tc>
+          <w:tcPr>
+            <w:tcW w:w="1250" w:type="pct"/>
+          </w:tcPr>
+          <w:p>
+            <w:pPr>
+              <w:pStyle w:val="Compact"/>
+              <w:rPr>
+                <w:sz w:val="17"/>
+              </w:rPr>
+            </w:pPr>
+            <w:r>
+              <w:rPr>
+                <w:sz w:val="17"/>
+              </w:rPr>
+              <w:t>In-house [V]</w:t>
+            </w:r>
+          </w:p>
+        </w:tc>
+      </w:tr>
+      <w:tr>
+        <w:trPr>
+          <w:cnfStyle w:val="000000100000" w:firstRow="0" w:lastRow="0" w:firstColumn="0" w:lastColumn="0" w:oddVBand="0" w:evenVBand="0" w:oddHBand="1" w:evenHBand="0" w:firstRowFirstColumn="0" w:firstRowLastColumn="0" w:lastRowFirstColumn="0" w:lastRowLastColumn="0"/>
+          <w:cantSplit/>
+        </w:trPr>
+        <w:tc>
+          <w:tcPr>
+            <w:tcW w:w="1250" w:type="pct"/>
+          </w:tcPr>
+          <w:p>
+            <w:pPr>
+              <w:pStyle w:val="Compact"/>
+              <w:rPr>
+                <w:sz w:val="17"/>
+              </w:rPr>
+            </w:pPr>
+            <w:r>
+              <w:rPr>
+                <w:sz w:val="17"/>
+              </w:rPr>
+              <w:t>Markdale Hospital</w:t>
+            </w:r>
+          </w:p>
+        </w:tc>
+        <w:tc>
+          <w:tcPr>
+            <w:tcW w:w="1250" w:type="pct"/>
+          </w:tcPr>
+          <w:p>
+            <w:pPr>
+              <w:pStyle w:val="Compact"/>
+              <w:rPr>
+                <w:sz w:val="17"/>
+              </w:rPr>
+            </w:pPr>
+            <w:r>
+              <w:rPr>
+                <w:sz w:val="17"/>
+              </w:rPr>
+              <w:t>—</w:t>
+            </w:r>
+          </w:p>
+        </w:tc>
+        <w:tc>
+          <w:tcPr>
+            <w:tcW w:w="1250" w:type="pct"/>
+          </w:tcPr>
+          <w:p>
+            <w:pPr>
+              <w:pStyle w:val="Compact"/>
+              <w:rPr>
+                <w:sz w:val="17"/>
+              </w:rPr>
+            </w:pPr>
+            <w:r>
+              <w:rPr>
+                <w:sz w:val="17"/>
+              </w:rPr>
+              <w:t>In-house (Khachi)</w:t>
+            </w:r>
+          </w:p>
+        </w:tc>
+        <w:tc>
+          <w:tcPr>
+            <w:tcW w:w="1250" w:type="pct"/>
+          </w:tcPr>
+          <w:p>
+            <w:pPr>
+              <w:pStyle w:val="Compact"/>
+              <w:rPr>
+                <w:sz w:val="17"/>
+              </w:rPr>
+            </w:pPr>
+            <w:r>
+              <w:rPr>
+                <w:sz w:val="17"/>
+              </w:rPr>
+              <w:t>In-house [V]</w:t>
+            </w:r>
+          </w:p>
+        </w:tc>
+      </w:tr>
+      <w:tr>
+        <w:trPr>
+          <w:cantSplit/>
+        </w:trPr>
+        <w:tc>
+          <w:tcPr>
+            <w:tcW w:w="1250" w:type="pct"/>
+          </w:tcPr>
+          <w:p>
+            <w:pPr>
+              <w:pStyle w:val="Compact"/>
+              <w:rPr>
+                <w:sz w:val="17"/>
+              </w:rPr>
+            </w:pPr>
+            <w:r>
+              <w:rPr>
+                <w:sz w:val="17"/>
+              </w:rPr>
+              <w:t>Dartmouth General</w:t>
+            </w:r>
+          </w:p>
+        </w:tc>
+        <w:tc>
+          <w:tcPr>
+            <w:tcW w:w="1250" w:type="pct"/>
+          </w:tcPr>
+          <w:p>
+            <w:pPr>
+              <w:pStyle w:val="Compact"/>
+              <w:rPr>
+                <w:sz w:val="17"/>
+              </w:rPr>
+            </w:pPr>
+            <w:r>
+              <w:rPr>
+                <w:sz w:val="17"/>
+              </w:rPr>
+              <w:t>—</w:t>
+            </w:r>
+          </w:p>
+        </w:tc>
+        <w:tc>
+          <w:tcPr>
+            <w:tcW w:w="1250" w:type="pct"/>
+          </w:tcPr>
+          <w:p>
+            <w:pPr>
+              <w:pStyle w:val="Compact"/>
+              <w:rPr>
+                <w:sz w:val="17"/>
+              </w:rPr>
+            </w:pPr>
+            <w:r>
+              <w:rPr>
+                <w:sz w:val="17"/>
+              </w:rPr>
+              <w:t>In-house (Hildenbrandt)</w:t>
+            </w:r>
+          </w:p>
+        </w:tc>
+        <w:tc>
+          <w:tcPr>
+            <w:tcW w:w="1250" w:type="pct"/>
+          </w:tcPr>
+          <w:p>
+            <w:pPr>
+              <w:pStyle w:val="Compact"/>
+              <w:rPr>
+                <w:sz w:val="17"/>
+              </w:rPr>
+            </w:pPr>
+            <w:r>
+              <w:rPr>
+                <w:sz w:val="17"/>
+              </w:rPr>
+              <w:t>In-house [V]</w:t>
+            </w:r>
+          </w:p>
+        </w:tc>
+      </w:tr>
+    </w:tbl>
+    <w:p>
+      <w:pPr>
+        <w:pStyle w:val="Heading2"/>
+      </w:pPr>
+      <w:bookmarkStart w:id="11" w:name="X79fa02d13dd6e27971481df4f6565224426045f"/>
+      <w:bookmarkEnd w:id="10"/>
+      <w:r>
+        <w:t>Appendix B — Non-healthcare external SE (verified sample)</w:t>
+      </w:r>
+    </w:p>
+    <w:tbl>
+      <w:tblPr>
+        <w:tblStyle w:val="GridTable4"/>
+        <w:tblW w:w="5000" w:type="pct"/>
+        <w:tblCellMar>
+          <w:top w:w="40" w:type="dxa"/>
+          <w:left w:w="100" w:type="dxa"/>
+          <w:bottom w:w="40" w:type="dxa"/>
+          <w:right w:w="100" w:type="dxa"/>
+        </w:tblCellMar>
+        <w:tblLook w:val="0420" w:firstRow="1" w:lastRow="0" w:firstColumn="0" w:lastColumn="0" w:noHBand="0" w:noVBand="1"/>
+      </w:tblPr>
+      <w:tblGrid>
+        <w:gridCol w:w="2610"/>
+        <w:gridCol w:w="2610"/>
+        <w:gridCol w:w="2610"/>
+        <w:gridCol w:w="2610"/>
+      </w:tblGrid>
+      <w:tr>
+        <w:trPr>
+          <w:cnfStyle w:val="100000000000" w:firstRow="1" w:lastRow="0" w:firstColumn="0" w:lastColumn="0" w:oddVBand="0" w:evenVBand="0" w:oddHBand="0" w:evenHBand="0" w:firstRowFirstColumn="0" w:firstRowLastColumn="0" w:lastRowFirstColumn="0" w:lastRowLastColumn="0"/>
+          <w:cantSplit/>
+          <w:tblHeader/>
+        </w:trPr>
+        <w:tc>
+          <w:tcPr>
+            <w:tcW w:w="1250" w:type="pct"/>
+          </w:tcPr>
+          <w:p>
+            <w:pPr>
+              <w:pStyle w:val="Compact"/>
+              <w:rPr>
+                <w:b w:val="0"/>
+                <w:sz w:val="17"/>
+              </w:rPr>
+            </w:pPr>
+            <w:r>
+              <w:rPr>
+                <w:b w:val="0"/>
+                <w:sz w:val="17"/>
+              </w:rPr>
+              <w:t>Project</w:t>
+            </w:r>
+          </w:p>
+        </w:tc>
+        <w:tc>
+          <w:tcPr>
+            <w:tcW w:w="1250" w:type="pct"/>
+          </w:tcPr>
+          <w:p>
+            <w:pPr>
+              <w:pStyle w:val="Compact"/>
+              <w:rPr>
+                <w:b w:val="0"/>
+                <w:sz w:val="17"/>
+              </w:rPr>
+            </w:pPr>
+            <w:r>
+              <w:rPr>
+                <w:b w:val="0"/>
+                <w:sz w:val="17"/>
+              </w:rPr>
+              <w:t>Sector</w:t>
+            </w:r>
+          </w:p>
+        </w:tc>
+        <w:tc>
+          <w:tcPr>
+            <w:tcW w:w="1250" w:type="pct"/>
+          </w:tcPr>
+          <w:p>
+            <w:pPr>
+              <w:pStyle w:val="Compact"/>
+              <w:rPr>
+                <w:b w:val="0"/>
+                <w:sz w:val="17"/>
+              </w:rPr>
+            </w:pPr>
+            <w:r>
+              <w:rPr>
+                <w:b w:val="0"/>
+                <w:sz w:val="17"/>
+              </w:rPr>
+              <w:t>Structural</w:t>
+            </w:r>
+          </w:p>
+        </w:tc>
+        <w:tc>
+          <w:tcPr>
+            <w:tcW w:w="1250" w:type="pct"/>
+          </w:tcPr>
+          <w:p>
+            <w:pPr>
+              <w:pStyle w:val="Compact"/>
+              <w:rPr>
+                <w:b w:val="0"/>
+                <w:sz w:val="17"/>
+              </w:rPr>
+            </w:pPr>
+            <w:r>
+              <w:rPr>
+                <w:b w:val="0"/>
+                <w:sz w:val="17"/>
+              </w:rPr>
+              <w:t>Trigger</w:t>
+            </w:r>
+          </w:p>
+        </w:tc>
+      </w:tr>
+      <w:tr>
+        <w:trPr>
+          <w:cnfStyle w:val="000000100000" w:firstRow="0" w:lastRow="0" w:firstColumn="0" w:lastColumn="0" w:oddVBand="0" w:evenVBand="0" w:oddHBand="1" w:evenHBand="0" w:firstRowFirstColumn="0" w:firstRowLastColumn="0" w:lastRowFirstColumn="0" w:lastRowLastColumn="0"/>
+          <w:cantSplit/>
+        </w:trPr>
+        <w:tc>
+          <w:tcPr>
+            <w:tcW w:w="1250" w:type="pct"/>
+          </w:tcPr>
+          <w:p>
+            <w:pPr>
+              <w:pStyle w:val="Compact"/>
+              <w:rPr>
+                <w:sz w:val="17"/>
+              </w:rPr>
+            </w:pPr>
+            <w:r>
+              <w:rPr>
+                <w:sz w:val="17"/>
+              </w:rPr>
+              <w:t>Vancouver House (59st)</w:t>
+            </w:r>
+          </w:p>
+        </w:tc>
+        <w:tc>
+          <w:tcPr>
+            <w:tcW w:w="1250" w:type="pct"/>
+          </w:tcPr>
+          <w:p>
+            <w:pPr>
+              <w:pStyle w:val="Compact"/>
+              <w:rPr>
+                <w:sz w:val="17"/>
+              </w:rPr>
+            </w:pPr>
+            <w:r>
+              <w:rPr>
+                <w:sz w:val="17"/>
+              </w:rPr>
+              <w:t>Tower</w:t>
+            </w:r>
+          </w:p>
+        </w:tc>
+        <w:tc>
+          <w:tcPr>
+            <w:tcW w:w="1250" w:type="pct"/>
+          </w:tcPr>
+          <w:p>
+            <w:pPr>
+              <w:pStyle w:val="Compact"/>
+              <w:rPr>
+                <w:sz w:val="17"/>
+              </w:rPr>
+            </w:pPr>
+            <w:r>
+              <w:rPr>
+                <w:sz w:val="17"/>
+              </w:rPr>
+              <w:t>Glotman Simpson + BuroHappold</w:t>
+            </w:r>
+          </w:p>
+        </w:tc>
+        <w:tc>
+          <w:tcPr>
+            <w:tcW w:w="1250" w:type="pct"/>
+          </w:tcPr>
+          <w:p>
+            <w:pPr>
+              <w:pStyle w:val="Compact"/>
+              <w:rPr>
+                <w:sz w:val="17"/>
+              </w:rPr>
+            </w:pPr>
+            <w:r>
+              <w:rPr>
+                <w:sz w:val="17"/>
+              </w:rPr>
+              <w:t>BIG design-arch led</w:t>
+            </w:r>
+          </w:p>
+        </w:tc>
+      </w:tr>
+      <w:tr>
+        <w:trPr>
+          <w:cantSplit/>
+        </w:trPr>
+        <w:tc>
+          <w:tcPr>
+            <w:tcW w:w="1250" w:type="pct"/>
+          </w:tcPr>
+          <w:p>
+            <w:pPr>
+              <w:pStyle w:val="Compact"/>
+              <w:rPr>
+                <w:sz w:val="17"/>
+              </w:rPr>
+            </w:pPr>
+            <w:r>
+              <w:rPr>
+                <w:sz w:val="17"/>
+              </w:rPr>
+              <w:t>Brookfield Place Calgary (60st)</w:t>
+            </w:r>
+          </w:p>
+        </w:tc>
+        <w:tc>
+          <w:tcPr>
+            <w:tcW w:w="1250" w:type="pct"/>
+          </w:tcPr>
+          <w:p>
+            <w:pPr>
+              <w:pStyle w:val="Compact"/>
+              <w:rPr>
+                <w:sz w:val="17"/>
+              </w:rPr>
+            </w:pPr>
+            <w:r>
+              <w:rPr>
+                <w:sz w:val="17"/>
+              </w:rPr>
+              <w:t>Office</w:t>
+            </w:r>
+          </w:p>
+        </w:tc>
+        <w:tc>
+          <w:tcPr>
+            <w:tcW w:w="1250" w:type="pct"/>
+          </w:tcPr>
+          <w:p>
+            <w:pPr>
+              <w:pStyle w:val="Compact"/>
+              <w:rPr>
+                <w:sz w:val="17"/>
+              </w:rPr>
+            </w:pPr>
+            <w:r>
+              <w:rPr>
+                <w:sz w:val="17"/>
+              </w:rPr>
+              <w:t>Entuitive</w:t>
+            </w:r>
+          </w:p>
+        </w:tc>
+        <w:tc>
+          <w:tcPr>
+            <w:tcW w:w="1250" w:type="pct"/>
+          </w:tcPr>
+          <w:p>
+            <w:pPr>
+              <w:pStyle w:val="Compact"/>
+              <w:rPr>
+                <w:sz w:val="17"/>
+              </w:rPr>
+            </w:pPr>
+            <w:r>
+              <w:rPr>
+                <w:sz w:val="17"/>
+              </w:rPr>
+              <w:t>AFK design-arch led</w:t>
+            </w:r>
+          </w:p>
+        </w:tc>
+      </w:tr>
+      <w:tr>
+        <w:trPr>
+          <w:cnfStyle w:val="000000100000" w:firstRow="0" w:lastRow="0" w:firstColumn="0" w:lastColumn="0" w:oddVBand="0" w:evenVBand="0" w:oddHBand="1" w:evenHBand="0" w:firstRowFirstColumn="0" w:firstRowLastColumn="0" w:lastRowFirstColumn="0" w:lastRowLastColumn="0"/>
+          <w:cantSplit/>
+        </w:trPr>
+        <w:tc>
+          <w:tcPr>
+            <w:tcW w:w="1250" w:type="pct"/>
+          </w:tcPr>
+          <w:p>
+            <w:pPr>
+              <w:pStyle w:val="Compact"/>
+              <w:rPr>
+                <w:sz w:val="17"/>
+              </w:rPr>
+            </w:pPr>
+            <w:r>
+              <w:rPr>
+                <w:sz w:val="17"/>
+              </w:rPr>
+              <w:t>The Parks (45+35st)</w:t>
+            </w:r>
+          </w:p>
+        </w:tc>
+        <w:tc>
+          <w:tcPr>
+            <w:tcW w:w="1250" w:type="pct"/>
+          </w:tcPr>
+          <w:p>
+            <w:pPr>
+              <w:pStyle w:val="Compact"/>
+              <w:rPr>
+                <w:sz w:val="17"/>
+              </w:rPr>
+            </w:pPr>
+            <w:r>
+              <w:rPr>
+                <w:sz w:val="17"/>
+              </w:rPr>
+              <w:t>Tower</w:t>
+            </w:r>
+          </w:p>
+        </w:tc>
+        <w:tc>
+          <w:tcPr>
+            <w:tcW w:w="1250" w:type="pct"/>
+          </w:tcPr>
+          <w:p>
+            <w:pPr>
+              <w:pStyle w:val="Compact"/>
+              <w:rPr>
+                <w:sz w:val="17"/>
+              </w:rPr>
+            </w:pPr>
+            <w:r>
+              <w:rPr>
+                <w:sz w:val="17"/>
+              </w:rPr>
+              <w:t>RJC</w:t>
+            </w:r>
+          </w:p>
+        </w:tc>
+        <w:tc>
+          <w:tcPr>
+            <w:tcW w:w="1250" w:type="pct"/>
+          </w:tcPr>
+          <w:p>
+            <w:pPr>
+              <w:pStyle w:val="Compact"/>
+              <w:rPr>
+                <w:sz w:val="17"/>
+              </w:rPr>
+            </w:pPr>
+            <w:r>
+              <w:rPr>
+                <w:sz w:val="17"/>
+              </w:rPr>
+              <w:t>Hariri Pontarini co-arch</w:t>
+            </w:r>
+          </w:p>
+        </w:tc>
+      </w:tr>
+      <w:tr>
+        <w:trPr>
+          <w:cantSplit/>
+        </w:trPr>
+        <w:tc>
+          <w:tcPr>
+            <w:tcW w:w="1250" w:type="pct"/>
+          </w:tcPr>
+          <w:p>
+            <w:pPr>
+              <w:pStyle w:val="Compact"/>
+              <w:rPr>
+                <w:sz w:val="17"/>
+              </w:rPr>
+            </w:pPr>
+            <w:r>
+              <w:rPr>
+                <w:sz w:val="17"/>
+              </w:rPr>
+              <w:t>The Hive (mass timber)</w:t>
+            </w:r>
+          </w:p>
+        </w:tc>
+        <w:tc>
+          <w:tcPr>
+            <w:tcW w:w="1250" w:type="pct"/>
+          </w:tcPr>
+          <w:p>
+            <w:pPr>
+              <w:pStyle w:val="Compact"/>
+              <w:rPr>
+                <w:sz w:val="17"/>
+              </w:rPr>
+            </w:pPr>
+            <w:r>
+              <w:rPr>
+                <w:sz w:val="17"/>
+              </w:rPr>
+              <w:t>Office</w:t>
+            </w:r>
+          </w:p>
+        </w:tc>
+        <w:tc>
+          <w:tcPr>
+            <w:tcW w:w="1250" w:type="pct"/>
+          </w:tcPr>
+          <w:p>
+            <w:pPr>
+              <w:pStyle w:val="Compact"/>
+              <w:rPr>
+                <w:sz w:val="17"/>
+              </w:rPr>
+            </w:pPr>
+            <w:r>
+              <w:rPr>
+                <w:sz w:val="17"/>
+              </w:rPr>
+              <w:t>Fast+Epp</w:t>
+            </w:r>
+          </w:p>
+        </w:tc>
+        <w:tc>
+          <w:tcPr>
+            <w:tcW w:w="1250" w:type="pct"/>
+          </w:tcPr>
+          <w:p>
+            <w:pPr>
+              <w:pStyle w:val="Compact"/>
+              <w:rPr>
+                <w:sz w:val="17"/>
+              </w:rPr>
+            </w:pPr>
+            <w:r>
+              <w:rPr>
+                <w:sz w:val="17"/>
+              </w:rPr>
+              <w:t>Pioneer seismic timber</w:t>
+            </w:r>
+          </w:p>
+        </w:tc>
+      </w:tr>
+      <w:tr>
+        <w:trPr>
+          <w:cnfStyle w:val="000000100000" w:firstRow="0" w:lastRow="0" w:firstColumn="0" w:lastColumn="0" w:oddVBand="0" w:evenVBand="0" w:oddHBand="1" w:evenHBand="0" w:firstRowFirstColumn="0" w:firstRowLastColumn="0" w:lastRowFirstColumn="0" w:lastRowLastColumn="0"/>
+          <w:cantSplit/>
+        </w:trPr>
+        <w:tc>
+          <w:tcPr>
+            <w:tcW w:w="1250" w:type="pct"/>
+          </w:tcPr>
+          <w:p>
+            <w:pPr>
+              <w:pStyle w:val="Compact"/>
+              <w:rPr>
+                <w:sz w:val="17"/>
+              </w:rPr>
+            </w:pPr>
+            <w:r>
+              <w:rPr>
+                <w:sz w:val="17"/>
+              </w:rPr>
+              <w:t>Calgary Central Library</w:t>
+            </w:r>
+          </w:p>
+        </w:tc>
+        <w:tc>
+          <w:tcPr>
+            <w:tcW w:w="1250" w:type="pct"/>
+          </w:tcPr>
+          <w:p>
+            <w:pPr>
+              <w:pStyle w:val="Compact"/>
+              <w:rPr>
+                <w:sz w:val="17"/>
+              </w:rPr>
+            </w:pPr>
+            <w:r>
+              <w:rPr>
+                <w:sz w:val="17"/>
+              </w:rPr>
+              <w:t>Civic</w:t>
+            </w:r>
+          </w:p>
+        </w:tc>
+        <w:tc>
+          <w:tcPr>
+            <w:tcW w:w="1250" w:type="pct"/>
+          </w:tcPr>
+          <w:p>
+            <w:pPr>
+              <w:pStyle w:val="Compact"/>
+              <w:rPr>
+                <w:sz w:val="17"/>
+              </w:rPr>
+            </w:pPr>
+            <w:r>
+              <w:rPr>
+                <w:sz w:val="17"/>
+              </w:rPr>
+              <w:t>Entuitive</w:t>
+            </w:r>
+          </w:p>
+        </w:tc>
+        <w:tc>
+          <w:tcPr>
+            <w:tcW w:w="1250" w:type="pct"/>
+          </w:tcPr>
+          <w:p>
+            <w:pPr>
+              <w:pStyle w:val="Compact"/>
+              <w:rPr>
+                <w:sz w:val="17"/>
+              </w:rPr>
+            </w:pPr>
+            <w:r>
+              <w:rPr>
+                <w:sz w:val="17"/>
+              </w:rPr>
+              <w:t>Snøhetta co-arch</w:t>
+            </w:r>
+          </w:p>
+        </w:tc>
+      </w:tr>
+      <w:tr>
+        <w:trPr>
+          <w:cantSplit/>
+        </w:trPr>
+        <w:tc>
+          <w:tcPr>
+            <w:tcW w:w="1250" w:type="pct"/>
+          </w:tcPr>
+          <w:p>
+            <w:pPr>
+              <w:pStyle w:val="Compact"/>
+              <w:rPr>
+                <w:sz w:val="17"/>
+              </w:rPr>
+            </w:pPr>
+            <w:r>
+              <w:rPr>
+                <w:sz w:val="17"/>
+              </w:rPr>
+              <w:t>TELUS Spark</w:t>
+            </w:r>
+          </w:p>
+        </w:tc>
+        <w:tc>
+          <w:tcPr>
+            <w:tcW w:w="1250" w:type="pct"/>
+          </w:tcPr>
+          <w:p>
+            <w:pPr>
+              <w:pStyle w:val="Compact"/>
+              <w:rPr>
+                <w:sz w:val="17"/>
+              </w:rPr>
+            </w:pPr>
+            <w:r>
+              <w:rPr>
+                <w:sz w:val="17"/>
+              </w:rPr>
+              <w:t>Civic</w:t>
+            </w:r>
+          </w:p>
+        </w:tc>
+        <w:tc>
+          <w:tcPr>
+            <w:tcW w:w="1250" w:type="pct"/>
+          </w:tcPr>
+          <w:p>
+            <w:pPr>
+              <w:pStyle w:val="Compact"/>
+              <w:rPr>
+                <w:sz w:val="17"/>
+              </w:rPr>
+            </w:pPr>
+            <w:r>
+              <w:rPr>
+                <w:sz w:val="17"/>
+              </w:rPr>
+              <w:t>Stantec</w:t>
+            </w:r>
+          </w:p>
+        </w:tc>
+        <w:tc>
+          <w:tcPr>
+            <w:tcW w:w="1250" w:type="pct"/>
+          </w:tcPr>
+          <w:p>
+            <w:pPr>
+              <w:pStyle w:val="Compact"/>
+              <w:rPr>
+                <w:sz w:val="17"/>
+              </w:rPr>
+            </w:pPr>
+            <w:r>
+              <w:rPr>
+                <w:sz w:val="17"/>
+              </w:rPr>
+              <w:t>Kasian co-arch</w:t>
+            </w:r>
+          </w:p>
+        </w:tc>
+      </w:tr>
+      <w:tr>
+        <w:trPr>
+          <w:cnfStyle w:val="000000100000" w:firstRow="0" w:lastRow="0" w:firstColumn="0" w:lastColumn="0" w:oddVBand="0" w:evenVBand="0" w:oddHBand="1" w:evenHBand="0" w:firstRowFirstColumn="0" w:firstRowLastColumn="0" w:lastRowFirstColumn="0" w:lastRowLastColumn="0"/>
+          <w:cantSplit/>
+        </w:trPr>
+        <w:tc>
+          <w:tcPr>
+            <w:tcW w:w="1250" w:type="pct"/>
+          </w:tcPr>
+          <w:p>
+            <w:pPr>
+              <w:pStyle w:val="Compact"/>
+              <w:rPr>
+                <w:sz w:val="17"/>
+              </w:rPr>
+            </w:pPr>
+            <w:r>
+              <w:rPr>
+                <w:sz w:val="17"/>
+              </w:rPr>
+              <w:t>Nk’Mip Cultural Centre</w:t>
+            </w:r>
+          </w:p>
+        </w:tc>
+        <w:tc>
+          <w:tcPr>
+            <w:tcW w:w="1250" w:type="pct"/>
+          </w:tcPr>
+          <w:p>
+            <w:pPr>
+              <w:pStyle w:val="Compact"/>
+              <w:rPr>
+                <w:sz w:val="17"/>
+              </w:rPr>
+            </w:pPr>
+            <w:r>
+              <w:rPr>
+                <w:sz w:val="17"/>
+              </w:rPr>
+              <w:t>Cultural</w:t>
+            </w:r>
+          </w:p>
+        </w:tc>
+        <w:tc>
+          <w:tcPr>
+            <w:tcW w:w="1250" w:type="pct"/>
+          </w:tcPr>
+          <w:p>
+            <w:pPr>
+              <w:pStyle w:val="Compact"/>
+              <w:rPr>
+                <w:sz w:val="17"/>
+              </w:rPr>
+            </w:pPr>
+            <w:r>
+              <w:rPr>
+                <w:sz w:val="17"/>
+              </w:rPr>
+              <w:t>Equilibrium</w:t>
+            </w:r>
+          </w:p>
+        </w:tc>
+        <w:tc>
+          <w:tcPr>
+            <w:tcW w:w="1250" w:type="pct"/>
+          </w:tcPr>
+          <w:p>
+            <w:pPr>
+              <w:pStyle w:val="Compact"/>
+              <w:rPr>
+                <w:sz w:val="17"/>
+              </w:rPr>
+            </w:pPr>
+            <w:r>
+              <w:rPr>
+                <w:sz w:val="17"/>
+              </w:rPr>
+              <w:t>Rammed-earth specialty</w:t>
+            </w:r>
+          </w:p>
+        </w:tc>
+      </w:tr>
+      <w:tr>
+        <w:trPr>
+          <w:cantSplit/>
+        </w:trPr>
+        <w:tc>
+          <w:tcPr>
+            <w:tcW w:w="1250" w:type="pct"/>
+          </w:tcPr>
+          <w:p>
+            <w:pPr>
+              <w:pStyle w:val="Compact"/>
+              <w:rPr>
+                <w:sz w:val="17"/>
+              </w:rPr>
+            </w:pPr>
+            <w:r>
+              <w:rPr>
+                <w:sz w:val="17"/>
+              </w:rPr>
+              <w:t>Catalyst – 77 Wade</w:t>
+            </w:r>
+          </w:p>
+        </w:tc>
+        <w:tc>
+          <w:tcPr>
+            <w:tcW w:w="1250" w:type="pct"/>
+          </w:tcPr>
+          <w:p>
+            <w:pPr>
+              <w:pStyle w:val="Compact"/>
+              <w:rPr>
+                <w:sz w:val="17"/>
+              </w:rPr>
+            </w:pPr>
+            <w:r>
+              <w:rPr>
+                <w:sz w:val="17"/>
+              </w:rPr>
+              <w:t>Life sciences</w:t>
+            </w:r>
+          </w:p>
+        </w:tc>
+        <w:tc>
+          <w:tcPr>
+            <w:tcW w:w="1250" w:type="pct"/>
+          </w:tcPr>
+          <w:p>
+            <w:pPr>
+              <w:pStyle w:val="Compact"/>
+              <w:rPr>
+                <w:sz w:val="17"/>
+              </w:rPr>
+            </w:pPr>
+            <w:r>
+              <w:rPr>
+                <w:sz w:val="17"/>
+              </w:rPr>
+              <w:t>Blackwell</w:t>
+            </w:r>
+          </w:p>
+        </w:tc>
+        <w:tc>
+          <w:tcPr>
+            <w:tcW w:w="1250" w:type="pct"/>
+          </w:tcPr>
+          <w:p>
+            <w:pPr>
+              <w:pStyle w:val="Compact"/>
+              <w:rPr>
+                <w:sz w:val="17"/>
+              </w:rPr>
+            </w:pPr>
+            <w:r>
+              <w:rPr>
+                <w:sz w:val="17"/>
+              </w:rPr>
+              <w:t>Lab specialty</w:t>
+            </w:r>
+          </w:p>
+        </w:tc>
+      </w:tr>
+      <w:tr>
+        <w:trPr>
+          <w:cnfStyle w:val="000000100000" w:firstRow="0" w:lastRow="0" w:firstColumn="0" w:lastColumn="0" w:oddVBand="0" w:evenVBand="0" w:oddHBand="1" w:evenHBand="0" w:firstRowFirstColumn="0" w:firstRowLastColumn="0" w:lastRowFirstColumn="0" w:lastRowLastColumn="0"/>
+          <w:cantSplit/>
+        </w:trPr>
+        <w:tc>
+          <w:tcPr>
+            <w:tcW w:w="1250" w:type="pct"/>
+          </w:tcPr>
+          <w:p>
+            <w:pPr>
+              <w:pStyle w:val="Compact"/>
+              <w:rPr>
+                <w:sz w:val="17"/>
+              </w:rPr>
+            </w:pPr>
+            <w:r>
+              <w:rPr>
+                <w:sz w:val="17"/>
+              </w:rPr>
+              <w:t>YYC Int’l Facilities</w:t>
+            </w:r>
+          </w:p>
+        </w:tc>
+        <w:tc>
+          <w:tcPr>
+            <w:tcW w:w="1250" w:type="pct"/>
+          </w:tcPr>
+          <w:p>
+            <w:pPr>
+              <w:pStyle w:val="Compact"/>
+              <w:rPr>
+                <w:sz w:val="17"/>
+              </w:rPr>
+            </w:pPr>
+            <w:r>
+              <w:rPr>
+                <w:sz w:val="17"/>
+              </w:rPr>
+              <w:t>Aviation</w:t>
+            </w:r>
+          </w:p>
+        </w:tc>
+        <w:tc>
+          <w:tcPr>
+            <w:tcW w:w="1250" w:type="pct"/>
+          </w:tcPr>
+          <w:p>
+            <w:pPr>
+              <w:pStyle w:val="Compact"/>
+              <w:rPr>
+                <w:sz w:val="17"/>
+              </w:rPr>
+            </w:pPr>
+            <w:r>
+              <w:rPr>
+                <w:sz w:val="17"/>
+              </w:rPr>
+              <w:t>RJC</w:t>
+            </w:r>
+          </w:p>
+        </w:tc>
+        <w:tc>
+          <w:tcPr>
+            <w:tcW w:w="1250" w:type="pct"/>
+          </w:tcPr>
+          <w:p>
+            <w:pPr>
+              <w:pStyle w:val="Compact"/>
+              <w:rPr>
+                <w:sz w:val="17"/>
+              </w:rPr>
+            </w:pPr>
+            <w:r>
+              <w:rPr>
+                <w:sz w:val="17"/>
+              </w:rPr>
+              <w:t>Architecture-only scope</w:t>
+            </w:r>
+          </w:p>
+        </w:tc>
+      </w:tr>
+      <w:tr>
+        <w:trPr>
+          <w:cantSplit/>
+        </w:trPr>
+        <w:tc>
+          <w:tcPr>
+            <w:tcW w:w="1250" w:type="pct"/>
+          </w:tcPr>
+          <w:p>
+            <w:pPr>
+              <w:pStyle w:val="Compact"/>
+              <w:rPr>
+                <w:sz w:val="17"/>
+              </w:rPr>
+            </w:pPr>
+            <w:r>
+              <w:rPr>
+                <w:sz w:val="17"/>
+              </w:rPr>
+              <w:t>Living Shangri-La Van/Tor (62/65st)</w:t>
+            </w:r>
+          </w:p>
+        </w:tc>
+        <w:tc>
+          <w:tcPr>
+            <w:tcW w:w="1250" w:type="pct"/>
+          </w:tcPr>
+          <w:p>
+            <w:pPr>
+              <w:pStyle w:val="Compact"/>
+              <w:rPr>
+                <w:sz w:val="17"/>
+              </w:rPr>
+            </w:pPr>
+            <w:r>
+              <w:rPr>
+                <w:sz w:val="17"/>
+              </w:rPr>
+              <w:t>Tower</w:t>
+            </w:r>
+          </w:p>
+        </w:tc>
+        <w:tc>
+          <w:tcPr>
+            <w:tcW w:w="1250" w:type="pct"/>
+          </w:tcPr>
+          <w:p>
+            <w:pPr>
+              <w:pStyle w:val="Compact"/>
+              <w:rPr>
+                <w:sz w:val="17"/>
+              </w:rPr>
+            </w:pPr>
+            <w:r>
+              <w:rPr>
+                <w:b/>
+                <w:bCs/>
+                <w:sz w:val="17"/>
+              </w:rPr>
+              <w:t>In-house (Wu)</w:t>
+            </w:r>
+          </w:p>
+        </w:tc>
+        <w:tc>
+          <w:tcPr>
+            <w:tcW w:w="1250" w:type="pct"/>
+          </w:tcPr>
+          <w:p>
+            <w:pPr>
+              <w:pStyle w:val="Compact"/>
+              <w:rPr>
+                <w:sz w:val="17"/>
+              </w:rPr>
+            </w:pPr>
+            <w:r>
+              <w:rPr>
+                <w:sz w:val="17"/>
+              </w:rPr>
+              <w:t>DIALOG prime — self-perform</w:t>
+            </w:r>
+          </w:p>
+        </w:tc>
+      </w:tr>
+      <w:tr>
+        <w:trPr>
+          <w:cnfStyle w:val="000000100000" w:firstRow="0" w:lastRow="0" w:firstColumn="0" w:lastColumn="0" w:oddVBand="0" w:evenVBand="0" w:oddHBand="1" w:evenHBand="0" w:firstRowFirstColumn="0" w:firstRowLastColumn="0" w:lastRowFirstColumn="0" w:lastRowLastColumn="0"/>
+          <w:cantSplit/>
+        </w:trPr>
+        <w:tc>
+          <w:tcPr>
+            <w:tcW w:w="1250" w:type="pct"/>
+          </w:tcPr>
+          <w:p>
+            <w:pPr>
+              <w:pStyle w:val="Compact"/>
+              <w:rPr>
+                <w:sz w:val="17"/>
+              </w:rPr>
+            </w:pPr>
+            <w:r>
+              <w:rPr>
+                <w:sz w:val="17"/>
+              </w:rPr>
+              <w:t>Enbridge Centre (26st)</w:t>
+            </w:r>
+          </w:p>
+        </w:tc>
+        <w:tc>
+          <w:tcPr>
+            <w:tcW w:w="1250" w:type="pct"/>
+          </w:tcPr>
+          <w:p>
+            <w:pPr>
+              <w:pStyle w:val="Compact"/>
+              <w:rPr>
+                <w:sz w:val="17"/>
+              </w:rPr>
+            </w:pPr>
+            <w:r>
+              <w:rPr>
+                <w:sz w:val="17"/>
+              </w:rPr>
+              <w:t>Office</w:t>
+            </w:r>
+          </w:p>
+        </w:tc>
+        <w:tc>
+          <w:tcPr>
+            <w:tcW w:w="1250" w:type="pct"/>
+          </w:tcPr>
+          <w:p>
+            <w:pPr>
+              <w:pStyle w:val="Compact"/>
+              <w:rPr>
+                <w:sz w:val="17"/>
+              </w:rPr>
+            </w:pPr>
+            <w:r>
+              <w:rPr>
+                <w:b/>
+                <w:bCs/>
+                <w:sz w:val="17"/>
+              </w:rPr>
+              <w:t>In-house (Oosterhof)</w:t>
+            </w:r>
+          </w:p>
+        </w:tc>
+        <w:tc>
+          <w:tcPr>
+            <w:tcW w:w="1250" w:type="pct"/>
+          </w:tcPr>
+          <w:p>
+            <w:pPr>
+              <w:pStyle w:val="Compact"/>
+              <w:rPr>
+                <w:sz w:val="17"/>
+              </w:rPr>
+            </w:pPr>
+            <w:r>
+              <w:rPr>
+                <w:sz w:val="17"/>
+              </w:rPr>
+              <w:t>DIALOG prime — self-perform</w:t>
+            </w:r>
+          </w:p>
+        </w:tc>
+      </w:tr>
+      <w:tr>
+        <w:trPr>
+          <w:cantSplit/>
+        </w:trPr>
+        <w:tc>
+          <w:tcPr>
+            <w:tcW w:w="1250" w:type="pct"/>
+          </w:tcPr>
+          <w:p>
+            <w:pPr>
+              <w:pStyle w:val="Compact"/>
+              <w:rPr>
+                <w:sz w:val="17"/>
+              </w:rPr>
+            </w:pPr>
+            <w:r>
+              <w:rPr>
+                <w:sz w:val="17"/>
+              </w:rPr>
+              <w:t>Royal Alberta Museum / Winspear</w:t>
+            </w:r>
+          </w:p>
+        </w:tc>
+        <w:tc>
+          <w:tcPr>
+            <w:tcW w:w="1250" w:type="pct"/>
+          </w:tcPr>
+          <w:p>
+            <w:pPr>
+              <w:pStyle w:val="Compact"/>
+              <w:rPr>
+                <w:sz w:val="17"/>
+              </w:rPr>
+            </w:pPr>
+            <w:r>
+              <w:rPr>
+                <w:sz w:val="17"/>
+              </w:rPr>
+              <w:t>Civic</w:t>
+            </w:r>
+          </w:p>
+        </w:tc>
+        <w:tc>
+          <w:tcPr>
+            <w:tcW w:w="1250" w:type="pct"/>
+          </w:tcPr>
+          <w:p>
+            <w:pPr>
+              <w:pStyle w:val="Compact"/>
+              <w:rPr>
+                <w:sz w:val="17"/>
+              </w:rPr>
+            </w:pPr>
+            <w:r>
+              <w:rPr>
+                <w:b/>
+                <w:bCs/>
+                <w:sz w:val="17"/>
+              </w:rPr>
+              <w:t>In-house (Montgomery)</w:t>
+            </w:r>
+          </w:p>
+        </w:tc>
+        <w:tc>
+          <w:tcPr>
+            <w:tcW w:w="1250" w:type="pct"/>
+          </w:tcPr>
+          <w:p>
+            <w:pPr>
+              <w:pStyle w:val="Compact"/>
+              <w:rPr>
+                <w:sz w:val="17"/>
+              </w:rPr>
+            </w:pPr>
+            <w:r>
+              <w:rPr>
+                <w:sz w:val="17"/>
+              </w:rPr>
+              <w:t>DIALOG prime — self-perform</w:t>
+            </w:r>
+          </w:p>
+        </w:tc>
+      </w:tr>
+      <w:tr>
+        <w:trPr>
+          <w:cnfStyle w:val="000000100000" w:firstRow="0" w:lastRow="0" w:firstColumn="0" w:lastColumn="0" w:oddVBand="0" w:evenVBand="0" w:oddHBand="1" w:evenHBand="0" w:firstRowFirstColumn="0" w:firstRowLastColumn="0" w:lastRowFirstColumn="0" w:lastRowLastColumn="0"/>
+          <w:cantSplit/>
+        </w:trPr>
+        <w:tc>
+          <w:tcPr>
+            <w:tcW w:w="1250" w:type="pct"/>
+          </w:tcPr>
+          <w:p>
+            <w:pPr>
+              <w:pStyle w:val="Compact"/>
+              <w:rPr>
+                <w:sz w:val="17"/>
+              </w:rPr>
+            </w:pPr>
+            <w:r>
+              <w:rPr>
+                <w:sz w:val="17"/>
+              </w:rPr>
+              <w:t>Walterdale Bridge / Valley Line / Broadway Subway</w:t>
+            </w:r>
+          </w:p>
+        </w:tc>
+        <w:tc>
+          <w:tcPr>
+            <w:tcW w:w="1250" w:type="pct"/>
+          </w:tcPr>
+          <w:p>
+            <w:pPr>
+              <w:pStyle w:val="Compact"/>
+              <w:rPr>
+                <w:sz w:val="17"/>
+              </w:rPr>
+            </w:pPr>
+            <w:r>
+              <w:rPr>
+                <w:sz w:val="17"/>
+              </w:rPr>
+              <w:t>Transit</w:t>
+            </w:r>
+          </w:p>
+        </w:tc>
+        <w:tc>
+          <w:tcPr>
+            <w:tcW w:w="1250" w:type="pct"/>
+          </w:tcPr>
+          <w:p>
+            <w:pPr>
+              <w:pStyle w:val="Compact"/>
+              <w:rPr>
+                <w:sz w:val="17"/>
+              </w:rPr>
+            </w:pPr>
+            <w:r>
+              <w:rPr>
+                <w:b/>
+                <w:bCs/>
+                <w:sz w:val="17"/>
+              </w:rPr>
+              <w:t>In-house</w:t>
+            </w:r>
+          </w:p>
+        </w:tc>
+        <w:tc>
+          <w:tcPr>
+            <w:tcW w:w="1250" w:type="pct"/>
+          </w:tcPr>
+          <w:p>
+            <w:pPr>
+              <w:pStyle w:val="Compact"/>
+              <w:rPr>
+                <w:sz w:val="17"/>
+              </w:rPr>
+            </w:pPr>
+            <w:r>
+              <w:rPr>
+                <w:sz w:val="17"/>
+              </w:rPr>
+              <w:t>Core domain — self-perform</w:t>
+            </w:r>
+          </w:p>
+        </w:tc>
+      </w:tr>
+    </w:tbl>
+    <w:p>
+      <w:r>
+        <w:pict w14:anchorId="42BA1F2F">
+          <v:rect id="_x0000_i1026" style="width:0;height:1.5pt" o:hralign="center" o:hrstd="t" o:hr="t"/>
+        </w:pict>
+      </w:r>
+    </w:p>
+    <w:p>
+      <w:pPr>
+        <w:pStyle w:val="FirstParagraph"/>
+      </w:pPr>
+      <w:r>
+        <w:rPr>
+          <w:i/>
+          <w:iCs/>
+        </w:rPr>
+        <w:t>Verification: 5 research passes + 6 adversarial primary-source fact-checks over ~60 projects, 2026-06-30/07-01. Sources: dialogdesign.ca, majorprojects.alberta.ca, infrastructurebc.com, northernhealth.ca, alberta.ca, apega.ca, canadianconsultingengineer.com, rjc.ca, fastepp.com, glotmansimpson.com, entuitive.com, thorntontomasetti.com, archdaily.com, skyscrapercenter.com. Per-claim confidence retained in source files; [H] items are to test in the room, not assert.</w:t>
       </w:r>
       <w:bookmarkEnd w:id="0"/>
-      <w:bookmarkEnd w:id="14"/>
+      <w:bookmarkEnd w:id="11"/>
     </w:p>
     <w:sectPr>
       <w:footnotePr>
         <w:numRestart w:val="eachSect"/>
       </w:footnotePr>
       <w:pgSz w:w="12240" w:h="15840"/>
-      <w:pgMar w:top="1440" w:right="1440" w:bottom="1440" w:left="1440" w:header="720" w:footer="720" w:gutter="0"/>
+      <w:pgMar w:top="860" w:right="1000" w:bottom="860" w:left="1000" w:header="720" w:footer="720" w:gutter="0"/>
       <w:cols w:space="720"/>
+      <w:docGrid w:linePitch="245"/>
     </w:sectPr>
   </w:body>
 </w:document>
@@ -1514,7 +3378,7 @@
   <w:abstractNum w:abstractNumId="0" w15:restartNumberingAfterBreak="0">
     <w:nsid w:val="0000A990"/>
     <w:multiLevelType w:val="multilevel"/>
-    <w:tmpl w:val="F66073CA"/>
+    <w:tmpl w:val="6A1C37CC"/>
     <w:lvl w:ilvl="0">
       <w:numFmt w:val="bullet"/>
       <w:lvlText w:val=" "/>
@@ -1591,7 +3455,7 @@
   <w:abstractNum w:abstractNumId="1" w15:restartNumberingAfterBreak="0">
     <w:nsid w:val="0000A991"/>
     <w:multiLevelType w:val="multilevel"/>
-    <w:tmpl w:val="A88ED7D4"/>
+    <w:tmpl w:val="79E273D8"/>
     <w:lvl w:ilvl="0">
       <w:numFmt w:val="bullet"/>
       <w:lvlText w:val=""/>
@@ -1695,7 +3559,7 @@
   <w:abstractNum w:abstractNumId="2" w15:restartNumberingAfterBreak="0">
     <w:nsid w:val="00A99411"/>
     <w:multiLevelType w:val="multilevel"/>
-    <w:tmpl w:val="14D4904A"/>
+    <w:tmpl w:val="8FCC2B94"/>
     <w:lvl w:ilvl="0">
       <w:start w:val="1"/>
       <w:numFmt w:val="decimal"/>
@@ -1778,10 +3642,10 @@
       </w:pPr>
     </w:lvl>
   </w:abstractNum>
-  <w:num w:numId="1" w16cid:durableId="926841863">
+  <w:num w:numId="1" w16cid:durableId="2070765058">
     <w:abstractNumId w:val="0"/>
   </w:num>
-  <w:num w:numId="2" w16cid:durableId="535118067">
+  <w:num w:numId="2" w16cid:durableId="551619290">
     <w:abstractNumId w:val="2"/>
     <w:lvlOverride w:ilvl="0">
       <w:startOverride w:val="1"/>
@@ -1811,10 +3675,19 @@
       <w:startOverride w:val="1"/>
     </w:lvlOverride>
   </w:num>
-  <w:num w:numId="3" w16cid:durableId="1889293693">
+  <w:num w:numId="3" w16cid:durableId="600262701">
     <w:abstractNumId w:val="1"/>
   </w:num>
-  <w:num w:numId="4" w16cid:durableId="1126629617">
+  <w:num w:numId="4" w16cid:durableId="1954165828">
+    <w:abstractNumId w:val="1"/>
+  </w:num>
+  <w:num w:numId="5" w16cid:durableId="2134059919">
+    <w:abstractNumId w:val="1"/>
+  </w:num>
+  <w:num w:numId="6" w16cid:durableId="1362317022">
+    <w:abstractNumId w:val="1"/>
+  </w:num>
+  <w:num w:numId="7" w16cid:durableId="1219784046">
     <w:abstractNumId w:val="2"/>
     <w:lvlOverride w:ilvl="0">
       <w:startOverride w:val="1"/>
@@ -1844,7 +3717,7 @@
       <w:startOverride w:val="1"/>
     </w:lvlOverride>
   </w:num>
-  <w:num w:numId="5" w16cid:durableId="375783944">
+  <w:num w:numId="8" w16cid:durableId="1324822862">
     <w:abstractNumId w:val="2"/>
     <w:lvlOverride w:ilvl="0">
       <w:startOverride w:val="1"/>
@@ -1874,7 +3747,7 @@
       <w:startOverride w:val="1"/>
     </w:lvlOverride>
   </w:num>
-  <w:num w:numId="6" w16cid:durableId="1516915439">
+  <w:num w:numId="9" w16cid:durableId="1102531614">
     <w:abstractNumId w:val="2"/>
     <w:lvlOverride w:ilvl="0">
       <w:startOverride w:val="1"/>
@@ -1925,9 +3798,6 @@
     </w:pPrDefault>
   </w:docDefaults>
   <w:latentStyles w:defLockedState="0" w:defUIPriority="0" w:defSemiHidden="0" w:defUnhideWhenUsed="0" w:defQFormat="0" w:count="376">
-    <w:lsdException w:name="toc 1" w:uiPriority="39"/>
-    <w:lsdException w:name="toc 2" w:uiPriority="39"/>
-    <w:lsdException w:name="Hyperlink" w:uiPriority="99"/>
     <w:lsdException w:name="Normal Table" w:semiHidden="1" w:unhideWhenUsed="1"/>
     <w:lsdException w:name="Table Simple 1" w:semiHidden="1" w:unhideWhenUsed="1"/>
     <w:lsdException w:name="Table Simple 2" w:semiHidden="1" w:unhideWhenUsed="1"/>
@@ -2175,11 +4045,11 @@
     <w:name w:val="Normal"/>
     <w:qFormat/>
     <w:pPr>
-      <w:spacing w:after="120"/>
+      <w:spacing w:after="40"/>
     </w:pPr>
     <w:rPr>
       <w:rFonts w:ascii="Calibri" w:hAnsi="Calibri" w:cs="Calibri"/>
-      <w:sz w:val="21"/>
+      <w:sz w:val="18"/>
     </w:rPr>
   </w:style>
   <w:style w:type="paragraph" w:styleId="Heading1">
@@ -2193,14 +4063,14 @@
     <w:pPr>
       <w:keepNext/>
       <w:keepLines/>
-      <w:spacing w:before="240" w:after="80"/>
+      <w:spacing w:before="100" w:after="20"/>
       <w:outlineLvl w:val="0"/>
     </w:pPr>
     <w:rPr>
       <w:rFonts w:eastAsiaTheme="majorEastAsia"/>
       <w:b/>
       <w:color w:val="1F3B5F"/>
-      <w:sz w:val="30"/>
+      <w:sz w:val="24"/>
       <w:szCs w:val="40"/>
     </w:rPr>
   </w:style>
@@ -2264,7 +4134,7 @@
     <w:pPr>
       <w:keepNext/>
       <w:keepLines/>
-      <w:spacing w:before="80" w:after="40"/>
+      <w:spacing w:before="80"/>
       <w:outlineLvl w:val="3"/>
     </w:pPr>
     <w:rPr>
@@ -2287,7 +4157,7 @@
     <w:pPr>
       <w:keepNext/>
       <w:keepLines/>
-      <w:spacing w:before="80" w:after="40"/>
+      <w:spacing w:before="80"/>
       <w:outlineLvl w:val="4"/>
     </w:pPr>
     <w:rPr>
@@ -2442,7 +4312,7 @@
     <w:rsid w:val="00A10FD9"/>
     <w:pPr>
       <w:keepNext/>
-      <w:spacing w:before="240" w:after="80"/>
+      <w:spacing w:before="100" w:after="20"/>
       <w:contextualSpacing/>
       <w:jc w:val="center"/>
     </w:pPr>
@@ -2450,7 +4320,7 @@
       <w:rFonts w:eastAsiaTheme="majorEastAsia"/>
       <w:b/>
       <w:color w:val="1F3B5F"/>
-      <w:sz w:val="40"/>
+      <w:sz w:val="26"/>
       <w:szCs w:val="56"/>
     </w:rPr>
   </w:style>
@@ -2464,7 +4334,7 @@
       <w:rFonts w:ascii="Calibri" w:eastAsiaTheme="majorEastAsia" w:hAnsi="Calibri" w:cs="Calibri"/>
       <w:b/>
       <w:color w:val="1F3B5F"/>
-      <w:sz w:val="40"/>
+      <w:sz w:val="26"/>
       <w:szCs w:val="56"/>
     </w:rPr>
   </w:style>
@@ -2575,7 +4445,6 @@
       <w:rFonts w:ascii="Calibri" w:eastAsiaTheme="majorEastAsia" w:hAnsi="Calibri" w:cs="Calibri"/>
       <w:b/>
       <w:color w:val="1F3B5F"/>
-      <w:sz w:val="30"/>
       <w:szCs w:val="40"/>
     </w:rPr>
   </w:style>
@@ -2762,6 +4631,9 @@
     <w:name w:val="caption"/>
     <w:basedOn w:val="Normal"/>
     <w:link w:val="CaptionChar"/>
+    <w:pPr>
+      <w:spacing w:after="120"/>
+    </w:pPr>
     <w:rPr>
       <w:i/>
     </w:rPr>
@@ -2816,7 +4688,6 @@
   <w:style w:type="character" w:styleId="Hyperlink">
     <w:name w:val="Hyperlink"/>
     <w:basedOn w:val="CaptionChar"/>
-    <w:uiPriority w:val="99"/>
     <w:rPr>
       <w:color w:val="156082" w:themeColor="accent1"/>
     </w:rPr>
@@ -2829,7 +4700,7 @@
     <w:unhideWhenUsed/>
     <w:qFormat/>
     <w:pPr>
-      <w:spacing w:line="259" w:lineRule="auto"/>
+      <w:spacing w:before="240" w:line="259" w:lineRule="auto"/>
       <w:outlineLvl w:val="9"/>
     </w:pPr>
     <w:rPr>
@@ -3136,28 +5007,81 @@
       <w:sz w:val="22"/>
     </w:rPr>
   </w:style>
-  <w:style w:type="paragraph" w:styleId="TOC1">
-    <w:name w:val="toc 1"/>
-    <w:basedOn w:val="Normal"/>
-    <w:next w:val="Normal"/>
-    <w:autoRedefine/>
-    <w:uiPriority w:val="39"/>
-    <w:rsid w:val="003663E5"/>
+  <w:style w:type="table" w:styleId="GridTable4">
+    <w:name w:val="Grid Table 4"/>
+    <w:basedOn w:val="TableNormal"/>
+    <w:uiPriority w:val="49"/>
+    <w:rsid w:val="003D0838"/>
     <w:pPr>
-      <w:spacing w:after="100"/>
+      <w:spacing w:after="0"/>
     </w:pPr>
-  </w:style>
-  <w:style w:type="paragraph" w:styleId="TOC2">
-    <w:name w:val="toc 2"/>
-    <w:basedOn w:val="Normal"/>
-    <w:next w:val="Normal"/>
-    <w:autoRedefine/>
-    <w:uiPriority w:val="39"/>
-    <w:rsid w:val="003663E5"/>
-    <w:pPr>
-      <w:spacing w:after="100"/>
-      <w:ind w:left="240"/>
-    </w:pPr>
+    <w:tblPr>
+      <w:tblStyleRowBandSize w:val="1"/>
+      <w:tblStyleColBandSize w:val="1"/>
+      <w:tblBorders>
+        <w:top w:val="single" w:sz="4" w:space="0" w:color="666666" w:themeColor="text1" w:themeTint="99"/>
+        <w:left w:val="single" w:sz="4" w:space="0" w:color="666666" w:themeColor="text1" w:themeTint="99"/>
+        <w:bottom w:val="single" w:sz="4" w:space="0" w:color="666666" w:themeColor="text1" w:themeTint="99"/>
+        <w:right w:val="single" w:sz="4" w:space="0" w:color="666666" w:themeColor="text1" w:themeTint="99"/>
+        <w:insideH w:val="single" w:sz="4" w:space="0" w:color="666666" w:themeColor="text1" w:themeTint="99"/>
+        <w:insideV w:val="single" w:sz="4" w:space="0" w:color="666666" w:themeColor="text1" w:themeTint="99"/>
+      </w:tblBorders>
+    </w:tblPr>
+    <w:tblStylePr w:type="firstRow">
+      <w:rPr>
+        <w:b/>
+        <w:bCs/>
+        <w:color w:val="FFFFFF" w:themeColor="background1"/>
+      </w:rPr>
+      <w:tblPr/>
+      <w:tcPr>
+        <w:tcBorders>
+          <w:top w:val="single" w:sz="4" w:space="0" w:color="000000" w:themeColor="text1"/>
+          <w:left w:val="single" w:sz="4" w:space="0" w:color="000000" w:themeColor="text1"/>
+          <w:bottom w:val="single" w:sz="4" w:space="0" w:color="000000" w:themeColor="text1"/>
+          <w:right w:val="single" w:sz="4" w:space="0" w:color="000000" w:themeColor="text1"/>
+          <w:insideH w:val="nil"/>
+          <w:insideV w:val="nil"/>
+        </w:tcBorders>
+        <w:shd w:val="clear" w:color="auto" w:fill="000000" w:themeFill="text1"/>
+      </w:tcPr>
+    </w:tblStylePr>
+    <w:tblStylePr w:type="lastRow">
+      <w:rPr>
+        <w:b/>
+        <w:bCs/>
+      </w:rPr>
+      <w:tblPr/>
+      <w:tcPr>
+        <w:tcBorders>
+          <w:top w:val="double" w:sz="4" w:space="0" w:color="000000" w:themeColor="text1"/>
+        </w:tcBorders>
+      </w:tcPr>
+    </w:tblStylePr>
+    <w:tblStylePr w:type="firstCol">
+      <w:rPr>
+        <w:b/>
+        <w:bCs/>
+      </w:rPr>
+    </w:tblStylePr>
+    <w:tblStylePr w:type="lastCol">
+      <w:rPr>
+        <w:b/>
+        <w:bCs/>
+      </w:rPr>
+    </w:tblStylePr>
+    <w:tblStylePr w:type="band1Vert">
+      <w:tblPr/>
+      <w:tcPr>
+        <w:shd w:val="clear" w:color="auto" w:fill="CCCCCC" w:themeFill="text1" w:themeFillTint="33"/>
+      </w:tcPr>
+    </w:tblStylePr>
+    <w:tblStylePr w:type="band1Horz">
+      <w:tblPr/>
+      <w:tcPr>
+        <w:shd w:val="clear" w:color="auto" w:fill="CCCCCC" w:themeFill="text1" w:themeFillTint="33"/>
+      </w:tcPr>
+    </w:tblStylePr>
   </w:style>
 </w:styles>
 </file>

</xml_diff>

<commit_message>
docs(bd): DIALOG brief — lead with the direct Edmonton-focused answer
The commissioning question ("what types of projects do they outsource
structural for — focus on Edmonton") was answered firm-wide but not
Edmonton-first. New page-one section answers it directly: (1) mega-scale
design-build hospitals as co-SE (Kaye ~$900M w/ Yolles - their own award cites
"massive scale and ambitious schedule", validating the "too busy" premise for
this type only); (2) high-rise residential towers (Parks/Hendrix -> RJC);
(3) architecture-only commissions (HSBC Place, Brewery District -> ISL/RJC);
plus the explicit not-outsourced list (standard hospitals, civic, bridges/
transit, airports, rec, own towers).

Co-Authored-By: Claude Fable 5 <noreply@anthropic.com>
</commit_message>
<xml_diff>
--- a/docs/KOR-DIALOG-Edmonton-Structural-Outsourcing-2026-06-30.docx
+++ b/docs/KOR-DIALOG-Edmonton-Structural-Outsourcing-2026-06-30.docx
@@ -75,9 +75,9 @@
       <w:pPr>
         <w:pStyle w:val="Heading2"/>
       </w:pPr>
-      <w:bookmarkStart w:id="1" w:name="X3351a517e04db12830a789ebdc6413a2b8dd05f"/>
-      <w:r>
-        <w:t>Bottom line — what DIALOG outsources structural engineering for</w:t>
+      <w:bookmarkStart w:id="1" w:name="Xed677de2da19d38e025a8943673c21f258b34a3"/>
+      <w:r>
+        <w:t>THE ANSWER — what DIALOG outsources structural for, IN EDMONTON [V]</w:t>
       </w:r>
     </w:p>
     <w:p>
@@ -85,17 +85,29 @@
         <w:pStyle w:val="FirstParagraph"/>
       </w:pPr>
       <w:r>
-        <w:t xml:space="preserve">DIALOG self-performs the bulk of its structural with a deep multidisciplinary bench. External (or co-) structural engineers appear in </w:t>
-      </w:r>
-      <w:r>
-        <w:rPr>
-          <w:b/>
-          <w:bCs/>
-        </w:rPr>
-        <w:t>five recurring situations</w:t>
-      </w:r>
-      <w:r>
-        <w:t xml:space="preserve"> [V]:</w:t>
+        <w:rPr>
+          <w:i/>
+          <w:iCs/>
+        </w:rPr>
+        <w:t>(The commissioning question: “they have a massive structural department but are so busy they outsource — what types of projects, focus on Edmonton?”)</w:t>
+      </w:r>
+    </w:p>
+    <w:p>
+      <w:pPr>
+        <w:pStyle w:val="BodyText"/>
+      </w:pPr>
+      <w:r>
+        <w:t xml:space="preserve">In Edmonton, DIALOG has brought in external structural engineers on </w:t>
+      </w:r>
+      <w:r>
+        <w:rPr>
+          <w:b/>
+          <w:bCs/>
+        </w:rPr>
+        <w:t>three project types</w:t>
+      </w:r>
+      <w:r>
+        <w:t>:</w:t>
       </w:r>
     </w:p>
     <w:p>
@@ -111,73 +123,40 @@
           <w:b/>
           <w:bCs/>
         </w:rPr>
-        <w:t>Tower work, where the developer procures structural separately from architecture.</w:t>
-      </w:r>
-      <w:r>
-        <w:t xml:space="preserve"> On high-rises, DIALOG plays </w:t>
+        <w:t>Very large hospitals delivered design-build</w:t>
+      </w:r>
+      <w:r>
+        <w:t xml:space="preserve"> — </w:t>
+      </w:r>
+      <w:r>
+        <w:rPr>
+          <w:b/>
+          <w:bCs/>
+        </w:rPr>
+        <w:t>Kaye Edmonton Clinic (~$900M): DIALOG + Yolles (now Jacobs) as co-equal structural engineers.</w:t>
+      </w:r>
+      <w:r>
+        <w:t xml:space="preserve"> Their own award submission cites the </w:t>
       </w:r>
       <w:r>
         <w:rPr>
           <w:i/>
           <w:iCs/>
         </w:rPr>
-        <w:t>either</w:t>
-      </w:r>
-      <w:r>
-        <w:t xml:space="preserve"> the architect role </w:t>
-      </w:r>
-      <w:r>
-        <w:rPr>
-          <w:i/>
-          <w:iCs/>
-        </w:rPr>
-        <w:t>or</w:t>
-      </w:r>
-      <w:r>
-        <w:t xml:space="preserve"> </w:t>
-      </w:r>
-      <w:r>
-        <w:t>the consulting-SE role — almost never both. As architect/AOR (usually under a design lead): Vancouver House (BIG → Glotman Simpson + BuroHappold), Brookfield Place 60st (AFK → Entuitive), The Parks (Hariri Pontarini → RJC), The Hendrix (→ RJC). As SE-only: the ex-</w:t>
-      </w:r>
-      <w:r>
-        <w:rPr>
-          <w:b/>
-          <w:bCs/>
-        </w:rPr>
-        <w:t>Jones Kwong Kishi</w:t>
-      </w:r>
-      <w:r>
-        <w:t xml:space="preserve"> practice (merged into DIALOG </w:t>
-      </w:r>
-      <w:r>
-        <w:rPr>
-          <w:b/>
-          <w:bCs/>
-        </w:rPr>
-        <w:t>Oct 2013</w:t>
-      </w:r>
-      <w:r>
-        <w:t xml:space="preserve">) engineered Shangri-La Vancouver/Toronto (62/65st), Fairmont Pacific Rim, Shaw Tower — </w:t>
-      </w:r>
-      <w:r>
-        <w:rPr>
-          <w:b/>
-          <w:bCs/>
-        </w:rPr>
-        <w:t>for other architects (James KM Cheng)</w:t>
-      </w:r>
-      <w:r>
-        <w:t xml:space="preserve">, not as DIALOG-prime. The only verified DIALOG-prime-with-in-house-structural building is </w:t>
-      </w:r>
-      <w:r>
-        <w:rPr>
-          <w:b/>
-          <w:bCs/>
-        </w:rPr>
-        <w:t>Enbridge Centre (26st)</w:t>
-      </w:r>
-      <w:r>
-        <w:t>.</w:t>
+        <w:t>“massive scale and ambitious schedule”</w:t>
+      </w:r>
+      <w:r>
+        <w:t xml:space="preserve"> as the reason — so the “too busy → outsource” premise is </w:t>
+      </w:r>
+      <w:r>
+        <w:rPr>
+          <w:b/>
+          <w:bCs/>
+        </w:rPr>
+        <w:t>exactly right for this project type</w:t>
+      </w:r>
+      <w:r>
+        <w:t>, and only this one. Below mega-scale they stay in-house (Norwood $364M, Edson, Grande Prairie ~$680M).</w:t>
       </w:r>
     </w:p>
     <w:p>
@@ -193,10 +172,20 @@
           <w:b/>
           <w:bCs/>
         </w:rPr>
-        <w:t>A design/“star” architect leads a civic/cultural project and DIALOG is executive/AOR:</w:t>
-      </w:r>
-      <w:r>
-        <w:t xml:space="preserve"> Calgary Central Library (Snøhetta → Entuitive), TELUS Spark (Kasian → Stantec).</w:t>
+        <w:t>High-rise residential towers</w:t>
+      </w:r>
+      <w:r>
+        <w:t xml:space="preserve"> — </w:t>
+      </w:r>
+      <w:r>
+        <w:rPr>
+          <w:b/>
+          <w:bCs/>
+        </w:rPr>
+        <w:t>The Parks (45+35 st) → RJC; The Hendrix (27 st) → RJC.</w:t>
+      </w:r>
+      <w:r>
+        <w:t xml:space="preserve"> On Edmonton towers the developer typically procures structural separately from architecture; RJC currently owns that lane.</w:t>
       </w:r>
     </w:p>
     <w:p>
@@ -212,91 +201,27 @@
           <w:b/>
           <w:bCs/>
         </w:rPr>
-        <w:t>Alberta mega-hospital design-builds led by PCL</w:t>
-      </w:r>
-      <w:r>
-        <w:t xml:space="preserve"> → co-SE, n=2: Kaye Edmonton Clinic ~$900M (→ Yolles/now Jacobs, </w:t>
+        <w:t>Architecture-only commissions</w:t>
+      </w:r>
+      <w:r>
+        <w:t xml:space="preserve"> (client hires structural directly) — </w:t>
+      </w:r>
+      <w:r>
+        <w:rPr>
+          <w:b/>
+          <w:bCs/>
+        </w:rPr>
+        <w:t>HSBC Place repositioning → ISL + RJC; Brewery District → ISL.</w:t>
+      </w:r>
+      <w:r>
+        <w:t xml:space="preserve"> </w:t>
       </w:r>
       <w:r>
         <w:rPr>
           <w:i/>
           <w:iCs/>
         </w:rPr>
-        <w:t>equal partners</w:t>
-      </w:r>
-      <w:r>
-        <w:t xml:space="preserve">) and Calgary Cancer Centre $1.4B (→ DIALOG + Stantec). </w:t>
-      </w:r>
-      <w:r>
-        <w:rPr>
-          <w:b/>
-          <w:bCs/>
-        </w:rPr>
-        <w:t>This is NOT a general scale rule:</w:t>
-      </w:r>
-      <w:r>
-        <w:t xml:space="preserve"> </w:t>
-      </w:r>
-      <w:r>
-        <w:t>UHN Toronto Western (~$1B, CM delivery) is fully in-house — the co-SE pattern is tied to the AB design-build consortium structure, not project size. Extrapolating it to other provinces/GCs is [H].</w:t>
-      </w:r>
-    </w:p>
-    <w:p>
-      <w:pPr>
-        <w:pStyle w:val="Compact"/>
-        <w:numPr>
-          <w:ilvl w:val="0"/>
-          <w:numId w:val="2"/>
-        </w:numPr>
-      </w:pPr>
-      <w:r>
-        <w:rPr>
-          <w:b/>
-          <w:bCs/>
-        </w:rPr>
-        <w:t>Specialist structural innovation they lack in-house</w:t>
-      </w:r>
-      <w:r>
-        <w:t xml:space="preserve"> → pioneer seismic mass timber (Fast+Epp, The Hive), rammed earth (Equilibrium, Nk’Mip), life-sciences labs (Blackwell, Catalyst-77 Wade), forensic concrete (RJC, Glenbow), blast/security (Thornton Tomasetti, Peel Police).</w:t>
-      </w:r>
-    </w:p>
-    <w:p>
-      <w:pPr>
-        <w:pStyle w:val="Compact"/>
-        <w:numPr>
-          <w:ilvl w:val="0"/>
-          <w:numId w:val="2"/>
-        </w:numPr>
-      </w:pPr>
-      <w:r>
-        <w:rPr>
-          <w:b/>
-          <w:bCs/>
-        </w:rPr>
-        <w:t>A studio lacking the relevant specialty</w:t>
-      </w:r>
-      <w:r>
-        <w:t xml:space="preserve"> </w:t>
-      </w:r>
-      <w:r>
-        <w:t xml:space="preserve">→ Vancouver’s structural practice (ex-JKK towers, Broadway Subway, community/housing) has </w:t>
-      </w:r>
-      <w:r>
-        <w:rPr>
-          <w:b/>
-          <w:bCs/>
-        </w:rPr>
-        <w:t>no healthcare structural track record</w:t>
-      </w:r>
-      <w:r>
-        <w:t xml:space="preserve">; Ottawa (opened 2026) has zero structural partners. </w:t>
-      </w:r>
-      <w:r>
-        <w:rPr>
-          <w:i/>
-          <w:iCs/>
-        </w:rPr>
-        <w:t>Caveat: a gap does not force outsourcing — DIALOG cross-deployed Hildenbrandt from Calgary to do Dartmouth General (NS) in-house.</w:t>
+        <w:t>(Mega-venues also go external — Rogers Place → Thornton Tomasetti prime, DIALOG associate — but under HOK, not DIALOG’s choice.)</w:t>
       </w:r>
     </w:p>
     <w:p>
@@ -308,23 +233,20 @@
           <w:b/>
           <w:bCs/>
         </w:rPr>
-        <w:t>Self-performs (do NOT pitch):</w:t>
-      </w:r>
-      <w:r>
-        <w:t xml:space="preserve"> </w:t>
-      </w:r>
-      <w:r>
-        <w:t xml:space="preserve">transit/bridges (their strongest domain — Walterdale, Valley Line, Broadway Subway, airports), sports/rec, mid-rise full-suite buildings when prime (Enbridge 26st), standard CLT timber (Bill Fisch), own civic (Royal Alberta Museum, Winspear), and </w:t>
-      </w:r>
-      <w:r>
-        <w:rPr>
-          <w:b/>
-          <w:bCs/>
-        </w:rPr>
-        <w:t>home-market healthcare at any scale outside AB design-build</w:t>
-      </w:r>
-      <w:r>
-        <w:t xml:space="preserve"> (Grande Prairie ~$680M, Edson, UHN Toronto Western ~$1B, Markdale, Dartmouth).</w:t>
+        <w:t>They do NOT outsource in Edmonton:</w:t>
+      </w:r>
+      <w:r>
+        <w:t xml:space="preserve"> standard-scale hospitals, civic/cultural (Royal Alberta Museum, Winspear), </w:t>
+      </w:r>
+      <w:r>
+        <w:rPr>
+          <w:b/>
+          <w:bCs/>
+        </w:rPr>
+        <w:t>bridges &amp; transit (strongest in-house domain</w:t>
+      </w:r>
+      <w:r>
+        <w:t xml:space="preserve"> — Walterdale, Valley Line), airport buildings, rec centres, own office towers (Enbridge Centre).</w:t>
       </w:r>
     </w:p>
     <w:p>
@@ -336,27 +258,41 @@
           <w:b/>
           <w:bCs/>
         </w:rPr>
-        <w:t>One line for the room:</w:t>
-      </w:r>
-      <w:r>
-        <w:t xml:space="preserve"> </w:t>
-      </w:r>
-      <w:r>
-        <w:rPr>
-          <w:i/>
-          <w:iCs/>
-        </w:rPr>
-        <w:t>“DIALOG brings in external structural where the developer or a design-lead architect procures it separately, on Alberta mega design-build hospitals as a co-SE, for specialist innovation, and where a studio lacks the specialty — and self-performs transit, bridges, mid-rise, civic, and most healthcare in-house.”</w:t>
+        <w:t>The July-10 implication:</w:t>
+      </w:r>
+      <w:r>
+        <w:t xml:space="preserve"> the realistic lane is the </w:t>
+      </w:r>
+      <w:r>
+        <w:rPr>
+          <w:b/>
+          <w:bCs/>
+        </w:rPr>
+        <w:t>Kaye-model mega-hospital co-SE</w:t>
+      </w:r>
+      <w:r>
+        <w:t xml:space="preserve"> (“who do you reach for next time?”) plus </w:t>
+      </w:r>
+      <w:r>
+        <w:rPr>
+          <w:b/>
+          <w:bCs/>
+        </w:rPr>
+        <w:t>overflow capacity</w:t>
+      </w:r>
+      <w:r>
+        <w:t xml:space="preserve"> — their Edmonton structural partner bench has thinned (Montgomery → emeritus, S. Renihan → transit) while the RPK merger added healthcare workload. The rest of this brief is the firm-wide evidence, the people, and how to run the meeting.</w:t>
       </w:r>
     </w:p>
     <w:p>
       <w:pPr>
         <w:pStyle w:val="Heading2"/>
       </w:pPr>
-      <w:bookmarkStart w:id="2" w:name="Xcc50162a1971f8d33d16dd8704cb081d2301ffb"/>
+      <w:bookmarkStart w:id="2" w:name="X99c392a30288503d801e06b8ef90ce135e318aa"/>
       <w:bookmarkEnd w:id="1"/>
       <w:r>
-        <w:t>Strategic read for July 10 — a relationship meeting, not a seat pitch</w:t>
+        <w:lastRenderedPageBreak/>
+        <w:t>Firm-wide pattern — what DIALOG outsources structural engineering for</w:t>
       </w:r>
     </w:p>
     <w:p>
@@ -364,88 +300,17 @@
         <w:pStyle w:val="FirstParagraph"/>
       </w:pPr>
       <w:r>
-        <w:rPr>
-          <w:b/>
-          <w:bCs/>
-        </w:rPr>
-        <w:t>There is no verified open seat to pitch.</w:t>
-      </w:r>
-      <w:r>
-        <w:t xml:space="preserve"> Triggers 1–2 are </w:t>
-      </w:r>
-      <w:r>
-        <w:rPr>
-          <w:b/>
-          <w:bCs/>
-        </w:rPr>
-        <w:t>developer/design-lead decisions — not DIALOG’s to award</w:t>
-      </w:r>
-      <w:r>
-        <w:t xml:space="preserve">; trigger 3 is rare (next AB mega-DB hospital is years out); trigger 5 belongs to other studios. What Georg Josi </w:t>
-      </w:r>
-      <w:r>
-        <w:rPr>
-          <w:i/>
-          <w:iCs/>
-        </w:rPr>
-        <w:t>can</w:t>
-      </w:r>
-      <w:r>
-        <w:t xml:space="preserve"> give KOR: </w:t>
-      </w:r>
-      <w:r>
-        <w:rPr>
-          <w:b/>
-          <w:bCs/>
-        </w:rPr>
-        <w:t>(a)</w:t>
-      </w:r>
-      <w:r>
-        <w:t xml:space="preserve"> a specialist/overflow relationship with Edmonton (their AB partner-level </w:t>
-      </w:r>
-      <w:r>
-        <w:lastRenderedPageBreak/>
-        <w:t xml:space="preserve">structural capacity genuinely is contracting), </w:t>
-      </w:r>
-      <w:r>
-        <w:rPr>
-          <w:b/>
-          <w:bCs/>
-        </w:rPr>
-        <w:t>(b)</w:t>
-      </w:r>
-      <w:r>
-        <w:t xml:space="preserve"> an intro path into the next AB mega design-build co-SE, </w:t>
-      </w:r>
-      <w:r>
-        <w:rPr>
-          <w:b/>
-          <w:bCs/>
-        </w:rPr>
-        <w:t>(c)</w:t>
-      </w:r>
-      <w:r>
-        <w:t xml:space="preserve"> a referral into the BC studio, </w:t>
-      </w:r>
-      <w:r>
-        <w:rPr>
-          <w:b/>
-          <w:bCs/>
-        </w:rPr>
-        <w:t>(d)</w:t>
-      </w:r>
-      <w:r>
-        <w:t xml:space="preserve"> the Misericordia watch. Walk in to become </w:t>
-      </w:r>
-      <w:r>
-        <w:rPr>
-          <w:i/>
-          <w:iCs/>
-        </w:rPr>
-        <w:t>the firm they think of</w:t>
-      </w:r>
-      <w:r>
-        <w:t xml:space="preserve"> — not to ask for a seat that isn’t on the table.</w:t>
+        <w:t xml:space="preserve">DIALOG self-performs the bulk of its structural with a deep multidisciplinary bench. External (or co-) structural engineers appear in </w:t>
+      </w:r>
+      <w:r>
+        <w:rPr>
+          <w:b/>
+          <w:bCs/>
+        </w:rPr>
+        <w:t>five recurring situations</w:t>
+      </w:r>
+      <w:r>
+        <w:t xml:space="preserve"> [V]:</w:t>
       </w:r>
     </w:p>
     <w:p>
@@ -461,76 +326,73 @@
           <w:b/>
           <w:bCs/>
         </w:rPr>
-        <w:t>UHNBC Acute Care Tower ($1.579B, Prince George)</w:t>
-      </w:r>
-      <w:r>
-        <w:t xml:space="preserve"> </w:t>
-      </w:r>
-      <w:r>
-        <w:t xml:space="preserve">[V facts, H opportunity]: DIALOG+EllisDon alliance (formed Dec 2025), design through late 2026, construction ~2027, opening ~2031. </w:t>
-      </w:r>
-      <w:r>
-        <w:rPr>
-          <w:b/>
-          <w:bCs/>
-        </w:rPr>
-        <w:t>Structural is most likely inside DIALOG BC’s own scope</w:t>
-      </w:r>
-      <w:r>
-        <w:t xml:space="preserve"> — the alliance named separate mechanical (PML) and electrical (Houle) participants precisely because DIALOG doesn’t self-perform those, and named </w:t>
-      </w:r>
-      <w:r>
-        <w:rPr>
-          <w:b/>
-          <w:bCs/>
-        </w:rPr>
-        <w:t>no structural participant</w:t>
-      </w:r>
-      <w:r>
-        <w:t xml:space="preserve">; their BC entity is legally “DIALOG BC Architecture </w:t>
-      </w:r>
-      <w:r>
-        <w:rPr>
-          <w:b/>
-          <w:bCs/>
-        </w:rPr>
-        <w:t>Engineering</w:t>
-      </w:r>
-      <w:r>
-        <w:t xml:space="preserve"> Interior Design Planning Inc.” </w:t>
-      </w:r>
-      <w:r>
-        <w:t xml:space="preserve">(Contrast: on the Cowichan Hospital alliance, architect Parkin — no in-house SE — named Bush Bohlman as a structural participant.) </w:t>
-      </w:r>
-      <w:r>
-        <w:rPr>
-          <w:b/>
-          <w:bCs/>
-        </w:rPr>
-        <w:t>Probe as capacity support, never claim the seat is open:</w:t>
-      </w:r>
-      <w:r>
-        <w:t xml:space="preserve"> </w:t>
+        <w:t>Tower work, where the developer procures structural separately from architecture.</w:t>
+      </w:r>
+      <w:r>
+        <w:t xml:space="preserve"> On high-rises, DIALOG plays </w:t>
       </w:r>
       <w:r>
         <w:rPr>
           <w:i/>
           <w:iCs/>
         </w:rPr>
-        <w:t>“Is your BC team self-performing structural on UHNBC, or would a BC healthcare-structural partner help carry it?”</w:t>
-      </w:r>
-      <w:r>
-        <w:t xml:space="preserve"> Note: </w:t>
-      </w:r>
-      <w:r>
-        <w:rPr>
-          <w:b/>
-          <w:bCs/>
-        </w:rPr>
-        <w:t>Prince George is low-seismicity</w:t>
-      </w:r>
-      <w:r>
-        <w:t xml:space="preserve"> (PGA ≈0.07g — Edmonton-level, 6–9× below Vancouver) — do not pitch it as seismic-intensive; the post-disaster importance angle is what applies.</w:t>
+        <w:t>either</w:t>
+      </w:r>
+      <w:r>
+        <w:t xml:space="preserve"> the architect role </w:t>
+      </w:r>
+      <w:r>
+        <w:rPr>
+          <w:i/>
+          <w:iCs/>
+        </w:rPr>
+        <w:t>or</w:t>
+      </w:r>
+      <w:r>
+        <w:t xml:space="preserve"> </w:t>
+      </w:r>
+      <w:r>
+        <w:t>the consulting-SE role — almost never both. As architect/AOR (usually under a design lead): Vancouver House (BIG → Glotman Simpson + BuroHappold), Brookfield Place 60st (AFK → Entuitive), The Parks (Hariri Pontarini → RJC), The Hendrix (→ RJC). As SE-only: the ex-</w:t>
+      </w:r>
+      <w:r>
+        <w:rPr>
+          <w:b/>
+          <w:bCs/>
+        </w:rPr>
+        <w:t>Jones Kwong Kishi</w:t>
+      </w:r>
+      <w:r>
+        <w:t xml:space="preserve"> practice (merged into DIALOG </w:t>
+      </w:r>
+      <w:r>
+        <w:rPr>
+          <w:b/>
+          <w:bCs/>
+        </w:rPr>
+        <w:t>Oct 2013</w:t>
+      </w:r>
+      <w:r>
+        <w:t xml:space="preserve">) engineered Shangri-La Vancouver/Toronto (62/65st), Fairmont Pacific Rim, Shaw Tower — </w:t>
+      </w:r>
+      <w:r>
+        <w:rPr>
+          <w:b/>
+          <w:bCs/>
+        </w:rPr>
+        <w:t>for other architects (James KM Cheng)</w:t>
+      </w:r>
+      <w:r>
+        <w:t xml:space="preserve">, not as DIALOG-prime. The only verified DIALOG-prime-with-in-house-structural building is </w:t>
+      </w:r>
+      <w:r>
+        <w:rPr>
+          <w:b/>
+          <w:bCs/>
+        </w:rPr>
+        <w:t>Enbridge Centre (26st)</w:t>
+      </w:r>
+      <w:r>
+        <w:t>.</w:t>
       </w:r>
     </w:p>
     <w:p>
@@ -546,27 +408,256 @@
           <w:b/>
           <w:bCs/>
         </w:rPr>
-        <w:t>Misericordia inpatient tower</w:t>
-      </w:r>
-      <w:r>
-        <w:t xml:space="preserve"> (~350 beds, architect seat open, planning-only funding) — long-lead AB teaming watch. </w:t>
+        <w:t>A design/“star” architect leads a civic/cultural project and DIALOG is executive/AOR:</w:t>
+      </w:r>
+      <w:r>
+        <w:t xml:space="preserve"> Calgary Central Library (Snøhetta → Entuitive), TELUS Spark (Kasian → Stantec).</w:t>
+      </w:r>
+    </w:p>
+    <w:p>
+      <w:pPr>
+        <w:pStyle w:val="Compact"/>
+        <w:numPr>
+          <w:ilvl w:val="0"/>
+          <w:numId w:val="3"/>
+        </w:numPr>
+      </w:pPr>
+      <w:r>
+        <w:rPr>
+          <w:b/>
+          <w:bCs/>
+        </w:rPr>
+        <w:t>Alberta mega-hospital design-builds led by PCL</w:t>
+      </w:r>
+      <w:r>
+        <w:t xml:space="preserve"> → co-SE, n=2: Kaye Edmonton Clinic ~$900M (→ Yolles/now Jacobs, </w:t>
       </w:r>
       <w:r>
         <w:rPr>
           <w:i/>
           <w:iCs/>
         </w:rPr>
-        <w:t>(Event Park &amp; NAIT: likely self-performed or Thornton Tomasetti — probe, not pitch.)</w:t>
+        <w:t>equal partners</w:t>
+      </w:r>
+      <w:r>
+        <w:t xml:space="preserve">) and Calgary Cancer Centre $1.4B (→ DIALOG + Stantec). </w:t>
+      </w:r>
+      <w:r>
+        <w:rPr>
+          <w:b/>
+          <w:bCs/>
+        </w:rPr>
+        <w:t>This is NOT a general scale rule:</w:t>
+      </w:r>
+      <w:r>
+        <w:t xml:space="preserve"> </w:t>
+      </w:r>
+      <w:r>
+        <w:t>UHN Toronto Western (~$1B, CM delivery) is fully in-house — the co-SE pattern is tied to the AB design-build consortium structure, not project size. Extrapolating it to other provinces/GCs is [H].</w:t>
+      </w:r>
+    </w:p>
+    <w:p>
+      <w:pPr>
+        <w:pStyle w:val="Compact"/>
+        <w:numPr>
+          <w:ilvl w:val="0"/>
+          <w:numId w:val="3"/>
+        </w:numPr>
+      </w:pPr>
+      <w:r>
+        <w:rPr>
+          <w:b/>
+          <w:bCs/>
+        </w:rPr>
+        <w:t>Specialist structural innovation they lack in-house</w:t>
+      </w:r>
+      <w:r>
+        <w:t xml:space="preserve"> → pioneer seismic mass timber (Fast+Epp, The Hive), rammed earth (Equilibrium, Nk’Mip), life-sciences labs (Blackwell, Catalyst-77 Wade), forensic concrete (RJC, Glenbow), blast/security (Thornton Tomasetti, Peel Police).</w:t>
+      </w:r>
+    </w:p>
+    <w:p>
+      <w:pPr>
+        <w:pStyle w:val="Compact"/>
+        <w:numPr>
+          <w:ilvl w:val="0"/>
+          <w:numId w:val="3"/>
+        </w:numPr>
+      </w:pPr>
+      <w:r>
+        <w:rPr>
+          <w:b/>
+          <w:bCs/>
+        </w:rPr>
+        <w:t>A studio lacking the relevant specialty</w:t>
+      </w:r>
+      <w:r>
+        <w:t xml:space="preserve"> </w:t>
+      </w:r>
+      <w:r>
+        <w:t xml:space="preserve">→ Vancouver’s structural practice (ex-JKK towers, Broadway Subway, community/housing) has </w:t>
+      </w:r>
+      <w:r>
+        <w:rPr>
+          <w:b/>
+          <w:bCs/>
+        </w:rPr>
+        <w:t>no healthcare structural track record</w:t>
+      </w:r>
+      <w:r>
+        <w:t xml:space="preserve">; Ottawa (opened 2026) has zero structural partners. </w:t>
+      </w:r>
+      <w:r>
+        <w:rPr>
+          <w:i/>
+          <w:iCs/>
+        </w:rPr>
+        <w:t>Caveat: a gap does not force outsourcing — DIALOG cross-deployed Hildenbrandt from Calgary to do Dartmouth General (NS) in-house.</w:t>
+      </w:r>
+    </w:p>
+    <w:p>
+      <w:pPr>
+        <w:pStyle w:val="FirstParagraph"/>
+      </w:pPr>
+      <w:r>
+        <w:rPr>
+          <w:b/>
+          <w:bCs/>
+        </w:rPr>
+        <w:t>Self-performs (do NOT pitch):</w:t>
+      </w:r>
+      <w:r>
+        <w:t xml:space="preserve"> </w:t>
+      </w:r>
+      <w:r>
+        <w:t xml:space="preserve">transit/bridges (their strongest domain — Walterdale, Valley Line, Broadway Subway, airports), sports/rec, mid-rise full-suite buildings when prime (Enbridge 26st), standard CLT timber (Bill Fisch), own civic (Royal Alberta Museum, Winspear), and </w:t>
+      </w:r>
+      <w:r>
+        <w:rPr>
+          <w:b/>
+          <w:bCs/>
+        </w:rPr>
+        <w:t>home-market healthcare at any scale outside AB design-build</w:t>
+      </w:r>
+      <w:r>
+        <w:t xml:space="preserve"> (Grande Prairie ~$680M, Edson, UHN Toronto Western ~$1B, Markdale, Dartmouth).</w:t>
+      </w:r>
+    </w:p>
+    <w:p>
+      <w:pPr>
+        <w:pStyle w:val="BodyText"/>
+      </w:pPr>
+      <w:r>
+        <w:rPr>
+          <w:b/>
+          <w:bCs/>
+        </w:rPr>
+        <w:t>One line for the room:</w:t>
+      </w:r>
+      <w:r>
+        <w:t xml:space="preserve"> </w:t>
+      </w:r>
+      <w:r>
+        <w:rPr>
+          <w:i/>
+          <w:iCs/>
+        </w:rPr>
+        <w:t>“DIALOG brings in external structural where the developer or a design-lead architect procures it separately, on Alberta mega design-build hospitals as a co-SE, for specialist innovation, and where a studio lacks the specialty — and self-performs transit, bridges, mid-rise, civic, and most healthcare in-house.”</w:t>
       </w:r>
     </w:p>
     <w:p>
       <w:pPr>
         <w:pStyle w:val="Heading2"/>
       </w:pPr>
-      <w:bookmarkStart w:id="3" w:name="dialog-structural-bench-who-owns-what-v"/>
+      <w:bookmarkStart w:id="3" w:name="Xcc50162a1971f8d33d16dd8704cb081d2301ffb"/>
       <w:bookmarkEnd w:id="2"/>
       <w:r>
-        <w:t>DIALOG structural bench — who owns what [V]</w:t>
+        <w:lastRenderedPageBreak/>
+        <w:t>Strategic read for July 10 — a relationship meeting, not a seat pitch</w:t>
+      </w:r>
+    </w:p>
+    <w:p>
+      <w:pPr>
+        <w:pStyle w:val="FirstParagraph"/>
+      </w:pPr>
+      <w:r>
+        <w:rPr>
+          <w:b/>
+          <w:bCs/>
+        </w:rPr>
+        <w:t>There is no verified open seat to pitch.</w:t>
+      </w:r>
+      <w:r>
+        <w:t xml:space="preserve"> Triggers 1–2 are </w:t>
+      </w:r>
+      <w:r>
+        <w:rPr>
+          <w:b/>
+          <w:bCs/>
+        </w:rPr>
+        <w:t>developer/design-lead decisions — not DIALOG’s to award</w:t>
+      </w:r>
+      <w:r>
+        <w:t xml:space="preserve">; trigger 3 is rare (next AB mega-DB hospital is years out); trigger 5 belongs to other studios. What Georg Josi </w:t>
+      </w:r>
+      <w:r>
+        <w:rPr>
+          <w:i/>
+          <w:iCs/>
+        </w:rPr>
+        <w:t>can</w:t>
+      </w:r>
+      <w:r>
+        <w:t xml:space="preserve"> give KOR: </w:t>
+      </w:r>
+      <w:r>
+        <w:rPr>
+          <w:b/>
+          <w:bCs/>
+        </w:rPr>
+        <w:t>(a)</w:t>
+      </w:r>
+      <w:r>
+        <w:t xml:space="preserve"> a specialist/overflow relationship with Edmonton (their AB partner-level structural capacity genuinely is contracting), </w:t>
+      </w:r>
+      <w:r>
+        <w:rPr>
+          <w:b/>
+          <w:bCs/>
+        </w:rPr>
+        <w:t>(b)</w:t>
+      </w:r>
+      <w:r>
+        <w:t xml:space="preserve"> an intro path into the next AB mega design-build co-SE, </w:t>
+      </w:r>
+      <w:r>
+        <w:rPr>
+          <w:b/>
+          <w:bCs/>
+        </w:rPr>
+        <w:t>(c)</w:t>
+      </w:r>
+      <w:r>
+        <w:t xml:space="preserve"> a referral into the BC studio, </w:t>
+      </w:r>
+      <w:r>
+        <w:rPr>
+          <w:b/>
+          <w:bCs/>
+        </w:rPr>
+        <w:t>(d)</w:t>
+      </w:r>
+      <w:r>
+        <w:t xml:space="preserve"> the Misericordia watch. Walk in to become </w:t>
+      </w:r>
+      <w:r>
+        <w:rPr>
+          <w:i/>
+          <w:iCs/>
+        </w:rPr>
+        <w:t>the firm they think of</w:t>
+      </w:r>
+      <w:r>
+        <w:t xml:space="preserve"> — not to ask for a seat that isn’t on the table.</w:t>
       </w:r>
     </w:p>
     <w:p>
@@ -582,40 +673,76 @@
           <w:b/>
           <w:bCs/>
         </w:rPr>
-        <w:t>Edmonton (largest studio, ~150 staff post-RPK):</w:t>
-      </w:r>
-      <w:r>
-        <w:t xml:space="preserve"> Georg Josi (Studio Chair; healthcare — Kaye), </w:t>
-      </w:r>
-      <w:r>
-        <w:rPr>
-          <w:b/>
-          <w:bCs/>
-        </w:rPr>
-        <w:t>Steven Oosterhof</w:t>
-      </w:r>
-      <w:r>
-        <w:t xml:space="preserve"> (PhD/PE/SE — </w:t>
-      </w:r>
-      <w:r>
-        <w:rPr>
-          <w:b/>
-          <w:bCs/>
-        </w:rPr>
-        <w:t>voting member of the NBCC Standing Committee on Earthquake Design</w:t>
+        <w:t>UHNBC Acute Care Tower ($1.579B, Prince George)</w:t>
       </w:r>
       <w:r>
         <w:t xml:space="preserve"> </w:t>
       </w:r>
       <w:r>
-        <w:t xml:space="preserve">(chaired by Perry Adebar, UBC); venue/commercial), Neil Robson (bridges/transit), Steven Prozniak (bridges), Ryan Renihan/Larissa Ulcar/Victoria Buffam (assoc). Jim Montgomery → Partner Emeritus 2025; Sandra Renihan → transit PM. </w:t>
-      </w:r>
-      <w:r>
-        <w:rPr>
-          <w:b/>
-          <w:bCs/>
-        </w:rPr>
-        <w:t>AB partner-level structural capacity is contracting.</w:t>
+        <w:t xml:space="preserve">[V facts, H opportunity]: DIALOG+EllisDon alliance (formed Dec 2025), design through late 2026, construction ~2027, opening ~2031. </w:t>
+      </w:r>
+      <w:r>
+        <w:rPr>
+          <w:b/>
+          <w:bCs/>
+        </w:rPr>
+        <w:t>Structural is most likely inside DIALOG BC’s own scope</w:t>
+      </w:r>
+      <w:r>
+        <w:t xml:space="preserve"> — the alliance named separate mechanical (PML) and electrical (Houle) participants precisely because DIALOG doesn’t self-perform those, and named </w:t>
+      </w:r>
+      <w:r>
+        <w:rPr>
+          <w:b/>
+          <w:bCs/>
+        </w:rPr>
+        <w:t>no structural participant</w:t>
+      </w:r>
+      <w:r>
+        <w:t xml:space="preserve">; their BC entity is legally “DIALOG BC Architecture </w:t>
+      </w:r>
+      <w:r>
+        <w:rPr>
+          <w:b/>
+          <w:bCs/>
+        </w:rPr>
+        <w:t>Engineering</w:t>
+      </w:r>
+      <w:r>
+        <w:t xml:space="preserve"> Interior Design Planning Inc.” </w:t>
+      </w:r>
+      <w:r>
+        <w:t xml:space="preserve">(Contrast: on the Cowichan Hospital alliance, architect Parkin — no in-house SE — named Bush Bohlman as a structural participant.) </w:t>
+      </w:r>
+      <w:r>
+        <w:rPr>
+          <w:b/>
+          <w:bCs/>
+        </w:rPr>
+        <w:t>Probe as capacity support, never claim the seat is open:</w:t>
+      </w:r>
+      <w:r>
+        <w:t xml:space="preserve"> </w:t>
+      </w:r>
+      <w:r>
+        <w:rPr>
+          <w:i/>
+          <w:iCs/>
+        </w:rPr>
+        <w:t>“Is your BC team self-performing structural on UHNBC, or would a BC healthcare-structural partner help carry it?”</w:t>
+      </w:r>
+      <w:r>
+        <w:t xml:space="preserve"> Note: </w:t>
+      </w:r>
+      <w:r>
+        <w:rPr>
+          <w:b/>
+          <w:bCs/>
+        </w:rPr>
+        <w:t>Prince George is low-seismicity</w:t>
+      </w:r>
+      <w:r>
+        <w:t xml:space="preserve"> (PGA ≈0.07g — Edmonton-level, 6–9× below Vancouver) — do not pitch it as seismic-intensive; the post-disaster importance angle is what applies.</w:t>
       </w:r>
     </w:p>
     <w:p>
@@ -631,159 +758,27 @@
           <w:b/>
           <w:bCs/>
         </w:rPr>
-        <w:t>Calgary:</w:t>
-      </w:r>
-      <w:r>
-        <w:t xml:space="preserve"> Ralph Hildenbrandt (</w:t>
-      </w:r>
-      <w:r>
-        <w:rPr>
-          <w:b/>
-          <w:bCs/>
-        </w:rPr>
-        <w:t>healthcare lead</w:t>
-      </w:r>
-      <w:r>
-        <w:t xml:space="preserve"> — GP Regional, Calgary Cancer, Dartmouth), Chris Lenzin (Studio Chair), Gerry Carson (precast/UHPC).</w:t>
-      </w:r>
-    </w:p>
-    <w:p>
-      <w:pPr>
-        <w:pStyle w:val="Compact"/>
-        <w:numPr>
-          <w:ilvl w:val="0"/>
-          <w:numId w:val="4"/>
-        </w:numPr>
-      </w:pPr>
-      <w:r>
-        <w:rPr>
-          <w:b/>
-          <w:bCs/>
-        </w:rPr>
-        <w:t>Toronto:</w:t>
-      </w:r>
-      <w:r>
-        <w:t xml:space="preserve"> </w:t>
-      </w:r>
-      <w:r>
-        <w:t>Daria Khachi (healthcare + forensics/post-disaster), Cameron Ritchie (healthcare), Charles Marshall (Studio Chair).</w:t>
-      </w:r>
-    </w:p>
-    <w:p>
-      <w:pPr>
-        <w:pStyle w:val="Compact"/>
-        <w:numPr>
-          <w:ilvl w:val="0"/>
-          <w:numId w:val="4"/>
-        </w:numPr>
-      </w:pPr>
-      <w:r>
-        <w:rPr>
-          <w:b/>
-          <w:bCs/>
-        </w:rPr>
-        <w:t>Vancouver:</w:t>
-      </w:r>
-      <w:r>
-        <w:t xml:space="preserve"> Thomas Wu (towers — ex-JKK credits incl. Shangri-La/Pacific Rim), Mehrak Razavi, Fadi Ghorayeb — plus Broadway Subway/community work; </w:t>
-      </w:r>
-      <w:r>
-        <w:rPr>
-          <w:b/>
-          <w:bCs/>
-        </w:rPr>
-        <w:t>no healthcare structural track record.</w:t>
-      </w:r>
-    </w:p>
-    <w:p>
-      <w:pPr>
-        <w:pStyle w:val="Heading2"/>
-      </w:pPr>
-      <w:bookmarkStart w:id="4" w:name="firm-context-for-the-relationship-v"/>
-      <w:bookmarkEnd w:id="3"/>
-      <w:r>
-        <w:t>Firm context (for the relationship) [V]</w:t>
-      </w:r>
-    </w:p>
-    <w:p>
-      <w:pPr>
-        <w:pStyle w:val="FirstParagraph"/>
-      </w:pPr>
-      <w:r>
-        <w:t xml:space="preserve">Partner-owned (50+ partners, flat governance, no single CEO), </w:t>
-      </w:r>
-      <w:r>
-        <w:rPr>
-          <w:b/>
-          <w:bCs/>
-        </w:rPr>
-        <w:t>600+ staff, 6 studios</w:t>
-      </w:r>
-      <w:r>
-        <w:t xml:space="preserve"> </w:t>
-      </w:r>
-      <w:r>
-        <w:t xml:space="preserve">(Vancouver, Calgary, Edmonton, Toronto, Ottawa [2026], San Francisco), fully multidisciplinary. </w:t>
-      </w:r>
-      <w:r>
-        <w:rPr>
-          <w:b/>
-          <w:bCs/>
-        </w:rPr>
-        <w:t>B Corp</w:t>
-      </w:r>
-      <w:r>
-        <w:t xml:space="preserve">, AIA-2030 + </w:t>
-      </w:r>
-      <w:r>
-        <w:rPr>
-          <w:b/>
-          <w:bCs/>
-        </w:rPr>
-        <w:t>SE 2050</w:t>
-      </w:r>
-      <w:r>
-        <w:t xml:space="preserve"> carbon commitments, “Community Wellbeing Framework” (with the Conference Board of Canada) is core identity. Chair </w:t>
-      </w:r>
-      <w:r>
-        <w:rPr>
-          <w:b/>
-          <w:bCs/>
-        </w:rPr>
-        <w:t>Antonio Gómez-Palacio</w:t>
-      </w:r>
-      <w:r>
-        <w:t xml:space="preserve"> (since 2022). </w:t>
+        <w:t>Misericordia inpatient tower</w:t>
+      </w:r>
+      <w:r>
+        <w:t xml:space="preserve"> (~350 beds, architect seat open, planning-only funding) — long-lead AB teaming watch. </w:t>
       </w:r>
       <w:r>
         <w:rPr>
           <w:i/>
           <w:iCs/>
         </w:rPr>
-        <w:t>Fast Company</w:t>
-      </w:r>
-      <w:r>
-        <w:t xml:space="preserve"> Most Innovative Architecture Firms 2026 (Peter Lougheed Wildlife Overpass). Deeply fluent in </w:t>
-      </w:r>
-      <w:r>
-        <w:rPr>
-          <w:b/>
-          <w:bCs/>
-        </w:rPr>
-        <w:t>IPD / alliance / design-build</w:t>
-      </w:r>
-      <w:r>
-        <w:t xml:space="preserve"> (UHNBC alliance, Calgary Cancer DB, Broadway Subway DBF).</w:t>
+        <w:t>(Event Park &amp; NAIT: likely self-performed or Thornton Tomasetti — probe, not pitch.)</w:t>
       </w:r>
     </w:p>
     <w:p>
       <w:pPr>
         <w:pStyle w:val="Heading2"/>
       </w:pPr>
-      <w:bookmarkStart w:id="5" w:name="how-kor-should-position"/>
-      <w:bookmarkEnd w:id="4"/>
-      <w:r>
-        <w:t>How KOR should position</w:t>
+      <w:bookmarkStart w:id="4" w:name="dialog-structural-bench-who-owns-what-v"/>
+      <w:bookmarkEnd w:id="3"/>
+      <w:r>
+        <w:t>DIALOG structural bench — who owns what [V]</w:t>
       </w:r>
     </w:p>
     <w:p>
@@ -799,23 +794,40 @@
           <w:b/>
           <w:bCs/>
         </w:rPr>
-        <w:t>Language:</w:t>
+        <w:t>Edmonton (largest studio, ~150 staff post-RPK):</w:t>
+      </w:r>
+      <w:r>
+        <w:t xml:space="preserve"> Georg Josi (Studio Chair; healthcare — Kaye), </w:t>
+      </w:r>
+      <w:r>
+        <w:rPr>
+          <w:b/>
+          <w:bCs/>
+        </w:rPr>
+        <w:t>Steven Oosterhof</w:t>
+      </w:r>
+      <w:r>
+        <w:t xml:space="preserve"> (PhD/PE/SE — </w:t>
+      </w:r>
+      <w:r>
+        <w:rPr>
+          <w:b/>
+          <w:bCs/>
+        </w:rPr>
+        <w:t>voting member of the NBCC Standing Committee on Earthquake Design</w:t>
       </w:r>
       <w:r>
         <w:t xml:space="preserve"> </w:t>
       </w:r>
       <w:r>
-        <w:t xml:space="preserve">“integrated team,” “all disciplines at the table,” “co-creative from concept” — </w:t>
-      </w:r>
-      <w:r>
-        <w:rPr>
-          <w:b/>
-          <w:bCs/>
-        </w:rPr>
-        <w:t>never “sub-consultant.”</w:t>
-      </w:r>
-      <w:r>
-        <w:t xml:space="preserve"> Speak partner, not vendor.</w:t>
+        <w:t xml:space="preserve">(chaired by Perry Adebar, UBC); venue/commercial), Neil Robson (bridges/transit), Steven Prozniak (bridges), Ryan Renihan/Larissa Ulcar/Victoria Buffam (assoc). Jim Montgomery → Partner Emeritus 2025; Sandra Renihan → transit PM. </w:t>
+      </w:r>
+      <w:r>
+        <w:rPr>
+          <w:b/>
+          <w:bCs/>
+        </w:rPr>
+        <w:t>AB partner-level structural capacity is contracting.</w:t>
       </w:r>
     </w:p>
     <w:p>
@@ -831,37 +843,20 @@
           <w:b/>
           <w:bCs/>
         </w:rPr>
-        <w:t>Respect their code authority:</w:t>
-      </w:r>
-      <w:r>
-        <w:t xml:space="preserve"> Oosterhof sits on the national seismic-code committee. </w:t>
-      </w:r>
-      <w:r>
-        <w:rPr>
-          <w:b/>
-          <w:bCs/>
-        </w:rPr>
-        <w:t>Do not lecture them on NBC content.</w:t>
-      </w:r>
-      <w:r>
-        <w:t xml:space="preserve"> KOR’s value is the </w:t>
-      </w:r>
-      <w:r>
-        <w:rPr>
-          <w:i/>
-          <w:iCs/>
-        </w:rPr>
-        <w:t>delivered bench</w:t>
-      </w:r>
-      <w:r>
-        <w:t xml:space="preserve">: decades of post-disaster/high-importance structural practice in Canada’s highest seismic-hazard zones, plus capacity — </w:t>
-      </w:r>
-      <w:r>
-        <w:rPr>
-          <w:i/>
-          <w:iCs/>
-        </w:rPr>
-        <w:t>“you have the code table; we have the coastal-BC production depth behind it.”</w:t>
+        <w:t>Calgary:</w:t>
+      </w:r>
+      <w:r>
+        <w:t xml:space="preserve"> Ralph Hildenbrandt (</w:t>
+      </w:r>
+      <w:r>
+        <w:rPr>
+          <w:b/>
+          <w:bCs/>
+        </w:rPr>
+        <w:t>healthcare lead</w:t>
+      </w:r>
+      <w:r>
+        <w:t xml:space="preserve"> — GP Regional, Calgary Cancer, Dartmouth), Chris Lenzin (Studio Chair), Gerry Carson (precast/UHPC).</w:t>
       </w:r>
     </w:p>
     <w:p>
@@ -877,25 +872,13 @@
           <w:b/>
           <w:bCs/>
         </w:rPr>
-        <w:lastRenderedPageBreak/>
-        <w:t>The seismic wedge (red-team-corrected wording, safe in front of SC-ED members):</w:t>
+        <w:t>Toronto:</w:t>
       </w:r>
       <w:r>
         <w:t xml:space="preserve"> </w:t>
       </w:r>
       <w:r>
-        <w:rPr>
-          <w:i/>
-          <w:iCs/>
-        </w:rPr>
-        <w:t>“Since May 1 2024, Alberta designs to the NBC 2023 Alberta Edition, which for the first time brings Alberta post-disaster buildings under Article 4.1.8.23 — the NBC 2020 requirement that hospitals behave essentially elastically under a more frequent earthquake, with a tightened 0.5% interstorey drift limit and minimum Rd ≥ 2.0. The 1.5 importance factor isn’t new — that’s been there since the 1990s — but this performance check is new to Alberta, and it’s the kind of requirement coastal-BC practices have bee</w:t>
-      </w:r>
-      <w:r>
-        <w:rPr>
-          <w:i/>
-          <w:iCs/>
-        </w:rPr>
-        <w:t>n designing around for years.”</w:t>
+        <w:t>Daria Khachi (healthcare + forensics/post-disaster), Cameron Ritchie (healthcare), Charles Marshall (Studio Chair).</w:t>
       </w:r>
     </w:p>
     <w:p>
@@ -911,69 +894,108 @@
           <w:b/>
           <w:bCs/>
         </w:rPr>
-        <w:t>Values hook:</w:t>
-      </w:r>
-      <w:r>
-        <w:t xml:space="preserve"> frame seismic resilience as </w:t>
-      </w:r>
-      <w:r>
-        <w:rPr>
-          <w:b/>
-          <w:bCs/>
-        </w:rPr>
-        <w:t>community wellbeing</w:t>
-      </w:r>
-      <w:r>
-        <w:t xml:space="preserve">, and </w:t>
-      </w:r>
-      <w:r>
-        <w:rPr>
-          <w:b/>
-          <w:bCs/>
-        </w:rPr>
-        <w:t>bring an embodied-carbon/LCA story</w:t>
-      </w:r>
-      <w:r>
-        <w:t xml:space="preserve"> — a B-Corp, SE-2050 firm will expect it.</w:t>
-      </w:r>
-    </w:p>
-    <w:p>
-      <w:pPr>
-        <w:pStyle w:val="Compact"/>
-        <w:numPr>
-          <w:ilvl w:val="0"/>
-          <w:numId w:val="5"/>
-        </w:numPr>
-      </w:pPr>
-      <w:r>
-        <w:rPr>
-          <w:b/>
-          <w:bCs/>
-        </w:rPr>
-        <w:t>The precedent to name:</w:t>
+        <w:t>Vancouver:</w:t>
+      </w:r>
+      <w:r>
+        <w:t xml:space="preserve"> Thomas Wu (towers — ex-JKK credits incl. Shangri-La/Pacific Rim), Mehrak Razavi, Fadi Ghorayeb — plus Broadway Subway/community work; </w:t>
+      </w:r>
+      <w:r>
+        <w:rPr>
+          <w:b/>
+          <w:bCs/>
+        </w:rPr>
+        <w:t>no healthcare structural track record.</w:t>
+      </w:r>
+    </w:p>
+    <w:p>
+      <w:pPr>
+        <w:pStyle w:val="Heading2"/>
+      </w:pPr>
+      <w:bookmarkStart w:id="5" w:name="firm-context-for-the-relationship-v"/>
+      <w:bookmarkEnd w:id="4"/>
+      <w:r>
+        <w:t>Firm context (for the relationship) [V]</w:t>
+      </w:r>
+    </w:p>
+    <w:p>
+      <w:pPr>
+        <w:pStyle w:val="FirstParagraph"/>
+      </w:pPr>
+      <w:r>
+        <w:t xml:space="preserve">Partner-owned (50+ partners, flat governance, no single CEO), </w:t>
+      </w:r>
+      <w:r>
+        <w:rPr>
+          <w:b/>
+          <w:bCs/>
+        </w:rPr>
+        <w:t>600+ staff, 6 studios</w:t>
       </w:r>
       <w:r>
         <w:t xml:space="preserve"> </w:t>
+      </w:r>
+      <w:r>
+        <w:t xml:space="preserve">(Vancouver, Calgary, Edmonton, Toronto, Ottawa [2026], San Francisco), fully multidisciplinary. </w:t>
+      </w:r>
+      <w:r>
+        <w:rPr>
+          <w:b/>
+          <w:bCs/>
+        </w:rPr>
+        <w:t>B Corp</w:t>
+      </w:r>
+      <w:r>
+        <w:t xml:space="preserve">, AIA-2030 + </w:t>
+      </w:r>
+      <w:r>
+        <w:rPr>
+          <w:b/>
+          <w:bCs/>
+        </w:rPr>
+        <w:t>SE 2050</w:t>
+      </w:r>
+      <w:r>
+        <w:t xml:space="preserve"> carbon commitments, “Community Wellbeing Framework” (with the Conference Board of Canada) is core identity. Chair </w:t>
+      </w:r>
+      <w:r>
+        <w:rPr>
+          <w:b/>
+          <w:bCs/>
+        </w:rPr>
+        <w:t>Antonio Gómez-Palacio</w:t>
+      </w:r>
+      <w:r>
+        <w:t xml:space="preserve"> (since 2022). </w:t>
       </w:r>
       <w:r>
         <w:rPr>
           <w:i/>
           <w:iCs/>
         </w:rPr>
-        <w:t>“the Fast+Epp-on-The-Hive model — a specialist structural partner brought in co-creatively”</w:t>
-      </w:r>
-      <w:r>
-        <w:t xml:space="preserve"> — for specialist/overflow scope, wherever it arises.</w:t>
+        <w:t>Fast Company</w:t>
+      </w:r>
+      <w:r>
+        <w:t xml:space="preserve"> Most Innovative Architecture Firms 2026 (Peter Lougheed Wildlife Overpass). Deeply fluent in </w:t>
+      </w:r>
+      <w:r>
+        <w:rPr>
+          <w:b/>
+          <w:bCs/>
+        </w:rPr>
+        <w:t>IPD / alliance / design-build</w:t>
+      </w:r>
+      <w:r>
+        <w:t xml:space="preserve"> (UHNBC alliance, Calgary Cancer DB, Broadway Subway DBF).</w:t>
       </w:r>
     </w:p>
     <w:p>
       <w:pPr>
         <w:pStyle w:val="Heading2"/>
       </w:pPr>
-      <w:bookmarkStart w:id="6" w:name="Xd6b3590db95f1f0ededed72df4a949721108dd5"/>
+      <w:bookmarkStart w:id="6" w:name="how-kor-should-position"/>
       <w:bookmarkEnd w:id="5"/>
       <w:r>
-        <w:t>Competitors for DIALOG’s external structural work [V]</w:t>
+        <w:t>How KOR should position</w:t>
       </w:r>
     </w:p>
     <w:p>
@@ -989,13 +1011,23 @@
           <w:b/>
           <w:bCs/>
         </w:rPr>
-        <w:t>RJC Engineers</w:t>
+        <w:t>Language:</w:t>
       </w:r>
       <w:r>
         <w:t xml:space="preserve"> </w:t>
       </w:r>
       <w:r>
-        <w:t>— the heavyweight: towers-with-co-arch, education, museum renovation, YYC airport; AB healthcare (South Health Campus). The one to displace.</w:t>
+        <w:t xml:space="preserve">“integrated team,” “all disciplines at the table,” “co-creative from concept” — </w:t>
+      </w:r>
+      <w:r>
+        <w:rPr>
+          <w:b/>
+          <w:bCs/>
+        </w:rPr>
+        <w:t>never “sub-consultant.”</w:t>
+      </w:r>
+      <w:r>
+        <w:t xml:space="preserve"> Speak partner, not vendor.</w:t>
       </w:r>
     </w:p>
     <w:p>
@@ -1011,20 +1043,37 @@
           <w:b/>
           <w:bCs/>
         </w:rPr>
-        <w:t>Entuitive</w:t>
-      </w:r>
-      <w:r>
-        <w:t xml:space="preserve"> — Edmonton office since 2016; Brookfield Place + Calgary Library. Institutional, </w:t>
-      </w:r>
-      <w:r>
-        <w:rPr>
-          <w:b/>
-          <w:bCs/>
-        </w:rPr>
-        <w:t>no AB acute-care record</w:t>
-      </w:r>
-      <w:r>
-        <w:t xml:space="preserve"> (don’t overstate).</w:t>
+        <w:t>Respect their code authority:</w:t>
+      </w:r>
+      <w:r>
+        <w:t xml:space="preserve"> Oosterhof sits on the national seismic-code committee. </w:t>
+      </w:r>
+      <w:r>
+        <w:rPr>
+          <w:b/>
+          <w:bCs/>
+        </w:rPr>
+        <w:t>Do not lecture them on NBC content.</w:t>
+      </w:r>
+      <w:r>
+        <w:t xml:space="preserve"> KOR’s value is the </w:t>
+      </w:r>
+      <w:r>
+        <w:rPr>
+          <w:i/>
+          <w:iCs/>
+        </w:rPr>
+        <w:t>delivered bench</w:t>
+      </w:r>
+      <w:r>
+        <w:t xml:space="preserve">: decades of post-disaster/high-importance structural practice in Canada’s highest seismic-hazard zones, plus capacity — </w:t>
+      </w:r>
+      <w:r>
+        <w:rPr>
+          <w:i/>
+          <w:iCs/>
+        </w:rPr>
+        <w:t>“you have the code table; we have the coastal-BC production depth behind it.”</w:t>
       </w:r>
     </w:p>
     <w:p>
@@ -1040,53 +1089,102 @@
           <w:b/>
           <w:bCs/>
         </w:rPr>
-        <w:t>Glotman Simpson / BuroHappold</w:t>
-      </w:r>
-      <w:r>
-        <w:t xml:space="preserve"> — Vancouver developer/starchitect towers. </w:t>
-      </w:r>
-      <w:r>
-        <w:rPr>
-          <w:b/>
-          <w:bCs/>
-        </w:rPr>
-        <w:t>Fast+Epp</w:t>
-      </w:r>
-      <w:r>
-        <w:t xml:space="preserve"> — mass timber (entrenched; don’t contest). </w:t>
-      </w:r>
-      <w:r>
-        <w:rPr>
-          <w:b/>
-          <w:bCs/>
-        </w:rPr>
-        <w:t>Stantec / Jacobs</w:t>
-      </w:r>
-      <w:r>
-        <w:t xml:space="preserve"> — the AB mega-hospital co-SE incumbents. </w:t>
-      </w:r>
-      <w:r>
-        <w:rPr>
-          <w:b/>
-          <w:bCs/>
-        </w:rPr>
-        <w:t>Bush Bohlman</w:t>
+        <w:t>The seismic wedge (red-team-corrected wording, safe in front of SC-ED members):</w:t>
       </w:r>
       <w:r>
         <w:t xml:space="preserve"> </w:t>
       </w:r>
       <w:r>
-        <w:t>— took the structural-participant seat on the Cowichan Hospital alliance (the BC-health-alliance precedent).</w:t>
+        <w:rPr>
+          <w:i/>
+          <w:iCs/>
+        </w:rPr>
+        <w:t>“Since May 1 2024, Alberta designs to the NBC 2023 Alberta Edition, which for the first time brings Alberta post-disaster buildings under Article 4.1.8.23 — the NBC 2020 requirement that hospitals behave essentially elastically under a more frequent earthquake, with a tightened 0.5% interstorey drift limit and minimum Rd ≥ 2.0. The 1.5 importance factor isn’t new — that’s been there since the 1990s — but this performance check is new to Alberta, and it’s the kind of requirement coastal-BC practices have bee</w:t>
+      </w:r>
+      <w:r>
+        <w:rPr>
+          <w:i/>
+          <w:iCs/>
+        </w:rPr>
+        <w:t>n designing around for years.”</w:t>
+      </w:r>
+    </w:p>
+    <w:p>
+      <w:pPr>
+        <w:pStyle w:val="Compact"/>
+        <w:numPr>
+          <w:ilvl w:val="0"/>
+          <w:numId w:val="6"/>
+        </w:numPr>
+      </w:pPr>
+      <w:r>
+        <w:rPr>
+          <w:b/>
+          <w:bCs/>
+        </w:rPr>
+        <w:t>Values hook:</w:t>
+      </w:r>
+      <w:r>
+        <w:t xml:space="preserve"> frame seismic resilience as </w:t>
+      </w:r>
+      <w:r>
+        <w:rPr>
+          <w:b/>
+          <w:bCs/>
+        </w:rPr>
+        <w:t>community wellbeing</w:t>
+      </w:r>
+      <w:r>
+        <w:t xml:space="preserve">, and </w:t>
+      </w:r>
+      <w:r>
+        <w:rPr>
+          <w:b/>
+          <w:bCs/>
+        </w:rPr>
+        <w:t>bring an embodied-carbon/LCA story</w:t>
+      </w:r>
+      <w:r>
+        <w:t xml:space="preserve"> — a B-Corp, SE-2050 firm will expect it.</w:t>
+      </w:r>
+    </w:p>
+    <w:p>
+      <w:pPr>
+        <w:pStyle w:val="Compact"/>
+        <w:numPr>
+          <w:ilvl w:val="0"/>
+          <w:numId w:val="6"/>
+        </w:numPr>
+      </w:pPr>
+      <w:r>
+        <w:rPr>
+          <w:b/>
+          <w:bCs/>
+        </w:rPr>
+        <w:t>The precedent to name:</w:t>
+      </w:r>
+      <w:r>
+        <w:t xml:space="preserve"> </w:t>
+      </w:r>
+      <w:r>
+        <w:rPr>
+          <w:i/>
+          <w:iCs/>
+        </w:rPr>
+        <w:t>“the Fast+Epp-on-The-Hive model — a specialist structural partner brought in co-creatively”</w:t>
+      </w:r>
+      <w:r>
+        <w:t xml:space="preserve"> — for specialist/overflow scope, wherever it arises.</w:t>
       </w:r>
     </w:p>
     <w:p>
       <w:pPr>
         <w:pStyle w:val="Heading2"/>
       </w:pPr>
-      <w:bookmarkStart w:id="7" w:name="do-not-say-red-team-landmines"/>
+      <w:bookmarkStart w:id="7" w:name="Xd6b3590db95f1f0ededed72df4a949721108dd5"/>
       <w:bookmarkEnd w:id="6"/>
       <w:r>
-        <w:t>Do NOT say (red-team landmines)</w:t>
+        <w:t>Competitors for DIALOG’s external structural work [V]</w:t>
       </w:r>
     </w:p>
     <w:p>
@@ -1102,20 +1200,13 @@
           <w:b/>
           <w:bCs/>
         </w:rPr>
-        <w:t>Don’t cite Shangri-La as “DIALOG self-performing structural as prime architect”</w:t>
-      </w:r>
-      <w:r>
-        <w:t xml:space="preserve"> — DIALOG was never the architect (James KM Cheng was); the structural is a </w:t>
-      </w:r>
-      <w:r>
-        <w:rPr>
-          <w:b/>
-          <w:bCs/>
-        </w:rPr>
-        <w:t>Jones Kwong Kishi legacy credit</w:t>
-      </w:r>
-      <w:r>
-        <w:t xml:space="preserve"> (merged Oct 2013, after completion). Their people know their own history. Only prime+in-house case: Enbridge Centre, 26st.</w:t>
+        <w:t>RJC Engineers</w:t>
+      </w:r>
+      <w:r>
+        <w:t xml:space="preserve"> </w:t>
+      </w:r>
+      <w:r>
+        <w:t>— the heavyweight: towers-with-co-arch, education, museum renovation, YYC airport; AB healthcare (South Health Campus). The one to displace.</w:t>
       </w:r>
     </w:p>
     <w:p>
@@ -1127,10 +1218,24 @@
         </w:numPr>
       </w:pPr>
       <w:r>
-        <w:t xml:space="preserve">Don’t say “DIALOG outsources hospital structural” </w:t>
-      </w:r>
-      <w:r>
-        <w:t>broadly — they self-perform at ~$680M (GP Regional) and ~$1B (UHN Toronto Western, CM delivery). The co-SE cases are AB PCL design-builds.</w:t>
+        <w:rPr>
+          <w:b/>
+          <w:bCs/>
+        </w:rPr>
+        <w:t>Entuitive</w:t>
+      </w:r>
+      <w:r>
+        <w:t xml:space="preserve"> — Edmonton office since 2016; Brookfield Place + Calgary Library. Institutional, </w:t>
+      </w:r>
+      <w:r>
+        <w:rPr>
+          <w:b/>
+          <w:bCs/>
+        </w:rPr>
+        <w:t>no AB acute-care record</w:t>
+      </w:r>
+      <w:r>
+        <w:t xml:space="preserve"> (don’t overstate).</w:t>
       </w:r>
     </w:p>
     <w:p>
@@ -1146,99 +1251,53 @@
           <w:b/>
           <w:bCs/>
         </w:rPr>
-        <w:t>Don’t pitch UHNBC as an open SE seat</w:t>
-      </w:r>
-      <w:r>
-        <w:t xml:space="preserve"> — structural is most likely inside DIALOG BC’s own scope (no structural alliance participant named; “Engineering” is in their BC entity’s legal name). Frame as a capacity-support question. And don’t call Prince George seismic-intensive (PGA ≈ Edmonton’s).</w:t>
-      </w:r>
-    </w:p>
-    <w:p>
-      <w:pPr>
-        <w:pStyle w:val="Compact"/>
-        <w:numPr>
-          <w:ilvl w:val="0"/>
-          <w:numId w:val="7"/>
-        </w:numPr>
-      </w:pPr>
-      <w:r>
-        <w:t xml:space="preserve">Don’t say Vancouver has “only one structural engineer” (≥3) or is </w:t>
-      </w:r>
-      <w:r>
-        <w:t xml:space="preserve">“tall-building only” (Broadway Subway, housing) — the accurate gap is </w:t>
-      </w:r>
-      <w:r>
-        <w:rPr>
-          <w:b/>
-          <w:bCs/>
-        </w:rPr>
-        <w:t>no healthcare structural track record</w:t>
-      </w:r>
-      <w:r>
-        <w:t>.</w:t>
-      </w:r>
-    </w:p>
-    <w:p>
-      <w:pPr>
-        <w:pStyle w:val="Compact"/>
-        <w:numPr>
-          <w:ilvl w:val="0"/>
-          <w:numId w:val="7"/>
-        </w:numPr>
-      </w:pPr>
-      <w:r>
-        <w:rPr>
-          <w:b/>
-          <w:bCs/>
-        </w:rPr>
-        <w:t>Don’t say Oosterhof “chairs” the seismic committee</w:t>
-      </w:r>
-      <w:r>
-        <w:t xml:space="preserve"> — voting member of SC-ED (chair: Perry Adebar, UBC). Don’t call him DIALOG’s “only seismic specialist.”</w:t>
-      </w:r>
-    </w:p>
-    <w:p>
-      <w:pPr>
-        <w:pStyle w:val="Compact"/>
-        <w:numPr>
-          <w:ilvl w:val="0"/>
-          <w:numId w:val="7"/>
-        </w:numPr>
-      </w:pPr>
-      <w:r>
-        <w:t>Don’t imply IE 1.5 is new (since ~1990), don’t cite a “1% drift limit” for the new check (</w:t>
-      </w:r>
-      <w:r>
-        <w:rPr>
-          <w:b/>
-          <w:bCs/>
-        </w:rPr>
-        <w:t>0.5%</w:t>
-      </w:r>
-      <w:r>
-        <w:t xml:space="preserve">, Art. 4.1.8.23), don’t call the rule Alberta-unique (national since NBC 2020; new </w:t>
-      </w:r>
-      <w:r>
-        <w:rPr>
-          <w:i/>
-          <w:iCs/>
-        </w:rPr>
-        <w:t>to Alberta</w:t>
+        <w:t>Glotman Simpson / BuroHappold</w:t>
+      </w:r>
+      <w:r>
+        <w:t xml:space="preserve"> — Vancouver developer/starchitect towers. </w:t>
+      </w:r>
+      <w:r>
+        <w:rPr>
+          <w:b/>
+          <w:bCs/>
+        </w:rPr>
+        <w:t>Fast+Epp</w:t>
+      </w:r>
+      <w:r>
+        <w:t xml:space="preserve"> — mass timber (entrenched; don’t contest). </w:t>
+      </w:r>
+      <w:r>
+        <w:rPr>
+          <w:b/>
+          <w:bCs/>
+        </w:rPr>
+        <w:t>Stantec / Jacobs</w:t>
+      </w:r>
+      <w:r>
+        <w:t xml:space="preserve"> — the AB mega-hospital co-SE incumbents. </w:t>
+      </w:r>
+      <w:r>
+        <w:rPr>
+          <w:b/>
+          <w:bCs/>
+        </w:rPr>
+        <w:t>Bush Bohlman</w:t>
       </w:r>
       <w:r>
         <w:t xml:space="preserve"> </w:t>
       </w:r>
       <w:r>
-        <w:t>May 1 2024), don’t attribute Foothills McCaig structural to Stantec (unverified), don’t say UHNBC construction starts “fall 2026” (~2027).</w:t>
+        <w:t>— took the structural-participant seat on the Cowichan Hospital alliance (the BC-health-alliance precedent).</w:t>
       </w:r>
     </w:p>
     <w:p>
       <w:pPr>
         <w:pStyle w:val="Heading2"/>
       </w:pPr>
-      <w:bookmarkStart w:id="8" w:name="questions-for-georg-josi-july-10"/>
+      <w:bookmarkStart w:id="8" w:name="do-not-say-red-team-landmines"/>
       <w:bookmarkEnd w:id="7"/>
       <w:r>
-        <w:t>Questions for Georg Josi (July 10)</w:t>
+        <w:t>Do NOT say (red-team landmines)</w:t>
       </w:r>
     </w:p>
     <w:p>
@@ -1250,17 +1309,24 @@
         </w:numPr>
       </w:pPr>
       <w:r>
-        <w:t xml:space="preserve">“On </w:t>
-      </w:r>
-      <w:r>
-        <w:rPr>
-          <w:b/>
-          <w:bCs/>
-        </w:rPr>
-        <w:t>UHNBC</w:t>
-      </w:r>
-      <w:r>
-        <w:t xml:space="preserve"> — is your BC team self-performing structural, or is there room for a BC healthcare-structural partner to help carry a $1.6B tower?”</w:t>
+        <w:rPr>
+          <w:b/>
+          <w:bCs/>
+        </w:rPr>
+        <w:t>Don’t cite Shangri-La as “DIALOG self-performing structural as prime architect”</w:t>
+      </w:r>
+      <w:r>
+        <w:t xml:space="preserve"> — DIALOG was never the architect (James KM Cheng was); the structural is a </w:t>
+      </w:r>
+      <w:r>
+        <w:rPr>
+          <w:b/>
+          <w:bCs/>
+        </w:rPr>
+        <w:t>Jones Kwong Kishi legacy credit</w:t>
+      </w:r>
+      <w:r>
+        <w:t xml:space="preserve"> (merged Oct 2013, after completion). Their people know their own history. Only prime+in-house case: Enbridge Centre, 26st.</w:t>
       </w:r>
     </w:p>
     <w:p>
@@ -1272,7 +1338,10 @@
         </w:numPr>
       </w:pPr>
       <w:r>
-        <w:t>“When a hospital hits Kaye/Calgary-Cancer scale under design-build, how do you structure the co-SE — and who do you reach for?”</w:t>
+        <w:t xml:space="preserve">Don’t say “DIALOG outsources hospital structural” </w:t>
+      </w:r>
+      <w:r>
+        <w:t>broadly — they self-perform at ~$680M (GP Regional) and ~$1B (UHN Toronto Western, CM delivery). The co-SE cases are AB PCL design-builds.</w:t>
       </w:r>
     </w:p>
     <w:p>
@@ -1284,8 +1353,14 @@
         </w:numPr>
       </w:pPr>
       <w:r>
-        <w:lastRenderedPageBreak/>
-        <w:t>“Your Vancouver studio’s structural strength is towers and transit — how are you covering healthcare structural in BC?”</w:t>
+        <w:rPr>
+          <w:b/>
+          <w:bCs/>
+        </w:rPr>
+        <w:t>Don’t pitch UHNBC as an open SE seat</w:t>
+      </w:r>
+      <w:r>
+        <w:t xml:space="preserve"> — structural is most likely inside DIALOG BC’s own scope (no structural alliance participant named; “Engineering” is in their BC entity’s legal name). Frame as a capacity-support question. And don’t call Prince George seismic-intensive (PGA ≈ Edmonton’s).</w:t>
       </w:r>
     </w:p>
     <w:p>
@@ -1297,17 +1372,84 @@
         </w:numPr>
       </w:pPr>
       <w:r>
-        <w:t>“With the RPK merger and two partners stepping back, where’s Edmonton’s structural bandwidth tightest over the next 24 months?”</w:t>
+        <w:t xml:space="preserve">Don’t say Vancouver has “only one structural engineer” (≥3) or is </w:t>
+      </w:r>
+      <w:r>
+        <w:t xml:space="preserve">“tall-building only” (Broadway Subway, housing) — the accurate gap is </w:t>
+      </w:r>
+      <w:r>
+        <w:rPr>
+          <w:b/>
+          <w:bCs/>
+        </w:rPr>
+        <w:t>no healthcare structural track record</w:t>
+      </w:r>
+      <w:r>
+        <w:t>.</w:t>
+      </w:r>
+    </w:p>
+    <w:p>
+      <w:pPr>
+        <w:pStyle w:val="Compact"/>
+        <w:numPr>
+          <w:ilvl w:val="0"/>
+          <w:numId w:val="8"/>
+        </w:numPr>
+      </w:pPr>
+      <w:r>
+        <w:rPr>
+          <w:b/>
+          <w:bCs/>
+        </w:rPr>
+        <w:t>Don’t say Oosterhof “chairs” the seismic committee</w:t>
+      </w:r>
+      <w:r>
+        <w:t xml:space="preserve"> — voting member of SC-ED (chair: Perry Adebar, UBC). Don’t call him DIALOG’s “only seismic specialist.”</w:t>
+      </w:r>
+    </w:p>
+    <w:p>
+      <w:pPr>
+        <w:pStyle w:val="Compact"/>
+        <w:numPr>
+          <w:ilvl w:val="0"/>
+          <w:numId w:val="8"/>
+        </w:numPr>
+      </w:pPr>
+      <w:r>
+        <w:t>Don’t imply IE 1.5 is new (since ~1990), don’t cite a “1% drift limit” for the new check (</w:t>
+      </w:r>
+      <w:r>
+        <w:rPr>
+          <w:b/>
+          <w:bCs/>
+        </w:rPr>
+        <w:t>0.5%</w:t>
+      </w:r>
+      <w:r>
+        <w:t xml:space="preserve">, Art. 4.1.8.23), don’t call the rule Alberta-unique (national since NBC 2020; new </w:t>
+      </w:r>
+      <w:r>
+        <w:rPr>
+          <w:i/>
+          <w:iCs/>
+        </w:rPr>
+        <w:t>to Alberta</w:t>
+      </w:r>
+      <w:r>
+        <w:t xml:space="preserve"> </w:t>
+      </w:r>
+      <w:r>
+        <w:t>May 1 2024), don’t attribute Foothills McCaig structural to Stantec (unverified), don’t say UHNBC construction starts “fall 2026” (~2027).</w:t>
       </w:r>
     </w:p>
     <w:p>
       <w:pPr>
         <w:pStyle w:val="Heading2"/>
       </w:pPr>
-      <w:bookmarkStart w:id="9" w:name="X3307e16a0659ff59c2f591c95fcda550004a6d3"/>
+      <w:bookmarkStart w:id="9" w:name="questions-for-georg-josi-july-10"/>
       <w:bookmarkEnd w:id="8"/>
       <w:r>
-        <w:t>Prerequisites — close before July 10 (only KOR can)</w:t>
+        <w:t>Questions for Georg Josi (July 10)</w:t>
       </w:r>
     </w:p>
     <w:p>
@@ -1319,14 +1461,17 @@
         </w:numPr>
       </w:pPr>
       <w:r>
-        <w:rPr>
-          <w:b/>
-          <w:bCs/>
-        </w:rPr>
-        <w:t>APEGA Permit to Practice</w:t>
-      </w:r>
-      <w:r>
-        <w:t xml:space="preserve"> for any Alberta work (hard legal requirement; not needed for BC scope).</w:t>
+        <w:t xml:space="preserve">“On </w:t>
+      </w:r>
+      <w:r>
+        <w:rPr>
+          <w:b/>
+          <w:bCs/>
+        </w:rPr>
+        <w:t>UHNBC</w:t>
+      </w:r>
+      <w:r>
+        <w:t xml:space="preserve"> — is your BC team self-performing structural, or is there room for a BC healthcare-structural partner to help carry a $1.6B tower?”</w:t>
       </w:r>
     </w:p>
     <w:p>
@@ -1338,14 +1483,7 @@
         </w:numPr>
       </w:pPr>
       <w:r>
-        <w:rPr>
-          <w:b/>
-          <w:bCs/>
-        </w:rPr>
-        <w:t>Nameable BC hospital / post-disaster references</w:t>
-      </w:r>
-      <w:r>
-        <w:t xml:space="preserve"> — the wedge only lands with real projects cited.</w:t>
+        <w:t>“When a hospital hits Kaye/Calgary-Cancer scale under design-build, how do you structure the co-SE — and who do you reach for?”</w:t>
       </w:r>
     </w:p>
     <w:p>
@@ -1357,6 +1495,78 @@
         </w:numPr>
       </w:pPr>
       <w:r>
+        <w:t>“Your Vancouver studio’s structural strength is towers and transit — how are you covering healthcare structural in BC?”</w:t>
+      </w:r>
+    </w:p>
+    <w:p>
+      <w:pPr>
+        <w:pStyle w:val="Compact"/>
+        <w:numPr>
+          <w:ilvl w:val="0"/>
+          <w:numId w:val="9"/>
+        </w:numPr>
+      </w:pPr>
+      <w:r>
+        <w:t>“With the RPK merger and two partners stepping back, where’s Edmonton’s structural bandwidth tightest over the next 24 months?”</w:t>
+      </w:r>
+    </w:p>
+    <w:p>
+      <w:pPr>
+        <w:pStyle w:val="Heading2"/>
+      </w:pPr>
+      <w:bookmarkStart w:id="10" w:name="X3307e16a0659ff59c2f591c95fcda550004a6d3"/>
+      <w:bookmarkEnd w:id="9"/>
+      <w:r>
+        <w:t>Prerequisites — close before July 10 (only KOR can)</w:t>
+      </w:r>
+    </w:p>
+    <w:p>
+      <w:pPr>
+        <w:pStyle w:val="Compact"/>
+        <w:numPr>
+          <w:ilvl w:val="0"/>
+          <w:numId w:val="10"/>
+        </w:numPr>
+      </w:pPr>
+      <w:r>
+        <w:rPr>
+          <w:b/>
+          <w:bCs/>
+        </w:rPr>
+        <w:t>APEGA Permit to Practice</w:t>
+      </w:r>
+      <w:r>
+        <w:t xml:space="preserve"> for any Alberta work (hard legal requirement; not needed for BC scope).</w:t>
+      </w:r>
+    </w:p>
+    <w:p>
+      <w:pPr>
+        <w:pStyle w:val="Compact"/>
+        <w:numPr>
+          <w:ilvl w:val="0"/>
+          <w:numId w:val="10"/>
+        </w:numPr>
+      </w:pPr>
+      <w:r>
+        <w:rPr>
+          <w:b/>
+          <w:bCs/>
+        </w:rPr>
+        <w:t>Nameable BC hospital / post-disaster references</w:t>
+      </w:r>
+      <w:r>
+        <w:t xml:space="preserve"> — the wedge only lands with real projects cited.</w:t>
+      </w:r>
+    </w:p>
+    <w:p>
+      <w:pPr>
+        <w:pStyle w:val="Compact"/>
+        <w:numPr>
+          <w:ilvl w:val="0"/>
+          <w:numId w:val="10"/>
+        </w:numPr>
+      </w:pPr>
+      <w:r>
         <w:rPr>
           <w:b/>
           <w:bCs/>
@@ -1369,7 +1579,7 @@
     </w:p>
     <w:p>
       <w:r>
-        <w:pict w14:anchorId="0AFFD336">
+        <w:pict w14:anchorId="4B36AF61">
           <v:rect id="_x0000_i1025" style="width:0;height:1.5pt" o:hralign="center" o:hrstd="t" o:hr="t"/>
         </w:pict>
       </w:r>
@@ -1378,8 +1588,8 @@
       <w:pPr>
         <w:pStyle w:val="Heading2"/>
       </w:pPr>
-      <w:bookmarkStart w:id="10" w:name="X0c1e04b6a3fd8c41ba770d9c2acfa795c203bb0"/>
-      <w:bookmarkEnd w:id="9"/>
+      <w:bookmarkStart w:id="11" w:name="X0c1e04b6a3fd8c41ba770d9c2acfa795c203bb0"/>
+      <w:bookmarkEnd w:id="10"/>
       <w:r>
         <w:t>Appendix A — Healthcare/institutional structural (verified catalogue)</w:t>
       </w:r>
@@ -1416,11 +1626,13 @@
             <w:pPr>
               <w:pStyle w:val="Compact"/>
               <w:rPr>
-                <w:sz w:val="17"/>
-              </w:rPr>
-            </w:pPr>
-            <w:r>
-              <w:rPr>
+                <w:b w:val="0"/>
+                <w:sz w:val="17"/>
+              </w:rPr>
+            </w:pPr>
+            <w:r>
+              <w:rPr>
+                <w:b w:val="0"/>
                 <w:sz w:val="17"/>
               </w:rPr>
               <w:t>Project</w:t>
@@ -1435,11 +1647,13 @@
             <w:pPr>
               <w:pStyle w:val="Compact"/>
               <w:rPr>
-                <w:sz w:val="17"/>
-              </w:rPr>
-            </w:pPr>
-            <w:r>
-              <w:rPr>
+                <w:b w:val="0"/>
+                <w:sz w:val="17"/>
+              </w:rPr>
+            </w:pPr>
+            <w:r>
+              <w:rPr>
+                <w:b w:val="0"/>
                 <w:sz w:val="17"/>
               </w:rPr>
               <w:t>~Value</w:t>
@@ -1454,11 +1668,13 @@
             <w:pPr>
               <w:pStyle w:val="Compact"/>
               <w:rPr>
-                <w:sz w:val="17"/>
-              </w:rPr>
-            </w:pPr>
-            <w:r>
-              <w:rPr>
+                <w:b w:val="0"/>
+                <w:sz w:val="17"/>
+              </w:rPr>
+            </w:pPr>
+            <w:r>
+              <w:rPr>
+                <w:b w:val="0"/>
                 <w:sz w:val="17"/>
               </w:rPr>
               <w:t>Structural</w:t>
@@ -1473,11 +1689,13 @@
             <w:pPr>
               <w:pStyle w:val="Compact"/>
               <w:rPr>
-                <w:sz w:val="17"/>
-              </w:rPr>
-            </w:pPr>
-            <w:r>
-              <w:rPr>
+                <w:b w:val="0"/>
+                <w:sz w:val="17"/>
+              </w:rPr>
+            </w:pPr>
+            <w:r>
+              <w:rPr>
+                <w:b w:val="0"/>
                 <w:sz w:val="17"/>
               </w:rPr>
               <w:t>Verdict</w:t>
@@ -2083,8 +2301,8 @@
       <w:pPr>
         <w:pStyle w:val="Heading2"/>
       </w:pPr>
-      <w:bookmarkStart w:id="11" w:name="X79fa02d13dd6e27971481df4f6565224426045f"/>
-      <w:bookmarkEnd w:id="10"/>
+      <w:bookmarkStart w:id="12" w:name="X79fa02d13dd6e27971481df4f6565224426045f"/>
+      <w:bookmarkEnd w:id="11"/>
       <w:r>
         <w:t>Appendix B — Non-healthcare external SE (verified sample)</w:t>
       </w:r>
@@ -2707,7 +2925,6 @@
               <w:rPr>
                 <w:sz w:val="17"/>
               </w:rPr>
-              <w:lastRenderedPageBreak/>
               <w:t>Catalyst – 77 Wade</w:t>
             </w:r>
           </w:p>
@@ -3111,7 +3328,7 @@
     </w:tbl>
     <w:p>
       <w:r>
-        <w:pict w14:anchorId="135674DE">
+        <w:pict w14:anchorId="0BF2E9A5">
           <v:rect id="_x0000_i1026" style="width:0;height:1.5pt" o:hralign="center" o:hrstd="t" o:hr="t"/>
         </w:pict>
       </w:r>
@@ -3135,7 +3352,7 @@
         <w:t xml:space="preserve"> newswire.ca (JKK merger), majorprojects.alberta.ca, infrastructurebc.com, northernhealth.ca, alberta.ca (Part 4 redline), nrcan.gc.ca (seismic hazard), apega.ca, canadianconsultingengineer.com, rjc.ca, fastepp.com, entuitive.com, thorntontomasetti.com. [H] items are to test in the room, not assert.</w:t>
       </w:r>
       <w:bookmarkEnd w:id="0"/>
-      <w:bookmarkEnd w:id="11"/>
+      <w:bookmarkEnd w:id="12"/>
     </w:p>
     <w:sectPr>
       <w:footnotePr>
@@ -3155,7 +3372,7 @@
   <w:abstractNum w:abstractNumId="0" w15:restartNumberingAfterBreak="0">
     <w:nsid w:val="0000A990"/>
     <w:multiLevelType w:val="multilevel"/>
-    <w:tmpl w:val="7242C1D4"/>
+    <w:tmpl w:val="EABA9BEA"/>
     <w:lvl w:ilvl="0">
       <w:numFmt w:val="bullet"/>
       <w:lvlText w:val=" "/>
@@ -3232,7 +3449,7 @@
   <w:abstractNum w:abstractNumId="1" w15:restartNumberingAfterBreak="0">
     <w:nsid w:val="0000A991"/>
     <w:multiLevelType w:val="multilevel"/>
-    <w:tmpl w:val="4D6A44EE"/>
+    <w:tmpl w:val="E3CCBE9E"/>
     <w:lvl w:ilvl="0">
       <w:numFmt w:val="bullet"/>
       <w:lvlText w:val=""/>
@@ -3336,7 +3553,7 @@
   <w:abstractNum w:abstractNumId="2" w15:restartNumberingAfterBreak="0">
     <w:nsid w:val="00A99411"/>
     <w:multiLevelType w:val="multilevel"/>
-    <w:tmpl w:val="BB343BD0"/>
+    <w:tmpl w:val="AC6418BA"/>
     <w:lvl w:ilvl="0">
       <w:start w:val="1"/>
       <w:numFmt w:val="decimal"/>
@@ -3419,10 +3636,10 @@
       </w:pPr>
     </w:lvl>
   </w:abstractNum>
-  <w:num w:numId="1" w16cid:durableId="508913902">
+  <w:num w:numId="1" w16cid:durableId="2086952346">
     <w:abstractNumId w:val="0"/>
   </w:num>
-  <w:num w:numId="2" w16cid:durableId="2052265911">
+  <w:num w:numId="2" w16cid:durableId="959140757">
     <w:abstractNumId w:val="2"/>
     <w:lvlOverride w:ilvl="0">
       <w:startOverride w:val="1"/>
@@ -3452,19 +3669,7 @@
       <w:startOverride w:val="1"/>
     </w:lvlOverride>
   </w:num>
-  <w:num w:numId="3" w16cid:durableId="1704595675">
-    <w:abstractNumId w:val="1"/>
-  </w:num>
-  <w:num w:numId="4" w16cid:durableId="531381284">
-    <w:abstractNumId w:val="1"/>
-  </w:num>
-  <w:num w:numId="5" w16cid:durableId="2023238042">
-    <w:abstractNumId w:val="1"/>
-  </w:num>
-  <w:num w:numId="6" w16cid:durableId="2005472588">
-    <w:abstractNumId w:val="1"/>
-  </w:num>
-  <w:num w:numId="7" w16cid:durableId="259721365">
+  <w:num w:numId="3" w16cid:durableId="333608142">
     <w:abstractNumId w:val="2"/>
     <w:lvlOverride w:ilvl="0">
       <w:startOverride w:val="1"/>
@@ -3494,7 +3699,19 @@
       <w:startOverride w:val="1"/>
     </w:lvlOverride>
   </w:num>
-  <w:num w:numId="8" w16cid:durableId="135419024">
+  <w:num w:numId="4" w16cid:durableId="767577564">
+    <w:abstractNumId w:val="1"/>
+  </w:num>
+  <w:num w:numId="5" w16cid:durableId="816797576">
+    <w:abstractNumId w:val="1"/>
+  </w:num>
+  <w:num w:numId="6" w16cid:durableId="771045779">
+    <w:abstractNumId w:val="1"/>
+  </w:num>
+  <w:num w:numId="7" w16cid:durableId="1276445855">
+    <w:abstractNumId w:val="1"/>
+  </w:num>
+  <w:num w:numId="8" w16cid:durableId="2031760167">
     <w:abstractNumId w:val="2"/>
     <w:lvlOverride w:ilvl="0">
       <w:startOverride w:val="1"/>
@@ -3524,7 +3741,37 @@
       <w:startOverride w:val="1"/>
     </w:lvlOverride>
   </w:num>
-  <w:num w:numId="9" w16cid:durableId="1194809495">
+  <w:num w:numId="9" w16cid:durableId="1570454156">
+    <w:abstractNumId w:val="2"/>
+    <w:lvlOverride w:ilvl="0">
+      <w:startOverride w:val="1"/>
+    </w:lvlOverride>
+    <w:lvlOverride w:ilvl="1">
+      <w:startOverride w:val="1"/>
+    </w:lvlOverride>
+    <w:lvlOverride w:ilvl="2">
+      <w:startOverride w:val="1"/>
+    </w:lvlOverride>
+    <w:lvlOverride w:ilvl="3">
+      <w:startOverride w:val="1"/>
+    </w:lvlOverride>
+    <w:lvlOverride w:ilvl="4">
+      <w:startOverride w:val="1"/>
+    </w:lvlOverride>
+    <w:lvlOverride w:ilvl="5">
+      <w:startOverride w:val="1"/>
+    </w:lvlOverride>
+    <w:lvlOverride w:ilvl="6">
+      <w:startOverride w:val="1"/>
+    </w:lvlOverride>
+    <w:lvlOverride w:ilvl="7">
+      <w:startOverride w:val="1"/>
+    </w:lvlOverride>
+    <w:lvlOverride w:ilvl="8">
+      <w:startOverride w:val="1"/>
+    </w:lvlOverride>
+  </w:num>
+  <w:num w:numId="10" w16cid:durableId="1710445973">
     <w:abstractNumId w:val="2"/>
     <w:lvlOverride w:ilvl="0">
       <w:startOverride w:val="1"/>
@@ -4788,7 +5035,7 @@
     <w:name w:val="Grid Table 4"/>
     <w:basedOn w:val="TableNormal"/>
     <w:uiPriority w:val="49"/>
-    <w:rsid w:val="00667710"/>
+    <w:rsid w:val="00C754D9"/>
     <w:pPr>
       <w:spacing w:after="0"/>
     </w:pPr>

</xml_diff>

<commit_message>
docs(bd): finish plain-language pass - spell out SC-ED, regenerate DOCX
Prior commit shipped stale DOCX (converter path bug - .NET IO needs absolute
paths when PS location and process CWD diverge). Regenerated both from the
plain-language sources; spelled out the last acronym (SC-ED -> Standing
Committee on Earthquake Design). Sweep now clean across all three docs.

Co-Authored-By: Claude Fable 5 <noreply@anthropic.com>
</commit_message>
<xml_diff>
--- a/docs/KOR-DIALOG-Edmonton-Structural-Outsourcing-2026-06-30.docx
+++ b/docs/KOR-DIALOG-Edmonton-Structural-Outsourcing-2026-06-30.docx
@@ -20,7 +20,7 @@
           <w:b/>
           <w:bCs/>
         </w:rPr>
-        <w:t>KOR Structural · July 10 2026 meeting · Verified 2026-07-01 (5 research + 6 fact-check passes + independent red-team with 3 further adversarial verifications; ~60 projects catalogued firm-wide)</w:t>
+        <w:t>KOR Structural · July 10 2026 meeting · Verified 2026-07-01 — every load-bearing claim independently fact-checked against primary sources; ~60 projects catalogued firm-wide</w:t>
       </w:r>
     </w:p>
     <w:p>
@@ -291,7 +291,6 @@
       <w:bookmarkStart w:id="2" w:name="X99c392a30288503d801e06b8ef90ce135e318aa"/>
       <w:bookmarkEnd w:id="1"/>
       <w:r>
-        <w:lastRenderedPageBreak/>
         <w:t>Firm-wide pattern — what DIALOG outsources structural engineering for</w:t>
       </w:r>
     </w:p>
@@ -349,10 +348,7 @@
         <w:t>or</w:t>
       </w:r>
       <w:r>
-        <w:t xml:space="preserve"> </w:t>
-      </w:r>
-      <w:r>
-        <w:t>the consulting-SE role — almost never both. As architect/AOR (usually under a design lead): Vancouver House (BIG → Glotman Simpson + BuroHappold), Brookfield Place 60st (AFK → Entuitive), The Parks (Hariri Pontarini → RJC), The Hendrix (→ RJC). As SE-only: the ex-</w:t>
+        <w:t xml:space="preserve"> the consulting-SE role — almost never both. As architect/AOR (usually under a design lead): Vancouver House (BIG → Glotman Simpson + BuroHappold), Brookfield Place 60st (AFK → Entuitive), The Parks (Hariri Pontarini → RJC), The Hendrix (→ RJC). As SE-only: the ex-</w:t>
       </w:r>
       <w:r>
         <w:rPr>
@@ -379,7 +375,15 @@
           <w:b/>
           <w:bCs/>
         </w:rPr>
-        <w:t>for other architects (James KM Cheng)</w:t>
+        <w:t xml:space="preserve">for other </w:t>
+      </w:r>
+      <w:r>
+        <w:rPr>
+          <w:b/>
+          <w:bCs/>
+        </w:rPr>
+        <w:lastRenderedPageBreak/>
+        <w:t>architects (James KM Cheng)</w:t>
       </w:r>
       <w:r>
         <w:t xml:space="preserve">, not as DIALOG-prime. The only verified DIALOG-prime-with-in-house-structural building is </w:t>
@@ -430,7 +434,10 @@
         <w:t>Alberta mega-hospital design-builds led by PCL</w:t>
       </w:r>
       <w:r>
-        <w:t xml:space="preserve"> → co-SE, n=2: Kaye Edmonton Clinic ~$900M (→ Yolles/now Jacobs, </w:t>
+        <w:t xml:space="preserve"> </w:t>
+      </w:r>
+      <w:r>
+        <w:t xml:space="preserve">→ co-SE, n=2: Kaye Edmonton Clinic ~$900M (→ Yolles/now Jacobs, </w:t>
       </w:r>
       <w:r>
         <w:rPr>
@@ -450,10 +457,7 @@
         <w:t>This is NOT a general scale rule:</w:t>
       </w:r>
       <w:r>
-        <w:t xml:space="preserve"> </w:t>
-      </w:r>
-      <w:r>
-        <w:t>UHN Toronto Western (~$1B, CM delivery) is fully in-house — the co-SE pattern is tied to the AB design-build consortium structure, not project size. Extrapolating it to other provinces/GCs is [H].</w:t>
+        <w:t xml:space="preserve"> UHN Toronto Western (~$1B, CM delivery) is fully in-house — the co-SE pattern is tied to the AB design-build consortium structure, not project size. Extrapolating it to other provinces/GCs is [H].</w:t>
       </w:r>
     </w:p>
     <w:p>
@@ -472,7 +476,10 @@
         <w:t>Specialist structural innovation they lack in-house</w:t>
       </w:r>
       <w:r>
-        <w:t xml:space="preserve"> → pioneer seismic mass timber (Fast+Epp, The Hive), rammed earth (Equilibrium, Nk’Mip), life-sciences labs (Blackwell, Catalyst-77 Wade), forensic concrete (RJC, Glenbow), blast/security (Thornton Tomasetti, Peel Police).</w:t>
+        <w:t xml:space="preserve"> </w:t>
+      </w:r>
+      <w:r>
+        <w:t>→ pioneer seismic mass timber (Fast+Epp, The Hive), rammed earth (Equilibrium, Nk’Mip), life-sciences labs (Blackwell, Catalyst-77 Wade), forensic concrete (RJC, Glenbow), blast/security (Thornton Tomasetti, Peel Police).</w:t>
       </w:r>
     </w:p>
     <w:p>
@@ -491,10 +498,7 @@
         <w:t>A studio lacking the relevant specialty</w:t>
       </w:r>
       <w:r>
-        <w:t xml:space="preserve"> </w:t>
-      </w:r>
-      <w:r>
-        <w:t xml:space="preserve">→ Vancouver’s structural practice (ex-JKK towers, Broadway Subway, community/housing) has </w:t>
+        <w:t xml:space="preserve"> → Vancouver’s structural practice (ex-JKK towers, Broadway Subway, community/housing) has </w:t>
       </w:r>
       <w:r>
         <w:rPr>
@@ -526,20 +530,20 @@
         <w:t>Self-performs (do NOT pitch):</w:t>
       </w:r>
       <w:r>
+        <w:t xml:space="preserve"> transit/bridges (their strongest domain — Walterdale, Valley Line, Broadway Subway, airports), sports/rec, mid-rise full-suite buildings when prime (Enbridge 26st), standard CLT timber (Bill Fisch), own civic (Royal Alberta Museum, Winspear), and </w:t>
+      </w:r>
+      <w:r>
+        <w:rPr>
+          <w:b/>
+          <w:bCs/>
+        </w:rPr>
+        <w:t>home-market healthcare at any scale outside AB design-build</w:t>
+      </w:r>
+      <w:r>
         <w:t xml:space="preserve"> </w:t>
       </w:r>
       <w:r>
-        <w:t xml:space="preserve">transit/bridges (their strongest domain — Walterdale, Valley Line, Broadway Subway, airports), sports/rec, mid-rise full-suite buildings when prime (Enbridge 26st), standard CLT timber (Bill Fisch), own civic (Royal Alberta Museum, Winspear), and </w:t>
-      </w:r>
-      <w:r>
-        <w:rPr>
-          <w:b/>
-          <w:bCs/>
-        </w:rPr>
-        <w:t>home-market healthcare at any scale outside AB design-build</w:t>
-      </w:r>
-      <w:r>
-        <w:t xml:space="preserve"> (Grande Prairie ~$680M, Edson, UHN Toronto Western ~$1B, Markdale, Dartmouth).</w:t>
+        <w:t>(Grande Prairie ~$680M, Edson, UHN Toronto Western ~$1B, Markdale, Dartmouth).</w:t>
       </w:r>
     </w:p>
     <w:p>
@@ -571,7 +575,6 @@
       <w:bookmarkStart w:id="3" w:name="Xcc50162a1971f8d33d16dd8704cb081d2301ffb"/>
       <w:bookmarkEnd w:id="2"/>
       <w:r>
-        <w:lastRenderedPageBreak/>
         <w:t>Strategic read for July 10 — a relationship meeting, not a seat pitch</w:t>
       </w:r>
     </w:p>
@@ -676,10 +679,7 @@
         <w:t>UHNBC Acute Care Tower ($1.579B, Prince George)</w:t>
       </w:r>
       <w:r>
-        <w:t xml:space="preserve"> </w:t>
-      </w:r>
-      <w:r>
-        <w:t xml:space="preserve">[V facts, H opportunity]: DIALOG+EllisDon alliance (formed Dec 2025), design through late 2026, construction ~2027, opening ~2031. </w:t>
+        <w:t xml:space="preserve"> [V facts, H opportunity]: DIALOG+EllisDon alliance (formed Dec 2025), design through late 2026, construction ~2027, opening ~2031. </w:t>
       </w:r>
       <w:r>
         <w:rPr>
@@ -699,7 +699,10 @@
         <w:t>no structural participant</w:t>
       </w:r>
       <w:r>
-        <w:t xml:space="preserve">; their BC entity is legally “DIALOG BC Architecture </w:t>
+        <w:t xml:space="preserve">; their BC entity is legally </w:t>
+      </w:r>
+      <w:r>
+        <w:t xml:space="preserve">“DIALOG BC Architecture </w:t>
       </w:r>
       <w:r>
         <w:rPr>
@@ -709,10 +712,7 @@
         <w:t>Engineering</w:t>
       </w:r>
       <w:r>
-        <w:t xml:space="preserve"> Interior Design Planning Inc.” </w:t>
-      </w:r>
-      <w:r>
-        <w:t xml:space="preserve">(Contrast: on the Cowichan Hospital alliance, architect Parkin — no in-house SE — named Bush Bohlman as a structural participant.) </w:t>
+        <w:t xml:space="preserve"> Interior Design Planning Inc.” (Contrast: on the Cowichan Hospital alliance, architect Parkin — no in-house SE — named Bush Bohlman as a structural participant.) </w:t>
       </w:r>
       <w:r>
         <w:rPr>
@@ -742,7 +742,10 @@
         <w:t>Prince George is low-seismicity</w:t>
       </w:r>
       <w:r>
-        <w:t xml:space="preserve"> (PGA ≈0.07g — Edmonton-level, 6–9× below Vancouver) — do not pitch it as seismic-intensive; the post-disaster importance angle is what applies.</w:t>
+        <w:t xml:space="preserve"> </w:t>
+      </w:r>
+      <w:r>
+        <w:t>(PGA ≈0.07g — Edmonton-level, 6–9× below Vancouver) — do not pitch it as seismic-intensive; the post-disaster importance angle is what applies.</w:t>
       </w:r>
     </w:p>
     <w:p>
@@ -778,6 +781,7 @@
       <w:bookmarkStart w:id="4" w:name="dialog-structural-bench-who-owns-what-v"/>
       <w:bookmarkEnd w:id="3"/>
       <w:r>
+        <w:lastRenderedPageBreak/>
         <w:t>DIALOG structural bench — who owns what [V]</w:t>
       </w:r>
     </w:p>
@@ -817,10 +821,7 @@
         <w:t>voting member of the NBCC Standing Committee on Earthquake Design</w:t>
       </w:r>
       <w:r>
-        <w:t xml:space="preserve"> </w:t>
-      </w:r>
-      <w:r>
-        <w:t xml:space="preserve">(chaired by Perry Adebar, UBC); venue/commercial), Neil Robson (bridges/transit), Steven Prozniak (bridges), Ryan Renihan/Larissa Ulcar/Victoria Buffam (assoc). Jim Montgomery → Partner Emeritus 2025; Sandra Renihan → transit PM. </w:t>
+        <w:t xml:space="preserve"> (chaired by Perry Adebar, UBC); venue/commercial), Neil Robson (bridges/transit), Steven Prozniak (bridges), Ryan Renihan/Larissa Ulcar/Victoria Buffam (assoc). Jim Montgomery → Partner Emeritus 2025; Sandra Renihan → transit PM. </w:t>
       </w:r>
       <w:r>
         <w:rPr>
@@ -1089,7 +1090,7 @@
           <w:b/>
           <w:bCs/>
         </w:rPr>
-        <w:t>The seismic wedge (red-team-corrected wording, safe in front of SC-ED members):</w:t>
+        <w:t>The seismic wedge (exact wording — checked against the code, safe in front of the committee members in the room):</w:t>
       </w:r>
       <w:r>
         <w:t xml:space="preserve"> </w:t>
@@ -1251,6 +1252,7 @@
           <w:b/>
           <w:bCs/>
         </w:rPr>
+        <w:lastRenderedPageBreak/>
         <w:t>Glotman Simpson / BuroHappold</w:t>
       </w:r>
       <w:r>
@@ -1294,10 +1296,10 @@
       <w:pPr>
         <w:pStyle w:val="Heading2"/>
       </w:pPr>
-      <w:bookmarkStart w:id="8" w:name="do-not-say-red-team-landmines"/>
+      <w:bookmarkStart w:id="8" w:name="Xc7b6365fdfb97cb995b95de33e0ad527519eb35"/>
       <w:bookmarkEnd w:id="7"/>
       <w:r>
-        <w:t>Do NOT say (red-team landmines)</w:t>
+        <w:t>Do NOT say (fact-checked — these would get corrected in the room)</w:t>
       </w:r>
     </w:p>
     <w:p>
@@ -1338,10 +1340,10 @@
         </w:numPr>
       </w:pPr>
       <w:r>
-        <w:t xml:space="preserve">Don’t say “DIALOG outsources hospital structural” </w:t>
-      </w:r>
-      <w:r>
-        <w:t>broadly — they self-perform at ~$680M (GP Regional) and ~$1B (UHN Toronto Western, CM delivery). The co-SE cases are AB PCL design-builds.</w:t>
+        <w:t xml:space="preserve">Don’t say </w:t>
+      </w:r>
+      <w:r>
+        <w:t>“DIALOG outsources hospital structural” broadly — they self-perform at ~$680M (GP Regional) and ~$1B (UHN Toronto Western, CM delivery). The co-SE cases are AB PCL design-builds.</w:t>
       </w:r>
     </w:p>
     <w:p>
@@ -1372,10 +1374,10 @@
         </w:numPr>
       </w:pPr>
       <w:r>
-        <w:t xml:space="preserve">Don’t say Vancouver has “only one structural engineer” (≥3) or is </w:t>
-      </w:r>
-      <w:r>
-        <w:t xml:space="preserve">“tall-building only” (Broadway Subway, housing) — the accurate gap is </w:t>
+        <w:t xml:space="preserve">Don’t say Vancouver has </w:t>
+      </w:r>
+      <w:r>
+        <w:t xml:space="preserve">“only one structural engineer” (≥3) or is “tall-building only” (Broadway Subway, housing) — the accurate gap is </w:t>
       </w:r>
       <w:r>
         <w:rPr>
@@ -1404,7 +1406,7 @@
         <w:t>Don’t say Oosterhof “chairs” the seismic committee</w:t>
       </w:r>
       <w:r>
-        <w:t xml:space="preserve"> — voting member of SC-ED (chair: Perry Adebar, UBC). Don’t call him DIALOG’s “only seismic specialist.”</w:t>
+        <w:t xml:space="preserve"> — he’s a voting member of the Standing Committee on Earthquake Design (the chair is Perry Adebar, UBC). Don’t call him DIALOG’s “only seismic specialist.”</w:t>
       </w:r>
     </w:p>
     <w:p>
@@ -1436,10 +1438,7 @@
         <w:t>to Alberta</w:t>
       </w:r>
       <w:r>
-        <w:t xml:space="preserve"> </w:t>
-      </w:r>
-      <w:r>
-        <w:t>May 1 2024), don’t attribute Foothills McCaig structural to Stantec (unverified), don’t say UHNBC construction starts “fall 2026” (~2027).</w:t>
+        <w:t xml:space="preserve"> May 1 2024), don’t attribute Foothills McCaig structural to Stantec (unverified), don’t say UHNBC construction starts “fall 2026” (~2027).</w:t>
       </w:r>
     </w:p>
     <w:p>
@@ -1536,7 +1535,10 @@
         <w:t>APEGA Permit to Practice</w:t>
       </w:r>
       <w:r>
-        <w:t xml:space="preserve"> for any Alberta work (hard legal requirement; not needed for BC scope).</w:t>
+        <w:t xml:space="preserve"> </w:t>
+      </w:r>
+      <w:r>
+        <w:t>for any Alberta work (hard legal requirement; not needed for BC scope).</w:t>
       </w:r>
     </w:p>
     <w:p>
@@ -1579,7 +1581,7 @@
     </w:p>
     <w:p>
       <w:r>
-        <w:pict w14:anchorId="4B36AF61">
+        <w:pict w14:anchorId="62C51161">
           <v:rect id="_x0000_i1025" style="width:0;height:1.5pt" o:hralign="center" o:hrstd="t" o:hr="t"/>
         </w:pict>
       </w:r>
@@ -1626,13 +1628,11 @@
             <w:pPr>
               <w:pStyle w:val="Compact"/>
               <w:rPr>
-                <w:b w:val="0"/>
-                <w:sz w:val="17"/>
-              </w:rPr>
-            </w:pPr>
-            <w:r>
-              <w:rPr>
-                <w:b w:val="0"/>
+                <w:sz w:val="17"/>
+              </w:rPr>
+            </w:pPr>
+            <w:r>
+              <w:rPr>
                 <w:sz w:val="17"/>
               </w:rPr>
               <w:t>Project</w:t>
@@ -1647,13 +1647,11 @@
             <w:pPr>
               <w:pStyle w:val="Compact"/>
               <w:rPr>
-                <w:b w:val="0"/>
-                <w:sz w:val="17"/>
-              </w:rPr>
-            </w:pPr>
-            <w:r>
-              <w:rPr>
-                <w:b w:val="0"/>
+                <w:sz w:val="17"/>
+              </w:rPr>
+            </w:pPr>
+            <w:r>
+              <w:rPr>
                 <w:sz w:val="17"/>
               </w:rPr>
               <w:t>~Value</w:t>
@@ -1668,13 +1666,11 @@
             <w:pPr>
               <w:pStyle w:val="Compact"/>
               <w:rPr>
-                <w:b w:val="0"/>
-                <w:sz w:val="17"/>
-              </w:rPr>
-            </w:pPr>
-            <w:r>
-              <w:rPr>
-                <w:b w:val="0"/>
+                <w:sz w:val="17"/>
+              </w:rPr>
+            </w:pPr>
+            <w:r>
+              <w:rPr>
                 <w:sz w:val="17"/>
               </w:rPr>
               <w:t>Structural</w:t>
@@ -1689,13 +1685,11 @@
             <w:pPr>
               <w:pStyle w:val="Compact"/>
               <w:rPr>
-                <w:b w:val="0"/>
-                <w:sz w:val="17"/>
-              </w:rPr>
-            </w:pPr>
-            <w:r>
-              <w:rPr>
-                <w:b w:val="0"/>
+                <w:sz w:val="17"/>
+              </w:rPr>
+            </w:pPr>
+            <w:r>
+              <w:rPr>
                 <w:sz w:val="17"/>
               </w:rPr>
               <w:t>Verdict</w:t>
@@ -1842,25 +1836,33 @@
               <w:rPr>
                 <w:sz w:val="17"/>
               </w:rPr>
-              <w:t>DIALOG + Stantec co-SE (PCL DB)</w:t>
-            </w:r>
-          </w:p>
-        </w:tc>
-        <w:tc>
-          <w:tcPr>
-            <w:tcW w:w="1250" w:type="pct"/>
-          </w:tcPr>
-          <w:p>
-            <w:pPr>
-              <w:pStyle w:val="Compact"/>
-              <w:rPr>
-                <w:sz w:val="17"/>
-              </w:rPr>
-            </w:pPr>
-            <w:r>
-              <w:rPr>
-                <w:sz w:val="17"/>
-              </w:rPr>
+              <w:t xml:space="preserve">DIALOG + Stantec co-SE </w:t>
+            </w:r>
+            <w:r>
+              <w:rPr>
+                <w:sz w:val="17"/>
+              </w:rPr>
+              <w:lastRenderedPageBreak/>
+              <w:t>(PCL DB)</w:t>
+            </w:r>
+          </w:p>
+        </w:tc>
+        <w:tc>
+          <w:tcPr>
+            <w:tcW w:w="1250" w:type="pct"/>
+          </w:tcPr>
+          <w:p>
+            <w:pPr>
+              <w:pStyle w:val="Compact"/>
+              <w:rPr>
+                <w:sz w:val="17"/>
+              </w:rPr>
+            </w:pPr>
+            <w:r>
+              <w:rPr>
+                <w:sz w:val="17"/>
+              </w:rPr>
+              <w:lastRenderedPageBreak/>
               <w:t>Co-SE — AB PCL DB [V]</w:t>
             </w:r>
           </w:p>
@@ -3328,7 +3330,7 @@
     </w:tbl>
     <w:p>
       <w:r>
-        <w:pict w14:anchorId="0BF2E9A5">
+        <w:pict w14:anchorId="3D38B1B8">
           <v:rect id="_x0000_i1026" style="width:0;height:1.5pt" o:hralign="center" o:hrstd="t" o:hr="t"/>
         </w:pict>
       </w:r>
@@ -3342,14 +3344,28 @@
           <w:i/>
           <w:iCs/>
         </w:rPr>
-        <w:t>Verification: 5 research passes + 6 adversarial fact-checks + an independent red-team (3 further primary-source verifications), 2026-06-30/07-01. Red-team corrections: Shangri-La role attribution (JKK legacy, not DIALOG-prime), UHNBC seat status (most likely in-house), $800M trigger narrowed to AB PCL design-builds (UHN Toronto Western counterexample), Prince George seismicity (low), Art. 4.1.8.23 precision (0.5% drift, new-to-Alberta), Oosterhof committee role (member, not chair). Sources: dialogdesign.ca,</w:t>
+        <w:t xml:space="preserve">Verification: five research passes and nine rounds of independent fact-checking against primary sources, 2026-06-30/07-01. Corrections made along the way (so you don’t repeat them): Shangri-La role attribution (JKK legacy credit, DIALOG was not the architect), UHNBC seat status (most likely in-house), the </w:t>
       </w:r>
       <w:r>
         <w:rPr>
           <w:i/>
           <w:iCs/>
         </w:rPr>
-        <w:t xml:space="preserve"> newswire.ca (JKK merger), majorprojects.alberta.ca, infrastructurebc.com, northernhealth.ca, alberta.ca (Part 4 redline), nrcan.gc.ca (seismic hazard), apega.ca, canadianconsultingengineer.com, rjc.ca, fastepp.com, entuitive.com, thorntontomasetti.com. [H] items are to test in the room, not assert.</w:t>
+        <w:t xml:space="preserve">“$800M → co-SE” </w:t>
+      </w:r>
+      <w:r>
+        <w:rPr>
+          <w:i/>
+          <w:iCs/>
+        </w:rPr>
+        <w:t>rule narrowed to AB PCL design-builds (UHN Toronto Western is the counterexample), Prince George seismicity (low), Art. 4.1.8.23 precision (0.5% drift, new-to-Alberta), Oosterhof committee role (member, not chair). Sources: dialogdesign.ca, newswire.ca (JKK merger), majorprojects.alberta.ca, infrastructurebc.com, northernhealth.ca, alberta.ca (Part 4 redline), nrcan.gc.ca (seismic hazard), apega.ca, canadianconsultingengineer.com, rjc.ca, fastepp.com, entuitive.com, thorntontomasetti.com. [H] items are to t</w:t>
+      </w:r>
+      <w:r>
+        <w:rPr>
+          <w:i/>
+          <w:iCs/>
+        </w:rPr>
+        <w:t>est in the room, not assert.</w:t>
       </w:r>
       <w:bookmarkEnd w:id="0"/>
       <w:bookmarkEnd w:id="12"/>
@@ -3372,7 +3388,7 @@
   <w:abstractNum w:abstractNumId="0" w15:restartNumberingAfterBreak="0">
     <w:nsid w:val="0000A990"/>
     <w:multiLevelType w:val="multilevel"/>
-    <w:tmpl w:val="EABA9BEA"/>
+    <w:tmpl w:val="B65EE7C4"/>
     <w:lvl w:ilvl="0">
       <w:numFmt w:val="bullet"/>
       <w:lvlText w:val=" "/>
@@ -3449,7 +3465,7 @@
   <w:abstractNum w:abstractNumId="1" w15:restartNumberingAfterBreak="0">
     <w:nsid w:val="0000A991"/>
     <w:multiLevelType w:val="multilevel"/>
-    <w:tmpl w:val="E3CCBE9E"/>
+    <w:tmpl w:val="9BBC1A6C"/>
     <w:lvl w:ilvl="0">
       <w:numFmt w:val="bullet"/>
       <w:lvlText w:val=""/>
@@ -3553,7 +3569,7 @@
   <w:abstractNum w:abstractNumId="2" w15:restartNumberingAfterBreak="0">
     <w:nsid w:val="00A99411"/>
     <w:multiLevelType w:val="multilevel"/>
-    <w:tmpl w:val="AC6418BA"/>
+    <w:tmpl w:val="0FAA4EDE"/>
     <w:lvl w:ilvl="0">
       <w:start w:val="1"/>
       <w:numFmt w:val="decimal"/>
@@ -3636,10 +3652,10 @@
       </w:pPr>
     </w:lvl>
   </w:abstractNum>
-  <w:num w:numId="1" w16cid:durableId="2086952346">
+  <w:num w:numId="1" w16cid:durableId="186329585">
     <w:abstractNumId w:val="0"/>
   </w:num>
-  <w:num w:numId="2" w16cid:durableId="959140757">
+  <w:num w:numId="2" w16cid:durableId="1495682923">
     <w:abstractNumId w:val="2"/>
     <w:lvlOverride w:ilvl="0">
       <w:startOverride w:val="1"/>
@@ -3669,7 +3685,7 @@
       <w:startOverride w:val="1"/>
     </w:lvlOverride>
   </w:num>
-  <w:num w:numId="3" w16cid:durableId="333608142">
+  <w:num w:numId="3" w16cid:durableId="1109399874">
     <w:abstractNumId w:val="2"/>
     <w:lvlOverride w:ilvl="0">
       <w:startOverride w:val="1"/>
@@ -3699,19 +3715,19 @@
       <w:startOverride w:val="1"/>
     </w:lvlOverride>
   </w:num>
-  <w:num w:numId="4" w16cid:durableId="767577564">
+  <w:num w:numId="4" w16cid:durableId="65568476">
     <w:abstractNumId w:val="1"/>
   </w:num>
-  <w:num w:numId="5" w16cid:durableId="816797576">
+  <w:num w:numId="5" w16cid:durableId="1492872024">
     <w:abstractNumId w:val="1"/>
   </w:num>
-  <w:num w:numId="6" w16cid:durableId="771045779">
+  <w:num w:numId="6" w16cid:durableId="649941328">
     <w:abstractNumId w:val="1"/>
   </w:num>
-  <w:num w:numId="7" w16cid:durableId="1276445855">
+  <w:num w:numId="7" w16cid:durableId="609288556">
     <w:abstractNumId w:val="1"/>
   </w:num>
-  <w:num w:numId="8" w16cid:durableId="2031760167">
+  <w:num w:numId="8" w16cid:durableId="1422993387">
     <w:abstractNumId w:val="2"/>
     <w:lvlOverride w:ilvl="0">
       <w:startOverride w:val="1"/>
@@ -3741,7 +3757,7 @@
       <w:startOverride w:val="1"/>
     </w:lvlOverride>
   </w:num>
-  <w:num w:numId="9" w16cid:durableId="1570454156">
+  <w:num w:numId="9" w16cid:durableId="1546404621">
     <w:abstractNumId w:val="2"/>
     <w:lvlOverride w:ilvl="0">
       <w:startOverride w:val="1"/>
@@ -3771,7 +3787,7 @@
       <w:startOverride w:val="1"/>
     </w:lvlOverride>
   </w:num>
-  <w:num w:numId="10" w16cid:durableId="1710445973">
+  <w:num w:numId="10" w16cid:durableId="1365443531">
     <w:abstractNumId w:val="2"/>
     <w:lvlOverride w:ilvl="0">
       <w:startOverride w:val="1"/>
@@ -5035,7 +5051,7 @@
     <w:name w:val="Grid Table 4"/>
     <w:basedOn w:val="TableNormal"/>
     <w:uiPriority w:val="49"/>
-    <w:rsid w:val="00C754D9"/>
+    <w:rsid w:val="00217E92"/>
     <w:pPr>
       <w:spacing w:after="0"/>
     </w:pPr>

</xml_diff>